<commit_message>
generated models and data for Condition Index
</commit_message>
<xml_diff>
--- a/writing/Chapter 1.docx
+++ b/writing/Chapter 1.docx
@@ -175,6 +175,41 @@
       <w:pPr>
         <w:rPr>
           <w:rFonts w:ascii="Arial" w:hAnsi="Arial" w:cs="Arial"/>
+        </w:rPr>
+      </w:pPr>
+      <w:r>
+        <w:rPr>
+          <w:rFonts w:ascii="Arial" w:hAnsi="Arial" w:cs="Arial"/>
+        </w:rPr>
+        <w:tab/>
+        <w:t xml:space="preserve">Thus, we explored the effects of </w:t>
+      </w:r>
+      <w:proofErr w:type="gramStart"/>
+      <w:r>
+        <w:rPr>
+          <w:rFonts w:ascii="Arial" w:hAnsi="Arial" w:cs="Arial"/>
+        </w:rPr>
+        <w:t>an</w:t>
+      </w:r>
+      <w:proofErr w:type="gramEnd"/>
+      <w:r>
+        <w:rPr>
+          <w:rFonts w:ascii="Arial" w:hAnsi="Arial" w:cs="Arial"/>
+        </w:rPr>
+        <w:t xml:space="preserve"> simulated acute heatwave following tidal and thermal hardening on three commercially farmed oyster species.</w:t>
+      </w:r>
+    </w:p>
+    <w:p>
+      <w:pPr>
+        <w:rPr>
+          <w:rFonts w:ascii="Arial" w:hAnsi="Arial" w:cs="Arial"/>
+        </w:rPr>
+      </w:pPr>
+    </w:p>
+    <w:p>
+      <w:pPr>
+        <w:rPr>
+          <w:rFonts w:ascii="Arial" w:hAnsi="Arial" w:cs="Arial"/>
           <w:b/>
           <w:bCs/>
           <w:sz w:val="28"/>
@@ -215,6 +250,165 @@
     </w:p>
     <w:p>
       <w:pPr>
+        <w:ind w:firstLine="720"/>
+        <w:rPr>
+          <w:rFonts w:ascii="Arial" w:hAnsi="Arial" w:cs="Arial"/>
+        </w:rPr>
+      </w:pPr>
+      <w:r>
+        <w:rPr>
+          <w:rFonts w:ascii="Arial" w:hAnsi="Arial" w:cs="Arial"/>
+          <w:i/>
+          <w:iCs/>
+        </w:rPr>
+        <w:t>O</w:t>
+      </w:r>
+      <w:r>
+        <w:rPr>
+          <w:rFonts w:ascii="Arial" w:hAnsi="Arial" w:cs="Arial"/>
+          <w:i/>
+          <w:iCs/>
+        </w:rPr>
+        <w:t>strea</w:t>
+      </w:r>
+      <w:r>
+        <w:rPr>
+          <w:rFonts w:ascii="Arial" w:hAnsi="Arial" w:cs="Arial"/>
+          <w:i/>
+          <w:iCs/>
+        </w:rPr>
+        <w:t xml:space="preserve"> </w:t>
+      </w:r>
+      <w:proofErr w:type="spellStart"/>
+      <w:r>
+        <w:rPr>
+          <w:rFonts w:ascii="Arial" w:hAnsi="Arial" w:cs="Arial"/>
+          <w:i/>
+          <w:iCs/>
+        </w:rPr>
+        <w:t>lurida</w:t>
+      </w:r>
+      <w:proofErr w:type="spellEnd"/>
+      <w:r>
+        <w:rPr>
+          <w:rFonts w:ascii="Arial" w:hAnsi="Arial" w:cs="Arial"/>
+        </w:rPr>
+        <w:t xml:space="preserve"> – </w:t>
+      </w:r>
+      <w:r>
+        <w:rPr>
+          <w:rFonts w:ascii="Arial" w:hAnsi="Arial" w:cs="Arial"/>
+        </w:rPr>
+        <w:t>x</w:t>
+      </w:r>
+    </w:p>
+    <w:p>
+      <w:pPr>
+        <w:ind w:firstLine="720"/>
+        <w:rPr>
+          <w:rFonts w:ascii="Arial" w:hAnsi="Arial" w:cs="Arial"/>
+        </w:rPr>
+      </w:pPr>
+      <w:r>
+        <w:rPr>
+          <w:rFonts w:ascii="Arial" w:hAnsi="Arial" w:cs="Arial"/>
+          <w:i/>
+          <w:iCs/>
+        </w:rPr>
+        <w:t>C</w:t>
+      </w:r>
+      <w:r>
+        <w:rPr>
+          <w:rFonts w:ascii="Arial" w:hAnsi="Arial" w:cs="Arial"/>
+          <w:i/>
+          <w:iCs/>
+        </w:rPr>
+        <w:t>rassostrea</w:t>
+      </w:r>
+      <w:r>
+        <w:rPr>
+          <w:rFonts w:ascii="Arial" w:hAnsi="Arial" w:cs="Arial"/>
+          <w:i/>
+          <w:iCs/>
+        </w:rPr>
+        <w:t xml:space="preserve"> </w:t>
+      </w:r>
+      <w:proofErr w:type="spellStart"/>
+      <w:r>
+        <w:rPr>
+          <w:rFonts w:ascii="Arial" w:hAnsi="Arial" w:cs="Arial"/>
+          <w:i/>
+          <w:iCs/>
+        </w:rPr>
+        <w:t>sikamea</w:t>
+      </w:r>
+      <w:proofErr w:type="spellEnd"/>
+      <w:r>
+        <w:rPr>
+          <w:rFonts w:ascii="Arial" w:hAnsi="Arial" w:cs="Arial"/>
+        </w:rPr>
+        <w:t xml:space="preserve"> – </w:t>
+      </w:r>
+      <w:r>
+        <w:rPr>
+          <w:rFonts w:ascii="Arial" w:hAnsi="Arial" w:cs="Arial"/>
+        </w:rPr>
+        <w:t>x</w:t>
+      </w:r>
+    </w:p>
+    <w:p>
+      <w:pPr>
+        <w:ind w:firstLine="720"/>
+        <w:rPr>
+          <w:rFonts w:ascii="Arial" w:hAnsi="Arial" w:cs="Arial"/>
+        </w:rPr>
+      </w:pPr>
+      <w:proofErr w:type="spellStart"/>
+      <w:r>
+        <w:rPr>
+          <w:rFonts w:ascii="Arial" w:hAnsi="Arial" w:cs="Arial"/>
+          <w:i/>
+          <w:iCs/>
+        </w:rPr>
+        <w:t>M</w:t>
+      </w:r>
+      <w:r>
+        <w:rPr>
+          <w:rFonts w:ascii="Arial" w:hAnsi="Arial" w:cs="Arial"/>
+          <w:i/>
+          <w:iCs/>
+        </w:rPr>
+        <w:t>agallana</w:t>
+      </w:r>
+      <w:proofErr w:type="spellEnd"/>
+      <w:r>
+        <w:rPr>
+          <w:rFonts w:ascii="Arial" w:hAnsi="Arial" w:cs="Arial"/>
+          <w:i/>
+          <w:iCs/>
+        </w:rPr>
+        <w:t xml:space="preserve"> gigas</w:t>
+      </w:r>
+      <w:r>
+        <w:rPr>
+          <w:rFonts w:ascii="Arial" w:hAnsi="Arial" w:cs="Arial"/>
+        </w:rPr>
+        <w:t xml:space="preserve"> – x</w:t>
+      </w:r>
+    </w:p>
+    <w:p>
+      <w:pPr>
+        <w:rPr>
+          <w:rFonts w:ascii="Arial" w:hAnsi="Arial" w:cs="Arial"/>
+          <w:b/>
+          <w:bCs/>
+          <w:i/>
+          <w:iCs/>
+        </w:rPr>
+      </w:pPr>
+    </w:p>
+    <w:p>
+      <w:pPr>
         <w:rPr>
           <w:rFonts w:ascii="Arial" w:hAnsi="Arial" w:cs="Arial"/>
           <w:b/>
@@ -367,6 +561,227 @@
     </w:p>
     <w:p>
       <w:pPr>
+        <w:rPr>
+          <w:rFonts w:ascii="Arial" w:hAnsi="Arial" w:cs="Arial"/>
+          <w:i/>
+          <w:iCs/>
+        </w:rPr>
+      </w:pPr>
+      <w:r>
+        <w:rPr>
+          <w:rFonts w:ascii="Arial" w:hAnsi="Arial" w:cs="Arial"/>
+          <w:i/>
+          <w:iCs/>
+        </w:rPr>
+        <w:t>Mortality</w:t>
+      </w:r>
+    </w:p>
+    <w:p>
+      <w:pPr>
+        <w:rPr>
+          <w:rFonts w:ascii="Arial" w:hAnsi="Arial" w:cs="Arial"/>
+          <w:i/>
+          <w:iCs/>
+        </w:rPr>
+      </w:pPr>
+      <w:r>
+        <w:rPr>
+          <w:rFonts w:ascii="Arial" w:hAnsi="Arial" w:cs="Arial"/>
+          <w:i/>
+          <w:iCs/>
+        </w:rPr>
+        <w:t>Growth</w:t>
+      </w:r>
+    </w:p>
+    <w:p>
+      <w:pPr>
+        <w:rPr>
+          <w:rFonts w:ascii="Arial" w:hAnsi="Arial" w:cs="Arial"/>
+          <w:i/>
+          <w:iCs/>
+        </w:rPr>
+      </w:pPr>
+      <w:r>
+        <w:rPr>
+          <w:rFonts w:ascii="Arial" w:hAnsi="Arial" w:cs="Arial"/>
+          <w:i/>
+          <w:iCs/>
+        </w:rPr>
+        <w:lastRenderedPageBreak/>
+        <w:t>Condition Index</w:t>
+      </w:r>
+    </w:p>
+    <w:p>
+      <w:pPr>
+        <w:rPr>
+          <w:rFonts w:ascii="Arial" w:hAnsi="Arial" w:cs="Arial"/>
+        </w:rPr>
+      </w:pPr>
+    </w:p>
+    <w:p>
+      <w:pPr>
+        <w:rPr>
+          <w:rFonts w:ascii="Arial" w:hAnsi="Arial" w:cs="Arial"/>
+          <w:i/>
+          <w:iCs/>
+        </w:rPr>
+      </w:pPr>
+      <w:r>
+        <w:rPr>
+          <w:rFonts w:ascii="Arial" w:hAnsi="Arial" w:cs="Arial"/>
+          <w:i/>
+          <w:iCs/>
+        </w:rPr>
+        <w:t>Physiology – Protein Carbonyl</w:t>
+      </w:r>
+    </w:p>
+    <w:p>
+      <w:pPr>
+        <w:rPr>
+          <w:rFonts w:ascii="Arial" w:hAnsi="Arial" w:cs="Arial"/>
+          <w:b/>
+          <w:bCs/>
+          <w:sz w:val="28"/>
+          <w:szCs w:val="28"/>
+        </w:rPr>
+      </w:pPr>
+    </w:p>
+    <w:p>
+      <w:pPr>
+        <w:rPr>
+          <w:rFonts w:ascii="Arial" w:hAnsi="Arial" w:cs="Arial"/>
+          <w:b/>
+          <w:bCs/>
+          <w:sz w:val="28"/>
+          <w:szCs w:val="28"/>
+        </w:rPr>
+      </w:pPr>
+      <w:r>
+        <w:rPr>
+          <w:rFonts w:ascii="Arial" w:hAnsi="Arial" w:cs="Arial"/>
+          <w:b/>
+          <w:bCs/>
+          <w:sz w:val="28"/>
+          <w:szCs w:val="28"/>
+        </w:rPr>
+        <w:t>RESULTS</w:t>
+      </w:r>
+    </w:p>
+    <w:p>
+      <w:pPr>
+        <w:rPr>
+          <w:rFonts w:ascii="Arial" w:hAnsi="Arial" w:cs="Arial"/>
+          <w:i/>
+          <w:iCs/>
+        </w:rPr>
+      </w:pPr>
+      <w:r>
+        <w:rPr>
+          <w:rFonts w:ascii="Arial" w:hAnsi="Arial" w:cs="Arial"/>
+          <w:i/>
+          <w:iCs/>
+        </w:rPr>
+        <w:t>Temperature/Tide</w:t>
+      </w:r>
+    </w:p>
+    <w:p>
+      <w:pPr>
+        <w:rPr>
+          <w:rFonts w:ascii="Arial" w:hAnsi="Arial" w:cs="Arial"/>
+          <w:i/>
+          <w:iCs/>
+        </w:rPr>
+      </w:pPr>
+      <w:r>
+        <w:rPr>
+          <w:rFonts w:ascii="Arial" w:hAnsi="Arial" w:cs="Arial"/>
+          <w:i/>
+          <w:iCs/>
+        </w:rPr>
+        <w:t>Mortality</w:t>
+      </w:r>
+    </w:p>
+    <w:p>
+      <w:pPr>
+        <w:rPr>
+          <w:rFonts w:ascii="Arial" w:hAnsi="Arial" w:cs="Arial"/>
+          <w:i/>
+          <w:iCs/>
+        </w:rPr>
+      </w:pPr>
+      <w:r>
+        <w:rPr>
+          <w:rFonts w:ascii="Arial" w:hAnsi="Arial" w:cs="Arial"/>
+          <w:i/>
+          <w:iCs/>
+        </w:rPr>
+        <w:t>Growth</w:t>
+      </w:r>
+    </w:p>
+    <w:p>
+      <w:pPr>
+        <w:rPr>
+          <w:rFonts w:ascii="Arial" w:hAnsi="Arial" w:cs="Arial"/>
+          <w:i/>
+          <w:iCs/>
+        </w:rPr>
+      </w:pPr>
+      <w:r>
+        <w:rPr>
+          <w:rFonts w:ascii="Arial" w:hAnsi="Arial" w:cs="Arial"/>
+          <w:i/>
+          <w:iCs/>
+        </w:rPr>
+        <w:t>Condition Index</w:t>
+      </w:r>
+    </w:p>
+    <w:p>
+      <w:pPr>
+        <w:rPr>
+          <w:rFonts w:ascii="Arial" w:hAnsi="Arial" w:cs="Arial"/>
+        </w:rPr>
+      </w:pPr>
+      <w:r>
+        <w:rPr>
+          <w:rFonts w:ascii="Arial" w:hAnsi="Arial" w:cs="Arial"/>
+          <w:i/>
+          <w:iCs/>
+        </w:rPr>
+        <w:tab/>
+      </w:r>
+      <w:r>
+        <w:rPr>
+          <w:rFonts w:ascii="Arial" w:hAnsi="Arial" w:cs="Arial"/>
+          <w:i/>
+          <w:iCs/>
+        </w:rPr>
+        <w:t xml:space="preserve">O. </w:t>
+      </w:r>
+      <w:proofErr w:type="spellStart"/>
+      <w:r>
+        <w:rPr>
+          <w:rFonts w:ascii="Arial" w:hAnsi="Arial" w:cs="Arial"/>
+          <w:i/>
+          <w:iCs/>
+        </w:rPr>
+        <w:t>lurida</w:t>
+      </w:r>
+      <w:proofErr w:type="spellEnd"/>
+      <w:r>
+        <w:rPr>
+          <w:rFonts w:ascii="Arial" w:hAnsi="Arial" w:cs="Arial"/>
+        </w:rPr>
+        <w:t xml:space="preserve"> – </w:t>
+      </w:r>
+      <w:r>
+        <w:rPr>
+          <w:rFonts w:ascii="Arial" w:hAnsi="Arial" w:cs="Arial"/>
+        </w:rPr>
+        <w:t>x</w:t>
+      </w:r>
+    </w:p>
+    <w:p>
+      <w:pPr>
         <w:ind w:firstLine="720"/>
         <w:rPr>
           <w:rFonts w:ascii="Arial" w:hAnsi="Arial" w:cs="Arial"/>
@@ -375,136 +790,19 @@
       <w:r>
         <w:rPr>
           <w:rFonts w:ascii="Arial" w:hAnsi="Arial" w:cs="Arial"/>
-        </w:rPr>
-        <w:t>XYZ</w:t>
-      </w:r>
-    </w:p>
-    <w:p>
-      <w:pPr>
-        <w:rPr>
-          <w:rFonts w:ascii="Arial" w:hAnsi="Arial" w:cs="Arial"/>
-          <w:b/>
-          <w:bCs/>
-          <w:sz w:val="28"/>
-          <w:szCs w:val="28"/>
-        </w:rPr>
-      </w:pPr>
-    </w:p>
-    <w:p>
-      <w:pPr>
-        <w:rPr>
-          <w:rFonts w:ascii="Arial" w:hAnsi="Arial" w:cs="Arial"/>
-          <w:b/>
-          <w:bCs/>
-          <w:sz w:val="28"/>
-          <w:szCs w:val="28"/>
-        </w:rPr>
-      </w:pPr>
-      <w:r>
-        <w:rPr>
-          <w:rFonts w:ascii="Arial" w:hAnsi="Arial" w:cs="Arial"/>
-          <w:b/>
-          <w:bCs/>
-          <w:sz w:val="28"/>
-          <w:szCs w:val="28"/>
-        </w:rPr>
-        <w:t>RESULTS</w:t>
-      </w:r>
-    </w:p>
-    <w:p>
-      <w:pPr>
-        <w:rPr>
-          <w:rFonts w:ascii="Arial" w:hAnsi="Arial" w:cs="Arial"/>
-          <w:i/>
-          <w:iCs/>
-        </w:rPr>
-      </w:pPr>
-      <w:r>
-        <w:rPr>
-          <w:rFonts w:ascii="Arial" w:hAnsi="Arial" w:cs="Arial"/>
-          <w:i/>
-          <w:iCs/>
-        </w:rPr>
-        <w:t>Temperature/Tide</w:t>
-      </w:r>
-    </w:p>
-    <w:p>
-      <w:pPr>
-        <w:rPr>
-          <w:rFonts w:ascii="Arial" w:hAnsi="Arial" w:cs="Arial"/>
-          <w:i/>
-          <w:iCs/>
-        </w:rPr>
-      </w:pPr>
-      <w:r>
-        <w:rPr>
-          <w:rFonts w:ascii="Arial" w:hAnsi="Arial" w:cs="Arial"/>
-          <w:i/>
-          <w:iCs/>
-        </w:rPr>
-        <w:t>Mortality</w:t>
-      </w:r>
-    </w:p>
-    <w:p>
-      <w:pPr>
-        <w:rPr>
-          <w:rFonts w:ascii="Arial" w:hAnsi="Arial" w:cs="Arial"/>
-          <w:i/>
-          <w:iCs/>
-        </w:rPr>
-      </w:pPr>
-      <w:r>
-        <w:rPr>
-          <w:rFonts w:ascii="Arial" w:hAnsi="Arial" w:cs="Arial"/>
-          <w:i/>
-          <w:iCs/>
-        </w:rPr>
-        <w:t>Growth</w:t>
-      </w:r>
-    </w:p>
-    <w:p>
-      <w:pPr>
-        <w:rPr>
-          <w:rFonts w:ascii="Arial" w:hAnsi="Arial" w:cs="Arial"/>
-          <w:i/>
-          <w:iCs/>
-        </w:rPr>
-      </w:pPr>
-      <w:r>
-        <w:rPr>
-          <w:rFonts w:ascii="Arial" w:hAnsi="Arial" w:cs="Arial"/>
-          <w:i/>
-          <w:iCs/>
-        </w:rPr>
-        <w:t>Condition Index</w:t>
-      </w:r>
-    </w:p>
-    <w:p>
-      <w:pPr>
-        <w:rPr>
-          <w:rFonts w:ascii="Arial" w:hAnsi="Arial" w:cs="Arial"/>
-        </w:rPr>
-      </w:pPr>
-      <w:r>
-        <w:rPr>
-          <w:rFonts w:ascii="Arial" w:hAnsi="Arial" w:cs="Arial"/>
-          <w:i/>
-          <w:iCs/>
-        </w:rPr>
-        <w:tab/>
-      </w:r>
-      <w:r>
-        <w:rPr>
-          <w:rFonts w:ascii="Arial" w:hAnsi="Arial" w:cs="Arial"/>
-        </w:rPr>
-        <w:t xml:space="preserve">O. </w:t>
+          <w:i/>
+          <w:iCs/>
+        </w:rPr>
+        <w:t xml:space="preserve">C. </w:t>
       </w:r>
       <w:proofErr w:type="spellStart"/>
       <w:r>
         <w:rPr>
           <w:rFonts w:ascii="Arial" w:hAnsi="Arial" w:cs="Arial"/>
-        </w:rPr>
-        <w:t>lurida</w:t>
+          <w:i/>
+          <w:iCs/>
+        </w:rPr>
+        <w:t>sikamea</w:t>
       </w:r>
       <w:proofErr w:type="spellEnd"/>
       <w:r>
@@ -513,6 +811,12 @@
         </w:rPr>
         <w:t xml:space="preserve"> – </w:t>
       </w:r>
+      <w:r>
+        <w:rPr>
+          <w:rFonts w:ascii="Arial" w:hAnsi="Arial" w:cs="Arial"/>
+        </w:rPr>
+        <w:t>x</w:t>
+      </w:r>
     </w:p>
     <w:p>
       <w:pPr>
@@ -524,37 +828,16 @@
       <w:r>
         <w:rPr>
           <w:rFonts w:ascii="Arial" w:hAnsi="Arial" w:cs="Arial"/>
-        </w:rPr>
-        <w:lastRenderedPageBreak/>
-        <w:t xml:space="preserve">C. </w:t>
-      </w:r>
-      <w:proofErr w:type="spellStart"/>
-      <w:r>
-        <w:rPr>
-          <w:rFonts w:ascii="Arial" w:hAnsi="Arial" w:cs="Arial"/>
-        </w:rPr>
-        <w:t>sikamea</w:t>
-      </w:r>
-      <w:proofErr w:type="spellEnd"/>
-      <w:r>
-        <w:rPr>
-          <w:rFonts w:ascii="Arial" w:hAnsi="Arial" w:cs="Arial"/>
-        </w:rPr>
-        <w:t xml:space="preserve"> – </w:t>
-      </w:r>
-    </w:p>
-    <w:p>
-      <w:pPr>
-        <w:ind w:firstLine="720"/>
-        <w:rPr>
-          <w:rFonts w:ascii="Arial" w:hAnsi="Arial" w:cs="Arial"/>
-        </w:rPr>
-      </w:pPr>
-      <w:r>
-        <w:rPr>
-          <w:rFonts w:ascii="Arial" w:hAnsi="Arial" w:cs="Arial"/>
-        </w:rPr>
-        <w:t>M. gigas – x</w:t>
+          <w:i/>
+          <w:iCs/>
+        </w:rPr>
+        <w:t>M. gigas</w:t>
+      </w:r>
+      <w:r>
+        <w:rPr>
+          <w:rFonts w:ascii="Arial" w:hAnsi="Arial" w:cs="Arial"/>
+        </w:rPr>
+        <w:t xml:space="preserve"> – x</w:t>
       </w:r>
     </w:p>
     <w:p>

</xml_diff>

<commit_message>
generated models and data for Condition Index and started analyzing data for Length/Width
</commit_message>
<xml_diff>
--- a/writing/Chapter 1.docx
+++ b/writing/Chapter 1.docx
@@ -175,6 +175,41 @@
       <w:pPr>
         <w:rPr>
           <w:rFonts w:ascii="Arial" w:hAnsi="Arial" w:cs="Arial"/>
+        </w:rPr>
+      </w:pPr>
+      <w:r>
+        <w:rPr>
+          <w:rFonts w:ascii="Arial" w:hAnsi="Arial" w:cs="Arial"/>
+        </w:rPr>
+        <w:tab/>
+        <w:t xml:space="preserve">Thus, we explored the effects of </w:t>
+      </w:r>
+      <w:proofErr w:type="gramStart"/>
+      <w:r>
+        <w:rPr>
+          <w:rFonts w:ascii="Arial" w:hAnsi="Arial" w:cs="Arial"/>
+        </w:rPr>
+        <w:t>an</w:t>
+      </w:r>
+      <w:proofErr w:type="gramEnd"/>
+      <w:r>
+        <w:rPr>
+          <w:rFonts w:ascii="Arial" w:hAnsi="Arial" w:cs="Arial"/>
+        </w:rPr>
+        <w:t xml:space="preserve"> simulated acute heatwave following tidal and thermal hardening on three commercially farmed oyster species.</w:t>
+      </w:r>
+    </w:p>
+    <w:p>
+      <w:pPr>
+        <w:rPr>
+          <w:rFonts w:ascii="Arial" w:hAnsi="Arial" w:cs="Arial"/>
+        </w:rPr>
+      </w:pPr>
+    </w:p>
+    <w:p>
+      <w:pPr>
+        <w:rPr>
+          <w:rFonts w:ascii="Arial" w:hAnsi="Arial" w:cs="Arial"/>
           <w:b/>
           <w:bCs/>
           <w:sz w:val="28"/>
@@ -215,6 +250,165 @@
     </w:p>
     <w:p>
       <w:pPr>
+        <w:ind w:firstLine="720"/>
+        <w:rPr>
+          <w:rFonts w:ascii="Arial" w:hAnsi="Arial" w:cs="Arial"/>
+        </w:rPr>
+      </w:pPr>
+      <w:r>
+        <w:rPr>
+          <w:rFonts w:ascii="Arial" w:hAnsi="Arial" w:cs="Arial"/>
+          <w:i/>
+          <w:iCs/>
+        </w:rPr>
+        <w:t>O</w:t>
+      </w:r>
+      <w:r>
+        <w:rPr>
+          <w:rFonts w:ascii="Arial" w:hAnsi="Arial" w:cs="Arial"/>
+          <w:i/>
+          <w:iCs/>
+        </w:rPr>
+        <w:t>strea</w:t>
+      </w:r>
+      <w:r>
+        <w:rPr>
+          <w:rFonts w:ascii="Arial" w:hAnsi="Arial" w:cs="Arial"/>
+          <w:i/>
+          <w:iCs/>
+        </w:rPr>
+        <w:t xml:space="preserve"> </w:t>
+      </w:r>
+      <w:proofErr w:type="spellStart"/>
+      <w:r>
+        <w:rPr>
+          <w:rFonts w:ascii="Arial" w:hAnsi="Arial" w:cs="Arial"/>
+          <w:i/>
+          <w:iCs/>
+        </w:rPr>
+        <w:t>lurida</w:t>
+      </w:r>
+      <w:proofErr w:type="spellEnd"/>
+      <w:r>
+        <w:rPr>
+          <w:rFonts w:ascii="Arial" w:hAnsi="Arial" w:cs="Arial"/>
+        </w:rPr>
+        <w:t xml:space="preserve"> – </w:t>
+      </w:r>
+      <w:r>
+        <w:rPr>
+          <w:rFonts w:ascii="Arial" w:hAnsi="Arial" w:cs="Arial"/>
+        </w:rPr>
+        <w:t>x</w:t>
+      </w:r>
+    </w:p>
+    <w:p>
+      <w:pPr>
+        <w:ind w:firstLine="720"/>
+        <w:rPr>
+          <w:rFonts w:ascii="Arial" w:hAnsi="Arial" w:cs="Arial"/>
+        </w:rPr>
+      </w:pPr>
+      <w:r>
+        <w:rPr>
+          <w:rFonts w:ascii="Arial" w:hAnsi="Arial" w:cs="Arial"/>
+          <w:i/>
+          <w:iCs/>
+        </w:rPr>
+        <w:t>C</w:t>
+      </w:r>
+      <w:r>
+        <w:rPr>
+          <w:rFonts w:ascii="Arial" w:hAnsi="Arial" w:cs="Arial"/>
+          <w:i/>
+          <w:iCs/>
+        </w:rPr>
+        <w:t>rassostrea</w:t>
+      </w:r>
+      <w:r>
+        <w:rPr>
+          <w:rFonts w:ascii="Arial" w:hAnsi="Arial" w:cs="Arial"/>
+          <w:i/>
+          <w:iCs/>
+        </w:rPr>
+        <w:t xml:space="preserve"> </w:t>
+      </w:r>
+      <w:proofErr w:type="spellStart"/>
+      <w:r>
+        <w:rPr>
+          <w:rFonts w:ascii="Arial" w:hAnsi="Arial" w:cs="Arial"/>
+          <w:i/>
+          <w:iCs/>
+        </w:rPr>
+        <w:t>sikamea</w:t>
+      </w:r>
+      <w:proofErr w:type="spellEnd"/>
+      <w:r>
+        <w:rPr>
+          <w:rFonts w:ascii="Arial" w:hAnsi="Arial" w:cs="Arial"/>
+        </w:rPr>
+        <w:t xml:space="preserve"> – </w:t>
+      </w:r>
+      <w:r>
+        <w:rPr>
+          <w:rFonts w:ascii="Arial" w:hAnsi="Arial" w:cs="Arial"/>
+        </w:rPr>
+        <w:t>x</w:t>
+      </w:r>
+    </w:p>
+    <w:p>
+      <w:pPr>
+        <w:ind w:firstLine="720"/>
+        <w:rPr>
+          <w:rFonts w:ascii="Arial" w:hAnsi="Arial" w:cs="Arial"/>
+        </w:rPr>
+      </w:pPr>
+      <w:proofErr w:type="spellStart"/>
+      <w:r>
+        <w:rPr>
+          <w:rFonts w:ascii="Arial" w:hAnsi="Arial" w:cs="Arial"/>
+          <w:i/>
+          <w:iCs/>
+        </w:rPr>
+        <w:t>M</w:t>
+      </w:r>
+      <w:r>
+        <w:rPr>
+          <w:rFonts w:ascii="Arial" w:hAnsi="Arial" w:cs="Arial"/>
+          <w:i/>
+          <w:iCs/>
+        </w:rPr>
+        <w:t>agallana</w:t>
+      </w:r>
+      <w:proofErr w:type="spellEnd"/>
+      <w:r>
+        <w:rPr>
+          <w:rFonts w:ascii="Arial" w:hAnsi="Arial" w:cs="Arial"/>
+          <w:i/>
+          <w:iCs/>
+        </w:rPr>
+        <w:t xml:space="preserve"> gigas</w:t>
+      </w:r>
+      <w:r>
+        <w:rPr>
+          <w:rFonts w:ascii="Arial" w:hAnsi="Arial" w:cs="Arial"/>
+        </w:rPr>
+        <w:t xml:space="preserve"> – x</w:t>
+      </w:r>
+    </w:p>
+    <w:p>
+      <w:pPr>
+        <w:rPr>
+          <w:rFonts w:ascii="Arial" w:hAnsi="Arial" w:cs="Arial"/>
+          <w:b/>
+          <w:bCs/>
+          <w:i/>
+          <w:iCs/>
+        </w:rPr>
+      </w:pPr>
+    </w:p>
+    <w:p>
+      <w:pPr>
         <w:rPr>
           <w:rFonts w:ascii="Arial" w:hAnsi="Arial" w:cs="Arial"/>
           <w:b/>
@@ -367,6 +561,227 @@
     </w:p>
     <w:p>
       <w:pPr>
+        <w:rPr>
+          <w:rFonts w:ascii="Arial" w:hAnsi="Arial" w:cs="Arial"/>
+          <w:i/>
+          <w:iCs/>
+        </w:rPr>
+      </w:pPr>
+      <w:r>
+        <w:rPr>
+          <w:rFonts w:ascii="Arial" w:hAnsi="Arial" w:cs="Arial"/>
+          <w:i/>
+          <w:iCs/>
+        </w:rPr>
+        <w:t>Mortality</w:t>
+      </w:r>
+    </w:p>
+    <w:p>
+      <w:pPr>
+        <w:rPr>
+          <w:rFonts w:ascii="Arial" w:hAnsi="Arial" w:cs="Arial"/>
+          <w:i/>
+          <w:iCs/>
+        </w:rPr>
+      </w:pPr>
+      <w:r>
+        <w:rPr>
+          <w:rFonts w:ascii="Arial" w:hAnsi="Arial" w:cs="Arial"/>
+          <w:i/>
+          <w:iCs/>
+        </w:rPr>
+        <w:t>Growth</w:t>
+      </w:r>
+    </w:p>
+    <w:p>
+      <w:pPr>
+        <w:rPr>
+          <w:rFonts w:ascii="Arial" w:hAnsi="Arial" w:cs="Arial"/>
+          <w:i/>
+          <w:iCs/>
+        </w:rPr>
+      </w:pPr>
+      <w:r>
+        <w:rPr>
+          <w:rFonts w:ascii="Arial" w:hAnsi="Arial" w:cs="Arial"/>
+          <w:i/>
+          <w:iCs/>
+        </w:rPr>
+        <w:lastRenderedPageBreak/>
+        <w:t>Condition Index</w:t>
+      </w:r>
+    </w:p>
+    <w:p>
+      <w:pPr>
+        <w:rPr>
+          <w:rFonts w:ascii="Arial" w:hAnsi="Arial" w:cs="Arial"/>
+        </w:rPr>
+      </w:pPr>
+    </w:p>
+    <w:p>
+      <w:pPr>
+        <w:rPr>
+          <w:rFonts w:ascii="Arial" w:hAnsi="Arial" w:cs="Arial"/>
+          <w:i/>
+          <w:iCs/>
+        </w:rPr>
+      </w:pPr>
+      <w:r>
+        <w:rPr>
+          <w:rFonts w:ascii="Arial" w:hAnsi="Arial" w:cs="Arial"/>
+          <w:i/>
+          <w:iCs/>
+        </w:rPr>
+        <w:t>Physiology – Protein Carbonyl</w:t>
+      </w:r>
+    </w:p>
+    <w:p>
+      <w:pPr>
+        <w:rPr>
+          <w:rFonts w:ascii="Arial" w:hAnsi="Arial" w:cs="Arial"/>
+          <w:b/>
+          <w:bCs/>
+          <w:sz w:val="28"/>
+          <w:szCs w:val="28"/>
+        </w:rPr>
+      </w:pPr>
+    </w:p>
+    <w:p>
+      <w:pPr>
+        <w:rPr>
+          <w:rFonts w:ascii="Arial" w:hAnsi="Arial" w:cs="Arial"/>
+          <w:b/>
+          <w:bCs/>
+          <w:sz w:val="28"/>
+          <w:szCs w:val="28"/>
+        </w:rPr>
+      </w:pPr>
+      <w:r>
+        <w:rPr>
+          <w:rFonts w:ascii="Arial" w:hAnsi="Arial" w:cs="Arial"/>
+          <w:b/>
+          <w:bCs/>
+          <w:sz w:val="28"/>
+          <w:szCs w:val="28"/>
+        </w:rPr>
+        <w:t>RESULTS</w:t>
+      </w:r>
+    </w:p>
+    <w:p>
+      <w:pPr>
+        <w:rPr>
+          <w:rFonts w:ascii="Arial" w:hAnsi="Arial" w:cs="Arial"/>
+          <w:i/>
+          <w:iCs/>
+        </w:rPr>
+      </w:pPr>
+      <w:r>
+        <w:rPr>
+          <w:rFonts w:ascii="Arial" w:hAnsi="Arial" w:cs="Arial"/>
+          <w:i/>
+          <w:iCs/>
+        </w:rPr>
+        <w:t>Temperature/Tide</w:t>
+      </w:r>
+    </w:p>
+    <w:p>
+      <w:pPr>
+        <w:rPr>
+          <w:rFonts w:ascii="Arial" w:hAnsi="Arial" w:cs="Arial"/>
+          <w:i/>
+          <w:iCs/>
+        </w:rPr>
+      </w:pPr>
+      <w:r>
+        <w:rPr>
+          <w:rFonts w:ascii="Arial" w:hAnsi="Arial" w:cs="Arial"/>
+          <w:i/>
+          <w:iCs/>
+        </w:rPr>
+        <w:t>Mortality</w:t>
+      </w:r>
+    </w:p>
+    <w:p>
+      <w:pPr>
+        <w:rPr>
+          <w:rFonts w:ascii="Arial" w:hAnsi="Arial" w:cs="Arial"/>
+          <w:i/>
+          <w:iCs/>
+        </w:rPr>
+      </w:pPr>
+      <w:r>
+        <w:rPr>
+          <w:rFonts w:ascii="Arial" w:hAnsi="Arial" w:cs="Arial"/>
+          <w:i/>
+          <w:iCs/>
+        </w:rPr>
+        <w:t>Growth</w:t>
+      </w:r>
+    </w:p>
+    <w:p>
+      <w:pPr>
+        <w:rPr>
+          <w:rFonts w:ascii="Arial" w:hAnsi="Arial" w:cs="Arial"/>
+          <w:i/>
+          <w:iCs/>
+        </w:rPr>
+      </w:pPr>
+      <w:r>
+        <w:rPr>
+          <w:rFonts w:ascii="Arial" w:hAnsi="Arial" w:cs="Arial"/>
+          <w:i/>
+          <w:iCs/>
+        </w:rPr>
+        <w:t>Condition Index</w:t>
+      </w:r>
+    </w:p>
+    <w:p>
+      <w:pPr>
+        <w:rPr>
+          <w:rFonts w:ascii="Arial" w:hAnsi="Arial" w:cs="Arial"/>
+        </w:rPr>
+      </w:pPr>
+      <w:r>
+        <w:rPr>
+          <w:rFonts w:ascii="Arial" w:hAnsi="Arial" w:cs="Arial"/>
+          <w:i/>
+          <w:iCs/>
+        </w:rPr>
+        <w:tab/>
+      </w:r>
+      <w:r>
+        <w:rPr>
+          <w:rFonts w:ascii="Arial" w:hAnsi="Arial" w:cs="Arial"/>
+          <w:i/>
+          <w:iCs/>
+        </w:rPr>
+        <w:t xml:space="preserve">O. </w:t>
+      </w:r>
+      <w:proofErr w:type="spellStart"/>
+      <w:r>
+        <w:rPr>
+          <w:rFonts w:ascii="Arial" w:hAnsi="Arial" w:cs="Arial"/>
+          <w:i/>
+          <w:iCs/>
+        </w:rPr>
+        <w:t>lurida</w:t>
+      </w:r>
+      <w:proofErr w:type="spellEnd"/>
+      <w:r>
+        <w:rPr>
+          <w:rFonts w:ascii="Arial" w:hAnsi="Arial" w:cs="Arial"/>
+        </w:rPr>
+        <w:t xml:space="preserve"> – </w:t>
+      </w:r>
+      <w:r>
+        <w:rPr>
+          <w:rFonts w:ascii="Arial" w:hAnsi="Arial" w:cs="Arial"/>
+        </w:rPr>
+        <w:t>x</w:t>
+      </w:r>
+    </w:p>
+    <w:p>
+      <w:pPr>
         <w:ind w:firstLine="720"/>
         <w:rPr>
           <w:rFonts w:ascii="Arial" w:hAnsi="Arial" w:cs="Arial"/>
@@ -375,136 +790,19 @@
       <w:r>
         <w:rPr>
           <w:rFonts w:ascii="Arial" w:hAnsi="Arial" w:cs="Arial"/>
-        </w:rPr>
-        <w:t>XYZ</w:t>
-      </w:r>
-    </w:p>
-    <w:p>
-      <w:pPr>
-        <w:rPr>
-          <w:rFonts w:ascii="Arial" w:hAnsi="Arial" w:cs="Arial"/>
-          <w:b/>
-          <w:bCs/>
-          <w:sz w:val="28"/>
-          <w:szCs w:val="28"/>
-        </w:rPr>
-      </w:pPr>
-    </w:p>
-    <w:p>
-      <w:pPr>
-        <w:rPr>
-          <w:rFonts w:ascii="Arial" w:hAnsi="Arial" w:cs="Arial"/>
-          <w:b/>
-          <w:bCs/>
-          <w:sz w:val="28"/>
-          <w:szCs w:val="28"/>
-        </w:rPr>
-      </w:pPr>
-      <w:r>
-        <w:rPr>
-          <w:rFonts w:ascii="Arial" w:hAnsi="Arial" w:cs="Arial"/>
-          <w:b/>
-          <w:bCs/>
-          <w:sz w:val="28"/>
-          <w:szCs w:val="28"/>
-        </w:rPr>
-        <w:t>RESULTS</w:t>
-      </w:r>
-    </w:p>
-    <w:p>
-      <w:pPr>
-        <w:rPr>
-          <w:rFonts w:ascii="Arial" w:hAnsi="Arial" w:cs="Arial"/>
-          <w:i/>
-          <w:iCs/>
-        </w:rPr>
-      </w:pPr>
-      <w:r>
-        <w:rPr>
-          <w:rFonts w:ascii="Arial" w:hAnsi="Arial" w:cs="Arial"/>
-          <w:i/>
-          <w:iCs/>
-        </w:rPr>
-        <w:t>Temperature/Tide</w:t>
-      </w:r>
-    </w:p>
-    <w:p>
-      <w:pPr>
-        <w:rPr>
-          <w:rFonts w:ascii="Arial" w:hAnsi="Arial" w:cs="Arial"/>
-          <w:i/>
-          <w:iCs/>
-        </w:rPr>
-      </w:pPr>
-      <w:r>
-        <w:rPr>
-          <w:rFonts w:ascii="Arial" w:hAnsi="Arial" w:cs="Arial"/>
-          <w:i/>
-          <w:iCs/>
-        </w:rPr>
-        <w:t>Mortality</w:t>
-      </w:r>
-    </w:p>
-    <w:p>
-      <w:pPr>
-        <w:rPr>
-          <w:rFonts w:ascii="Arial" w:hAnsi="Arial" w:cs="Arial"/>
-          <w:i/>
-          <w:iCs/>
-        </w:rPr>
-      </w:pPr>
-      <w:r>
-        <w:rPr>
-          <w:rFonts w:ascii="Arial" w:hAnsi="Arial" w:cs="Arial"/>
-          <w:i/>
-          <w:iCs/>
-        </w:rPr>
-        <w:t>Growth</w:t>
-      </w:r>
-    </w:p>
-    <w:p>
-      <w:pPr>
-        <w:rPr>
-          <w:rFonts w:ascii="Arial" w:hAnsi="Arial" w:cs="Arial"/>
-          <w:i/>
-          <w:iCs/>
-        </w:rPr>
-      </w:pPr>
-      <w:r>
-        <w:rPr>
-          <w:rFonts w:ascii="Arial" w:hAnsi="Arial" w:cs="Arial"/>
-          <w:i/>
-          <w:iCs/>
-        </w:rPr>
-        <w:t>Condition Index</w:t>
-      </w:r>
-    </w:p>
-    <w:p>
-      <w:pPr>
-        <w:rPr>
-          <w:rFonts w:ascii="Arial" w:hAnsi="Arial" w:cs="Arial"/>
-        </w:rPr>
-      </w:pPr>
-      <w:r>
-        <w:rPr>
-          <w:rFonts w:ascii="Arial" w:hAnsi="Arial" w:cs="Arial"/>
-          <w:i/>
-          <w:iCs/>
-        </w:rPr>
-        <w:tab/>
-      </w:r>
-      <w:r>
-        <w:rPr>
-          <w:rFonts w:ascii="Arial" w:hAnsi="Arial" w:cs="Arial"/>
-        </w:rPr>
-        <w:t xml:space="preserve">O. </w:t>
+          <w:i/>
+          <w:iCs/>
+        </w:rPr>
+        <w:t xml:space="preserve">C. </w:t>
       </w:r>
       <w:proofErr w:type="spellStart"/>
       <w:r>
         <w:rPr>
           <w:rFonts w:ascii="Arial" w:hAnsi="Arial" w:cs="Arial"/>
-        </w:rPr>
-        <w:t>lurida</w:t>
+          <w:i/>
+          <w:iCs/>
+        </w:rPr>
+        <w:t>sikamea</w:t>
       </w:r>
       <w:proofErr w:type="spellEnd"/>
       <w:r>
@@ -513,6 +811,12 @@
         </w:rPr>
         <w:t xml:space="preserve"> – </w:t>
       </w:r>
+      <w:r>
+        <w:rPr>
+          <w:rFonts w:ascii="Arial" w:hAnsi="Arial" w:cs="Arial"/>
+        </w:rPr>
+        <w:t>x</w:t>
+      </w:r>
     </w:p>
     <w:p>
       <w:pPr>
@@ -524,37 +828,16 @@
       <w:r>
         <w:rPr>
           <w:rFonts w:ascii="Arial" w:hAnsi="Arial" w:cs="Arial"/>
-        </w:rPr>
-        <w:lastRenderedPageBreak/>
-        <w:t xml:space="preserve">C. </w:t>
-      </w:r>
-      <w:proofErr w:type="spellStart"/>
-      <w:r>
-        <w:rPr>
-          <w:rFonts w:ascii="Arial" w:hAnsi="Arial" w:cs="Arial"/>
-        </w:rPr>
-        <w:t>sikamea</w:t>
-      </w:r>
-      <w:proofErr w:type="spellEnd"/>
-      <w:r>
-        <w:rPr>
-          <w:rFonts w:ascii="Arial" w:hAnsi="Arial" w:cs="Arial"/>
-        </w:rPr>
-        <w:t xml:space="preserve"> – </w:t>
-      </w:r>
-    </w:p>
-    <w:p>
-      <w:pPr>
-        <w:ind w:firstLine="720"/>
-        <w:rPr>
-          <w:rFonts w:ascii="Arial" w:hAnsi="Arial" w:cs="Arial"/>
-        </w:rPr>
-      </w:pPr>
-      <w:r>
-        <w:rPr>
-          <w:rFonts w:ascii="Arial" w:hAnsi="Arial" w:cs="Arial"/>
-        </w:rPr>
-        <w:t>M. gigas – x</w:t>
+          <w:i/>
+          <w:iCs/>
+        </w:rPr>
+        <w:t>M. gigas</w:t>
+      </w:r>
+      <w:r>
+        <w:rPr>
+          <w:rFonts w:ascii="Arial" w:hAnsi="Arial" w:cs="Arial"/>
+        </w:rPr>
+        <w:t xml:space="preserve"> – x</w:t>
       </w:r>
     </w:p>
     <w:p>

</xml_diff>

<commit_message>
made edits to CI data for O. lurida and added text to Ch. 1 draft.
</commit_message>
<xml_diff>
--- a/writing/Chapter 1.docx
+++ b/writing/Chapter 1.docx
@@ -5004,14 +5004,35 @@
           <w:rFonts w:ascii="Arial" w:hAnsi="Arial" w:cs="Arial"/>
           <w:color w:val="7030A0"/>
         </w:rPr>
-        <w:t>˚C</w:t>
-      </w:r>
-      <w:r>
-        <w:rPr>
-          <w:rFonts w:ascii="Arial" w:hAnsi="Arial" w:cs="Arial"/>
-          <w:color w:val="7030A0"/>
-        </w:rPr>
-        <w:t xml:space="preserve"> (2</w:t>
+        <w:t>˚C (2.</w:t>
+      </w:r>
+      <w:r>
+        <w:rPr>
+          <w:rFonts w:ascii="Arial" w:hAnsi="Arial" w:cs="Arial"/>
+          <w:color w:val="7030A0"/>
+        </w:rPr>
+        <w:t>81</w:t>
+      </w:r>
+      <w:r>
+        <w:rPr>
+          <w:rFonts w:ascii="Arial" w:hAnsi="Arial" w:cs="Arial"/>
+          <w:color w:val="7030A0"/>
+        </w:rPr>
+        <w:t xml:space="preserve"> cm ± 0.0</w:t>
+      </w:r>
+      <w:r>
+        <w:rPr>
+          <w:rFonts w:ascii="Arial" w:hAnsi="Arial" w:cs="Arial"/>
+          <w:color w:val="7030A0"/>
+        </w:rPr>
+        <w:t>2</w:t>
+      </w:r>
+      <w:r>
+        <w:rPr>
+          <w:rFonts w:ascii="Arial" w:hAnsi="Arial" w:cs="Arial"/>
+          <w:color w:val="7030A0"/>
+        </w:rPr>
+        <w:t>)</w:t>
       </w:r>
       <w:r>
         <w:rPr>
@@ -5025,55 +5046,6 @@
           <w:rFonts w:ascii="Arial" w:hAnsi="Arial" w:cs="Arial"/>
           <w:color w:val="7030A0"/>
         </w:rPr>
-        <w:t>81</w:t>
-      </w:r>
-      <w:r>
-        <w:rPr>
-          <w:rFonts w:ascii="Arial" w:hAnsi="Arial" w:cs="Arial"/>
-          <w:color w:val="7030A0"/>
-        </w:rPr>
-        <w:t xml:space="preserve"> </w:t>
-      </w:r>
-      <w:r>
-        <w:rPr>
-          <w:rFonts w:ascii="Arial" w:hAnsi="Arial" w:cs="Arial"/>
-          <w:color w:val="7030A0"/>
-        </w:rPr>
-        <w:t>c</w:t>
-      </w:r>
-      <w:r>
-        <w:rPr>
-          <w:rFonts w:ascii="Arial" w:hAnsi="Arial" w:cs="Arial"/>
-          <w:color w:val="7030A0"/>
-        </w:rPr>
-        <w:t>m ± 0.0</w:t>
-      </w:r>
-      <w:r>
-        <w:rPr>
-          <w:rFonts w:ascii="Arial" w:hAnsi="Arial" w:cs="Arial"/>
-          <w:color w:val="7030A0"/>
-        </w:rPr>
-        <w:t>2</w:t>
-      </w:r>
-      <w:r>
-        <w:rPr>
-          <w:rFonts w:ascii="Arial" w:hAnsi="Arial" w:cs="Arial"/>
-          <w:color w:val="7030A0"/>
-        </w:rPr>
-        <w:t>)</w:t>
-      </w:r>
-      <w:r>
-        <w:rPr>
-          <w:rFonts w:ascii="Arial" w:hAnsi="Arial" w:cs="Arial"/>
-          <w:color w:val="7030A0"/>
-        </w:rPr>
-        <w:t>.</w:t>
-      </w:r>
-      <w:r>
-        <w:rPr>
-          <w:rFonts w:ascii="Arial" w:hAnsi="Arial" w:cs="Arial"/>
-          <w:color w:val="7030A0"/>
-        </w:rPr>
         <w:t xml:space="preserve"> And, </w:t>
       </w:r>
       <w:r>
@@ -5102,14 +5074,7 @@
           <w:rFonts w:ascii="Arial" w:hAnsi="Arial" w:cs="Arial"/>
           <w:color w:val="7030A0"/>
         </w:rPr>
-        <w:t>2</w:t>
-      </w:r>
-      <w:r>
-        <w:rPr>
-          <w:rFonts w:ascii="Arial" w:hAnsi="Arial" w:cs="Arial"/>
-          <w:color w:val="7030A0"/>
-        </w:rPr>
-        <w:t>.</w:t>
+        <w:t>2.</w:t>
       </w:r>
       <w:r>
         <w:rPr>
@@ -5123,28 +5088,7 @@
           <w:rFonts w:ascii="Arial" w:hAnsi="Arial" w:cs="Arial"/>
           <w:color w:val="7030A0"/>
         </w:rPr>
-        <w:t xml:space="preserve"> </w:t>
-      </w:r>
-      <w:r>
-        <w:rPr>
-          <w:rFonts w:ascii="Arial" w:hAnsi="Arial" w:cs="Arial"/>
-          <w:color w:val="7030A0"/>
-        </w:rPr>
-        <w:t>c</w:t>
-      </w:r>
-      <w:r>
-        <w:rPr>
-          <w:rFonts w:ascii="Arial" w:hAnsi="Arial" w:cs="Arial"/>
-          <w:color w:val="7030A0"/>
-        </w:rPr>
-        <w:t>m ± 0.0</w:t>
-      </w:r>
-      <w:r>
-        <w:rPr>
-          <w:rFonts w:ascii="Arial" w:hAnsi="Arial" w:cs="Arial"/>
-          <w:color w:val="7030A0"/>
-        </w:rPr>
-        <w:t>2</w:t>
+        <w:t xml:space="preserve"> cm ± 0.02</w:t>
       </w:r>
       <w:r>
         <w:rPr>
@@ -5172,21 +5116,7 @@
           <w:rFonts w:ascii="Arial" w:hAnsi="Arial" w:cs="Arial"/>
           <w:color w:val="7030A0"/>
         </w:rPr>
-        <w:t>2</w:t>
-      </w:r>
-      <w:r>
-        <w:rPr>
-          <w:rFonts w:ascii="Arial" w:hAnsi="Arial" w:cs="Arial"/>
-          <w:color w:val="7030A0"/>
-        </w:rPr>
-        <w:t>.</w:t>
-      </w:r>
-      <w:r>
-        <w:rPr>
-          <w:rFonts w:ascii="Arial" w:hAnsi="Arial" w:cs="Arial"/>
-          <w:color w:val="7030A0"/>
-        </w:rPr>
-        <w:t>8</w:t>
+        <w:t>2.8</w:t>
       </w:r>
       <w:r>
         <w:rPr>
@@ -5200,28 +5130,7 @@
           <w:rFonts w:ascii="Arial" w:hAnsi="Arial" w:cs="Arial"/>
           <w:color w:val="7030A0"/>
         </w:rPr>
-        <w:t xml:space="preserve"> </w:t>
-      </w:r>
-      <w:r>
-        <w:rPr>
-          <w:rFonts w:ascii="Arial" w:hAnsi="Arial" w:cs="Arial"/>
-          <w:color w:val="7030A0"/>
-        </w:rPr>
-        <w:t>c</w:t>
-      </w:r>
-      <w:r>
-        <w:rPr>
-          <w:rFonts w:ascii="Arial" w:hAnsi="Arial" w:cs="Arial"/>
-          <w:color w:val="7030A0"/>
-        </w:rPr>
-        <w:t>m ± 0.0</w:t>
-      </w:r>
-      <w:r>
-        <w:rPr>
-          <w:rFonts w:ascii="Arial" w:hAnsi="Arial" w:cs="Arial"/>
-          <w:color w:val="7030A0"/>
-        </w:rPr>
-        <w:t>2</w:t>
+        <w:t xml:space="preserve"> cm ± 0.02</w:t>
       </w:r>
       <w:r>
         <w:rPr>
@@ -5242,6 +5151,7 @@
       <w:pPr>
         <w:rPr>
           <w:rFonts w:ascii="Arial" w:hAnsi="Arial" w:cs="Arial"/>
+          <w:color w:val="7030A0"/>
         </w:rPr>
       </w:pPr>
       <w:r>
@@ -5267,10 +5177,21 @@
       <w:r>
         <w:rPr>
           <w:rFonts w:ascii="Arial" w:hAnsi="Arial" w:cs="Arial"/>
+          <w:b/>
+          <w:bCs/>
           <w:i/>
           <w:iCs/>
           <w:color w:val="7030A0"/>
         </w:rPr>
+        <w:t xml:space="preserve"> (CI)</w:t>
+      </w:r>
+      <w:r>
+        <w:rPr>
+          <w:rFonts w:ascii="Arial" w:hAnsi="Arial" w:cs="Arial"/>
+          <w:i/>
+          <w:iCs/>
+          <w:color w:val="7030A0"/>
+        </w:rPr>
         <w:t xml:space="preserve"> </w:t>
       </w:r>
       <w:r>
@@ -5278,14 +5199,14 @@
           <w:rFonts w:ascii="Arial" w:hAnsi="Arial" w:cs="Arial"/>
           <w:color w:val="7030A0"/>
         </w:rPr>
-        <w:t>-- X</w:t>
+        <w:t xml:space="preserve">-- </w:t>
       </w:r>
     </w:p>
     <w:p>
       <w:pPr>
-        <w:ind w:left="720"/>
-        <w:rPr>
-          <w:rFonts w:ascii="Arial" w:hAnsi="Arial" w:cs="Arial"/>
+        <w:rPr>
+          <w:rFonts w:ascii="Arial" w:hAnsi="Arial" w:cs="Arial"/>
+          <w:color w:val="7030A0"/>
         </w:rPr>
       </w:pPr>
       <w:r>
@@ -5293,28 +5214,1111 @@
           <w:rFonts w:ascii="Arial" w:hAnsi="Arial" w:cs="Arial"/>
           <w:i/>
           <w:iCs/>
+          <w:color w:val="7030A0"/>
         </w:rPr>
         <w:tab/>
+      </w:r>
+      <w:r>
+        <w:rPr>
+          <w:rFonts w:ascii="Arial" w:hAnsi="Arial" w:cs="Arial"/>
+          <w:color w:val="7030A0"/>
+        </w:rPr>
+        <w:t>Stress hardening</w:t>
+      </w:r>
+      <w:r>
+        <w:rPr>
+          <w:rFonts w:ascii="Arial" w:hAnsi="Arial" w:cs="Arial"/>
+          <w:color w:val="7030A0"/>
+        </w:rPr>
+        <w:t xml:space="preserve"> temperature </w:t>
+      </w:r>
+      <w:r>
+        <w:rPr>
+          <w:rFonts w:ascii="Arial" w:hAnsi="Arial" w:cs="Arial"/>
+          <w:color w:val="7030A0"/>
+        </w:rPr>
+        <w:t>(</w:t>
       </w:r>
       <w:r>
         <w:rPr>
           <w:rFonts w:ascii="Arial" w:hAnsi="Arial" w:cs="Arial"/>
           <w:i/>
           <w:iCs/>
+          <w:color w:val="7030A0"/>
+        </w:rPr>
+        <w:t>P</w:t>
+      </w:r>
+      <w:r>
+        <w:rPr>
+          <w:rFonts w:ascii="Arial" w:hAnsi="Arial" w:cs="Arial"/>
+          <w:color w:val="7030A0"/>
+        </w:rPr>
+        <w:t xml:space="preserve"> </w:t>
+      </w:r>
+      <w:r>
+        <w:rPr>
+          <w:rFonts w:ascii="Arial" w:hAnsi="Arial" w:cs="Arial"/>
+          <w:color w:val="7030A0"/>
+        </w:rPr>
+        <w:t>=</w:t>
+      </w:r>
+      <w:r>
+        <w:rPr>
+          <w:rFonts w:ascii="Arial" w:hAnsi="Arial" w:cs="Arial"/>
+          <w:color w:val="7030A0"/>
+        </w:rPr>
+        <w:t xml:space="preserve"> 0.0</w:t>
+      </w:r>
+      <w:r>
+        <w:rPr>
+          <w:rFonts w:ascii="Arial" w:hAnsi="Arial" w:cs="Arial"/>
+          <w:color w:val="7030A0"/>
+        </w:rPr>
+        <w:t xml:space="preserve">12, </w:t>
+      </w:r>
+      <w:r>
+        <w:rPr>
+          <w:rFonts w:ascii="Arial" w:hAnsi="Arial" w:cs="Arial"/>
+          <w:color w:val="7030A0"/>
+        </w:rPr>
+        <w:t xml:space="preserve">Table </w:t>
+      </w:r>
+      <w:r>
+        <w:rPr>
+          <w:rFonts w:ascii="Arial" w:hAnsi="Arial" w:cs="Arial"/>
+          <w:b/>
+          <w:bCs/>
+          <w:color w:val="7030A0"/>
+        </w:rPr>
+        <w:t>GROWTH</w:t>
+      </w:r>
+      <w:r>
+        <w:rPr>
+          <w:rFonts w:ascii="Arial" w:hAnsi="Arial" w:cs="Arial"/>
+          <w:color w:val="7030A0"/>
+        </w:rPr>
+        <w:t>)</w:t>
+      </w:r>
+      <w:r>
+        <w:rPr>
+          <w:rFonts w:ascii="Arial" w:hAnsi="Arial" w:cs="Arial"/>
+          <w:color w:val="7030A0"/>
+        </w:rPr>
+        <w:t xml:space="preserve"> influenced</w:t>
+      </w:r>
+      <w:r>
+        <w:rPr>
+          <w:rFonts w:ascii="Arial" w:hAnsi="Arial" w:cs="Arial"/>
+          <w:color w:val="7030A0"/>
+        </w:rPr>
+        <w:t xml:space="preserve"> </w:t>
+      </w:r>
+      <w:r>
+        <w:rPr>
+          <w:rFonts w:ascii="Arial" w:hAnsi="Arial" w:cs="Arial"/>
+          <w:i/>
+          <w:iCs/>
+          <w:color w:val="7030A0"/>
         </w:rPr>
         <w:t>O. lurida</w:t>
       </w:r>
       <w:r>
         <w:rPr>
           <w:rFonts w:ascii="Arial" w:hAnsi="Arial" w:cs="Arial"/>
-        </w:rPr>
-        <w:t xml:space="preserve"> – </w:t>
-      </w:r>
-      <w:r>
-        <w:rPr>
-          <w:rFonts w:ascii="Arial" w:hAnsi="Arial" w:cs="Arial"/>
-        </w:rPr>
-        <w:t>x</w:t>
+          <w:color w:val="7030A0"/>
+        </w:rPr>
+        <w:t xml:space="preserve"> </w:t>
+      </w:r>
+      <w:r>
+        <w:rPr>
+          <w:rFonts w:ascii="Arial" w:hAnsi="Arial" w:cs="Arial"/>
+          <w:color w:val="7030A0"/>
+        </w:rPr>
+        <w:t>CI</w:t>
+      </w:r>
+      <w:r>
+        <w:rPr>
+          <w:rFonts w:ascii="Arial" w:hAnsi="Arial" w:cs="Arial"/>
+          <w:color w:val="7030A0"/>
+        </w:rPr>
+        <w:t xml:space="preserve">, whereas tide and marine heatwave temperature did not </w:t>
+      </w:r>
+      <w:r>
+        <w:rPr>
+          <w:rFonts w:ascii="Arial" w:hAnsi="Arial" w:cs="Arial"/>
+          <w:color w:val="7030A0"/>
+        </w:rPr>
+        <w:t>(</w:t>
+      </w:r>
+      <w:r>
+        <w:rPr>
+          <w:rFonts w:ascii="Arial" w:hAnsi="Arial" w:cs="Arial"/>
+          <w:i/>
+          <w:iCs/>
+          <w:color w:val="7030A0"/>
+        </w:rPr>
+        <w:t>P</w:t>
+      </w:r>
+      <w:r>
+        <w:rPr>
+          <w:rFonts w:ascii="Arial" w:hAnsi="Arial" w:cs="Arial"/>
+          <w:color w:val="7030A0"/>
+        </w:rPr>
+        <w:t xml:space="preserve"> </w:t>
+      </w:r>
+      <w:r>
+        <w:rPr>
+          <w:rFonts w:ascii="Arial" w:hAnsi="Arial" w:cs="Arial"/>
+          <w:color w:val="7030A0"/>
+        </w:rPr>
+        <w:t>&gt;</w:t>
+      </w:r>
+      <w:r>
+        <w:rPr>
+          <w:rFonts w:ascii="Arial" w:hAnsi="Arial" w:cs="Arial"/>
+          <w:color w:val="7030A0"/>
+        </w:rPr>
+        <w:t xml:space="preserve"> 0.0</w:t>
+      </w:r>
+      <w:r>
+        <w:rPr>
+          <w:rFonts w:ascii="Arial" w:hAnsi="Arial" w:cs="Arial"/>
+          <w:color w:val="7030A0"/>
+        </w:rPr>
+        <w:t xml:space="preserve">5, </w:t>
+      </w:r>
+      <w:r>
+        <w:rPr>
+          <w:rFonts w:ascii="Arial" w:hAnsi="Arial" w:cs="Arial"/>
+          <w:color w:val="7030A0"/>
+        </w:rPr>
+        <w:t xml:space="preserve">Table </w:t>
+      </w:r>
+      <w:r>
+        <w:rPr>
+          <w:rFonts w:ascii="Arial" w:hAnsi="Arial" w:cs="Arial"/>
+          <w:b/>
+          <w:bCs/>
+          <w:color w:val="7030A0"/>
+        </w:rPr>
+        <w:t>GROWTH</w:t>
+      </w:r>
+      <w:r>
+        <w:rPr>
+          <w:rFonts w:ascii="Arial" w:hAnsi="Arial" w:cs="Arial"/>
+          <w:color w:val="7030A0"/>
+        </w:rPr>
+        <w:t>)</w:t>
+      </w:r>
+      <w:r>
+        <w:rPr>
+          <w:rFonts w:ascii="Arial" w:hAnsi="Arial" w:cs="Arial"/>
+          <w:color w:val="7030A0"/>
+        </w:rPr>
+        <w:t xml:space="preserve">, condition index being </w:t>
+      </w:r>
+      <w:r>
+        <w:rPr>
+          <w:rFonts w:ascii="Arial" w:hAnsi="Arial" w:cs="Arial"/>
+          <w:color w:val="7030A0"/>
+        </w:rPr>
+        <w:t>6</w:t>
+      </w:r>
+      <w:r>
+        <w:rPr>
+          <w:rFonts w:ascii="Arial" w:hAnsi="Arial" w:cs="Arial"/>
+          <w:color w:val="7030A0"/>
+        </w:rPr>
+        <w:t>.5</w:t>
+      </w:r>
+      <w:r>
+        <w:rPr>
+          <w:rFonts w:ascii="Arial" w:hAnsi="Arial" w:cs="Arial"/>
+          <w:color w:val="7030A0"/>
+        </w:rPr>
+        <w:t xml:space="preserve">% higher for oysters hardened at </w:t>
+      </w:r>
+      <w:r>
+        <w:rPr>
+          <w:rFonts w:ascii="Arial" w:hAnsi="Arial" w:cs="Arial"/>
+          <w:color w:val="7030A0"/>
+        </w:rPr>
+        <w:t>1</w:t>
+      </w:r>
+      <w:r>
+        <w:rPr>
+          <w:rFonts w:ascii="Arial" w:hAnsi="Arial" w:cs="Arial"/>
+          <w:color w:val="7030A0"/>
+        </w:rPr>
+        <w:t>5</w:t>
+      </w:r>
+      <w:r>
+        <w:rPr>
+          <w:rFonts w:ascii="Arial" w:hAnsi="Arial" w:cs="Arial"/>
+          <w:color w:val="7030A0"/>
+        </w:rPr>
+        <w:t>˚C</w:t>
+      </w:r>
+      <w:r>
+        <w:rPr>
+          <w:rFonts w:ascii="Arial" w:hAnsi="Arial" w:cs="Arial"/>
+          <w:color w:val="7030A0"/>
+        </w:rPr>
+        <w:t xml:space="preserve"> (</w:t>
+      </w:r>
+      <w:r>
+        <w:rPr>
+          <w:rFonts w:ascii="Arial" w:hAnsi="Arial" w:cs="Arial"/>
+          <w:color w:val="7030A0"/>
+        </w:rPr>
+        <w:t>7.51</w:t>
+      </w:r>
+      <w:r>
+        <w:rPr>
+          <w:rFonts w:ascii="Arial" w:hAnsi="Arial" w:cs="Arial"/>
+          <w:color w:val="7030A0"/>
+        </w:rPr>
+        <w:t xml:space="preserve"> </w:t>
+      </w:r>
+      <w:r>
+        <w:rPr>
+          <w:rFonts w:ascii="Arial" w:hAnsi="Arial" w:cs="Arial"/>
+          <w:color w:val="7030A0"/>
+        </w:rPr>
+        <w:t>±</w:t>
+      </w:r>
+      <w:r>
+        <w:rPr>
+          <w:rFonts w:ascii="Arial" w:hAnsi="Arial" w:cs="Arial"/>
+          <w:color w:val="7030A0"/>
+        </w:rPr>
+        <w:t xml:space="preserve"> 0.</w:t>
+      </w:r>
+      <w:r>
+        <w:rPr>
+          <w:rFonts w:ascii="Arial" w:hAnsi="Arial" w:cs="Arial"/>
+          <w:color w:val="7030A0"/>
+        </w:rPr>
+        <w:t>21</w:t>
+      </w:r>
+      <w:r>
+        <w:rPr>
+          <w:rFonts w:ascii="Arial" w:hAnsi="Arial" w:cs="Arial"/>
+          <w:color w:val="7030A0"/>
+        </w:rPr>
+        <w:t>)</w:t>
+      </w:r>
+      <w:r>
+        <w:rPr>
+          <w:rFonts w:ascii="Arial" w:hAnsi="Arial" w:cs="Arial"/>
+          <w:color w:val="7030A0"/>
+        </w:rPr>
+        <w:t xml:space="preserve"> </w:t>
+      </w:r>
+      <w:r>
+        <w:rPr>
+          <w:rFonts w:ascii="Arial" w:hAnsi="Arial" w:cs="Arial"/>
+          <w:color w:val="7030A0"/>
+        </w:rPr>
+        <w:t>compared to those at</w:t>
+      </w:r>
+      <w:r>
+        <w:rPr>
+          <w:rFonts w:ascii="Arial" w:hAnsi="Arial" w:cs="Arial"/>
+          <w:color w:val="7030A0"/>
+        </w:rPr>
+        <w:t xml:space="preserve"> 21</w:t>
+      </w:r>
+      <w:r>
+        <w:rPr>
+          <w:rFonts w:ascii="Arial" w:hAnsi="Arial" w:cs="Arial"/>
+          <w:color w:val="7030A0"/>
+        </w:rPr>
+        <w:t>˚C</w:t>
+      </w:r>
+      <w:r>
+        <w:rPr>
+          <w:rFonts w:ascii="Arial" w:hAnsi="Arial" w:cs="Arial"/>
+          <w:color w:val="7030A0"/>
+        </w:rPr>
+        <w:t xml:space="preserve"> (</w:t>
+      </w:r>
+      <w:r>
+        <w:rPr>
+          <w:rFonts w:ascii="Arial" w:hAnsi="Arial" w:cs="Arial"/>
+          <w:color w:val="7030A0"/>
+        </w:rPr>
+        <w:t>7.02</w:t>
+      </w:r>
+      <w:r>
+        <w:rPr>
+          <w:rFonts w:ascii="Arial" w:hAnsi="Arial" w:cs="Arial"/>
+          <w:color w:val="7030A0"/>
+        </w:rPr>
+        <w:t xml:space="preserve"> mg </w:t>
+      </w:r>
+      <w:r>
+        <w:rPr>
+          <w:rFonts w:ascii="Arial" w:hAnsi="Arial" w:cs="Arial"/>
+          <w:color w:val="7030A0"/>
+        </w:rPr>
+        <w:t>±</w:t>
+      </w:r>
+      <w:r>
+        <w:rPr>
+          <w:rFonts w:ascii="Arial" w:hAnsi="Arial" w:cs="Arial"/>
+          <w:color w:val="7030A0"/>
+        </w:rPr>
+        <w:t xml:space="preserve"> 0.</w:t>
+      </w:r>
+      <w:r>
+        <w:rPr>
+          <w:rFonts w:ascii="Arial" w:hAnsi="Arial" w:cs="Arial"/>
+          <w:color w:val="7030A0"/>
+        </w:rPr>
+        <w:t>21</w:t>
+      </w:r>
+      <w:r>
+        <w:rPr>
+          <w:rFonts w:ascii="Arial" w:hAnsi="Arial" w:cs="Arial"/>
+          <w:color w:val="7030A0"/>
+        </w:rPr>
+        <w:t>).</w:t>
+      </w:r>
+      <w:r>
+        <w:rPr>
+          <w:rFonts w:ascii="Arial" w:hAnsi="Arial" w:cs="Arial"/>
+          <w:color w:val="7030A0"/>
+        </w:rPr>
+        <w:t xml:space="preserve"> </w:t>
+      </w:r>
+      <w:r>
+        <w:rPr>
+          <w:rFonts w:ascii="Arial" w:hAnsi="Arial" w:cs="Arial"/>
+          <w:color w:val="7030A0"/>
+        </w:rPr>
+        <w:t xml:space="preserve">However, stress hardening and marine heatwave temperature did interact </w:t>
+      </w:r>
+      <w:r>
+        <w:rPr>
+          <w:rFonts w:ascii="Arial" w:hAnsi="Arial" w:cs="Arial"/>
+          <w:color w:val="7030A0"/>
+        </w:rPr>
+        <w:t>(</w:t>
+      </w:r>
+      <w:r>
+        <w:rPr>
+          <w:rFonts w:ascii="Arial" w:hAnsi="Arial" w:cs="Arial"/>
+          <w:i/>
+          <w:iCs/>
+          <w:color w:val="7030A0"/>
+        </w:rPr>
+        <w:t>P</w:t>
+      </w:r>
+      <w:r>
+        <w:rPr>
+          <w:rFonts w:ascii="Arial" w:hAnsi="Arial" w:cs="Arial"/>
+          <w:color w:val="7030A0"/>
+        </w:rPr>
+        <w:t xml:space="preserve"> </w:t>
+      </w:r>
+      <w:r>
+        <w:rPr>
+          <w:rFonts w:ascii="Arial" w:hAnsi="Arial" w:cs="Arial"/>
+          <w:color w:val="7030A0"/>
+        </w:rPr>
+        <w:t>=</w:t>
+      </w:r>
+      <w:r>
+        <w:rPr>
+          <w:rFonts w:ascii="Arial" w:hAnsi="Arial" w:cs="Arial"/>
+          <w:color w:val="7030A0"/>
+        </w:rPr>
+        <w:t xml:space="preserve"> 0.0</w:t>
+      </w:r>
+      <w:r>
+        <w:rPr>
+          <w:rFonts w:ascii="Arial" w:hAnsi="Arial" w:cs="Arial"/>
+          <w:color w:val="7030A0"/>
+        </w:rPr>
+        <w:t>2</w:t>
+      </w:r>
+      <w:r>
+        <w:rPr>
+          <w:rFonts w:ascii="Arial" w:hAnsi="Arial" w:cs="Arial"/>
+          <w:color w:val="7030A0"/>
+        </w:rPr>
+        <w:t xml:space="preserve">, </w:t>
+      </w:r>
+      <w:r>
+        <w:rPr>
+          <w:rFonts w:ascii="Arial" w:hAnsi="Arial" w:cs="Arial"/>
+          <w:color w:val="7030A0"/>
+        </w:rPr>
+        <w:t xml:space="preserve">Table </w:t>
+      </w:r>
+      <w:r>
+        <w:rPr>
+          <w:rFonts w:ascii="Arial" w:hAnsi="Arial" w:cs="Arial"/>
+          <w:b/>
+          <w:bCs/>
+          <w:color w:val="7030A0"/>
+        </w:rPr>
+        <w:t>GROWTH</w:t>
+      </w:r>
+      <w:r>
+        <w:rPr>
+          <w:rFonts w:ascii="Arial" w:hAnsi="Arial" w:cs="Arial"/>
+          <w:color w:val="7030A0"/>
+        </w:rPr>
+        <w:t>). A</w:t>
+      </w:r>
+      <w:r>
+        <w:rPr>
+          <w:rFonts w:ascii="Arial" w:hAnsi="Arial" w:cs="Arial"/>
+          <w:color w:val="7030A0"/>
+        </w:rPr>
+        <w:t>nd, a</w:t>
+      </w:r>
+      <w:r>
+        <w:rPr>
+          <w:rFonts w:ascii="Arial" w:hAnsi="Arial" w:cs="Arial"/>
+          <w:color w:val="7030A0"/>
+        </w:rPr>
+        <w:t xml:space="preserve"> pairwise comparison further demonstrated that </w:t>
+      </w:r>
+      <w:r>
+        <w:rPr>
+          <w:rFonts w:ascii="Arial" w:hAnsi="Arial" w:cs="Arial"/>
+          <w:color w:val="7030A0"/>
+        </w:rPr>
+        <w:t xml:space="preserve">CI for oysters that experienced the </w:t>
+      </w:r>
+      <w:r>
+        <w:rPr>
+          <w:rFonts w:ascii="Arial" w:hAnsi="Arial" w:cs="Arial"/>
+          <w:color w:val="7030A0"/>
+        </w:rPr>
+        <w:t>1</w:t>
+      </w:r>
+      <w:r>
+        <w:rPr>
+          <w:rFonts w:ascii="Arial" w:hAnsi="Arial" w:cs="Arial"/>
+          <w:color w:val="7030A0"/>
+        </w:rPr>
+        <w:t>5</w:t>
+      </w:r>
+      <w:r>
+        <w:rPr>
+          <w:rFonts w:ascii="Arial" w:hAnsi="Arial" w:cs="Arial"/>
+          <w:color w:val="7030A0"/>
+        </w:rPr>
+        <w:t>˚C</w:t>
+      </w:r>
+      <w:r>
+        <w:rPr>
+          <w:rFonts w:ascii="Arial" w:hAnsi="Arial" w:cs="Arial"/>
+          <w:color w:val="7030A0"/>
+        </w:rPr>
+        <w:t xml:space="preserve"> stress hardening treatment</w:t>
+      </w:r>
+      <w:r>
+        <w:rPr>
+          <w:rFonts w:ascii="Arial" w:hAnsi="Arial" w:cs="Arial"/>
+          <w:color w:val="7030A0"/>
+        </w:rPr>
+        <w:t xml:space="preserve"> </w:t>
+      </w:r>
+      <w:r>
+        <w:rPr>
+          <w:rFonts w:ascii="Arial" w:hAnsi="Arial" w:cs="Arial"/>
+          <w:color w:val="7030A0"/>
+        </w:rPr>
+        <w:t>(</w:t>
+      </w:r>
+      <w:r>
+        <w:rPr>
+          <w:rFonts w:ascii="Arial" w:hAnsi="Arial" w:cs="Arial"/>
+          <w:color w:val="7030A0"/>
+        </w:rPr>
+        <w:t>6</w:t>
+      </w:r>
+      <w:r>
+        <w:rPr>
+          <w:rFonts w:ascii="Arial" w:hAnsi="Arial" w:cs="Arial"/>
+          <w:color w:val="7030A0"/>
+        </w:rPr>
+        <w:t>.</w:t>
+      </w:r>
+      <w:r>
+        <w:rPr>
+          <w:rFonts w:ascii="Arial" w:hAnsi="Arial" w:cs="Arial"/>
+          <w:color w:val="7030A0"/>
+        </w:rPr>
+        <w:t>7</w:t>
+      </w:r>
+      <w:r>
+        <w:rPr>
+          <w:rFonts w:ascii="Arial" w:hAnsi="Arial" w:cs="Arial"/>
+          <w:color w:val="7030A0"/>
+        </w:rPr>
+        <w:t xml:space="preserve">1 </w:t>
+      </w:r>
+      <w:r>
+        <w:rPr>
+          <w:rFonts w:ascii="Arial" w:hAnsi="Arial" w:cs="Arial"/>
+          <w:color w:val="7030A0"/>
+        </w:rPr>
+        <w:t>±</w:t>
+      </w:r>
+      <w:r>
+        <w:rPr>
+          <w:rFonts w:ascii="Arial" w:hAnsi="Arial" w:cs="Arial"/>
+          <w:color w:val="7030A0"/>
+        </w:rPr>
+        <w:t xml:space="preserve"> 0.</w:t>
+      </w:r>
+      <w:r>
+        <w:rPr>
+          <w:rFonts w:ascii="Arial" w:hAnsi="Arial" w:cs="Arial"/>
+          <w:color w:val="7030A0"/>
+        </w:rPr>
+        <w:t>34</w:t>
+      </w:r>
+      <w:r>
+        <w:rPr>
+          <w:rFonts w:ascii="Arial" w:hAnsi="Arial" w:cs="Arial"/>
+          <w:color w:val="7030A0"/>
+        </w:rPr>
+        <w:t>)</w:t>
+      </w:r>
+      <w:r>
+        <w:rPr>
+          <w:rFonts w:ascii="Arial" w:hAnsi="Arial" w:cs="Arial"/>
+          <w:color w:val="7030A0"/>
+        </w:rPr>
+        <w:t xml:space="preserve"> had </w:t>
+      </w:r>
+      <w:r>
+        <w:rPr>
+          <w:rFonts w:ascii="Arial" w:hAnsi="Arial" w:cs="Arial"/>
+          <w:color w:val="7030A0"/>
+        </w:rPr>
+        <w:t>15</w:t>
+      </w:r>
+      <w:r>
+        <w:rPr>
+          <w:rFonts w:ascii="Arial" w:hAnsi="Arial" w:cs="Arial"/>
+          <w:color w:val="7030A0"/>
+        </w:rPr>
+        <w:t xml:space="preserve">% </w:t>
+      </w:r>
+      <w:r>
+        <w:rPr>
+          <w:rFonts w:ascii="Arial" w:hAnsi="Arial" w:cs="Arial"/>
+          <w:color w:val="7030A0"/>
+        </w:rPr>
+        <w:t>high</w:t>
+      </w:r>
+      <w:r>
+        <w:rPr>
+          <w:rFonts w:ascii="Arial" w:hAnsi="Arial" w:cs="Arial"/>
+          <w:color w:val="7030A0"/>
+        </w:rPr>
+        <w:t>er CI than those that experience</w:t>
+      </w:r>
+      <w:r>
+        <w:rPr>
+          <w:rFonts w:ascii="Arial" w:hAnsi="Arial" w:cs="Arial"/>
+          <w:color w:val="7030A0"/>
+        </w:rPr>
+        <w:t>d</w:t>
+      </w:r>
+      <w:r>
+        <w:rPr>
+          <w:rFonts w:ascii="Arial" w:hAnsi="Arial" w:cs="Arial"/>
+          <w:color w:val="7030A0"/>
+        </w:rPr>
+        <w:t xml:space="preserve"> 2</w:t>
+      </w:r>
+      <w:r>
+        <w:rPr>
+          <w:rFonts w:ascii="Arial" w:hAnsi="Arial" w:cs="Arial"/>
+          <w:color w:val="7030A0"/>
+        </w:rPr>
+        <w:t>1˚C</w:t>
+      </w:r>
+      <w:r>
+        <w:rPr>
+          <w:rFonts w:ascii="Arial" w:hAnsi="Arial" w:cs="Arial"/>
+          <w:color w:val="7030A0"/>
+        </w:rPr>
+        <w:t xml:space="preserve"> </w:t>
+      </w:r>
+      <w:r>
+        <w:rPr>
+          <w:rFonts w:ascii="Arial" w:hAnsi="Arial" w:cs="Arial"/>
+          <w:color w:val="7030A0"/>
+        </w:rPr>
+        <w:t>(</w:t>
+      </w:r>
+      <w:r>
+        <w:rPr>
+          <w:rFonts w:ascii="Arial" w:hAnsi="Arial" w:cs="Arial"/>
+          <w:color w:val="7030A0"/>
+        </w:rPr>
+        <w:t>5</w:t>
+      </w:r>
+      <w:r>
+        <w:rPr>
+          <w:rFonts w:ascii="Arial" w:hAnsi="Arial" w:cs="Arial"/>
+          <w:color w:val="7030A0"/>
+        </w:rPr>
+        <w:t>.</w:t>
+      </w:r>
+      <w:r>
+        <w:rPr>
+          <w:rFonts w:ascii="Arial" w:hAnsi="Arial" w:cs="Arial"/>
+          <w:color w:val="7030A0"/>
+        </w:rPr>
+        <w:t>67</w:t>
+      </w:r>
+      <w:r>
+        <w:rPr>
+          <w:rFonts w:ascii="Arial" w:hAnsi="Arial" w:cs="Arial"/>
+          <w:color w:val="7030A0"/>
+        </w:rPr>
+        <w:t xml:space="preserve"> </w:t>
+      </w:r>
+      <w:r>
+        <w:rPr>
+          <w:rFonts w:ascii="Arial" w:hAnsi="Arial" w:cs="Arial"/>
+          <w:color w:val="7030A0"/>
+        </w:rPr>
+        <w:t>±</w:t>
+      </w:r>
+      <w:r>
+        <w:rPr>
+          <w:rFonts w:ascii="Arial" w:hAnsi="Arial" w:cs="Arial"/>
+          <w:color w:val="7030A0"/>
+        </w:rPr>
+        <w:t xml:space="preserve"> 0.</w:t>
+      </w:r>
+      <w:r>
+        <w:rPr>
+          <w:rFonts w:ascii="Arial" w:hAnsi="Arial" w:cs="Arial"/>
+          <w:color w:val="7030A0"/>
+        </w:rPr>
+        <w:t>26</w:t>
+      </w:r>
+      <w:r>
+        <w:rPr>
+          <w:rFonts w:ascii="Arial" w:hAnsi="Arial" w:cs="Arial"/>
+          <w:color w:val="7030A0"/>
+        </w:rPr>
+        <w:t>)</w:t>
+      </w:r>
+      <w:r>
+        <w:rPr>
+          <w:rFonts w:ascii="Arial" w:hAnsi="Arial" w:cs="Arial"/>
+          <w:color w:val="7030A0"/>
+        </w:rPr>
+        <w:t xml:space="preserve"> before the</w:t>
+      </w:r>
+      <w:r>
+        <w:rPr>
+          <w:rFonts w:ascii="Arial" w:hAnsi="Arial" w:cs="Arial"/>
+          <w:color w:val="7030A0"/>
+        </w:rPr>
+        <w:t xml:space="preserve"> </w:t>
+      </w:r>
+      <w:r>
+        <w:rPr>
+          <w:rFonts w:ascii="Arial" w:hAnsi="Arial" w:cs="Arial"/>
+          <w:color w:val="7030A0"/>
+        </w:rPr>
+        <w:t>1</w:t>
+      </w:r>
+      <w:r>
+        <w:rPr>
+          <w:rFonts w:ascii="Arial" w:hAnsi="Arial" w:cs="Arial"/>
+          <w:color w:val="7030A0"/>
+        </w:rPr>
+        <w:t>5</w:t>
+      </w:r>
+      <w:r>
+        <w:rPr>
+          <w:rFonts w:ascii="Arial" w:hAnsi="Arial" w:cs="Arial"/>
+          <w:color w:val="7030A0"/>
+        </w:rPr>
+        <w:t>˚C</w:t>
+      </w:r>
+      <w:r>
+        <w:rPr>
+          <w:rFonts w:ascii="Arial" w:hAnsi="Arial" w:cs="Arial"/>
+          <w:color w:val="7030A0"/>
+        </w:rPr>
+        <w:t xml:space="preserve"> marine heatwave</w:t>
+      </w:r>
+      <w:r>
+        <w:rPr>
+          <w:rFonts w:ascii="Arial" w:hAnsi="Arial" w:cs="Arial"/>
+          <w:color w:val="7030A0"/>
+        </w:rPr>
+        <w:t xml:space="preserve"> </w:t>
+      </w:r>
+      <w:r>
+        <w:rPr>
+          <w:rFonts w:ascii="Arial" w:hAnsi="Arial" w:cs="Arial"/>
+          <w:color w:val="7030A0"/>
+        </w:rPr>
+        <w:t>(</w:t>
+      </w:r>
+      <w:r>
+        <w:rPr>
+          <w:rFonts w:ascii="Arial" w:hAnsi="Arial" w:cs="Arial"/>
+          <w:i/>
+          <w:iCs/>
+          <w:color w:val="7030A0"/>
+        </w:rPr>
+        <w:t>P</w:t>
+      </w:r>
+      <w:r>
+        <w:rPr>
+          <w:rFonts w:ascii="Arial" w:hAnsi="Arial" w:cs="Arial"/>
+          <w:color w:val="7030A0"/>
+        </w:rPr>
+        <w:t xml:space="preserve"> </w:t>
+      </w:r>
+      <w:r>
+        <w:rPr>
+          <w:rFonts w:ascii="Arial" w:hAnsi="Arial" w:cs="Arial"/>
+          <w:color w:val="7030A0"/>
+        </w:rPr>
+        <w:t>=</w:t>
+      </w:r>
+      <w:r>
+        <w:rPr>
+          <w:rFonts w:ascii="Arial" w:hAnsi="Arial" w:cs="Arial"/>
+          <w:color w:val="7030A0"/>
+        </w:rPr>
+        <w:t xml:space="preserve"> 0.0</w:t>
+      </w:r>
+      <w:r>
+        <w:rPr>
+          <w:rFonts w:ascii="Arial" w:hAnsi="Arial" w:cs="Arial"/>
+          <w:color w:val="7030A0"/>
+        </w:rPr>
+        <w:t xml:space="preserve">12, </w:t>
+      </w:r>
+      <w:r>
+        <w:rPr>
+          <w:rFonts w:ascii="Arial" w:hAnsi="Arial" w:cs="Arial"/>
+          <w:color w:val="7030A0"/>
+        </w:rPr>
+        <w:t xml:space="preserve">Table </w:t>
+      </w:r>
+      <w:r>
+        <w:rPr>
+          <w:rFonts w:ascii="Arial" w:hAnsi="Arial" w:cs="Arial"/>
+          <w:b/>
+          <w:bCs/>
+          <w:color w:val="7030A0"/>
+        </w:rPr>
+        <w:t>GROWTH</w:t>
+      </w:r>
+      <w:r>
+        <w:rPr>
+          <w:rFonts w:ascii="Arial" w:hAnsi="Arial" w:cs="Arial"/>
+          <w:b/>
+          <w:bCs/>
+          <w:color w:val="7030A0"/>
+        </w:rPr>
+        <w:t xml:space="preserve"> PAIRWISE</w:t>
+      </w:r>
+      <w:r>
+        <w:rPr>
+          <w:rFonts w:ascii="Arial" w:hAnsi="Arial" w:cs="Arial"/>
+          <w:color w:val="7030A0"/>
+        </w:rPr>
+        <w:t>)</w:t>
+      </w:r>
+      <w:r>
+        <w:rPr>
+          <w:rFonts w:ascii="Arial" w:hAnsi="Arial" w:cs="Arial"/>
+          <w:color w:val="7030A0"/>
+        </w:rPr>
+        <w:t xml:space="preserve">. Similarly, for oysters in the </w:t>
+      </w:r>
+      <w:r>
+        <w:rPr>
+          <w:rFonts w:ascii="Arial" w:hAnsi="Arial" w:cs="Arial"/>
+          <w:color w:val="7030A0"/>
+        </w:rPr>
+        <w:t>1</w:t>
+      </w:r>
+      <w:r>
+        <w:rPr>
+          <w:rFonts w:ascii="Arial" w:hAnsi="Arial" w:cs="Arial"/>
+          <w:color w:val="7030A0"/>
+        </w:rPr>
+        <w:t>8</w:t>
+      </w:r>
+      <w:r>
+        <w:rPr>
+          <w:rFonts w:ascii="Arial" w:hAnsi="Arial" w:cs="Arial"/>
+          <w:color w:val="7030A0"/>
+        </w:rPr>
+        <w:t>˚C</w:t>
+      </w:r>
+      <w:r>
+        <w:rPr>
+          <w:rFonts w:ascii="Arial" w:hAnsi="Arial" w:cs="Arial"/>
+          <w:color w:val="7030A0"/>
+        </w:rPr>
+        <w:t xml:space="preserve"> marine heatwave</w:t>
+      </w:r>
+      <w:r>
+        <w:rPr>
+          <w:rFonts w:ascii="Arial" w:hAnsi="Arial" w:cs="Arial"/>
+          <w:color w:val="7030A0"/>
+        </w:rPr>
+        <w:t xml:space="preserve"> (</w:t>
+      </w:r>
+      <w:r>
+        <w:rPr>
+          <w:rFonts w:ascii="Arial" w:hAnsi="Arial" w:cs="Arial"/>
+          <w:i/>
+          <w:iCs/>
+          <w:color w:val="7030A0"/>
+        </w:rPr>
+        <w:t>P</w:t>
+      </w:r>
+      <w:r>
+        <w:rPr>
+          <w:rFonts w:ascii="Arial" w:hAnsi="Arial" w:cs="Arial"/>
+          <w:color w:val="7030A0"/>
+        </w:rPr>
+        <w:t xml:space="preserve"> </w:t>
+      </w:r>
+      <w:r>
+        <w:rPr>
+          <w:rFonts w:ascii="Arial" w:hAnsi="Arial" w:cs="Arial"/>
+          <w:color w:val="7030A0"/>
+        </w:rPr>
+        <w:t>=</w:t>
+      </w:r>
+      <w:r>
+        <w:rPr>
+          <w:rFonts w:ascii="Arial" w:hAnsi="Arial" w:cs="Arial"/>
+          <w:color w:val="7030A0"/>
+        </w:rPr>
+        <w:t xml:space="preserve"> 0.0</w:t>
+      </w:r>
+      <w:r>
+        <w:rPr>
+          <w:rFonts w:ascii="Arial" w:hAnsi="Arial" w:cs="Arial"/>
+          <w:color w:val="7030A0"/>
+        </w:rPr>
+        <w:t xml:space="preserve">12, </w:t>
+      </w:r>
+      <w:r>
+        <w:rPr>
+          <w:rFonts w:ascii="Arial" w:hAnsi="Arial" w:cs="Arial"/>
+          <w:color w:val="7030A0"/>
+        </w:rPr>
+        <w:t xml:space="preserve">Table </w:t>
+      </w:r>
+      <w:r>
+        <w:rPr>
+          <w:rFonts w:ascii="Arial" w:hAnsi="Arial" w:cs="Arial"/>
+          <w:b/>
+          <w:bCs/>
+          <w:color w:val="7030A0"/>
+        </w:rPr>
+        <w:t>GROWTH</w:t>
+      </w:r>
+      <w:r>
+        <w:rPr>
+          <w:rFonts w:ascii="Arial" w:hAnsi="Arial" w:cs="Arial"/>
+          <w:color w:val="7030A0"/>
+        </w:rPr>
+        <w:t>)</w:t>
+      </w:r>
+      <w:r>
+        <w:rPr>
+          <w:rFonts w:ascii="Arial" w:hAnsi="Arial" w:cs="Arial"/>
+          <w:color w:val="7030A0"/>
+        </w:rPr>
+        <w:t xml:space="preserve"> varied by </w:t>
+      </w:r>
+      <w:r>
+        <w:rPr>
+          <w:rFonts w:ascii="Arial" w:hAnsi="Arial" w:cs="Arial"/>
+          <w:color w:val="7030A0"/>
+        </w:rPr>
+        <w:t>12.5</w:t>
+      </w:r>
+      <w:r>
+        <w:rPr>
+          <w:rFonts w:ascii="Arial" w:hAnsi="Arial" w:cs="Arial"/>
+          <w:color w:val="7030A0"/>
+        </w:rPr>
+        <w:t xml:space="preserve">% between the </w:t>
+      </w:r>
+      <w:r>
+        <w:rPr>
+          <w:rFonts w:ascii="Arial" w:hAnsi="Arial" w:cs="Arial"/>
+          <w:color w:val="7030A0"/>
+        </w:rPr>
+        <w:t>1</w:t>
+      </w:r>
+      <w:r>
+        <w:rPr>
+          <w:rFonts w:ascii="Arial" w:hAnsi="Arial" w:cs="Arial"/>
+          <w:color w:val="7030A0"/>
+        </w:rPr>
+        <w:t>5</w:t>
+      </w:r>
+      <w:r>
+        <w:rPr>
+          <w:rFonts w:ascii="Arial" w:hAnsi="Arial" w:cs="Arial"/>
+          <w:color w:val="7030A0"/>
+        </w:rPr>
+        <w:t>˚C</w:t>
+      </w:r>
+      <w:r>
+        <w:rPr>
+          <w:rFonts w:ascii="Arial" w:hAnsi="Arial" w:cs="Arial"/>
+          <w:color w:val="7030A0"/>
+        </w:rPr>
+        <w:t xml:space="preserve"> </w:t>
+      </w:r>
+      <w:r>
+        <w:rPr>
+          <w:rFonts w:ascii="Arial" w:hAnsi="Arial" w:cs="Arial"/>
+          <w:color w:val="7030A0"/>
+        </w:rPr>
+        <w:t>(</w:t>
+      </w:r>
+      <w:r>
+        <w:rPr>
+          <w:rFonts w:ascii="Arial" w:hAnsi="Arial" w:cs="Arial"/>
+          <w:color w:val="7030A0"/>
+        </w:rPr>
+        <w:t>8.54</w:t>
+      </w:r>
+      <w:r>
+        <w:rPr>
+          <w:rFonts w:ascii="Arial" w:hAnsi="Arial" w:cs="Arial"/>
+          <w:color w:val="7030A0"/>
+        </w:rPr>
+        <w:t xml:space="preserve"> </w:t>
+      </w:r>
+      <w:r>
+        <w:rPr>
+          <w:rFonts w:ascii="Arial" w:hAnsi="Arial" w:cs="Arial"/>
+          <w:color w:val="7030A0"/>
+        </w:rPr>
+        <w:t>±</w:t>
+      </w:r>
+      <w:r>
+        <w:rPr>
+          <w:rFonts w:ascii="Arial" w:hAnsi="Arial" w:cs="Arial"/>
+          <w:color w:val="7030A0"/>
+        </w:rPr>
+        <w:t xml:space="preserve"> 0.</w:t>
+      </w:r>
+      <w:r>
+        <w:rPr>
+          <w:rFonts w:ascii="Arial" w:hAnsi="Arial" w:cs="Arial"/>
+          <w:color w:val="7030A0"/>
+        </w:rPr>
+        <w:t>64</w:t>
+      </w:r>
+      <w:r>
+        <w:rPr>
+          <w:rFonts w:ascii="Arial" w:hAnsi="Arial" w:cs="Arial"/>
+          <w:color w:val="7030A0"/>
+        </w:rPr>
+        <w:t>)</w:t>
+      </w:r>
+      <w:r>
+        <w:rPr>
+          <w:rFonts w:ascii="Arial" w:hAnsi="Arial" w:cs="Arial"/>
+          <w:color w:val="7030A0"/>
+        </w:rPr>
+        <w:t xml:space="preserve"> and 2</w:t>
+      </w:r>
+      <w:r>
+        <w:rPr>
+          <w:rFonts w:ascii="Arial" w:hAnsi="Arial" w:cs="Arial"/>
+          <w:color w:val="7030A0"/>
+        </w:rPr>
+        <w:t>1˚C</w:t>
+      </w:r>
+      <w:r>
+        <w:rPr>
+          <w:rFonts w:ascii="Arial" w:hAnsi="Arial" w:cs="Arial"/>
+          <w:color w:val="7030A0"/>
+        </w:rPr>
+        <w:t xml:space="preserve"> </w:t>
+      </w:r>
+      <w:r>
+        <w:rPr>
+          <w:rFonts w:ascii="Arial" w:hAnsi="Arial" w:cs="Arial"/>
+          <w:color w:val="7030A0"/>
+        </w:rPr>
+        <w:t>(7.</w:t>
+      </w:r>
+      <w:r>
+        <w:rPr>
+          <w:rFonts w:ascii="Arial" w:hAnsi="Arial" w:cs="Arial"/>
+          <w:color w:val="7030A0"/>
+        </w:rPr>
+        <w:t>47</w:t>
+      </w:r>
+      <w:r>
+        <w:rPr>
+          <w:rFonts w:ascii="Arial" w:hAnsi="Arial" w:cs="Arial"/>
+          <w:color w:val="7030A0"/>
+        </w:rPr>
+        <w:t xml:space="preserve"> </w:t>
+      </w:r>
+      <w:r>
+        <w:rPr>
+          <w:rFonts w:ascii="Arial" w:hAnsi="Arial" w:cs="Arial"/>
+          <w:color w:val="7030A0"/>
+        </w:rPr>
+        <w:t>±</w:t>
+      </w:r>
+      <w:r>
+        <w:rPr>
+          <w:rFonts w:ascii="Arial" w:hAnsi="Arial" w:cs="Arial"/>
+          <w:color w:val="7030A0"/>
+        </w:rPr>
+        <w:t xml:space="preserve"> 0.</w:t>
+      </w:r>
+      <w:r>
+        <w:rPr>
+          <w:rFonts w:ascii="Arial" w:hAnsi="Arial" w:cs="Arial"/>
+          <w:color w:val="7030A0"/>
+        </w:rPr>
+        <w:t>50</w:t>
+      </w:r>
+      <w:r>
+        <w:rPr>
+          <w:rFonts w:ascii="Arial" w:hAnsi="Arial" w:cs="Arial"/>
+          <w:color w:val="7030A0"/>
+        </w:rPr>
+        <w:t>)</w:t>
+      </w:r>
+      <w:r>
+        <w:rPr>
+          <w:rFonts w:ascii="Arial" w:hAnsi="Arial" w:cs="Arial"/>
+          <w:color w:val="7030A0"/>
+        </w:rPr>
+        <w:t xml:space="preserve"> stress hardening treatments.</w:t>
       </w:r>
     </w:p>
     <w:p>
@@ -5322,6 +6326,7 @@
         <w:ind w:left="720" w:firstLine="720"/>
         <w:rPr>
           <w:rFonts w:ascii="Arial" w:hAnsi="Arial" w:cs="Arial"/>
+          <w:color w:val="7030A0"/>
         </w:rPr>
       </w:pPr>
       <w:r>
@@ -5329,18 +6334,21 @@
           <w:rFonts w:ascii="Arial" w:hAnsi="Arial" w:cs="Arial"/>
           <w:i/>
           <w:iCs/>
+          <w:color w:val="7030A0"/>
         </w:rPr>
         <w:t>C. sikamea</w:t>
       </w:r>
       <w:r>
         <w:rPr>
           <w:rFonts w:ascii="Arial" w:hAnsi="Arial" w:cs="Arial"/>
+          <w:color w:val="7030A0"/>
         </w:rPr>
         <w:t xml:space="preserve"> – </w:t>
       </w:r>
       <w:r>
         <w:rPr>
           <w:rFonts w:ascii="Arial" w:hAnsi="Arial" w:cs="Arial"/>
+          <w:color w:val="7030A0"/>
         </w:rPr>
         <w:t>x</w:t>
       </w:r>
@@ -5350,6 +6358,7 @@
         <w:ind w:left="720" w:firstLine="720"/>
         <w:rPr>
           <w:rFonts w:ascii="Arial" w:hAnsi="Arial" w:cs="Arial"/>
+          <w:color w:val="7030A0"/>
         </w:rPr>
       </w:pPr>
       <w:r>
@@ -5357,12 +6366,14 @@
           <w:rFonts w:ascii="Arial" w:hAnsi="Arial" w:cs="Arial"/>
           <w:i/>
           <w:iCs/>
+          <w:color w:val="7030A0"/>
         </w:rPr>
         <w:t>M. gigas</w:t>
       </w:r>
       <w:r>
         <w:rPr>
           <w:rFonts w:ascii="Arial" w:hAnsi="Arial" w:cs="Arial"/>
+          <w:color w:val="7030A0"/>
         </w:rPr>
         <w:t xml:space="preserve"> – x</w:t>
       </w:r>
@@ -5381,6 +6392,76 @@
       <w:pPr>
         <w:rPr>
           <w:rFonts w:ascii="Arial" w:hAnsi="Arial" w:cs="Arial"/>
+          <w:i/>
+          <w:iCs/>
+          <w:color w:val="FF0000"/>
+        </w:rPr>
+      </w:pPr>
+    </w:p>
+    <w:p>
+      <w:pPr>
+        <w:rPr>
+          <w:rFonts w:ascii="Arial" w:hAnsi="Arial" w:cs="Arial"/>
+          <w:i/>
+          <w:iCs/>
+          <w:color w:val="FF0000"/>
+        </w:rPr>
+      </w:pPr>
+    </w:p>
+    <w:p>
+      <w:pPr>
+        <w:rPr>
+          <w:rFonts w:ascii="Arial" w:hAnsi="Arial" w:cs="Arial"/>
+          <w:i/>
+          <w:iCs/>
+          <w:color w:val="FF0000"/>
+        </w:rPr>
+      </w:pPr>
+    </w:p>
+    <w:p>
+      <w:pPr>
+        <w:rPr>
+          <w:rFonts w:ascii="Arial" w:hAnsi="Arial" w:cs="Arial"/>
+          <w:i/>
+          <w:iCs/>
+          <w:color w:val="FF0000"/>
+        </w:rPr>
+      </w:pPr>
+    </w:p>
+    <w:p>
+      <w:pPr>
+        <w:rPr>
+          <w:rFonts w:ascii="Arial" w:hAnsi="Arial" w:cs="Arial"/>
+          <w:i/>
+          <w:iCs/>
+          <w:color w:val="FF0000"/>
+        </w:rPr>
+      </w:pPr>
+    </w:p>
+    <w:p>
+      <w:pPr>
+        <w:rPr>
+          <w:rFonts w:ascii="Arial" w:hAnsi="Arial" w:cs="Arial"/>
+          <w:i/>
+          <w:iCs/>
+          <w:color w:val="FF0000"/>
+        </w:rPr>
+      </w:pPr>
+    </w:p>
+    <w:p>
+      <w:pPr>
+        <w:rPr>
+          <w:rFonts w:ascii="Arial" w:hAnsi="Arial" w:cs="Arial"/>
+          <w:i/>
+          <w:iCs/>
+          <w:color w:val="FF0000"/>
+        </w:rPr>
+      </w:pPr>
+    </w:p>
+    <w:p>
+      <w:pPr>
+        <w:rPr>
+          <w:rFonts w:ascii="Arial" w:hAnsi="Arial" w:cs="Arial"/>
         </w:rPr>
       </w:pPr>
       <w:r>
@@ -5440,6 +6521,7 @@
           <w:sz w:val="28"/>
           <w:szCs w:val="28"/>
         </w:rPr>
+        <w:lastRenderedPageBreak/>
         <w:t>DISCUSSION</w:t>
       </w:r>
     </w:p>
@@ -7667,6 +8749,12 @@
                 <w:rFonts w:ascii="Arial" w:hAnsi="Arial" w:cs="Arial"/>
               </w:rPr>
             </w:pPr>
+            <w:r>
+              <w:rPr>
+                <w:rFonts w:ascii="Arial" w:hAnsi="Arial" w:cs="Arial"/>
+              </w:rPr>
+              <w:t>-0.999</w:t>
+            </w:r>
           </w:p>
         </w:tc>
         <w:tc>
@@ -7681,6 +8769,12 @@
                 <w:rFonts w:ascii="Arial" w:hAnsi="Arial" w:cs="Arial"/>
               </w:rPr>
             </w:pPr>
+            <w:r>
+              <w:rPr>
+                <w:rFonts w:ascii="Arial" w:hAnsi="Arial" w:cs="Arial"/>
+              </w:rPr>
+              <w:t>0.399</w:t>
+            </w:r>
           </w:p>
         </w:tc>
         <w:tc>
@@ -7694,6 +8788,12 @@
                 <w:rFonts w:ascii="Arial" w:hAnsi="Arial" w:cs="Arial"/>
               </w:rPr>
             </w:pPr>
+            <w:r>
+              <w:rPr>
+                <w:rFonts w:ascii="Arial" w:hAnsi="Arial" w:cs="Arial"/>
+              </w:rPr>
+              <w:t>---</w:t>
+            </w:r>
           </w:p>
         </w:tc>
         <w:tc>
@@ -7708,6 +8808,12 @@
                 <w:rFonts w:ascii="Arial" w:hAnsi="Arial" w:cs="Arial"/>
               </w:rPr>
             </w:pPr>
+            <w:r>
+              <w:rPr>
+                <w:rFonts w:ascii="Arial" w:hAnsi="Arial" w:cs="Arial"/>
+              </w:rPr>
+              <w:t>-2.502</w:t>
+            </w:r>
           </w:p>
         </w:tc>
         <w:tc>
@@ -7720,8 +8826,26 @@
               <w:jc w:val="center"/>
               <w:rPr>
                 <w:rFonts w:ascii="Arial" w:hAnsi="Arial" w:cs="Arial"/>
-              </w:rPr>
-            </w:pPr>
+                <w:b/>
+                <w:bCs/>
+              </w:rPr>
+            </w:pPr>
+            <w:r>
+              <w:rPr>
+                <w:rFonts w:ascii="Arial" w:hAnsi="Arial" w:cs="Arial"/>
+                <w:b/>
+                <w:bCs/>
+              </w:rPr>
+              <w:t>0.01</w:t>
+            </w:r>
+            <w:r>
+              <w:rPr>
+                <w:rFonts w:ascii="Arial" w:hAnsi="Arial" w:cs="Arial"/>
+                <w:b/>
+                <w:bCs/>
+              </w:rPr>
+              <w:t>2</w:t>
+            </w:r>
           </w:p>
         </w:tc>
       </w:tr>
@@ -7817,6 +8941,12 @@
                 <w:rFonts w:ascii="Arial" w:hAnsi="Arial" w:cs="Arial"/>
               </w:rPr>
             </w:pPr>
+            <w:r>
+              <w:rPr>
+                <w:rFonts w:ascii="Arial" w:hAnsi="Arial" w:cs="Arial"/>
+              </w:rPr>
+              <w:t>0.374</w:t>
+            </w:r>
           </w:p>
         </w:tc>
         <w:tc>
@@ -7831,6 +8961,12 @@
                 <w:rFonts w:ascii="Arial" w:hAnsi="Arial" w:cs="Arial"/>
               </w:rPr>
             </w:pPr>
+            <w:r>
+              <w:rPr>
+                <w:rFonts w:ascii="Arial" w:hAnsi="Arial" w:cs="Arial"/>
+              </w:rPr>
+              <w:t>0.291</w:t>
+            </w:r>
           </w:p>
         </w:tc>
         <w:tc>
@@ -7844,6 +8980,12 @@
                 <w:rFonts w:ascii="Arial" w:hAnsi="Arial" w:cs="Arial"/>
               </w:rPr>
             </w:pPr>
+            <w:r>
+              <w:rPr>
+                <w:rFonts w:ascii="Arial" w:hAnsi="Arial" w:cs="Arial"/>
+              </w:rPr>
+              <w:t>---</w:t>
+            </w:r>
           </w:p>
         </w:tc>
         <w:tc>
@@ -7858,6 +9000,18 @@
                 <w:rFonts w:ascii="Arial" w:hAnsi="Arial" w:cs="Arial"/>
               </w:rPr>
             </w:pPr>
+            <w:r>
+              <w:rPr>
+                <w:rFonts w:ascii="Arial" w:hAnsi="Arial" w:cs="Arial"/>
+              </w:rPr>
+              <w:t>1.</w:t>
+            </w:r>
+            <w:r>
+              <w:rPr>
+                <w:rFonts w:ascii="Arial" w:hAnsi="Arial" w:cs="Arial"/>
+              </w:rPr>
+              <w:t>284</w:t>
+            </w:r>
           </w:p>
         </w:tc>
         <w:tc>
@@ -7872,6 +9026,18 @@
                 <w:rFonts w:ascii="Arial" w:hAnsi="Arial" w:cs="Arial"/>
               </w:rPr>
             </w:pPr>
+            <w:r>
+              <w:rPr>
+                <w:rFonts w:ascii="Arial" w:hAnsi="Arial" w:cs="Arial"/>
+              </w:rPr>
+              <w:t>0.</w:t>
+            </w:r>
+            <w:r>
+              <w:rPr>
+                <w:rFonts w:ascii="Arial" w:hAnsi="Arial" w:cs="Arial"/>
+              </w:rPr>
+              <w:t>200</w:t>
+            </w:r>
           </w:p>
         </w:tc>
       </w:tr>
@@ -8159,6 +9325,12 @@
                 <w:rFonts w:ascii="Arial" w:hAnsi="Arial" w:cs="Arial"/>
               </w:rPr>
             </w:pPr>
+            <w:r>
+              <w:rPr>
+                <w:rFonts w:ascii="Arial" w:hAnsi="Arial" w:cs="Arial"/>
+              </w:rPr>
+              <w:t>1.791</w:t>
+            </w:r>
           </w:p>
         </w:tc>
         <w:tc>
@@ -8173,6 +9345,12 @@
                 <w:rFonts w:ascii="Arial" w:hAnsi="Arial" w:cs="Arial"/>
               </w:rPr>
             </w:pPr>
+            <w:r>
+              <w:rPr>
+                <w:rFonts w:ascii="Arial" w:hAnsi="Arial" w:cs="Arial"/>
+              </w:rPr>
+              <w:t>0.987</w:t>
+            </w:r>
           </w:p>
         </w:tc>
         <w:tc>
@@ -8186,6 +9364,12 @@
                 <w:rFonts w:ascii="Arial" w:hAnsi="Arial" w:cs="Arial"/>
               </w:rPr>
             </w:pPr>
+            <w:r>
+              <w:rPr>
+                <w:rFonts w:ascii="Arial" w:hAnsi="Arial" w:cs="Arial"/>
+              </w:rPr>
+              <w:t>---</w:t>
+            </w:r>
           </w:p>
         </w:tc>
         <w:tc>
@@ -8200,6 +9384,12 @@
                 <w:rFonts w:ascii="Arial" w:hAnsi="Arial" w:cs="Arial"/>
               </w:rPr>
             </w:pPr>
+            <w:r>
+              <w:rPr>
+                <w:rFonts w:ascii="Arial" w:hAnsi="Arial" w:cs="Arial"/>
+              </w:rPr>
+              <w:t>1.816</w:t>
+            </w:r>
           </w:p>
         </w:tc>
         <w:tc>
@@ -8214,6 +9404,12 @@
                 <w:rFonts w:ascii="Arial" w:hAnsi="Arial" w:cs="Arial"/>
               </w:rPr>
             </w:pPr>
+            <w:r>
+              <w:rPr>
+                <w:rFonts w:ascii="Arial" w:hAnsi="Arial" w:cs="Arial"/>
+              </w:rPr>
+              <w:t>0.069</w:t>
+            </w:r>
           </w:p>
         </w:tc>
       </w:tr>
@@ -8309,6 +9505,12 @@
                 <w:rFonts w:ascii="Arial" w:hAnsi="Arial" w:cs="Arial"/>
               </w:rPr>
             </w:pPr>
+            <w:r>
+              <w:rPr>
+                <w:rFonts w:ascii="Arial" w:hAnsi="Arial" w:cs="Arial"/>
+              </w:rPr>
+              <w:t>1.008</w:t>
+            </w:r>
           </w:p>
         </w:tc>
         <w:tc>
@@ -8323,6 +9525,12 @@
                 <w:rFonts w:ascii="Arial" w:hAnsi="Arial" w:cs="Arial"/>
               </w:rPr>
             </w:pPr>
+            <w:r>
+              <w:rPr>
+                <w:rFonts w:ascii="Arial" w:hAnsi="Arial" w:cs="Arial"/>
+              </w:rPr>
+              <w:t>0.981</w:t>
+            </w:r>
           </w:p>
         </w:tc>
         <w:tc>
@@ -8336,6 +9544,12 @@
                 <w:rFonts w:ascii="Arial" w:hAnsi="Arial" w:cs="Arial"/>
               </w:rPr>
             </w:pPr>
+            <w:r>
+              <w:rPr>
+                <w:rFonts w:ascii="Arial" w:hAnsi="Arial" w:cs="Arial"/>
+              </w:rPr>
+              <w:t>---</w:t>
+            </w:r>
           </w:p>
         </w:tc>
         <w:tc>
@@ -8350,6 +9564,12 @@
                 <w:rFonts w:ascii="Arial" w:hAnsi="Arial" w:cs="Arial"/>
               </w:rPr>
             </w:pPr>
+            <w:r>
+              <w:rPr>
+                <w:rFonts w:ascii="Arial" w:hAnsi="Arial" w:cs="Arial"/>
+              </w:rPr>
+              <w:t>1.027</w:t>
+            </w:r>
           </w:p>
         </w:tc>
         <w:tc>
@@ -8364,6 +9584,12 @@
                 <w:rFonts w:ascii="Arial" w:hAnsi="Arial" w:cs="Arial"/>
               </w:rPr>
             </w:pPr>
+            <w:r>
+              <w:rPr>
+                <w:rFonts w:ascii="Arial" w:hAnsi="Arial" w:cs="Arial"/>
+              </w:rPr>
+              <w:t>0.305</w:t>
+            </w:r>
           </w:p>
         </w:tc>
       </w:tr>
@@ -8459,6 +9685,12 @@
                 <w:rFonts w:ascii="Arial" w:hAnsi="Arial" w:cs="Arial"/>
               </w:rPr>
             </w:pPr>
+            <w:r>
+              <w:rPr>
+                <w:rFonts w:ascii="Arial" w:hAnsi="Arial" w:cs="Arial"/>
+              </w:rPr>
+              <w:t>0.351</w:t>
+            </w:r>
           </w:p>
         </w:tc>
         <w:tc>
@@ -8473,6 +9705,12 @@
                 <w:rFonts w:ascii="Arial" w:hAnsi="Arial" w:cs="Arial"/>
               </w:rPr>
             </w:pPr>
+            <w:r>
+              <w:rPr>
+                <w:rFonts w:ascii="Arial" w:hAnsi="Arial" w:cs="Arial"/>
+              </w:rPr>
+              <w:t>0.978</w:t>
+            </w:r>
           </w:p>
         </w:tc>
         <w:tc>
@@ -8486,6 +9724,12 @@
                 <w:rFonts w:ascii="Arial" w:hAnsi="Arial" w:cs="Arial"/>
               </w:rPr>
             </w:pPr>
+            <w:r>
+              <w:rPr>
+                <w:rFonts w:ascii="Arial" w:hAnsi="Arial" w:cs="Arial"/>
+              </w:rPr>
+              <w:t>---</w:t>
+            </w:r>
           </w:p>
         </w:tc>
         <w:tc>
@@ -8500,6 +9744,12 @@
                 <w:rFonts w:ascii="Arial" w:hAnsi="Arial" w:cs="Arial"/>
               </w:rPr>
             </w:pPr>
+            <w:r>
+              <w:rPr>
+                <w:rFonts w:ascii="Arial" w:hAnsi="Arial" w:cs="Arial"/>
+              </w:rPr>
+              <w:t>0.359</w:t>
+            </w:r>
           </w:p>
         </w:tc>
         <w:tc>
@@ -8514,6 +9764,607 @@
                 <w:rFonts w:ascii="Arial" w:hAnsi="Arial" w:cs="Arial"/>
               </w:rPr>
             </w:pPr>
+            <w:r>
+              <w:rPr>
+                <w:rFonts w:ascii="Arial" w:hAnsi="Arial" w:cs="Arial"/>
+              </w:rPr>
+              <w:t>0.720</w:t>
+            </w:r>
+          </w:p>
+        </w:tc>
+      </w:tr>
+      <w:tr>
+        <w:tc>
+          <w:tcPr>
+            <w:tcW w:w="1050" w:type="dxa"/>
+            <w:vMerge/>
+            <w:textDirection w:val="btLr"/>
+            <w:vAlign w:val="center"/>
+          </w:tcPr>
+          <w:p>
+            <w:pPr>
+              <w:ind w:left="113" w:right="113"/>
+              <w:jc w:val="center"/>
+              <w:rPr>
+                <w:rFonts w:ascii="Arial" w:hAnsi="Arial" w:cs="Arial"/>
+                <w:b/>
+                <w:bCs/>
+                <w:sz w:val="18"/>
+                <w:szCs w:val="18"/>
+              </w:rPr>
+            </w:pPr>
+          </w:p>
+        </w:tc>
+        <w:tc>
+          <w:tcPr>
+            <w:tcW w:w="1316" w:type="dxa"/>
+            <w:vMerge/>
+            <w:vAlign w:val="center"/>
+          </w:tcPr>
+          <w:p>
+            <w:pPr>
+              <w:jc w:val="center"/>
+              <w:rPr>
+                <w:rFonts w:ascii="Arial" w:hAnsi="Arial" w:cs="Arial"/>
+              </w:rPr>
+            </w:pPr>
+          </w:p>
+        </w:tc>
+        <w:tc>
+          <w:tcPr>
+            <w:tcW w:w="1769" w:type="dxa"/>
+            <w:vAlign w:val="center"/>
+          </w:tcPr>
+          <w:p>
+            <w:pPr>
+              <w:rPr>
+                <w:rFonts w:ascii="Arial" w:hAnsi="Arial" w:cs="Arial"/>
+                <w:sz w:val="18"/>
+                <w:szCs w:val="18"/>
+              </w:rPr>
+            </w:pPr>
+            <w:r>
+              <w:rPr>
+                <w:rFonts w:ascii="Arial" w:hAnsi="Arial" w:cs="Arial"/>
+                <w:sz w:val="18"/>
+                <w:szCs w:val="18"/>
+              </w:rPr>
+              <w:t xml:space="preserve">SH Temp * </w:t>
+            </w:r>
+          </w:p>
+          <w:p>
+            <w:pPr>
+              <w:rPr>
+                <w:rFonts w:ascii="Arial" w:hAnsi="Arial" w:cs="Arial"/>
+                <w:sz w:val="18"/>
+                <w:szCs w:val="18"/>
+              </w:rPr>
+            </w:pPr>
+            <w:r>
+              <w:rPr>
+                <w:rFonts w:ascii="Arial" w:hAnsi="Arial" w:cs="Arial"/>
+                <w:sz w:val="18"/>
+                <w:szCs w:val="18"/>
+              </w:rPr>
+              <w:t>MHW Temp (18˚C)</w:t>
+            </w:r>
+          </w:p>
+        </w:tc>
+        <w:tc>
+          <w:tcPr>
+            <w:tcW w:w="1170" w:type="dxa"/>
+            <w:vAlign w:val="center"/>
+          </w:tcPr>
+          <w:p>
+            <w:pPr>
+              <w:jc w:val="center"/>
+              <w:rPr>
+                <w:rFonts w:ascii="Arial" w:hAnsi="Arial" w:cs="Arial"/>
+              </w:rPr>
+            </w:pPr>
+            <w:r>
+              <w:rPr>
+                <w:rFonts w:ascii="Arial" w:hAnsi="Arial" w:cs="Arial"/>
+              </w:rPr>
+              <w:t>Tank</w:t>
+            </w:r>
+          </w:p>
+        </w:tc>
+        <w:tc>
+          <w:tcPr>
+            <w:tcW w:w="1170" w:type="dxa"/>
+            <w:vAlign w:val="center"/>
+          </w:tcPr>
+          <w:p>
+            <w:pPr>
+              <w:jc w:val="center"/>
+              <w:rPr>
+                <w:rFonts w:ascii="Arial" w:hAnsi="Arial" w:cs="Arial"/>
+              </w:rPr>
+            </w:pPr>
+            <w:r>
+              <w:rPr>
+                <w:rFonts w:ascii="Arial" w:hAnsi="Arial" w:cs="Arial"/>
+              </w:rPr>
+              <w:t>-0.095</w:t>
+            </w:r>
+          </w:p>
+        </w:tc>
+        <w:tc>
+          <w:tcPr>
+            <w:tcW w:w="990" w:type="dxa"/>
+            <w:vAlign w:val="center"/>
+          </w:tcPr>
+          <w:p>
+            <w:pPr>
+              <w:jc w:val="center"/>
+              <w:rPr>
+                <w:rFonts w:ascii="Arial" w:hAnsi="Arial" w:cs="Arial"/>
+              </w:rPr>
+            </w:pPr>
+            <w:r>
+              <w:rPr>
+                <w:rFonts w:ascii="Arial" w:hAnsi="Arial" w:cs="Arial"/>
+              </w:rPr>
+              <w:t>0.589</w:t>
+            </w:r>
+          </w:p>
+        </w:tc>
+        <w:tc>
+          <w:tcPr>
+            <w:tcW w:w="1080" w:type="dxa"/>
+          </w:tcPr>
+          <w:p>
+            <w:pPr>
+              <w:jc w:val="center"/>
+              <w:rPr>
+                <w:rFonts w:ascii="Arial" w:hAnsi="Arial" w:cs="Arial"/>
+              </w:rPr>
+            </w:pPr>
+            <w:r>
+              <w:rPr>
+                <w:rFonts w:ascii="Arial" w:hAnsi="Arial" w:cs="Arial"/>
+              </w:rPr>
+              <w:t>---</w:t>
+            </w:r>
+          </w:p>
+        </w:tc>
+        <w:tc>
+          <w:tcPr>
+            <w:tcW w:w="990" w:type="dxa"/>
+            <w:vAlign w:val="center"/>
+          </w:tcPr>
+          <w:p>
+            <w:pPr>
+              <w:jc w:val="center"/>
+              <w:rPr>
+                <w:rFonts w:ascii="Arial" w:hAnsi="Arial" w:cs="Arial"/>
+              </w:rPr>
+            </w:pPr>
+            <w:r>
+              <w:rPr>
+                <w:rFonts w:ascii="Arial" w:hAnsi="Arial" w:cs="Arial"/>
+              </w:rPr>
+              <w:t>-0.162</w:t>
+            </w:r>
+          </w:p>
+        </w:tc>
+        <w:tc>
+          <w:tcPr>
+            <w:tcW w:w="1080" w:type="dxa"/>
+            <w:vAlign w:val="center"/>
+          </w:tcPr>
+          <w:p>
+            <w:pPr>
+              <w:jc w:val="center"/>
+              <w:rPr>
+                <w:rFonts w:ascii="Arial" w:hAnsi="Arial" w:cs="Arial"/>
+              </w:rPr>
+            </w:pPr>
+            <w:r>
+              <w:rPr>
+                <w:rFonts w:ascii="Arial" w:hAnsi="Arial" w:cs="Arial"/>
+              </w:rPr>
+              <w:t>0.872</w:t>
+            </w:r>
+          </w:p>
+        </w:tc>
+      </w:tr>
+      <w:tr>
+        <w:tc>
+          <w:tcPr>
+            <w:tcW w:w="1050" w:type="dxa"/>
+            <w:vMerge/>
+            <w:textDirection w:val="btLr"/>
+            <w:vAlign w:val="center"/>
+          </w:tcPr>
+          <w:p>
+            <w:pPr>
+              <w:ind w:left="113" w:right="113"/>
+              <w:jc w:val="center"/>
+              <w:rPr>
+                <w:rFonts w:ascii="Arial" w:hAnsi="Arial" w:cs="Arial"/>
+                <w:b/>
+                <w:bCs/>
+                <w:sz w:val="18"/>
+                <w:szCs w:val="18"/>
+              </w:rPr>
+            </w:pPr>
+          </w:p>
+        </w:tc>
+        <w:tc>
+          <w:tcPr>
+            <w:tcW w:w="1316" w:type="dxa"/>
+            <w:vMerge/>
+            <w:vAlign w:val="center"/>
+          </w:tcPr>
+          <w:p>
+            <w:pPr>
+              <w:jc w:val="center"/>
+              <w:rPr>
+                <w:rFonts w:ascii="Arial" w:hAnsi="Arial" w:cs="Arial"/>
+              </w:rPr>
+            </w:pPr>
+          </w:p>
+        </w:tc>
+        <w:tc>
+          <w:tcPr>
+            <w:tcW w:w="1769" w:type="dxa"/>
+            <w:vAlign w:val="center"/>
+          </w:tcPr>
+          <w:p>
+            <w:pPr>
+              <w:rPr>
+                <w:rFonts w:ascii="Arial" w:hAnsi="Arial" w:cs="Arial"/>
+                <w:sz w:val="18"/>
+                <w:szCs w:val="18"/>
+              </w:rPr>
+            </w:pPr>
+            <w:r>
+              <w:rPr>
+                <w:rFonts w:ascii="Arial" w:hAnsi="Arial" w:cs="Arial"/>
+                <w:sz w:val="18"/>
+                <w:szCs w:val="18"/>
+              </w:rPr>
+              <w:t xml:space="preserve">SH Temp * </w:t>
+            </w:r>
+          </w:p>
+          <w:p>
+            <w:pPr>
+              <w:rPr>
+                <w:rFonts w:ascii="Arial" w:hAnsi="Arial" w:cs="Arial"/>
+                <w:sz w:val="18"/>
+                <w:szCs w:val="18"/>
+              </w:rPr>
+            </w:pPr>
+            <w:r>
+              <w:rPr>
+                <w:rFonts w:ascii="Arial" w:hAnsi="Arial" w:cs="Arial"/>
+                <w:sz w:val="18"/>
+                <w:szCs w:val="18"/>
+              </w:rPr>
+              <w:t>MHW Temp (21˚C)</w:t>
+            </w:r>
+          </w:p>
+        </w:tc>
+        <w:tc>
+          <w:tcPr>
+            <w:tcW w:w="1170" w:type="dxa"/>
+            <w:vAlign w:val="center"/>
+          </w:tcPr>
+          <w:p>
+            <w:pPr>
+              <w:jc w:val="center"/>
+              <w:rPr>
+                <w:rFonts w:ascii="Arial" w:hAnsi="Arial" w:cs="Arial"/>
+              </w:rPr>
+            </w:pPr>
+            <w:r>
+              <w:rPr>
+                <w:rFonts w:ascii="Arial" w:hAnsi="Arial" w:cs="Arial"/>
+              </w:rPr>
+              <w:t>Tank</w:t>
+            </w:r>
+          </w:p>
+        </w:tc>
+        <w:tc>
+          <w:tcPr>
+            <w:tcW w:w="1170" w:type="dxa"/>
+            <w:vAlign w:val="center"/>
+          </w:tcPr>
+          <w:p>
+            <w:pPr>
+              <w:jc w:val="center"/>
+              <w:rPr>
+                <w:rFonts w:ascii="Arial" w:hAnsi="Arial" w:cs="Arial"/>
+              </w:rPr>
+            </w:pPr>
+            <w:r>
+              <w:rPr>
+                <w:rFonts w:ascii="Arial" w:hAnsi="Arial" w:cs="Arial"/>
+              </w:rPr>
+              <w:t>0.525</w:t>
+            </w:r>
+          </w:p>
+        </w:tc>
+        <w:tc>
+          <w:tcPr>
+            <w:tcW w:w="990" w:type="dxa"/>
+            <w:vAlign w:val="center"/>
+          </w:tcPr>
+          <w:p>
+            <w:pPr>
+              <w:jc w:val="center"/>
+              <w:rPr>
+                <w:rFonts w:ascii="Arial" w:hAnsi="Arial" w:cs="Arial"/>
+              </w:rPr>
+            </w:pPr>
+            <w:r>
+              <w:rPr>
+                <w:rFonts w:ascii="Arial" w:hAnsi="Arial" w:cs="Arial"/>
+              </w:rPr>
+              <w:t>0.584</w:t>
+            </w:r>
+          </w:p>
+        </w:tc>
+        <w:tc>
+          <w:tcPr>
+            <w:tcW w:w="1080" w:type="dxa"/>
+          </w:tcPr>
+          <w:p>
+            <w:pPr>
+              <w:jc w:val="center"/>
+              <w:rPr>
+                <w:rFonts w:ascii="Arial" w:hAnsi="Arial" w:cs="Arial"/>
+              </w:rPr>
+            </w:pPr>
+            <w:r>
+              <w:rPr>
+                <w:rFonts w:ascii="Arial" w:hAnsi="Arial" w:cs="Arial"/>
+              </w:rPr>
+              <w:t>---</w:t>
+            </w:r>
+          </w:p>
+        </w:tc>
+        <w:tc>
+          <w:tcPr>
+            <w:tcW w:w="990" w:type="dxa"/>
+            <w:vAlign w:val="center"/>
+          </w:tcPr>
+          <w:p>
+            <w:pPr>
+              <w:jc w:val="center"/>
+              <w:rPr>
+                <w:rFonts w:ascii="Arial" w:hAnsi="Arial" w:cs="Arial"/>
+              </w:rPr>
+            </w:pPr>
+            <w:r>
+              <w:rPr>
+                <w:rFonts w:ascii="Arial" w:hAnsi="Arial" w:cs="Arial"/>
+              </w:rPr>
+              <w:t>0.899</w:t>
+            </w:r>
+          </w:p>
+        </w:tc>
+        <w:tc>
+          <w:tcPr>
+            <w:tcW w:w="1080" w:type="dxa"/>
+            <w:vAlign w:val="center"/>
+          </w:tcPr>
+          <w:p>
+            <w:pPr>
+              <w:jc w:val="center"/>
+              <w:rPr>
+                <w:rFonts w:ascii="Arial" w:hAnsi="Arial" w:cs="Arial"/>
+              </w:rPr>
+            </w:pPr>
+            <w:r>
+              <w:rPr>
+                <w:rFonts w:ascii="Arial" w:hAnsi="Arial" w:cs="Arial"/>
+              </w:rPr>
+              <w:t>0.369</w:t>
+            </w:r>
+          </w:p>
+        </w:tc>
+      </w:tr>
+      <w:tr>
+        <w:tc>
+          <w:tcPr>
+            <w:tcW w:w="1050" w:type="dxa"/>
+            <w:vMerge/>
+            <w:textDirection w:val="btLr"/>
+            <w:vAlign w:val="center"/>
+          </w:tcPr>
+          <w:p>
+            <w:pPr>
+              <w:ind w:left="113" w:right="113"/>
+              <w:jc w:val="center"/>
+              <w:rPr>
+                <w:rFonts w:ascii="Arial" w:hAnsi="Arial" w:cs="Arial"/>
+                <w:b/>
+                <w:bCs/>
+                <w:sz w:val="18"/>
+                <w:szCs w:val="18"/>
+              </w:rPr>
+            </w:pPr>
+          </w:p>
+        </w:tc>
+        <w:tc>
+          <w:tcPr>
+            <w:tcW w:w="1316" w:type="dxa"/>
+            <w:vMerge/>
+            <w:vAlign w:val="center"/>
+          </w:tcPr>
+          <w:p>
+            <w:pPr>
+              <w:jc w:val="center"/>
+              <w:rPr>
+                <w:rFonts w:ascii="Arial" w:hAnsi="Arial" w:cs="Arial"/>
+              </w:rPr>
+            </w:pPr>
+          </w:p>
+        </w:tc>
+        <w:tc>
+          <w:tcPr>
+            <w:tcW w:w="1769" w:type="dxa"/>
+            <w:vAlign w:val="center"/>
+          </w:tcPr>
+          <w:p>
+            <w:pPr>
+              <w:rPr>
+                <w:rFonts w:ascii="Arial" w:hAnsi="Arial" w:cs="Arial"/>
+                <w:sz w:val="18"/>
+                <w:szCs w:val="18"/>
+              </w:rPr>
+            </w:pPr>
+            <w:r>
+              <w:rPr>
+                <w:rFonts w:ascii="Arial" w:hAnsi="Arial" w:cs="Arial"/>
+                <w:sz w:val="18"/>
+                <w:szCs w:val="18"/>
+              </w:rPr>
+              <w:t xml:space="preserve">SH Temp * </w:t>
+            </w:r>
+          </w:p>
+          <w:p>
+            <w:pPr>
+              <w:rPr>
+                <w:rFonts w:ascii="Arial" w:hAnsi="Arial" w:cs="Arial"/>
+                <w:sz w:val="18"/>
+                <w:szCs w:val="18"/>
+              </w:rPr>
+            </w:pPr>
+            <w:r>
+              <w:rPr>
+                <w:rFonts w:ascii="Arial" w:hAnsi="Arial" w:cs="Arial"/>
+                <w:sz w:val="18"/>
+                <w:szCs w:val="18"/>
+              </w:rPr>
+              <w:t>MHW Temp (24˚C)</w:t>
+            </w:r>
+          </w:p>
+        </w:tc>
+        <w:tc>
+          <w:tcPr>
+            <w:tcW w:w="1170" w:type="dxa"/>
+            <w:vAlign w:val="center"/>
+          </w:tcPr>
+          <w:p>
+            <w:pPr>
+              <w:jc w:val="center"/>
+              <w:rPr>
+                <w:rFonts w:ascii="Arial" w:hAnsi="Arial" w:cs="Arial"/>
+              </w:rPr>
+            </w:pPr>
+            <w:r>
+              <w:rPr>
+                <w:rFonts w:ascii="Arial" w:hAnsi="Arial" w:cs="Arial"/>
+              </w:rPr>
+              <w:t>Tank</w:t>
+            </w:r>
+          </w:p>
+        </w:tc>
+        <w:tc>
+          <w:tcPr>
+            <w:tcW w:w="1170" w:type="dxa"/>
+            <w:vAlign w:val="center"/>
+          </w:tcPr>
+          <w:p>
+            <w:pPr>
+              <w:jc w:val="center"/>
+              <w:rPr>
+                <w:rFonts w:ascii="Arial" w:hAnsi="Arial" w:cs="Arial"/>
+              </w:rPr>
+            </w:pPr>
+            <w:r>
+              <w:rPr>
+                <w:rFonts w:ascii="Arial" w:hAnsi="Arial" w:cs="Arial"/>
+              </w:rPr>
+              <w:t>1.345</w:t>
+            </w:r>
+          </w:p>
+        </w:tc>
+        <w:tc>
+          <w:tcPr>
+            <w:tcW w:w="990" w:type="dxa"/>
+            <w:vAlign w:val="center"/>
+          </w:tcPr>
+          <w:p>
+            <w:pPr>
+              <w:jc w:val="center"/>
+              <w:rPr>
+                <w:rFonts w:ascii="Arial" w:hAnsi="Arial" w:cs="Arial"/>
+              </w:rPr>
+            </w:pPr>
+            <w:r>
+              <w:rPr>
+                <w:rFonts w:ascii="Arial" w:hAnsi="Arial" w:cs="Arial"/>
+              </w:rPr>
+              <w:t>0.572</w:t>
+            </w:r>
+          </w:p>
+        </w:tc>
+        <w:tc>
+          <w:tcPr>
+            <w:tcW w:w="1080" w:type="dxa"/>
+          </w:tcPr>
+          <w:p>
+            <w:pPr>
+              <w:jc w:val="center"/>
+              <w:rPr>
+                <w:rFonts w:ascii="Arial" w:hAnsi="Arial" w:cs="Arial"/>
+              </w:rPr>
+            </w:pPr>
+            <w:r>
+              <w:rPr>
+                <w:rFonts w:ascii="Arial" w:hAnsi="Arial" w:cs="Arial"/>
+              </w:rPr>
+              <w:t>---</w:t>
+            </w:r>
+          </w:p>
+        </w:tc>
+        <w:tc>
+          <w:tcPr>
+            <w:tcW w:w="990" w:type="dxa"/>
+            <w:vAlign w:val="center"/>
+          </w:tcPr>
+          <w:p>
+            <w:pPr>
+              <w:jc w:val="center"/>
+              <w:rPr>
+                <w:rFonts w:ascii="Arial" w:hAnsi="Arial" w:cs="Arial"/>
+              </w:rPr>
+            </w:pPr>
+            <w:r>
+              <w:rPr>
+                <w:rFonts w:ascii="Arial" w:hAnsi="Arial" w:cs="Arial"/>
+              </w:rPr>
+              <w:t>2.351</w:t>
+            </w:r>
+          </w:p>
+        </w:tc>
+        <w:tc>
+          <w:tcPr>
+            <w:tcW w:w="1080" w:type="dxa"/>
+            <w:vAlign w:val="center"/>
+          </w:tcPr>
+          <w:p>
+            <w:pPr>
+              <w:jc w:val="center"/>
+              <w:rPr>
+                <w:rFonts w:ascii="Arial" w:hAnsi="Arial" w:cs="Arial"/>
+                <w:b/>
+                <w:bCs/>
+              </w:rPr>
+            </w:pPr>
+            <w:r>
+              <w:rPr>
+                <w:rFonts w:ascii="Arial" w:hAnsi="Arial" w:cs="Arial"/>
+                <w:b/>
+                <w:bCs/>
+              </w:rPr>
+              <w:t>0.019</w:t>
+            </w:r>
           </w:p>
         </w:tc>
       </w:tr>
@@ -12403,6 +14254,7 @@
               <w:rPr>
                 <w:rFonts w:ascii="Arial" w:hAnsi="Arial" w:cs="Arial"/>
               </w:rPr>
+              <w:lastRenderedPageBreak/>
               <w:t>Condition Index</w:t>
             </w:r>
           </w:p>
@@ -12426,6 +14278,7 @@
                 <w:sz w:val="18"/>
                 <w:szCs w:val="18"/>
               </w:rPr>
+              <w:lastRenderedPageBreak/>
               <w:t>SH Temp</w:t>
             </w:r>
           </w:p>
@@ -13330,7 +15183,6 @@
           <w:sz w:val="28"/>
           <w:szCs w:val="28"/>
         </w:rPr>
-        <w:lastRenderedPageBreak/>
         <w:t>TABLE X</w:t>
       </w:r>
       <w:r>
@@ -13444,8 +15296,8 @@
         <w:gridCol w:w="1134"/>
         <w:gridCol w:w="852"/>
         <w:gridCol w:w="762"/>
-        <w:gridCol w:w="885"/>
-        <w:gridCol w:w="949"/>
+        <w:gridCol w:w="1029"/>
+        <w:gridCol w:w="805"/>
       </w:tblGrid>
       <w:tr>
         <w:trPr>
@@ -13621,7 +15473,7 @@
         </w:tc>
         <w:tc>
           <w:tcPr>
-            <w:tcW w:w="885" w:type="dxa"/>
+            <w:tcW w:w="1029" w:type="dxa"/>
             <w:vAlign w:val="center"/>
           </w:tcPr>
           <w:p>
@@ -13647,7 +15499,7 @@
         </w:tc>
         <w:tc>
           <w:tcPr>
-            <w:tcW w:w="949" w:type="dxa"/>
+            <w:tcW w:w="805" w:type="dxa"/>
             <w:vAlign w:val="center"/>
           </w:tcPr>
           <w:p>
@@ -13860,7 +15712,7 @@
         </w:tc>
         <w:tc>
           <w:tcPr>
-            <w:tcW w:w="885" w:type="dxa"/>
+            <w:tcW w:w="1029" w:type="dxa"/>
             <w:vAlign w:val="center"/>
           </w:tcPr>
           <w:p>
@@ -13889,7 +15741,7 @@
         </w:tc>
         <w:tc>
           <w:tcPr>
-            <w:tcW w:w="949" w:type="dxa"/>
+            <w:tcW w:w="805" w:type="dxa"/>
             <w:vAlign w:val="center"/>
           </w:tcPr>
           <w:p>
@@ -14090,7 +15942,7 @@
         </w:tc>
         <w:tc>
           <w:tcPr>
-            <w:tcW w:w="885" w:type="dxa"/>
+            <w:tcW w:w="1029" w:type="dxa"/>
             <w:vAlign w:val="center"/>
           </w:tcPr>
           <w:p>
@@ -14126,7 +15978,7 @@
         </w:tc>
         <w:tc>
           <w:tcPr>
-            <w:tcW w:w="949" w:type="dxa"/>
+            <w:tcW w:w="805" w:type="dxa"/>
             <w:vAlign w:val="center"/>
           </w:tcPr>
           <w:p>
@@ -14149,7 +16001,14 @@
                 <w:rFonts w:ascii="Arial" w:hAnsi="Arial" w:cs="Arial"/>
                 <w:color w:val="000000" w:themeColor="text1"/>
               </w:rPr>
-              <w:t>9968</w:t>
+              <w:t>99</w:t>
+            </w:r>
+            <w:r>
+              <w:rPr>
+                <w:rFonts w:ascii="Arial" w:hAnsi="Arial" w:cs="Arial"/>
+                <w:color w:val="000000" w:themeColor="text1"/>
+              </w:rPr>
+              <w:t>7</w:t>
             </w:r>
           </w:p>
         </w:tc>
@@ -14337,7 +16196,7 @@
         </w:tc>
         <w:tc>
           <w:tcPr>
-            <w:tcW w:w="885" w:type="dxa"/>
+            <w:tcW w:w="1029" w:type="dxa"/>
             <w:vAlign w:val="center"/>
           </w:tcPr>
           <w:p>
@@ -14380,7 +16239,7 @@
         </w:tc>
         <w:tc>
           <w:tcPr>
-            <w:tcW w:w="949" w:type="dxa"/>
+            <w:tcW w:w="805" w:type="dxa"/>
             <w:vAlign w:val="center"/>
           </w:tcPr>
           <w:p>
@@ -14403,7 +16262,14 @@
                 <w:rFonts w:ascii="Arial" w:hAnsi="Arial" w:cs="Arial"/>
                 <w:color w:val="000000" w:themeColor="text1"/>
               </w:rPr>
-              <w:t>6787</w:t>
+              <w:t>67</w:t>
+            </w:r>
+            <w:r>
+              <w:rPr>
+                <w:rFonts w:ascii="Arial" w:hAnsi="Arial" w:cs="Arial"/>
+                <w:color w:val="000000" w:themeColor="text1"/>
+              </w:rPr>
+              <w:t>9</w:t>
             </w:r>
           </w:p>
         </w:tc>
@@ -14597,7 +16463,7 @@
         </w:tc>
         <w:tc>
           <w:tcPr>
-            <w:tcW w:w="885" w:type="dxa"/>
+            <w:tcW w:w="1029" w:type="dxa"/>
             <w:vAlign w:val="center"/>
           </w:tcPr>
           <w:p>
@@ -14626,7 +16492,7 @@
         </w:tc>
         <w:tc>
           <w:tcPr>
-            <w:tcW w:w="949" w:type="dxa"/>
+            <w:tcW w:w="805" w:type="dxa"/>
             <w:vAlign w:val="center"/>
           </w:tcPr>
           <w:p>
@@ -14649,7 +16515,14 @@
                 <w:rFonts w:ascii="Arial" w:hAnsi="Arial" w:cs="Arial"/>
                 <w:color w:val="000000" w:themeColor="text1"/>
               </w:rPr>
-              <w:t>.0966</w:t>
+              <w:t>.09</w:t>
+            </w:r>
+            <w:r>
+              <w:rPr>
+                <w:rFonts w:ascii="Arial" w:hAnsi="Arial" w:cs="Arial"/>
+                <w:color w:val="000000" w:themeColor="text1"/>
+              </w:rPr>
+              <w:t>7</w:t>
             </w:r>
           </w:p>
         </w:tc>
@@ -14695,6 +16568,26 @@
               </w:rPr>
               <w:t>Condition Index</w:t>
             </w:r>
+            <w:r>
+              <w:rPr>
+                <w:rFonts w:ascii="Arial" w:hAnsi="Arial" w:cs="Arial"/>
+              </w:rPr>
+              <w:br/>
+            </w:r>
+            <w:r>
+              <w:rPr>
+                <w:rFonts w:ascii="Arial" w:hAnsi="Arial" w:cs="Arial"/>
+              </w:rPr>
+              <w:br/>
+            </w:r>
+            <w:r>
+              <w:rPr>
+                <w:rFonts w:ascii="Arial" w:hAnsi="Arial" w:cs="Arial"/>
+                <w:i/>
+                <w:iCs/>
+              </w:rPr>
+              <w:t>* Z ratio</w:t>
+            </w:r>
           </w:p>
         </w:tc>
         <w:tc>
@@ -14729,6 +16622,24 @@
                 <w:rFonts w:ascii="Arial" w:hAnsi="Arial" w:cs="Arial"/>
               </w:rPr>
             </w:pPr>
+            <w:r>
+              <w:rPr>
+                <w:rFonts w:ascii="Arial" w:hAnsi="Arial" w:cs="Arial"/>
+              </w:rPr>
+              <w:t xml:space="preserve">15˚C v. </w:t>
+            </w:r>
+            <w:r>
+              <w:rPr>
+                <w:rFonts w:ascii="Arial" w:hAnsi="Arial" w:cs="Arial"/>
+              </w:rPr>
+              <w:t>21</w:t>
+            </w:r>
+            <w:r>
+              <w:rPr>
+                <w:rFonts w:ascii="Arial" w:hAnsi="Arial" w:cs="Arial"/>
+              </w:rPr>
+              <w:t>˚C</w:t>
+            </w:r>
           </w:p>
         </w:tc>
         <w:tc>
@@ -14744,6 +16655,13 @@
                 <w:color w:val="000000" w:themeColor="text1"/>
               </w:rPr>
             </w:pPr>
+            <w:r>
+              <w:rPr>
+                <w:rFonts w:ascii="Arial" w:hAnsi="Arial" w:cs="Arial"/>
+                <w:color w:val="000000" w:themeColor="text1"/>
+              </w:rPr>
+              <w:t>0.999</w:t>
+            </w:r>
           </w:p>
         </w:tc>
         <w:tc>
@@ -14759,12 +16677,18 @@
                 <w:color w:val="000000" w:themeColor="text1"/>
               </w:rPr>
             </w:pPr>
+            <w:r>
+              <w:rPr>
+                <w:rFonts w:ascii="Arial" w:hAnsi="Arial" w:cs="Arial"/>
+                <w:color w:val="000000" w:themeColor="text1"/>
+              </w:rPr>
+              <w:t>0.399</w:t>
+            </w:r>
           </w:p>
         </w:tc>
         <w:tc>
           <w:tcPr>
             <w:tcW w:w="762" w:type="dxa"/>
-            <w:vAlign w:val="center"/>
           </w:tcPr>
           <w:p>
             <w:pPr>
@@ -14774,11 +16698,17 @@
                 <w:color w:val="000000" w:themeColor="text1"/>
               </w:rPr>
             </w:pPr>
-          </w:p>
-        </w:tc>
-        <w:tc>
-          <w:tcPr>
-            <w:tcW w:w="885" w:type="dxa"/>
+            <w:r>
+              <w:rPr>
+                <w:rFonts w:ascii="Arial" w:hAnsi="Arial" w:cs="Arial"/>
+              </w:rPr>
+              <w:t>---</w:t>
+            </w:r>
+          </w:p>
+        </w:tc>
+        <w:tc>
+          <w:tcPr>
+            <w:tcW w:w="1029" w:type="dxa"/>
             <w:vAlign w:val="center"/>
           </w:tcPr>
           <w:p>
@@ -14789,21 +16719,46 @@
                 <w:color w:val="000000" w:themeColor="text1"/>
               </w:rPr>
             </w:pPr>
-          </w:p>
-        </w:tc>
-        <w:tc>
-          <w:tcPr>
-            <w:tcW w:w="949" w:type="dxa"/>
-            <w:vAlign w:val="center"/>
-          </w:tcPr>
-          <w:p>
-            <w:pPr>
-              <w:jc w:val="center"/>
+            <w:r>
               <w:rPr>
                 <w:rFonts w:ascii="Arial" w:hAnsi="Arial" w:cs="Arial"/>
                 <w:color w:val="000000" w:themeColor="text1"/>
               </w:rPr>
-            </w:pPr>
+              <w:t>2.502</w:t>
+            </w:r>
+            <w:r>
+              <w:rPr>
+                <w:rFonts w:ascii="Arial" w:hAnsi="Arial" w:cs="Arial"/>
+                <w:color w:val="000000" w:themeColor="text1"/>
+              </w:rPr>
+              <w:t>*</w:t>
+            </w:r>
+          </w:p>
+        </w:tc>
+        <w:tc>
+          <w:tcPr>
+            <w:tcW w:w="805" w:type="dxa"/>
+            <w:vAlign w:val="center"/>
+          </w:tcPr>
+          <w:p>
+            <w:pPr>
+              <w:jc w:val="center"/>
+              <w:rPr>
+                <w:rFonts w:ascii="Arial" w:hAnsi="Arial" w:cs="Arial"/>
+                <w:b/>
+                <w:bCs/>
+                <w:color w:val="000000" w:themeColor="text1"/>
+              </w:rPr>
+            </w:pPr>
+            <w:r>
+              <w:rPr>
+                <w:rFonts w:ascii="Arial" w:hAnsi="Arial" w:cs="Arial"/>
+                <w:b/>
+                <w:bCs/>
+                <w:color w:val="000000" w:themeColor="text1"/>
+              </w:rPr>
+              <w:t>0.012</w:t>
+            </w:r>
           </w:p>
         </w:tc>
       </w:tr>
@@ -14888,6 +16843,24 @@
                 <w:rFonts w:ascii="Arial" w:hAnsi="Arial" w:cs="Arial"/>
               </w:rPr>
             </w:pPr>
+            <w:r>
+              <w:rPr>
+                <w:rFonts w:ascii="Arial" w:hAnsi="Arial" w:cs="Arial"/>
+              </w:rPr>
+              <w:t xml:space="preserve">15˚C v. </w:t>
+            </w:r>
+            <w:r>
+              <w:rPr>
+                <w:rFonts w:ascii="Arial" w:hAnsi="Arial" w:cs="Arial"/>
+              </w:rPr>
+              <w:t>21</w:t>
+            </w:r>
+            <w:r>
+              <w:rPr>
+                <w:rFonts w:ascii="Arial" w:hAnsi="Arial" w:cs="Arial"/>
+              </w:rPr>
+              <w:t>˚C</w:t>
+            </w:r>
           </w:p>
         </w:tc>
         <w:tc>
@@ -14903,6 +16876,13 @@
                 <w:color w:val="000000" w:themeColor="text1"/>
               </w:rPr>
             </w:pPr>
+            <w:r>
+              <w:rPr>
+                <w:rFonts w:ascii="Arial" w:hAnsi="Arial" w:cs="Arial"/>
+                <w:color w:val="000000" w:themeColor="text1"/>
+              </w:rPr>
+              <w:t>1.094</w:t>
+            </w:r>
           </w:p>
         </w:tc>
         <w:tc>
@@ -14918,12 +16898,18 @@
                 <w:color w:val="000000" w:themeColor="text1"/>
               </w:rPr>
             </w:pPr>
+            <w:r>
+              <w:rPr>
+                <w:rFonts w:ascii="Arial" w:hAnsi="Arial" w:cs="Arial"/>
+                <w:color w:val="000000" w:themeColor="text1"/>
+              </w:rPr>
+              <w:t>0.433</w:t>
+            </w:r>
           </w:p>
         </w:tc>
         <w:tc>
           <w:tcPr>
             <w:tcW w:w="762" w:type="dxa"/>
-            <w:vAlign w:val="center"/>
           </w:tcPr>
           <w:p>
             <w:pPr>
@@ -14933,11 +16919,17 @@
                 <w:color w:val="000000" w:themeColor="text1"/>
               </w:rPr>
             </w:pPr>
-          </w:p>
-        </w:tc>
-        <w:tc>
-          <w:tcPr>
-            <w:tcW w:w="885" w:type="dxa"/>
+            <w:r>
+              <w:rPr>
+                <w:rFonts w:ascii="Arial" w:hAnsi="Arial" w:cs="Arial"/>
+              </w:rPr>
+              <w:t>---</w:t>
+            </w:r>
+          </w:p>
+        </w:tc>
+        <w:tc>
+          <w:tcPr>
+            <w:tcW w:w="1029" w:type="dxa"/>
             <w:vAlign w:val="center"/>
           </w:tcPr>
           <w:p>
@@ -14948,21 +16940,55 @@
                 <w:color w:val="000000" w:themeColor="text1"/>
               </w:rPr>
             </w:pPr>
-          </w:p>
-        </w:tc>
-        <w:tc>
-          <w:tcPr>
-            <w:tcW w:w="949" w:type="dxa"/>
-            <w:vAlign w:val="center"/>
-          </w:tcPr>
-          <w:p>
-            <w:pPr>
-              <w:jc w:val="center"/>
+            <w:r>
               <w:rPr>
                 <w:rFonts w:ascii="Arial" w:hAnsi="Arial" w:cs="Arial"/>
                 <w:color w:val="000000" w:themeColor="text1"/>
               </w:rPr>
-            </w:pPr>
+              <w:t>2.524</w:t>
+            </w:r>
+            <w:r>
+              <w:rPr>
+                <w:rFonts w:ascii="Arial" w:hAnsi="Arial" w:cs="Arial"/>
+                <w:color w:val="000000" w:themeColor="text1"/>
+              </w:rPr>
+              <w:t>*</w:t>
+            </w:r>
+          </w:p>
+        </w:tc>
+        <w:tc>
+          <w:tcPr>
+            <w:tcW w:w="805" w:type="dxa"/>
+            <w:vAlign w:val="center"/>
+          </w:tcPr>
+          <w:p>
+            <w:pPr>
+              <w:jc w:val="center"/>
+              <w:rPr>
+                <w:rFonts w:ascii="Arial" w:hAnsi="Arial" w:cs="Arial"/>
+                <w:b/>
+                <w:bCs/>
+                <w:color w:val="000000" w:themeColor="text1"/>
+              </w:rPr>
+            </w:pPr>
+            <w:r>
+              <w:rPr>
+                <w:rFonts w:ascii="Arial" w:hAnsi="Arial" w:cs="Arial"/>
+                <w:b/>
+                <w:bCs/>
+                <w:color w:val="000000" w:themeColor="text1"/>
+              </w:rPr>
+              <w:t>0.01</w:t>
+            </w:r>
+            <w:r>
+              <w:rPr>
+                <w:rFonts w:ascii="Arial" w:hAnsi="Arial" w:cs="Arial"/>
+                <w:b/>
+                <w:bCs/>
+                <w:color w:val="000000" w:themeColor="text1"/>
+              </w:rPr>
+              <w:t>2</w:t>
+            </w:r>
           </w:p>
         </w:tc>
       </w:tr>
@@ -15041,6 +17067,24 @@
                 <w:rFonts w:ascii="Arial" w:hAnsi="Arial" w:cs="Arial"/>
               </w:rPr>
             </w:pPr>
+            <w:r>
+              <w:rPr>
+                <w:rFonts w:ascii="Arial" w:hAnsi="Arial" w:cs="Arial"/>
+              </w:rPr>
+              <w:t xml:space="preserve">15˚C v. </w:t>
+            </w:r>
+            <w:r>
+              <w:rPr>
+                <w:rFonts w:ascii="Arial" w:hAnsi="Arial" w:cs="Arial"/>
+              </w:rPr>
+              <w:t>21</w:t>
+            </w:r>
+            <w:r>
+              <w:rPr>
+                <w:rFonts w:ascii="Arial" w:hAnsi="Arial" w:cs="Arial"/>
+              </w:rPr>
+              <w:t>˚C</w:t>
+            </w:r>
           </w:p>
         </w:tc>
         <w:tc>
@@ -15056,6 +17100,13 @@
                 <w:color w:val="000000" w:themeColor="text1"/>
               </w:rPr>
             </w:pPr>
+            <w:r>
+              <w:rPr>
+                <w:rFonts w:ascii="Arial" w:hAnsi="Arial" w:cs="Arial"/>
+                <w:color w:val="000000" w:themeColor="text1"/>
+              </w:rPr>
+              <w:t>0.473</w:t>
+            </w:r>
           </w:p>
         </w:tc>
         <w:tc>
@@ -15071,12 +17122,18 @@
                 <w:color w:val="000000" w:themeColor="text1"/>
               </w:rPr>
             </w:pPr>
+            <w:r>
+              <w:rPr>
+                <w:rFonts w:ascii="Arial" w:hAnsi="Arial" w:cs="Arial"/>
+                <w:color w:val="000000" w:themeColor="text1"/>
+              </w:rPr>
+              <w:t>0.427</w:t>
+            </w:r>
           </w:p>
         </w:tc>
         <w:tc>
           <w:tcPr>
             <w:tcW w:w="762" w:type="dxa"/>
-            <w:vAlign w:val="center"/>
           </w:tcPr>
           <w:p>
             <w:pPr>
@@ -15086,11 +17143,17 @@
                 <w:color w:val="000000" w:themeColor="text1"/>
               </w:rPr>
             </w:pPr>
-          </w:p>
-        </w:tc>
-        <w:tc>
-          <w:tcPr>
-            <w:tcW w:w="885" w:type="dxa"/>
+            <w:r>
+              <w:rPr>
+                <w:rFonts w:ascii="Arial" w:hAnsi="Arial" w:cs="Arial"/>
+              </w:rPr>
+              <w:t>---</w:t>
+            </w:r>
+          </w:p>
+        </w:tc>
+        <w:tc>
+          <w:tcPr>
+            <w:tcW w:w="1029" w:type="dxa"/>
             <w:vAlign w:val="center"/>
           </w:tcPr>
           <w:p>
@@ -15101,21 +17164,42 @@
                 <w:color w:val="000000" w:themeColor="text1"/>
               </w:rPr>
             </w:pPr>
-          </w:p>
-        </w:tc>
-        <w:tc>
-          <w:tcPr>
-            <w:tcW w:w="949" w:type="dxa"/>
-            <w:vAlign w:val="center"/>
-          </w:tcPr>
-          <w:p>
-            <w:pPr>
-              <w:jc w:val="center"/>
+            <w:r>
               <w:rPr>
                 <w:rFonts w:ascii="Arial" w:hAnsi="Arial" w:cs="Arial"/>
                 <w:color w:val="000000" w:themeColor="text1"/>
               </w:rPr>
-            </w:pPr>
+              <w:t>1.109</w:t>
+            </w:r>
+            <w:r>
+              <w:rPr>
+                <w:rFonts w:ascii="Arial" w:hAnsi="Arial" w:cs="Arial"/>
+                <w:color w:val="000000" w:themeColor="text1"/>
+              </w:rPr>
+              <w:t>*</w:t>
+            </w:r>
+          </w:p>
+        </w:tc>
+        <w:tc>
+          <w:tcPr>
+            <w:tcW w:w="805" w:type="dxa"/>
+            <w:vAlign w:val="center"/>
+          </w:tcPr>
+          <w:p>
+            <w:pPr>
+              <w:jc w:val="center"/>
+              <w:rPr>
+                <w:rFonts w:ascii="Arial" w:hAnsi="Arial" w:cs="Arial"/>
+                <w:color w:val="000000" w:themeColor="text1"/>
+              </w:rPr>
+            </w:pPr>
+            <w:r>
+              <w:rPr>
+                <w:rFonts w:ascii="Arial" w:hAnsi="Arial" w:cs="Arial"/>
+                <w:color w:val="000000" w:themeColor="text1"/>
+              </w:rPr>
+              <w:t>0.267</w:t>
+            </w:r>
           </w:p>
         </w:tc>
       </w:tr>
@@ -15194,6 +17278,36 @@
                 <w:rFonts w:ascii="Arial" w:hAnsi="Arial" w:cs="Arial"/>
               </w:rPr>
             </w:pPr>
+            <w:r>
+              <w:rPr>
+                <w:rFonts w:ascii="Arial" w:hAnsi="Arial" w:cs="Arial"/>
+              </w:rPr>
+              <w:t>1</w:t>
+            </w:r>
+            <w:r>
+              <w:rPr>
+                <w:rFonts w:ascii="Arial" w:hAnsi="Arial" w:cs="Arial"/>
+              </w:rPr>
+              <w:t>5</w:t>
+            </w:r>
+            <w:r>
+              <w:rPr>
+                <w:rFonts w:ascii="Arial" w:hAnsi="Arial" w:cs="Arial"/>
+              </w:rPr>
+              <w:t xml:space="preserve">˚C v. </w:t>
+            </w:r>
+            <w:r>
+              <w:rPr>
+                <w:rFonts w:ascii="Arial" w:hAnsi="Arial" w:cs="Arial"/>
+              </w:rPr>
+              <w:t>2</w:t>
+            </w:r>
+            <w:r>
+              <w:rPr>
+                <w:rFonts w:ascii="Arial" w:hAnsi="Arial" w:cs="Arial"/>
+              </w:rPr>
+              <w:t>1˚C</w:t>
+            </w:r>
           </w:p>
         </w:tc>
         <w:tc>
@@ -15209,6 +17323,13 @@
                 <w:color w:val="000000" w:themeColor="text1"/>
               </w:rPr>
             </w:pPr>
+            <w:r>
+              <w:rPr>
+                <w:rFonts w:ascii="Arial" w:hAnsi="Arial" w:cs="Arial"/>
+                <w:color w:val="000000" w:themeColor="text1"/>
+              </w:rPr>
+              <w:t>0.346</w:t>
+            </w:r>
           </w:p>
         </w:tc>
         <w:tc>
@@ -15224,12 +17345,18 @@
                 <w:color w:val="000000" w:themeColor="text1"/>
               </w:rPr>
             </w:pPr>
+            <w:r>
+              <w:rPr>
+                <w:rFonts w:ascii="Arial" w:hAnsi="Arial" w:cs="Arial"/>
+                <w:color w:val="000000" w:themeColor="text1"/>
+              </w:rPr>
+              <w:t>0.409</w:t>
+            </w:r>
           </w:p>
         </w:tc>
         <w:tc>
           <w:tcPr>
             <w:tcW w:w="762" w:type="dxa"/>
-            <w:vAlign w:val="center"/>
           </w:tcPr>
           <w:p>
             <w:pPr>
@@ -15239,11 +17366,17 @@
                 <w:color w:val="000000" w:themeColor="text1"/>
               </w:rPr>
             </w:pPr>
-          </w:p>
-        </w:tc>
-        <w:tc>
-          <w:tcPr>
-            <w:tcW w:w="885" w:type="dxa"/>
+            <w:r>
+              <w:rPr>
+                <w:rFonts w:ascii="Arial" w:hAnsi="Arial" w:cs="Arial"/>
+              </w:rPr>
+              <w:t>---</w:t>
+            </w:r>
+          </w:p>
+        </w:tc>
+        <w:tc>
+          <w:tcPr>
+            <w:tcW w:w="1029" w:type="dxa"/>
             <w:vAlign w:val="center"/>
           </w:tcPr>
           <w:p>
@@ -15254,21 +17387,42 @@
                 <w:color w:val="000000" w:themeColor="text1"/>
               </w:rPr>
             </w:pPr>
-          </w:p>
-        </w:tc>
-        <w:tc>
-          <w:tcPr>
-            <w:tcW w:w="949" w:type="dxa"/>
-            <w:vAlign w:val="center"/>
-          </w:tcPr>
-          <w:p>
-            <w:pPr>
-              <w:jc w:val="center"/>
+            <w:r>
               <w:rPr>
                 <w:rFonts w:ascii="Arial" w:hAnsi="Arial" w:cs="Arial"/>
                 <w:color w:val="000000" w:themeColor="text1"/>
               </w:rPr>
-            </w:pPr>
+              <w:t>-0.845</w:t>
+            </w:r>
+            <w:r>
+              <w:rPr>
+                <w:rFonts w:ascii="Arial" w:hAnsi="Arial" w:cs="Arial"/>
+                <w:color w:val="000000" w:themeColor="text1"/>
+              </w:rPr>
+              <w:t>*</w:t>
+            </w:r>
+          </w:p>
+        </w:tc>
+        <w:tc>
+          <w:tcPr>
+            <w:tcW w:w="805" w:type="dxa"/>
+            <w:vAlign w:val="center"/>
+          </w:tcPr>
+          <w:p>
+            <w:pPr>
+              <w:jc w:val="center"/>
+              <w:rPr>
+                <w:rFonts w:ascii="Arial" w:hAnsi="Arial" w:cs="Arial"/>
+                <w:color w:val="000000" w:themeColor="text1"/>
+              </w:rPr>
+            </w:pPr>
+            <w:r>
+              <w:rPr>
+                <w:rFonts w:ascii="Arial" w:hAnsi="Arial" w:cs="Arial"/>
+                <w:color w:val="000000" w:themeColor="text1"/>
+              </w:rPr>
+              <w:t>0.398</w:t>
+            </w:r>
           </w:p>
         </w:tc>
       </w:tr>
@@ -15437,7 +17591,7 @@
         </w:tc>
         <w:tc>
           <w:tcPr>
-            <w:tcW w:w="885" w:type="dxa"/>
+            <w:tcW w:w="1029" w:type="dxa"/>
             <w:vAlign w:val="center"/>
           </w:tcPr>
           <w:p>
@@ -15459,7 +17613,7 @@
         </w:tc>
         <w:tc>
           <w:tcPr>
-            <w:tcW w:w="949" w:type="dxa"/>
+            <w:tcW w:w="805" w:type="dxa"/>
             <w:vAlign w:val="center"/>
           </w:tcPr>
           <w:p>
@@ -15639,7 +17793,7 @@
         </w:tc>
         <w:tc>
           <w:tcPr>
-            <w:tcW w:w="885" w:type="dxa"/>
+            <w:tcW w:w="1029" w:type="dxa"/>
             <w:vAlign w:val="center"/>
           </w:tcPr>
           <w:p>
@@ -15661,7 +17815,7 @@
         </w:tc>
         <w:tc>
           <w:tcPr>
-            <w:tcW w:w="949" w:type="dxa"/>
+            <w:tcW w:w="805" w:type="dxa"/>
             <w:vAlign w:val="center"/>
           </w:tcPr>
           <w:p>
@@ -15839,7 +17993,7 @@
         </w:tc>
         <w:tc>
           <w:tcPr>
-            <w:tcW w:w="885" w:type="dxa"/>
+            <w:tcW w:w="1029" w:type="dxa"/>
             <w:vAlign w:val="center"/>
           </w:tcPr>
           <w:p>
@@ -15861,7 +18015,7 @@
         </w:tc>
         <w:tc>
           <w:tcPr>
-            <w:tcW w:w="949" w:type="dxa"/>
+            <w:tcW w:w="805" w:type="dxa"/>
             <w:vAlign w:val="center"/>
           </w:tcPr>
           <w:p>
@@ -16035,7 +18189,7 @@
         </w:tc>
         <w:tc>
           <w:tcPr>
-            <w:tcW w:w="885" w:type="dxa"/>
+            <w:tcW w:w="1029" w:type="dxa"/>
             <w:vAlign w:val="center"/>
           </w:tcPr>
           <w:p>
@@ -16057,7 +18211,7 @@
         </w:tc>
         <w:tc>
           <w:tcPr>
-            <w:tcW w:w="949" w:type="dxa"/>
+            <w:tcW w:w="805" w:type="dxa"/>
             <w:vAlign w:val="center"/>
           </w:tcPr>
           <w:p>
@@ -16206,7 +18360,7 @@
         </w:tc>
         <w:tc>
           <w:tcPr>
-            <w:tcW w:w="885" w:type="dxa"/>
+            <w:tcW w:w="1029" w:type="dxa"/>
             <w:vAlign w:val="center"/>
           </w:tcPr>
           <w:p>
@@ -16221,7 +18375,7 @@
         </w:tc>
         <w:tc>
           <w:tcPr>
-            <w:tcW w:w="949" w:type="dxa"/>
+            <w:tcW w:w="805" w:type="dxa"/>
             <w:vAlign w:val="center"/>
           </w:tcPr>
           <w:p>
@@ -16367,7 +18521,7 @@
         </w:tc>
         <w:tc>
           <w:tcPr>
-            <w:tcW w:w="885" w:type="dxa"/>
+            <w:tcW w:w="1029" w:type="dxa"/>
             <w:vAlign w:val="center"/>
           </w:tcPr>
           <w:p>
@@ -16382,7 +18536,7 @@
         </w:tc>
         <w:tc>
           <w:tcPr>
-            <w:tcW w:w="949" w:type="dxa"/>
+            <w:tcW w:w="805" w:type="dxa"/>
             <w:vAlign w:val="center"/>
           </w:tcPr>
           <w:p>
@@ -16522,7 +18676,7 @@
         </w:tc>
         <w:tc>
           <w:tcPr>
-            <w:tcW w:w="885" w:type="dxa"/>
+            <w:tcW w:w="1029" w:type="dxa"/>
             <w:vAlign w:val="center"/>
           </w:tcPr>
           <w:p>
@@ -16537,7 +18691,7 @@
         </w:tc>
         <w:tc>
           <w:tcPr>
-            <w:tcW w:w="949" w:type="dxa"/>
+            <w:tcW w:w="805" w:type="dxa"/>
             <w:vAlign w:val="center"/>
           </w:tcPr>
           <w:p>
@@ -16677,7 +18831,7 @@
         </w:tc>
         <w:tc>
           <w:tcPr>
-            <w:tcW w:w="885" w:type="dxa"/>
+            <w:tcW w:w="1029" w:type="dxa"/>
             <w:vAlign w:val="center"/>
           </w:tcPr>
           <w:p>
@@ -16692,7 +18846,7 @@
         </w:tc>
         <w:tc>
           <w:tcPr>
-            <w:tcW w:w="949" w:type="dxa"/>
+            <w:tcW w:w="805" w:type="dxa"/>
             <w:vAlign w:val="center"/>
           </w:tcPr>
           <w:p>
@@ -16868,7 +19022,7 @@
         </w:tc>
         <w:tc>
           <w:tcPr>
-            <w:tcW w:w="885" w:type="dxa"/>
+            <w:tcW w:w="1029" w:type="dxa"/>
             <w:vAlign w:val="center"/>
           </w:tcPr>
           <w:p>
@@ -16889,7 +19043,7 @@
         </w:tc>
         <w:tc>
           <w:tcPr>
-            <w:tcW w:w="949" w:type="dxa"/>
+            <w:tcW w:w="805" w:type="dxa"/>
             <w:vAlign w:val="center"/>
           </w:tcPr>
           <w:p>
@@ -17063,7 +19217,7 @@
         </w:tc>
         <w:tc>
           <w:tcPr>
-            <w:tcW w:w="885" w:type="dxa"/>
+            <w:tcW w:w="1029" w:type="dxa"/>
             <w:vAlign w:val="center"/>
           </w:tcPr>
           <w:p>
@@ -17084,7 +19238,7 @@
         </w:tc>
         <w:tc>
           <w:tcPr>
-            <w:tcW w:w="949" w:type="dxa"/>
+            <w:tcW w:w="805" w:type="dxa"/>
             <w:vAlign w:val="center"/>
           </w:tcPr>
           <w:p>
@@ -17252,7 +19406,7 @@
         </w:tc>
         <w:tc>
           <w:tcPr>
-            <w:tcW w:w="885" w:type="dxa"/>
+            <w:tcW w:w="1029" w:type="dxa"/>
             <w:vAlign w:val="center"/>
           </w:tcPr>
           <w:p>
@@ -17273,7 +19427,7 @@
         </w:tc>
         <w:tc>
           <w:tcPr>
-            <w:tcW w:w="949" w:type="dxa"/>
+            <w:tcW w:w="805" w:type="dxa"/>
             <w:vAlign w:val="center"/>
           </w:tcPr>
           <w:p>
@@ -17441,7 +19595,7 @@
         </w:tc>
         <w:tc>
           <w:tcPr>
-            <w:tcW w:w="885" w:type="dxa"/>
+            <w:tcW w:w="1029" w:type="dxa"/>
             <w:vAlign w:val="center"/>
           </w:tcPr>
           <w:p>
@@ -17462,7 +19616,7 @@
         </w:tc>
         <w:tc>
           <w:tcPr>
-            <w:tcW w:w="949" w:type="dxa"/>
+            <w:tcW w:w="805" w:type="dxa"/>
             <w:vAlign w:val="center"/>
           </w:tcPr>
           <w:p>
@@ -17606,7 +19760,7 @@
         </w:tc>
         <w:tc>
           <w:tcPr>
-            <w:tcW w:w="885" w:type="dxa"/>
+            <w:tcW w:w="1029" w:type="dxa"/>
             <w:vAlign w:val="center"/>
           </w:tcPr>
           <w:p>
@@ -17621,7 +19775,7 @@
         </w:tc>
         <w:tc>
           <w:tcPr>
-            <w:tcW w:w="949" w:type="dxa"/>
+            <w:tcW w:w="805" w:type="dxa"/>
             <w:vAlign w:val="center"/>
           </w:tcPr>
           <w:p>
@@ -17765,7 +19919,7 @@
         </w:tc>
         <w:tc>
           <w:tcPr>
-            <w:tcW w:w="885" w:type="dxa"/>
+            <w:tcW w:w="1029" w:type="dxa"/>
             <w:vAlign w:val="center"/>
           </w:tcPr>
           <w:p>
@@ -17780,7 +19934,7 @@
         </w:tc>
         <w:tc>
           <w:tcPr>
-            <w:tcW w:w="949" w:type="dxa"/>
+            <w:tcW w:w="805" w:type="dxa"/>
             <w:vAlign w:val="center"/>
           </w:tcPr>
           <w:p>
@@ -17918,7 +20072,7 @@
         </w:tc>
         <w:tc>
           <w:tcPr>
-            <w:tcW w:w="885" w:type="dxa"/>
+            <w:tcW w:w="1029" w:type="dxa"/>
             <w:vAlign w:val="center"/>
           </w:tcPr>
           <w:p>
@@ -17933,7 +20087,7 @@
         </w:tc>
         <w:tc>
           <w:tcPr>
-            <w:tcW w:w="949" w:type="dxa"/>
+            <w:tcW w:w="805" w:type="dxa"/>
             <w:vAlign w:val="center"/>
           </w:tcPr>
           <w:p>
@@ -18071,7 +20225,7 @@
         </w:tc>
         <w:tc>
           <w:tcPr>
-            <w:tcW w:w="885" w:type="dxa"/>
+            <w:tcW w:w="1029" w:type="dxa"/>
             <w:vAlign w:val="center"/>
           </w:tcPr>
           <w:p>
@@ -18086,7 +20240,7 @@
         </w:tc>
         <w:tc>
           <w:tcPr>
-            <w:tcW w:w="949" w:type="dxa"/>
+            <w:tcW w:w="805" w:type="dxa"/>
             <w:vAlign w:val="center"/>
           </w:tcPr>
           <w:p>

</xml_diff>

<commit_message>
interpreted CI data for O. lurida, C. sikamea, M. gigas
</commit_message>
<xml_diff>
--- a/writing/Chapter 1.docx
+++ b/writing/Chapter 1.docx
@@ -41,7 +41,27 @@
           <w:sz w:val="28"/>
           <w:szCs w:val="28"/>
         </w:rPr>
-        <w:t xml:space="preserve">March 29 – X </w:t>
+        <w:t xml:space="preserve">March 29 – </w:t>
+      </w:r>
+      <w:r>
+        <w:rPr>
+          <w:rFonts w:ascii="Arial" w:hAnsi="Arial" w:cs="Arial"/>
+          <w:b/>
+          <w:bCs/>
+          <w:sz w:val="28"/>
+          <w:szCs w:val="28"/>
+        </w:rPr>
+        <w:t>969</w:t>
+      </w:r>
+      <w:r>
+        <w:rPr>
+          <w:rFonts w:ascii="Arial" w:hAnsi="Arial" w:cs="Arial"/>
+          <w:b/>
+          <w:bCs/>
+          <w:sz w:val="28"/>
+          <w:szCs w:val="28"/>
+        </w:rPr>
+        <w:t xml:space="preserve"> words (as of 4:51pm)</w:t>
       </w:r>
     </w:p>
     <w:p>
@@ -5109,7 +5129,21 @@
           <w:rFonts w:ascii="Arial" w:hAnsi="Arial" w:cs="Arial"/>
           <w:color w:val="7030A0"/>
         </w:rPr>
-        <w:t>% smaller oysters that were fully submerged (</w:t>
+        <w:t>% smaller</w:t>
+      </w:r>
+      <w:r>
+        <w:rPr>
+          <w:rFonts w:ascii="Arial" w:hAnsi="Arial" w:cs="Arial"/>
+          <w:color w:val="7030A0"/>
+        </w:rPr>
+        <w:t xml:space="preserve"> than</w:t>
+      </w:r>
+      <w:r>
+        <w:rPr>
+          <w:rFonts w:ascii="Arial" w:hAnsi="Arial" w:cs="Arial"/>
+          <w:color w:val="7030A0"/>
+        </w:rPr>
+        <w:t xml:space="preserve"> oysters that were fully submerged (</w:t>
       </w:r>
       <w:r>
         <w:rPr>
@@ -5201,36 +5235,1148 @@
         </w:rPr>
         <w:t xml:space="preserve">-- </w:t>
       </w:r>
+      <w:r>
+        <w:rPr>
+          <w:rFonts w:ascii="Arial" w:hAnsi="Arial" w:cs="Arial"/>
+          <w:color w:val="7030A0"/>
+        </w:rPr>
+        <w:t>Stress hardening</w:t>
+      </w:r>
+      <w:r>
+        <w:rPr>
+          <w:rFonts w:ascii="Arial" w:hAnsi="Arial" w:cs="Arial"/>
+          <w:color w:val="7030A0"/>
+        </w:rPr>
+        <w:t xml:space="preserve"> temperature </w:t>
+      </w:r>
+      <w:r>
+        <w:rPr>
+          <w:rFonts w:ascii="Arial" w:hAnsi="Arial" w:cs="Arial"/>
+          <w:color w:val="7030A0"/>
+        </w:rPr>
+        <w:t>(</w:t>
+      </w:r>
+      <w:r>
+        <w:rPr>
+          <w:rFonts w:ascii="Arial" w:hAnsi="Arial" w:cs="Arial"/>
+          <w:i/>
+          <w:iCs/>
+          <w:color w:val="7030A0"/>
+        </w:rPr>
+        <w:t>P</w:t>
+      </w:r>
+      <w:r>
+        <w:rPr>
+          <w:rFonts w:ascii="Arial" w:hAnsi="Arial" w:cs="Arial"/>
+          <w:color w:val="7030A0"/>
+        </w:rPr>
+        <w:t xml:space="preserve"> </w:t>
+      </w:r>
+      <w:r>
+        <w:rPr>
+          <w:rFonts w:ascii="Arial" w:hAnsi="Arial" w:cs="Arial"/>
+          <w:color w:val="7030A0"/>
+        </w:rPr>
+        <w:t>=</w:t>
+      </w:r>
+      <w:r>
+        <w:rPr>
+          <w:rFonts w:ascii="Arial" w:hAnsi="Arial" w:cs="Arial"/>
+          <w:color w:val="7030A0"/>
+        </w:rPr>
+        <w:t xml:space="preserve"> 0.0</w:t>
+      </w:r>
+      <w:r>
+        <w:rPr>
+          <w:rFonts w:ascii="Arial" w:hAnsi="Arial" w:cs="Arial"/>
+          <w:color w:val="7030A0"/>
+        </w:rPr>
+        <w:t xml:space="preserve">12, </w:t>
+      </w:r>
+      <w:r>
+        <w:rPr>
+          <w:rFonts w:ascii="Arial" w:hAnsi="Arial" w:cs="Arial"/>
+          <w:color w:val="7030A0"/>
+        </w:rPr>
+        <w:t xml:space="preserve">Table </w:t>
+      </w:r>
+      <w:r>
+        <w:rPr>
+          <w:rFonts w:ascii="Arial" w:hAnsi="Arial" w:cs="Arial"/>
+          <w:b/>
+          <w:bCs/>
+          <w:color w:val="7030A0"/>
+        </w:rPr>
+        <w:t>GROWTH</w:t>
+      </w:r>
+      <w:r>
+        <w:rPr>
+          <w:rFonts w:ascii="Arial" w:hAnsi="Arial" w:cs="Arial"/>
+          <w:color w:val="7030A0"/>
+        </w:rPr>
+        <w:t>)</w:t>
+      </w:r>
+      <w:r>
+        <w:rPr>
+          <w:rFonts w:ascii="Arial" w:hAnsi="Arial" w:cs="Arial"/>
+          <w:color w:val="7030A0"/>
+        </w:rPr>
+        <w:t xml:space="preserve"> influenced</w:t>
+      </w:r>
+      <w:r>
+        <w:rPr>
+          <w:rFonts w:ascii="Arial" w:hAnsi="Arial" w:cs="Arial"/>
+          <w:color w:val="7030A0"/>
+        </w:rPr>
+        <w:t xml:space="preserve"> </w:t>
+      </w:r>
+      <w:r>
+        <w:rPr>
+          <w:rFonts w:ascii="Arial" w:hAnsi="Arial" w:cs="Arial"/>
+          <w:i/>
+          <w:iCs/>
+          <w:color w:val="7030A0"/>
+        </w:rPr>
+        <w:t>O. lurida</w:t>
+      </w:r>
+      <w:r>
+        <w:rPr>
+          <w:rFonts w:ascii="Arial" w:hAnsi="Arial" w:cs="Arial"/>
+          <w:color w:val="7030A0"/>
+        </w:rPr>
+        <w:t xml:space="preserve"> </w:t>
+      </w:r>
+      <w:r>
+        <w:rPr>
+          <w:rFonts w:ascii="Arial" w:hAnsi="Arial" w:cs="Arial"/>
+          <w:color w:val="7030A0"/>
+        </w:rPr>
+        <w:t>CI</w:t>
+      </w:r>
+      <w:r>
+        <w:rPr>
+          <w:rFonts w:ascii="Arial" w:hAnsi="Arial" w:cs="Arial"/>
+          <w:color w:val="7030A0"/>
+        </w:rPr>
+        <w:t xml:space="preserve">, whereas tide and marine heatwave temperature did not </w:t>
+      </w:r>
+      <w:r>
+        <w:rPr>
+          <w:rFonts w:ascii="Arial" w:hAnsi="Arial" w:cs="Arial"/>
+          <w:color w:val="7030A0"/>
+        </w:rPr>
+        <w:t>(</w:t>
+      </w:r>
+      <w:r>
+        <w:rPr>
+          <w:rFonts w:ascii="Arial" w:hAnsi="Arial" w:cs="Arial"/>
+          <w:i/>
+          <w:iCs/>
+          <w:color w:val="7030A0"/>
+        </w:rPr>
+        <w:t>P</w:t>
+      </w:r>
+      <w:r>
+        <w:rPr>
+          <w:rFonts w:ascii="Arial" w:hAnsi="Arial" w:cs="Arial"/>
+          <w:color w:val="7030A0"/>
+        </w:rPr>
+        <w:t xml:space="preserve"> </w:t>
+      </w:r>
+      <w:r>
+        <w:rPr>
+          <w:rFonts w:ascii="Arial" w:hAnsi="Arial" w:cs="Arial"/>
+          <w:color w:val="7030A0"/>
+        </w:rPr>
+        <w:t>&gt;</w:t>
+      </w:r>
+      <w:r>
+        <w:rPr>
+          <w:rFonts w:ascii="Arial" w:hAnsi="Arial" w:cs="Arial"/>
+          <w:color w:val="7030A0"/>
+        </w:rPr>
+        <w:t xml:space="preserve"> 0.0</w:t>
+      </w:r>
+      <w:r>
+        <w:rPr>
+          <w:rFonts w:ascii="Arial" w:hAnsi="Arial" w:cs="Arial"/>
+          <w:color w:val="7030A0"/>
+        </w:rPr>
+        <w:t xml:space="preserve">5, </w:t>
+      </w:r>
+      <w:r>
+        <w:rPr>
+          <w:rFonts w:ascii="Arial" w:hAnsi="Arial" w:cs="Arial"/>
+          <w:color w:val="7030A0"/>
+        </w:rPr>
+        <w:t xml:space="preserve">Table </w:t>
+      </w:r>
+      <w:r>
+        <w:rPr>
+          <w:rFonts w:ascii="Arial" w:hAnsi="Arial" w:cs="Arial"/>
+          <w:b/>
+          <w:bCs/>
+          <w:color w:val="7030A0"/>
+        </w:rPr>
+        <w:t>GROWTH</w:t>
+      </w:r>
+      <w:r>
+        <w:rPr>
+          <w:rFonts w:ascii="Arial" w:hAnsi="Arial" w:cs="Arial"/>
+          <w:color w:val="7030A0"/>
+        </w:rPr>
+        <w:t>)</w:t>
+      </w:r>
+      <w:r>
+        <w:rPr>
+          <w:rFonts w:ascii="Arial" w:hAnsi="Arial" w:cs="Arial"/>
+          <w:color w:val="7030A0"/>
+        </w:rPr>
+        <w:t xml:space="preserve">, condition index being </w:t>
+      </w:r>
+      <w:r>
+        <w:rPr>
+          <w:rFonts w:ascii="Arial" w:hAnsi="Arial" w:cs="Arial"/>
+          <w:color w:val="7030A0"/>
+        </w:rPr>
+        <w:t>6</w:t>
+      </w:r>
+      <w:r>
+        <w:rPr>
+          <w:rFonts w:ascii="Arial" w:hAnsi="Arial" w:cs="Arial"/>
+          <w:color w:val="7030A0"/>
+        </w:rPr>
+        <w:t>.5</w:t>
+      </w:r>
+      <w:r>
+        <w:rPr>
+          <w:rFonts w:ascii="Arial" w:hAnsi="Arial" w:cs="Arial"/>
+          <w:color w:val="7030A0"/>
+        </w:rPr>
+        <w:t xml:space="preserve">% higher for oysters hardened at </w:t>
+      </w:r>
+      <w:r>
+        <w:rPr>
+          <w:rFonts w:ascii="Arial" w:hAnsi="Arial" w:cs="Arial"/>
+          <w:color w:val="7030A0"/>
+        </w:rPr>
+        <w:t>1</w:t>
+      </w:r>
+      <w:r>
+        <w:rPr>
+          <w:rFonts w:ascii="Arial" w:hAnsi="Arial" w:cs="Arial"/>
+          <w:color w:val="7030A0"/>
+        </w:rPr>
+        <w:t>5</w:t>
+      </w:r>
+      <w:r>
+        <w:rPr>
+          <w:rFonts w:ascii="Arial" w:hAnsi="Arial" w:cs="Arial"/>
+          <w:color w:val="7030A0"/>
+        </w:rPr>
+        <w:t>˚C</w:t>
+      </w:r>
+      <w:r>
+        <w:rPr>
+          <w:rFonts w:ascii="Arial" w:hAnsi="Arial" w:cs="Arial"/>
+          <w:color w:val="7030A0"/>
+        </w:rPr>
+        <w:t xml:space="preserve"> (</w:t>
+      </w:r>
+      <w:r>
+        <w:rPr>
+          <w:rFonts w:ascii="Arial" w:hAnsi="Arial" w:cs="Arial"/>
+          <w:color w:val="7030A0"/>
+        </w:rPr>
+        <w:t>7.51</w:t>
+      </w:r>
+      <w:r>
+        <w:rPr>
+          <w:rFonts w:ascii="Arial" w:hAnsi="Arial" w:cs="Arial"/>
+          <w:color w:val="7030A0"/>
+        </w:rPr>
+        <w:t xml:space="preserve"> </w:t>
+      </w:r>
+      <w:r>
+        <w:rPr>
+          <w:rFonts w:ascii="Arial" w:hAnsi="Arial" w:cs="Arial"/>
+          <w:color w:val="7030A0"/>
+        </w:rPr>
+        <w:t>±</w:t>
+      </w:r>
+      <w:r>
+        <w:rPr>
+          <w:rFonts w:ascii="Arial" w:hAnsi="Arial" w:cs="Arial"/>
+          <w:color w:val="7030A0"/>
+        </w:rPr>
+        <w:t xml:space="preserve"> 0.</w:t>
+      </w:r>
+      <w:r>
+        <w:rPr>
+          <w:rFonts w:ascii="Arial" w:hAnsi="Arial" w:cs="Arial"/>
+          <w:color w:val="7030A0"/>
+        </w:rPr>
+        <w:t>21</w:t>
+      </w:r>
+      <w:r>
+        <w:rPr>
+          <w:rFonts w:ascii="Arial" w:hAnsi="Arial" w:cs="Arial"/>
+          <w:color w:val="7030A0"/>
+        </w:rPr>
+        <w:t>)</w:t>
+      </w:r>
+      <w:r>
+        <w:rPr>
+          <w:rFonts w:ascii="Arial" w:hAnsi="Arial" w:cs="Arial"/>
+          <w:color w:val="7030A0"/>
+        </w:rPr>
+        <w:t xml:space="preserve"> </w:t>
+      </w:r>
+      <w:r>
+        <w:rPr>
+          <w:rFonts w:ascii="Arial" w:hAnsi="Arial" w:cs="Arial"/>
+          <w:color w:val="7030A0"/>
+        </w:rPr>
+        <w:t>compared to those at</w:t>
+      </w:r>
+      <w:r>
+        <w:rPr>
+          <w:rFonts w:ascii="Arial" w:hAnsi="Arial" w:cs="Arial"/>
+          <w:color w:val="7030A0"/>
+        </w:rPr>
+        <w:t xml:space="preserve"> 21</w:t>
+      </w:r>
+      <w:r>
+        <w:rPr>
+          <w:rFonts w:ascii="Arial" w:hAnsi="Arial" w:cs="Arial"/>
+          <w:color w:val="7030A0"/>
+        </w:rPr>
+        <w:t>˚C</w:t>
+      </w:r>
+      <w:r>
+        <w:rPr>
+          <w:rFonts w:ascii="Arial" w:hAnsi="Arial" w:cs="Arial"/>
+          <w:color w:val="7030A0"/>
+        </w:rPr>
+        <w:t xml:space="preserve"> (</w:t>
+      </w:r>
+      <w:r>
+        <w:rPr>
+          <w:rFonts w:ascii="Arial" w:hAnsi="Arial" w:cs="Arial"/>
+          <w:color w:val="7030A0"/>
+        </w:rPr>
+        <w:t>7.02</w:t>
+      </w:r>
+      <w:r>
+        <w:rPr>
+          <w:rFonts w:ascii="Arial" w:hAnsi="Arial" w:cs="Arial"/>
+          <w:color w:val="7030A0"/>
+        </w:rPr>
+        <w:t xml:space="preserve"> mg </w:t>
+      </w:r>
+      <w:r>
+        <w:rPr>
+          <w:rFonts w:ascii="Arial" w:hAnsi="Arial" w:cs="Arial"/>
+          <w:color w:val="7030A0"/>
+        </w:rPr>
+        <w:t>±</w:t>
+      </w:r>
+      <w:r>
+        <w:rPr>
+          <w:rFonts w:ascii="Arial" w:hAnsi="Arial" w:cs="Arial"/>
+          <w:color w:val="7030A0"/>
+        </w:rPr>
+        <w:t xml:space="preserve"> 0.</w:t>
+      </w:r>
+      <w:r>
+        <w:rPr>
+          <w:rFonts w:ascii="Arial" w:hAnsi="Arial" w:cs="Arial"/>
+          <w:color w:val="7030A0"/>
+        </w:rPr>
+        <w:t>21</w:t>
+      </w:r>
+      <w:r>
+        <w:rPr>
+          <w:rFonts w:ascii="Arial" w:hAnsi="Arial" w:cs="Arial"/>
+          <w:color w:val="7030A0"/>
+        </w:rPr>
+        <w:t>).</w:t>
+      </w:r>
+      <w:r>
+        <w:rPr>
+          <w:rFonts w:ascii="Arial" w:hAnsi="Arial" w:cs="Arial"/>
+          <w:color w:val="7030A0"/>
+        </w:rPr>
+        <w:t xml:space="preserve"> </w:t>
+      </w:r>
+      <w:r>
+        <w:rPr>
+          <w:rFonts w:ascii="Arial" w:hAnsi="Arial" w:cs="Arial"/>
+          <w:color w:val="7030A0"/>
+        </w:rPr>
+        <w:t xml:space="preserve">However, stress hardening and marine heatwave temperature did interact </w:t>
+      </w:r>
+      <w:r>
+        <w:rPr>
+          <w:rFonts w:ascii="Arial" w:hAnsi="Arial" w:cs="Arial"/>
+          <w:color w:val="7030A0"/>
+        </w:rPr>
+        <w:t>(</w:t>
+      </w:r>
+      <w:r>
+        <w:rPr>
+          <w:rFonts w:ascii="Arial" w:hAnsi="Arial" w:cs="Arial"/>
+          <w:i/>
+          <w:iCs/>
+          <w:color w:val="7030A0"/>
+        </w:rPr>
+        <w:t>P</w:t>
+      </w:r>
+      <w:r>
+        <w:rPr>
+          <w:rFonts w:ascii="Arial" w:hAnsi="Arial" w:cs="Arial"/>
+          <w:color w:val="7030A0"/>
+        </w:rPr>
+        <w:t xml:space="preserve"> </w:t>
+      </w:r>
+      <w:r>
+        <w:rPr>
+          <w:rFonts w:ascii="Arial" w:hAnsi="Arial" w:cs="Arial"/>
+          <w:color w:val="7030A0"/>
+        </w:rPr>
+        <w:t>=</w:t>
+      </w:r>
+      <w:r>
+        <w:rPr>
+          <w:rFonts w:ascii="Arial" w:hAnsi="Arial" w:cs="Arial"/>
+          <w:color w:val="7030A0"/>
+        </w:rPr>
+        <w:t xml:space="preserve"> 0.0</w:t>
+      </w:r>
+      <w:r>
+        <w:rPr>
+          <w:rFonts w:ascii="Arial" w:hAnsi="Arial" w:cs="Arial"/>
+          <w:color w:val="7030A0"/>
+        </w:rPr>
+        <w:t>2</w:t>
+      </w:r>
+      <w:r>
+        <w:rPr>
+          <w:rFonts w:ascii="Arial" w:hAnsi="Arial" w:cs="Arial"/>
+          <w:color w:val="7030A0"/>
+        </w:rPr>
+        <w:t xml:space="preserve">, </w:t>
+      </w:r>
+      <w:r>
+        <w:rPr>
+          <w:rFonts w:ascii="Arial" w:hAnsi="Arial" w:cs="Arial"/>
+          <w:color w:val="7030A0"/>
+        </w:rPr>
+        <w:t xml:space="preserve">Table </w:t>
+      </w:r>
+      <w:r>
+        <w:rPr>
+          <w:rFonts w:ascii="Arial" w:hAnsi="Arial" w:cs="Arial"/>
+          <w:b/>
+          <w:bCs/>
+          <w:color w:val="7030A0"/>
+        </w:rPr>
+        <w:t>GROWTH</w:t>
+      </w:r>
+      <w:r>
+        <w:rPr>
+          <w:rFonts w:ascii="Arial" w:hAnsi="Arial" w:cs="Arial"/>
+          <w:color w:val="7030A0"/>
+        </w:rPr>
+        <w:t>). A</w:t>
+      </w:r>
+      <w:r>
+        <w:rPr>
+          <w:rFonts w:ascii="Arial" w:hAnsi="Arial" w:cs="Arial"/>
+          <w:color w:val="7030A0"/>
+        </w:rPr>
+        <w:t>nd, a</w:t>
+      </w:r>
+      <w:r>
+        <w:rPr>
+          <w:rFonts w:ascii="Arial" w:hAnsi="Arial" w:cs="Arial"/>
+          <w:color w:val="7030A0"/>
+        </w:rPr>
+        <w:t xml:space="preserve"> pairwise comparison further demonstrated that </w:t>
+      </w:r>
+      <w:r>
+        <w:rPr>
+          <w:rFonts w:ascii="Arial" w:hAnsi="Arial" w:cs="Arial"/>
+          <w:color w:val="7030A0"/>
+        </w:rPr>
+        <w:t xml:space="preserve">CI for oysters that experienced the </w:t>
+      </w:r>
+      <w:r>
+        <w:rPr>
+          <w:rFonts w:ascii="Arial" w:hAnsi="Arial" w:cs="Arial"/>
+          <w:color w:val="7030A0"/>
+        </w:rPr>
+        <w:t>1</w:t>
+      </w:r>
+      <w:r>
+        <w:rPr>
+          <w:rFonts w:ascii="Arial" w:hAnsi="Arial" w:cs="Arial"/>
+          <w:color w:val="7030A0"/>
+        </w:rPr>
+        <w:t>5</w:t>
+      </w:r>
+      <w:r>
+        <w:rPr>
+          <w:rFonts w:ascii="Arial" w:hAnsi="Arial" w:cs="Arial"/>
+          <w:color w:val="7030A0"/>
+        </w:rPr>
+        <w:t>˚C</w:t>
+      </w:r>
+      <w:r>
+        <w:rPr>
+          <w:rFonts w:ascii="Arial" w:hAnsi="Arial" w:cs="Arial"/>
+          <w:color w:val="7030A0"/>
+        </w:rPr>
+        <w:t xml:space="preserve"> stress hardening treatment</w:t>
+      </w:r>
+      <w:r>
+        <w:rPr>
+          <w:rFonts w:ascii="Arial" w:hAnsi="Arial" w:cs="Arial"/>
+          <w:color w:val="7030A0"/>
+        </w:rPr>
+        <w:t xml:space="preserve"> </w:t>
+      </w:r>
+      <w:r>
+        <w:rPr>
+          <w:rFonts w:ascii="Arial" w:hAnsi="Arial" w:cs="Arial"/>
+          <w:color w:val="7030A0"/>
+        </w:rPr>
+        <w:t>(</w:t>
+      </w:r>
+      <w:r>
+        <w:rPr>
+          <w:rFonts w:ascii="Arial" w:hAnsi="Arial" w:cs="Arial"/>
+          <w:color w:val="7030A0"/>
+        </w:rPr>
+        <w:t>6</w:t>
+      </w:r>
+      <w:r>
+        <w:rPr>
+          <w:rFonts w:ascii="Arial" w:hAnsi="Arial" w:cs="Arial"/>
+          <w:color w:val="7030A0"/>
+        </w:rPr>
+        <w:t>.</w:t>
+      </w:r>
+      <w:r>
+        <w:rPr>
+          <w:rFonts w:ascii="Arial" w:hAnsi="Arial" w:cs="Arial"/>
+          <w:color w:val="7030A0"/>
+        </w:rPr>
+        <w:t>7</w:t>
+      </w:r>
+      <w:r>
+        <w:rPr>
+          <w:rFonts w:ascii="Arial" w:hAnsi="Arial" w:cs="Arial"/>
+          <w:color w:val="7030A0"/>
+        </w:rPr>
+        <w:t xml:space="preserve">1 </w:t>
+      </w:r>
+      <w:r>
+        <w:rPr>
+          <w:rFonts w:ascii="Arial" w:hAnsi="Arial" w:cs="Arial"/>
+          <w:color w:val="7030A0"/>
+        </w:rPr>
+        <w:t>±</w:t>
+      </w:r>
+      <w:r>
+        <w:rPr>
+          <w:rFonts w:ascii="Arial" w:hAnsi="Arial" w:cs="Arial"/>
+          <w:color w:val="7030A0"/>
+        </w:rPr>
+        <w:t xml:space="preserve"> 0.</w:t>
+      </w:r>
+      <w:r>
+        <w:rPr>
+          <w:rFonts w:ascii="Arial" w:hAnsi="Arial" w:cs="Arial"/>
+          <w:color w:val="7030A0"/>
+        </w:rPr>
+        <w:t>34</w:t>
+      </w:r>
+      <w:r>
+        <w:rPr>
+          <w:rFonts w:ascii="Arial" w:hAnsi="Arial" w:cs="Arial"/>
+          <w:color w:val="7030A0"/>
+        </w:rPr>
+        <w:t>)</w:t>
+      </w:r>
+      <w:r>
+        <w:rPr>
+          <w:rFonts w:ascii="Arial" w:hAnsi="Arial" w:cs="Arial"/>
+          <w:color w:val="7030A0"/>
+        </w:rPr>
+        <w:t xml:space="preserve"> had </w:t>
+      </w:r>
+      <w:r>
+        <w:rPr>
+          <w:rFonts w:ascii="Arial" w:hAnsi="Arial" w:cs="Arial"/>
+          <w:color w:val="7030A0"/>
+        </w:rPr>
+        <w:t>15</w:t>
+      </w:r>
+      <w:r>
+        <w:rPr>
+          <w:rFonts w:ascii="Arial" w:hAnsi="Arial" w:cs="Arial"/>
+          <w:color w:val="7030A0"/>
+        </w:rPr>
+        <w:t xml:space="preserve">% </w:t>
+      </w:r>
+      <w:r>
+        <w:rPr>
+          <w:rFonts w:ascii="Arial" w:hAnsi="Arial" w:cs="Arial"/>
+          <w:color w:val="7030A0"/>
+        </w:rPr>
+        <w:t>high</w:t>
+      </w:r>
+      <w:r>
+        <w:rPr>
+          <w:rFonts w:ascii="Arial" w:hAnsi="Arial" w:cs="Arial"/>
+          <w:color w:val="7030A0"/>
+        </w:rPr>
+        <w:t>er CI than those that experience</w:t>
+      </w:r>
+      <w:r>
+        <w:rPr>
+          <w:rFonts w:ascii="Arial" w:hAnsi="Arial" w:cs="Arial"/>
+          <w:color w:val="7030A0"/>
+        </w:rPr>
+        <w:t>d</w:t>
+      </w:r>
+      <w:r>
+        <w:rPr>
+          <w:rFonts w:ascii="Arial" w:hAnsi="Arial" w:cs="Arial"/>
+          <w:color w:val="7030A0"/>
+        </w:rPr>
+        <w:t xml:space="preserve"> 2</w:t>
+      </w:r>
+      <w:r>
+        <w:rPr>
+          <w:rFonts w:ascii="Arial" w:hAnsi="Arial" w:cs="Arial"/>
+          <w:color w:val="7030A0"/>
+        </w:rPr>
+        <w:t>1˚C</w:t>
+      </w:r>
+      <w:r>
+        <w:rPr>
+          <w:rFonts w:ascii="Arial" w:hAnsi="Arial" w:cs="Arial"/>
+          <w:color w:val="7030A0"/>
+        </w:rPr>
+        <w:t xml:space="preserve"> </w:t>
+      </w:r>
+      <w:r>
+        <w:rPr>
+          <w:rFonts w:ascii="Arial" w:hAnsi="Arial" w:cs="Arial"/>
+          <w:color w:val="7030A0"/>
+        </w:rPr>
+        <w:t>(</w:t>
+      </w:r>
+      <w:r>
+        <w:rPr>
+          <w:rFonts w:ascii="Arial" w:hAnsi="Arial" w:cs="Arial"/>
+          <w:color w:val="7030A0"/>
+        </w:rPr>
+        <w:t>5</w:t>
+      </w:r>
+      <w:r>
+        <w:rPr>
+          <w:rFonts w:ascii="Arial" w:hAnsi="Arial" w:cs="Arial"/>
+          <w:color w:val="7030A0"/>
+        </w:rPr>
+        <w:t>.</w:t>
+      </w:r>
+      <w:r>
+        <w:rPr>
+          <w:rFonts w:ascii="Arial" w:hAnsi="Arial" w:cs="Arial"/>
+          <w:color w:val="7030A0"/>
+        </w:rPr>
+        <w:t>67</w:t>
+      </w:r>
+      <w:r>
+        <w:rPr>
+          <w:rFonts w:ascii="Arial" w:hAnsi="Arial" w:cs="Arial"/>
+          <w:color w:val="7030A0"/>
+        </w:rPr>
+        <w:t xml:space="preserve"> </w:t>
+      </w:r>
+      <w:r>
+        <w:rPr>
+          <w:rFonts w:ascii="Arial" w:hAnsi="Arial" w:cs="Arial"/>
+          <w:color w:val="7030A0"/>
+        </w:rPr>
+        <w:t>±</w:t>
+      </w:r>
+      <w:r>
+        <w:rPr>
+          <w:rFonts w:ascii="Arial" w:hAnsi="Arial" w:cs="Arial"/>
+          <w:color w:val="7030A0"/>
+        </w:rPr>
+        <w:t xml:space="preserve"> 0.</w:t>
+      </w:r>
+      <w:r>
+        <w:rPr>
+          <w:rFonts w:ascii="Arial" w:hAnsi="Arial" w:cs="Arial"/>
+          <w:color w:val="7030A0"/>
+        </w:rPr>
+        <w:t>26</w:t>
+      </w:r>
+      <w:r>
+        <w:rPr>
+          <w:rFonts w:ascii="Arial" w:hAnsi="Arial" w:cs="Arial"/>
+          <w:color w:val="7030A0"/>
+        </w:rPr>
+        <w:t>)</w:t>
+      </w:r>
+      <w:r>
+        <w:rPr>
+          <w:rFonts w:ascii="Arial" w:hAnsi="Arial" w:cs="Arial"/>
+          <w:color w:val="7030A0"/>
+        </w:rPr>
+        <w:t xml:space="preserve"> before the</w:t>
+      </w:r>
+      <w:r>
+        <w:rPr>
+          <w:rFonts w:ascii="Arial" w:hAnsi="Arial" w:cs="Arial"/>
+          <w:color w:val="7030A0"/>
+        </w:rPr>
+        <w:t xml:space="preserve"> </w:t>
+      </w:r>
+      <w:r>
+        <w:rPr>
+          <w:rFonts w:ascii="Arial" w:hAnsi="Arial" w:cs="Arial"/>
+          <w:color w:val="7030A0"/>
+        </w:rPr>
+        <w:t>1</w:t>
+      </w:r>
+      <w:r>
+        <w:rPr>
+          <w:rFonts w:ascii="Arial" w:hAnsi="Arial" w:cs="Arial"/>
+          <w:color w:val="7030A0"/>
+        </w:rPr>
+        <w:t>5</w:t>
+      </w:r>
+      <w:r>
+        <w:rPr>
+          <w:rFonts w:ascii="Arial" w:hAnsi="Arial" w:cs="Arial"/>
+          <w:color w:val="7030A0"/>
+        </w:rPr>
+        <w:t>˚C</w:t>
+      </w:r>
+      <w:r>
+        <w:rPr>
+          <w:rFonts w:ascii="Arial" w:hAnsi="Arial" w:cs="Arial"/>
+          <w:color w:val="7030A0"/>
+        </w:rPr>
+        <w:t xml:space="preserve"> marine heatwave</w:t>
+      </w:r>
+      <w:r>
+        <w:rPr>
+          <w:rFonts w:ascii="Arial" w:hAnsi="Arial" w:cs="Arial"/>
+          <w:color w:val="7030A0"/>
+        </w:rPr>
+        <w:t xml:space="preserve"> </w:t>
+      </w:r>
+      <w:r>
+        <w:rPr>
+          <w:rFonts w:ascii="Arial" w:hAnsi="Arial" w:cs="Arial"/>
+          <w:color w:val="7030A0"/>
+        </w:rPr>
+        <w:t>(</w:t>
+      </w:r>
+      <w:r>
+        <w:rPr>
+          <w:rFonts w:ascii="Arial" w:hAnsi="Arial" w:cs="Arial"/>
+          <w:i/>
+          <w:iCs/>
+          <w:color w:val="7030A0"/>
+        </w:rPr>
+        <w:t>P</w:t>
+      </w:r>
+      <w:r>
+        <w:rPr>
+          <w:rFonts w:ascii="Arial" w:hAnsi="Arial" w:cs="Arial"/>
+          <w:color w:val="7030A0"/>
+        </w:rPr>
+        <w:t xml:space="preserve"> </w:t>
+      </w:r>
+      <w:r>
+        <w:rPr>
+          <w:rFonts w:ascii="Arial" w:hAnsi="Arial" w:cs="Arial"/>
+          <w:color w:val="7030A0"/>
+        </w:rPr>
+        <w:t>=</w:t>
+      </w:r>
+      <w:r>
+        <w:rPr>
+          <w:rFonts w:ascii="Arial" w:hAnsi="Arial" w:cs="Arial"/>
+          <w:color w:val="7030A0"/>
+        </w:rPr>
+        <w:t xml:space="preserve"> 0.0</w:t>
+      </w:r>
+      <w:r>
+        <w:rPr>
+          <w:rFonts w:ascii="Arial" w:hAnsi="Arial" w:cs="Arial"/>
+          <w:color w:val="7030A0"/>
+        </w:rPr>
+        <w:t xml:space="preserve">12, </w:t>
+      </w:r>
+      <w:r>
+        <w:rPr>
+          <w:rFonts w:ascii="Arial" w:hAnsi="Arial" w:cs="Arial"/>
+          <w:color w:val="7030A0"/>
+        </w:rPr>
+        <w:t xml:space="preserve">Table </w:t>
+      </w:r>
+      <w:r>
+        <w:rPr>
+          <w:rFonts w:ascii="Arial" w:hAnsi="Arial" w:cs="Arial"/>
+          <w:b/>
+          <w:bCs/>
+          <w:color w:val="7030A0"/>
+        </w:rPr>
+        <w:t>GROWTH</w:t>
+      </w:r>
+      <w:r>
+        <w:rPr>
+          <w:rFonts w:ascii="Arial" w:hAnsi="Arial" w:cs="Arial"/>
+          <w:b/>
+          <w:bCs/>
+          <w:color w:val="7030A0"/>
+        </w:rPr>
+        <w:t xml:space="preserve"> PAIRWISE</w:t>
+      </w:r>
+      <w:r>
+        <w:rPr>
+          <w:rFonts w:ascii="Arial" w:hAnsi="Arial" w:cs="Arial"/>
+          <w:color w:val="7030A0"/>
+        </w:rPr>
+        <w:t>)</w:t>
+      </w:r>
+      <w:r>
+        <w:rPr>
+          <w:rFonts w:ascii="Arial" w:hAnsi="Arial" w:cs="Arial"/>
+          <w:color w:val="7030A0"/>
+        </w:rPr>
+        <w:t xml:space="preserve">. Similarly, for oysters in the </w:t>
+      </w:r>
+      <w:r>
+        <w:rPr>
+          <w:rFonts w:ascii="Arial" w:hAnsi="Arial" w:cs="Arial"/>
+          <w:color w:val="7030A0"/>
+        </w:rPr>
+        <w:t>1</w:t>
+      </w:r>
+      <w:r>
+        <w:rPr>
+          <w:rFonts w:ascii="Arial" w:hAnsi="Arial" w:cs="Arial"/>
+          <w:color w:val="7030A0"/>
+        </w:rPr>
+        <w:t>8</w:t>
+      </w:r>
+      <w:r>
+        <w:rPr>
+          <w:rFonts w:ascii="Arial" w:hAnsi="Arial" w:cs="Arial"/>
+          <w:color w:val="7030A0"/>
+        </w:rPr>
+        <w:t>˚C</w:t>
+      </w:r>
+      <w:r>
+        <w:rPr>
+          <w:rFonts w:ascii="Arial" w:hAnsi="Arial" w:cs="Arial"/>
+          <w:color w:val="7030A0"/>
+        </w:rPr>
+        <w:t xml:space="preserve"> marine heatwave</w:t>
+      </w:r>
+      <w:r>
+        <w:rPr>
+          <w:rFonts w:ascii="Arial" w:hAnsi="Arial" w:cs="Arial"/>
+          <w:color w:val="7030A0"/>
+        </w:rPr>
+        <w:t xml:space="preserve"> (</w:t>
+      </w:r>
+      <w:r>
+        <w:rPr>
+          <w:rFonts w:ascii="Arial" w:hAnsi="Arial" w:cs="Arial"/>
+          <w:i/>
+          <w:iCs/>
+          <w:color w:val="7030A0"/>
+        </w:rPr>
+        <w:t>P</w:t>
+      </w:r>
+      <w:r>
+        <w:rPr>
+          <w:rFonts w:ascii="Arial" w:hAnsi="Arial" w:cs="Arial"/>
+          <w:color w:val="7030A0"/>
+        </w:rPr>
+        <w:t xml:space="preserve"> </w:t>
+      </w:r>
+      <w:r>
+        <w:rPr>
+          <w:rFonts w:ascii="Arial" w:hAnsi="Arial" w:cs="Arial"/>
+          <w:color w:val="7030A0"/>
+        </w:rPr>
+        <w:t>=</w:t>
+      </w:r>
+      <w:r>
+        <w:rPr>
+          <w:rFonts w:ascii="Arial" w:hAnsi="Arial" w:cs="Arial"/>
+          <w:color w:val="7030A0"/>
+        </w:rPr>
+        <w:t xml:space="preserve"> 0.0</w:t>
+      </w:r>
+      <w:r>
+        <w:rPr>
+          <w:rFonts w:ascii="Arial" w:hAnsi="Arial" w:cs="Arial"/>
+          <w:color w:val="7030A0"/>
+        </w:rPr>
+        <w:t xml:space="preserve">12, </w:t>
+      </w:r>
+      <w:r>
+        <w:rPr>
+          <w:rFonts w:ascii="Arial" w:hAnsi="Arial" w:cs="Arial"/>
+          <w:color w:val="7030A0"/>
+        </w:rPr>
+        <w:t xml:space="preserve">Table </w:t>
+      </w:r>
+      <w:r>
+        <w:rPr>
+          <w:rFonts w:ascii="Arial" w:hAnsi="Arial" w:cs="Arial"/>
+          <w:b/>
+          <w:bCs/>
+          <w:color w:val="7030A0"/>
+        </w:rPr>
+        <w:t>GROWTH</w:t>
+      </w:r>
+      <w:r>
+        <w:rPr>
+          <w:rFonts w:ascii="Arial" w:hAnsi="Arial" w:cs="Arial"/>
+          <w:b/>
+          <w:bCs/>
+          <w:color w:val="7030A0"/>
+        </w:rPr>
+        <w:t xml:space="preserve"> PAIRWISE</w:t>
+      </w:r>
+      <w:r>
+        <w:rPr>
+          <w:rFonts w:ascii="Arial" w:hAnsi="Arial" w:cs="Arial"/>
+          <w:color w:val="7030A0"/>
+        </w:rPr>
+        <w:t>)</w:t>
+      </w:r>
+      <w:r>
+        <w:rPr>
+          <w:rFonts w:ascii="Arial" w:hAnsi="Arial" w:cs="Arial"/>
+          <w:color w:val="7030A0"/>
+        </w:rPr>
+        <w:t xml:space="preserve"> varied by </w:t>
+      </w:r>
+      <w:r>
+        <w:rPr>
+          <w:rFonts w:ascii="Arial" w:hAnsi="Arial" w:cs="Arial"/>
+          <w:color w:val="7030A0"/>
+        </w:rPr>
+        <w:t>12.5</w:t>
+      </w:r>
+      <w:r>
+        <w:rPr>
+          <w:rFonts w:ascii="Arial" w:hAnsi="Arial" w:cs="Arial"/>
+          <w:color w:val="7030A0"/>
+        </w:rPr>
+        <w:t xml:space="preserve">% between the </w:t>
+      </w:r>
+      <w:r>
+        <w:rPr>
+          <w:rFonts w:ascii="Arial" w:hAnsi="Arial" w:cs="Arial"/>
+          <w:color w:val="7030A0"/>
+        </w:rPr>
+        <w:t>1</w:t>
+      </w:r>
+      <w:r>
+        <w:rPr>
+          <w:rFonts w:ascii="Arial" w:hAnsi="Arial" w:cs="Arial"/>
+          <w:color w:val="7030A0"/>
+        </w:rPr>
+        <w:t>5</w:t>
+      </w:r>
+      <w:r>
+        <w:rPr>
+          <w:rFonts w:ascii="Arial" w:hAnsi="Arial" w:cs="Arial"/>
+          <w:color w:val="7030A0"/>
+        </w:rPr>
+        <w:t>˚C</w:t>
+      </w:r>
+      <w:r>
+        <w:rPr>
+          <w:rFonts w:ascii="Arial" w:hAnsi="Arial" w:cs="Arial"/>
+          <w:color w:val="7030A0"/>
+        </w:rPr>
+        <w:t xml:space="preserve"> </w:t>
+      </w:r>
+      <w:r>
+        <w:rPr>
+          <w:rFonts w:ascii="Arial" w:hAnsi="Arial" w:cs="Arial"/>
+          <w:color w:val="7030A0"/>
+        </w:rPr>
+        <w:t>(</w:t>
+      </w:r>
+      <w:r>
+        <w:rPr>
+          <w:rFonts w:ascii="Arial" w:hAnsi="Arial" w:cs="Arial"/>
+          <w:color w:val="7030A0"/>
+        </w:rPr>
+        <w:t>8.54</w:t>
+      </w:r>
+      <w:r>
+        <w:rPr>
+          <w:rFonts w:ascii="Arial" w:hAnsi="Arial" w:cs="Arial"/>
+          <w:color w:val="7030A0"/>
+        </w:rPr>
+        <w:t xml:space="preserve"> </w:t>
+      </w:r>
+      <w:r>
+        <w:rPr>
+          <w:rFonts w:ascii="Arial" w:hAnsi="Arial" w:cs="Arial"/>
+          <w:color w:val="7030A0"/>
+        </w:rPr>
+        <w:t>±</w:t>
+      </w:r>
+      <w:r>
+        <w:rPr>
+          <w:rFonts w:ascii="Arial" w:hAnsi="Arial" w:cs="Arial"/>
+          <w:color w:val="7030A0"/>
+        </w:rPr>
+        <w:t xml:space="preserve"> 0.</w:t>
+      </w:r>
+      <w:r>
+        <w:rPr>
+          <w:rFonts w:ascii="Arial" w:hAnsi="Arial" w:cs="Arial"/>
+          <w:color w:val="7030A0"/>
+        </w:rPr>
+        <w:t>64</w:t>
+      </w:r>
+      <w:r>
+        <w:rPr>
+          <w:rFonts w:ascii="Arial" w:hAnsi="Arial" w:cs="Arial"/>
+          <w:color w:val="7030A0"/>
+        </w:rPr>
+        <w:t>)</w:t>
+      </w:r>
+      <w:r>
+        <w:rPr>
+          <w:rFonts w:ascii="Arial" w:hAnsi="Arial" w:cs="Arial"/>
+          <w:color w:val="7030A0"/>
+        </w:rPr>
+        <w:t xml:space="preserve"> and 2</w:t>
+      </w:r>
+      <w:r>
+        <w:rPr>
+          <w:rFonts w:ascii="Arial" w:hAnsi="Arial" w:cs="Arial"/>
+          <w:color w:val="7030A0"/>
+        </w:rPr>
+        <w:t>1˚C</w:t>
+      </w:r>
+      <w:r>
+        <w:rPr>
+          <w:rFonts w:ascii="Arial" w:hAnsi="Arial" w:cs="Arial"/>
+          <w:color w:val="7030A0"/>
+        </w:rPr>
+        <w:t xml:space="preserve"> </w:t>
+      </w:r>
+      <w:r>
+        <w:rPr>
+          <w:rFonts w:ascii="Arial" w:hAnsi="Arial" w:cs="Arial"/>
+          <w:color w:val="7030A0"/>
+        </w:rPr>
+        <w:t>(7.</w:t>
+      </w:r>
+      <w:r>
+        <w:rPr>
+          <w:rFonts w:ascii="Arial" w:hAnsi="Arial" w:cs="Arial"/>
+          <w:color w:val="7030A0"/>
+        </w:rPr>
+        <w:t>47</w:t>
+      </w:r>
+      <w:r>
+        <w:rPr>
+          <w:rFonts w:ascii="Arial" w:hAnsi="Arial" w:cs="Arial"/>
+          <w:color w:val="7030A0"/>
+        </w:rPr>
+        <w:t xml:space="preserve"> </w:t>
+      </w:r>
+      <w:r>
+        <w:rPr>
+          <w:rFonts w:ascii="Arial" w:hAnsi="Arial" w:cs="Arial"/>
+          <w:color w:val="7030A0"/>
+        </w:rPr>
+        <w:t>±</w:t>
+      </w:r>
+      <w:r>
+        <w:rPr>
+          <w:rFonts w:ascii="Arial" w:hAnsi="Arial" w:cs="Arial"/>
+          <w:color w:val="7030A0"/>
+        </w:rPr>
+        <w:t xml:space="preserve"> 0.</w:t>
+      </w:r>
+      <w:r>
+        <w:rPr>
+          <w:rFonts w:ascii="Arial" w:hAnsi="Arial" w:cs="Arial"/>
+          <w:color w:val="7030A0"/>
+        </w:rPr>
+        <w:t>50</w:t>
+      </w:r>
+      <w:r>
+        <w:rPr>
+          <w:rFonts w:ascii="Arial" w:hAnsi="Arial" w:cs="Arial"/>
+          <w:color w:val="7030A0"/>
+        </w:rPr>
+        <w:t>)</w:t>
+      </w:r>
+      <w:r>
+        <w:rPr>
+          <w:rFonts w:ascii="Arial" w:hAnsi="Arial" w:cs="Arial"/>
+          <w:color w:val="7030A0"/>
+        </w:rPr>
+        <w:t xml:space="preserve"> stress hardening treatments.</w:t>
+      </w:r>
     </w:p>
     <w:p>
       <w:pPr>
-        <w:rPr>
-          <w:rFonts w:ascii="Arial" w:hAnsi="Arial" w:cs="Arial"/>
-          <w:color w:val="7030A0"/>
-        </w:rPr>
-      </w:pPr>
-      <w:r>
+        <w:ind w:firstLine="720"/>
         <w:rPr>
           <w:rFonts w:ascii="Arial" w:hAnsi="Arial" w:cs="Arial"/>
           <w:i/>
           <w:iCs/>
           <w:color w:val="7030A0"/>
         </w:rPr>
-        <w:tab/>
-      </w:r>
-      <w:r>
-        <w:rPr>
-          <w:rFonts w:ascii="Arial" w:hAnsi="Arial" w:cs="Arial"/>
-          <w:color w:val="7030A0"/>
-        </w:rPr>
-        <w:t>Stress hardening</w:t>
-      </w:r>
-      <w:r>
-        <w:rPr>
-          <w:rFonts w:ascii="Arial" w:hAnsi="Arial" w:cs="Arial"/>
-          <w:color w:val="7030A0"/>
-        </w:rPr>
-        <w:t xml:space="preserve"> temperature </w:t>
+      </w:pPr>
+      <w:r>
+        <w:rPr>
+          <w:rFonts w:ascii="Arial" w:hAnsi="Arial" w:cs="Arial"/>
+          <w:color w:val="7030A0"/>
+        </w:rPr>
+        <w:t xml:space="preserve">While tidal regime during stress hardening </w:t>
+      </w:r>
+      <w:r>
+        <w:rPr>
+          <w:rFonts w:ascii="Arial" w:hAnsi="Arial" w:cs="Arial"/>
+          <w:color w:val="7030A0"/>
+        </w:rPr>
+        <w:t xml:space="preserve">did not </w:t>
+      </w:r>
+      <w:r>
+        <w:rPr>
+          <w:rFonts w:ascii="Arial" w:hAnsi="Arial" w:cs="Arial"/>
+          <w:color w:val="7030A0"/>
+        </w:rPr>
+        <w:t xml:space="preserve">influence CI </w:t>
       </w:r>
       <w:r>
         <w:rPr>
@@ -5260,21 +6406,7 @@
           <w:rFonts w:ascii="Arial" w:hAnsi="Arial" w:cs="Arial"/>
           <w:color w:val="7030A0"/>
         </w:rPr>
-        <w:t>=</w:t>
-      </w:r>
-      <w:r>
-        <w:rPr>
-          <w:rFonts w:ascii="Arial" w:hAnsi="Arial" w:cs="Arial"/>
-          <w:color w:val="7030A0"/>
-        </w:rPr>
-        <w:t xml:space="preserve"> 0.0</w:t>
-      </w:r>
-      <w:r>
-        <w:rPr>
-          <w:rFonts w:ascii="Arial" w:hAnsi="Arial" w:cs="Arial"/>
-          <w:color w:val="7030A0"/>
-        </w:rPr>
-        <w:t xml:space="preserve">12, </w:t>
+        <w:t xml:space="preserve">&gt; 0.05, </w:t>
       </w:r>
       <w:r>
         <w:rPr>
@@ -5304,14 +6436,7 @@
           <w:rFonts w:ascii="Arial" w:hAnsi="Arial" w:cs="Arial"/>
           <w:color w:val="7030A0"/>
         </w:rPr>
-        <w:t xml:space="preserve"> influenced</w:t>
-      </w:r>
-      <w:r>
-        <w:rPr>
-          <w:rFonts w:ascii="Arial" w:hAnsi="Arial" w:cs="Arial"/>
-          <w:color w:val="7030A0"/>
-        </w:rPr>
-        <w:t xml:space="preserve"> </w:t>
+        <w:t xml:space="preserve"> in </w:t>
       </w:r>
       <w:r>
         <w:rPr>
@@ -5320,7 +6445,21 @@
           <w:iCs/>
           <w:color w:val="7030A0"/>
         </w:rPr>
-        <w:t>O. lurida</w:t>
+        <w:t xml:space="preserve">C. sikamea, </w:t>
+      </w:r>
+      <w:r>
+        <w:rPr>
+          <w:rFonts w:ascii="Arial" w:hAnsi="Arial" w:cs="Arial"/>
+          <w:color w:val="7030A0"/>
+        </w:rPr>
+        <w:t>s</w:t>
+      </w:r>
+      <w:r>
+        <w:rPr>
+          <w:rFonts w:ascii="Arial" w:hAnsi="Arial" w:cs="Arial"/>
+          <w:color w:val="7030A0"/>
+        </w:rPr>
+        <w:t>tress hardening</w:t>
       </w:r>
       <w:r>
         <w:rPr>
@@ -5328,20 +6467,6 @@
           <w:color w:val="7030A0"/>
         </w:rPr>
         <w:t xml:space="preserve"> </w:t>
-      </w:r>
-      <w:r>
-        <w:rPr>
-          <w:rFonts w:ascii="Arial" w:hAnsi="Arial" w:cs="Arial"/>
-          <w:color w:val="7030A0"/>
-        </w:rPr>
-        <w:t>CI</w:t>
-      </w:r>
-      <w:r>
-        <w:rPr>
-          <w:rFonts w:ascii="Arial" w:hAnsi="Arial" w:cs="Arial"/>
-          <w:color w:val="7030A0"/>
-        </w:rPr>
-        <w:t xml:space="preserve">, whereas tide and marine heatwave temperature did not </w:t>
       </w:r>
       <w:r>
         <w:rPr>
@@ -5371,7 +6496,7 @@
           <w:rFonts w:ascii="Arial" w:hAnsi="Arial" w:cs="Arial"/>
           <w:color w:val="7030A0"/>
         </w:rPr>
-        <w:t>&gt;</w:t>
+        <w:t>=</w:t>
       </w:r>
       <w:r>
         <w:rPr>
@@ -5385,7 +6510,7 @@
           <w:rFonts w:ascii="Arial" w:hAnsi="Arial" w:cs="Arial"/>
           <w:color w:val="7030A0"/>
         </w:rPr>
-        <w:t xml:space="preserve">5, </w:t>
+        <w:t xml:space="preserve">1, </w:t>
       </w:r>
       <w:r>
         <w:rPr>
@@ -5415,49 +6540,21 @@
           <w:rFonts w:ascii="Arial" w:hAnsi="Arial" w:cs="Arial"/>
           <w:color w:val="7030A0"/>
         </w:rPr>
-        <w:t xml:space="preserve">, condition index being </w:t>
-      </w:r>
-      <w:r>
-        <w:rPr>
-          <w:rFonts w:ascii="Arial" w:hAnsi="Arial" w:cs="Arial"/>
-          <w:color w:val="7030A0"/>
-        </w:rPr>
-        <w:t>6</w:t>
-      </w:r>
-      <w:r>
-        <w:rPr>
-          <w:rFonts w:ascii="Arial" w:hAnsi="Arial" w:cs="Arial"/>
-          <w:color w:val="7030A0"/>
-        </w:rPr>
-        <w:t>.5</w:t>
-      </w:r>
-      <w:r>
-        <w:rPr>
-          <w:rFonts w:ascii="Arial" w:hAnsi="Arial" w:cs="Arial"/>
-          <w:color w:val="7030A0"/>
-        </w:rPr>
-        <w:t xml:space="preserve">% higher for oysters hardened at </w:t>
-      </w:r>
-      <w:r>
-        <w:rPr>
-          <w:rFonts w:ascii="Arial" w:hAnsi="Arial" w:cs="Arial"/>
-          <w:color w:val="7030A0"/>
-        </w:rPr>
-        <w:t>1</w:t>
-      </w:r>
-      <w:r>
-        <w:rPr>
-          <w:rFonts w:ascii="Arial" w:hAnsi="Arial" w:cs="Arial"/>
-          <w:color w:val="7030A0"/>
-        </w:rPr>
-        <w:t>5</w:t>
-      </w:r>
-      <w:r>
-        <w:rPr>
-          <w:rFonts w:ascii="Arial" w:hAnsi="Arial" w:cs="Arial"/>
-          <w:color w:val="7030A0"/>
-        </w:rPr>
-        <w:t>˚C</w:t>
+        <w:t xml:space="preserve"> and marine heatwave</w:t>
+      </w:r>
+      <w:r>
+        <w:rPr>
+          <w:rFonts w:ascii="Arial" w:hAnsi="Arial" w:cs="Arial"/>
+          <w:color w:val="7030A0"/>
+        </w:rPr>
+        <w:t xml:space="preserve"> </w:t>
+      </w:r>
+      <w:r>
+        <w:rPr>
+          <w:rFonts w:ascii="Arial" w:hAnsi="Arial" w:cs="Arial"/>
+          <w:color w:val="7030A0"/>
+        </w:rPr>
+        <w:t>temperatures</w:t>
       </w:r>
       <w:r>
         <w:rPr>
@@ -5465,146 +6562,6 @@
           <w:color w:val="7030A0"/>
         </w:rPr>
         <w:t xml:space="preserve"> (</w:t>
-      </w:r>
-      <w:r>
-        <w:rPr>
-          <w:rFonts w:ascii="Arial" w:hAnsi="Arial" w:cs="Arial"/>
-          <w:color w:val="7030A0"/>
-        </w:rPr>
-        <w:t>7.51</w:t>
-      </w:r>
-      <w:r>
-        <w:rPr>
-          <w:rFonts w:ascii="Arial" w:hAnsi="Arial" w:cs="Arial"/>
-          <w:color w:val="7030A0"/>
-        </w:rPr>
-        <w:t xml:space="preserve"> </w:t>
-      </w:r>
-      <w:r>
-        <w:rPr>
-          <w:rFonts w:ascii="Arial" w:hAnsi="Arial" w:cs="Arial"/>
-          <w:color w:val="7030A0"/>
-        </w:rPr>
-        <w:t>±</w:t>
-      </w:r>
-      <w:r>
-        <w:rPr>
-          <w:rFonts w:ascii="Arial" w:hAnsi="Arial" w:cs="Arial"/>
-          <w:color w:val="7030A0"/>
-        </w:rPr>
-        <w:t xml:space="preserve"> 0.</w:t>
-      </w:r>
-      <w:r>
-        <w:rPr>
-          <w:rFonts w:ascii="Arial" w:hAnsi="Arial" w:cs="Arial"/>
-          <w:color w:val="7030A0"/>
-        </w:rPr>
-        <w:t>21</w:t>
-      </w:r>
-      <w:r>
-        <w:rPr>
-          <w:rFonts w:ascii="Arial" w:hAnsi="Arial" w:cs="Arial"/>
-          <w:color w:val="7030A0"/>
-        </w:rPr>
-        <w:t>)</w:t>
-      </w:r>
-      <w:r>
-        <w:rPr>
-          <w:rFonts w:ascii="Arial" w:hAnsi="Arial" w:cs="Arial"/>
-          <w:color w:val="7030A0"/>
-        </w:rPr>
-        <w:t xml:space="preserve"> </w:t>
-      </w:r>
-      <w:r>
-        <w:rPr>
-          <w:rFonts w:ascii="Arial" w:hAnsi="Arial" w:cs="Arial"/>
-          <w:color w:val="7030A0"/>
-        </w:rPr>
-        <w:t>compared to those at</w:t>
-      </w:r>
-      <w:r>
-        <w:rPr>
-          <w:rFonts w:ascii="Arial" w:hAnsi="Arial" w:cs="Arial"/>
-          <w:color w:val="7030A0"/>
-        </w:rPr>
-        <w:t xml:space="preserve"> 21</w:t>
-      </w:r>
-      <w:r>
-        <w:rPr>
-          <w:rFonts w:ascii="Arial" w:hAnsi="Arial" w:cs="Arial"/>
-          <w:color w:val="7030A0"/>
-        </w:rPr>
-        <w:t>˚C</w:t>
-      </w:r>
-      <w:r>
-        <w:rPr>
-          <w:rFonts w:ascii="Arial" w:hAnsi="Arial" w:cs="Arial"/>
-          <w:color w:val="7030A0"/>
-        </w:rPr>
-        <w:t xml:space="preserve"> (</w:t>
-      </w:r>
-      <w:r>
-        <w:rPr>
-          <w:rFonts w:ascii="Arial" w:hAnsi="Arial" w:cs="Arial"/>
-          <w:color w:val="7030A0"/>
-        </w:rPr>
-        <w:t>7.02</w:t>
-      </w:r>
-      <w:r>
-        <w:rPr>
-          <w:rFonts w:ascii="Arial" w:hAnsi="Arial" w:cs="Arial"/>
-          <w:color w:val="7030A0"/>
-        </w:rPr>
-        <w:t xml:space="preserve"> mg </w:t>
-      </w:r>
-      <w:r>
-        <w:rPr>
-          <w:rFonts w:ascii="Arial" w:hAnsi="Arial" w:cs="Arial"/>
-          <w:color w:val="7030A0"/>
-        </w:rPr>
-        <w:t>±</w:t>
-      </w:r>
-      <w:r>
-        <w:rPr>
-          <w:rFonts w:ascii="Arial" w:hAnsi="Arial" w:cs="Arial"/>
-          <w:color w:val="7030A0"/>
-        </w:rPr>
-        <w:t xml:space="preserve"> 0.</w:t>
-      </w:r>
-      <w:r>
-        <w:rPr>
-          <w:rFonts w:ascii="Arial" w:hAnsi="Arial" w:cs="Arial"/>
-          <w:color w:val="7030A0"/>
-        </w:rPr>
-        <w:t>21</w:t>
-      </w:r>
-      <w:r>
-        <w:rPr>
-          <w:rFonts w:ascii="Arial" w:hAnsi="Arial" w:cs="Arial"/>
-          <w:color w:val="7030A0"/>
-        </w:rPr>
-        <w:t>).</w:t>
-      </w:r>
-      <w:r>
-        <w:rPr>
-          <w:rFonts w:ascii="Arial" w:hAnsi="Arial" w:cs="Arial"/>
-          <w:color w:val="7030A0"/>
-        </w:rPr>
-        <w:t xml:space="preserve"> </w:t>
-      </w:r>
-      <w:r>
-        <w:rPr>
-          <w:rFonts w:ascii="Arial" w:hAnsi="Arial" w:cs="Arial"/>
-          <w:color w:val="7030A0"/>
-        </w:rPr>
-        <w:t xml:space="preserve">However, stress hardening and marine heatwave temperature did interact </w:t>
-      </w:r>
-      <w:r>
-        <w:rPr>
-          <w:rFonts w:ascii="Arial" w:hAnsi="Arial" w:cs="Arial"/>
-          <w:color w:val="7030A0"/>
-        </w:rPr>
-        <w:t>(</w:t>
       </w:r>
       <w:r>
         <w:rPr>
@@ -5627,7 +6584,7 @@
           <w:rFonts w:ascii="Arial" w:hAnsi="Arial" w:cs="Arial"/>
           <w:color w:val="7030A0"/>
         </w:rPr>
-        <w:t>=</w:t>
+        <w:t>≤</w:t>
       </w:r>
       <w:r>
         <w:rPr>
@@ -5671,175 +6628,21 @@
           <w:rFonts w:ascii="Arial" w:hAnsi="Arial" w:cs="Arial"/>
           <w:color w:val="7030A0"/>
         </w:rPr>
-        <w:t>). A</w:t>
-      </w:r>
-      <w:r>
-        <w:rPr>
-          <w:rFonts w:ascii="Arial" w:hAnsi="Arial" w:cs="Arial"/>
-          <w:color w:val="7030A0"/>
-        </w:rPr>
-        <w:t>nd, a</w:t>
-      </w:r>
-      <w:r>
-        <w:rPr>
-          <w:rFonts w:ascii="Arial" w:hAnsi="Arial" w:cs="Arial"/>
-          <w:color w:val="7030A0"/>
-        </w:rPr>
-        <w:t xml:space="preserve"> pairwise comparison further demonstrated that </w:t>
-      </w:r>
-      <w:r>
-        <w:rPr>
-          <w:rFonts w:ascii="Arial" w:hAnsi="Arial" w:cs="Arial"/>
-          <w:color w:val="7030A0"/>
-        </w:rPr>
-        <w:t xml:space="preserve">CI for oysters that experienced the </w:t>
-      </w:r>
-      <w:r>
-        <w:rPr>
-          <w:rFonts w:ascii="Arial" w:hAnsi="Arial" w:cs="Arial"/>
-          <w:color w:val="7030A0"/>
-        </w:rPr>
-        <w:t>1</w:t>
-      </w:r>
-      <w:r>
-        <w:rPr>
-          <w:rFonts w:ascii="Arial" w:hAnsi="Arial" w:cs="Arial"/>
-          <w:color w:val="7030A0"/>
-        </w:rPr>
-        <w:t>5</w:t>
-      </w:r>
-      <w:r>
-        <w:rPr>
-          <w:rFonts w:ascii="Arial" w:hAnsi="Arial" w:cs="Arial"/>
-          <w:color w:val="7030A0"/>
-        </w:rPr>
-        <w:t>˚C</w:t>
-      </w:r>
-      <w:r>
-        <w:rPr>
-          <w:rFonts w:ascii="Arial" w:hAnsi="Arial" w:cs="Arial"/>
-          <w:color w:val="7030A0"/>
-        </w:rPr>
-        <w:t xml:space="preserve"> stress hardening treatment</w:t>
-      </w:r>
-      <w:r>
-        <w:rPr>
-          <w:rFonts w:ascii="Arial" w:hAnsi="Arial" w:cs="Arial"/>
-          <w:color w:val="7030A0"/>
-        </w:rPr>
-        <w:t xml:space="preserve"> </w:t>
-      </w:r>
-      <w:r>
-        <w:rPr>
-          <w:rFonts w:ascii="Arial" w:hAnsi="Arial" w:cs="Arial"/>
-          <w:color w:val="7030A0"/>
-        </w:rPr>
-        <w:t>(</w:t>
-      </w:r>
-      <w:r>
-        <w:rPr>
-          <w:rFonts w:ascii="Arial" w:hAnsi="Arial" w:cs="Arial"/>
-          <w:color w:val="7030A0"/>
-        </w:rPr>
-        <w:t>6</w:t>
-      </w:r>
-      <w:r>
-        <w:rPr>
-          <w:rFonts w:ascii="Arial" w:hAnsi="Arial" w:cs="Arial"/>
-          <w:color w:val="7030A0"/>
-        </w:rPr>
-        <w:t>.</w:t>
-      </w:r>
-      <w:r>
-        <w:rPr>
-          <w:rFonts w:ascii="Arial" w:hAnsi="Arial" w:cs="Arial"/>
-          <w:color w:val="7030A0"/>
-        </w:rPr>
-        <w:t>7</w:t>
-      </w:r>
-      <w:r>
-        <w:rPr>
-          <w:rFonts w:ascii="Arial" w:hAnsi="Arial" w:cs="Arial"/>
-          <w:color w:val="7030A0"/>
-        </w:rPr>
-        <w:t xml:space="preserve">1 </w:t>
-      </w:r>
-      <w:r>
-        <w:rPr>
-          <w:rFonts w:ascii="Arial" w:hAnsi="Arial" w:cs="Arial"/>
-          <w:color w:val="7030A0"/>
-        </w:rPr>
-        <w:t>±</w:t>
-      </w:r>
-      <w:r>
-        <w:rPr>
-          <w:rFonts w:ascii="Arial" w:hAnsi="Arial" w:cs="Arial"/>
-          <w:color w:val="7030A0"/>
-        </w:rPr>
-        <w:t xml:space="preserve"> 0.</w:t>
-      </w:r>
-      <w:r>
-        <w:rPr>
-          <w:rFonts w:ascii="Arial" w:hAnsi="Arial" w:cs="Arial"/>
-          <w:color w:val="7030A0"/>
-        </w:rPr>
-        <w:t>34</w:t>
-      </w:r>
-      <w:r>
-        <w:rPr>
-          <w:rFonts w:ascii="Arial" w:hAnsi="Arial" w:cs="Arial"/>
-          <w:color w:val="7030A0"/>
-        </w:rPr>
-        <w:t>)</w:t>
-      </w:r>
-      <w:r>
-        <w:rPr>
-          <w:rFonts w:ascii="Arial" w:hAnsi="Arial" w:cs="Arial"/>
-          <w:color w:val="7030A0"/>
-        </w:rPr>
-        <w:t xml:space="preserve"> had </w:t>
-      </w:r>
-      <w:r>
-        <w:rPr>
-          <w:rFonts w:ascii="Arial" w:hAnsi="Arial" w:cs="Arial"/>
-          <w:color w:val="7030A0"/>
-        </w:rPr>
-        <w:t>15</w:t>
-      </w:r>
-      <w:r>
-        <w:rPr>
-          <w:rFonts w:ascii="Arial" w:hAnsi="Arial" w:cs="Arial"/>
-          <w:color w:val="7030A0"/>
-        </w:rPr>
-        <w:t xml:space="preserve">% </w:t>
-      </w:r>
-      <w:r>
-        <w:rPr>
-          <w:rFonts w:ascii="Arial" w:hAnsi="Arial" w:cs="Arial"/>
-          <w:color w:val="7030A0"/>
-        </w:rPr>
-        <w:t>high</w:t>
-      </w:r>
-      <w:r>
-        <w:rPr>
-          <w:rFonts w:ascii="Arial" w:hAnsi="Arial" w:cs="Arial"/>
-          <w:color w:val="7030A0"/>
-        </w:rPr>
-        <w:t>er CI than those that experience</w:t>
-      </w:r>
-      <w:r>
-        <w:rPr>
-          <w:rFonts w:ascii="Arial" w:hAnsi="Arial" w:cs="Arial"/>
-          <w:color w:val="7030A0"/>
-        </w:rPr>
-        <w:t>d</w:t>
-      </w:r>
-      <w:r>
-        <w:rPr>
-          <w:rFonts w:ascii="Arial" w:hAnsi="Arial" w:cs="Arial"/>
-          <w:color w:val="7030A0"/>
-        </w:rPr>
-        <w:t xml:space="preserve"> 2</w:t>
+        <w:t xml:space="preserve">) </w:t>
+      </w:r>
+      <w:r>
+        <w:rPr>
+          <w:rFonts w:ascii="Arial" w:hAnsi="Arial" w:cs="Arial"/>
+          <w:color w:val="7030A0"/>
+        </w:rPr>
+        <w:t xml:space="preserve">except for </w:t>
+      </w:r>
+      <w:r>
+        <w:rPr>
+          <w:rFonts w:ascii="Arial" w:hAnsi="Arial" w:cs="Arial"/>
+          <w:color w:val="7030A0"/>
+        </w:rPr>
+        <w:t>2</w:t>
       </w:r>
       <w:r>
         <w:rPr>
@@ -5853,126 +6656,7 @@
           <w:rFonts w:ascii="Arial" w:hAnsi="Arial" w:cs="Arial"/>
           <w:color w:val="7030A0"/>
         </w:rPr>
-        <w:t xml:space="preserve"> </w:t>
-      </w:r>
-      <w:r>
-        <w:rPr>
-          <w:rFonts w:ascii="Arial" w:hAnsi="Arial" w:cs="Arial"/>
-          <w:color w:val="7030A0"/>
-        </w:rPr>
-        <w:t>(</w:t>
-      </w:r>
-      <w:r>
-        <w:rPr>
-          <w:rFonts w:ascii="Arial" w:hAnsi="Arial" w:cs="Arial"/>
-          <w:color w:val="7030A0"/>
-        </w:rPr>
-        <w:t>5</w:t>
-      </w:r>
-      <w:r>
-        <w:rPr>
-          <w:rFonts w:ascii="Arial" w:hAnsi="Arial" w:cs="Arial"/>
-          <w:color w:val="7030A0"/>
-        </w:rPr>
-        <w:t>.</w:t>
-      </w:r>
-      <w:r>
-        <w:rPr>
-          <w:rFonts w:ascii="Arial" w:hAnsi="Arial" w:cs="Arial"/>
-          <w:color w:val="7030A0"/>
-        </w:rPr>
-        <w:t>67</w:t>
-      </w:r>
-      <w:r>
-        <w:rPr>
-          <w:rFonts w:ascii="Arial" w:hAnsi="Arial" w:cs="Arial"/>
-          <w:color w:val="7030A0"/>
-        </w:rPr>
-        <w:t xml:space="preserve"> </w:t>
-      </w:r>
-      <w:r>
-        <w:rPr>
-          <w:rFonts w:ascii="Arial" w:hAnsi="Arial" w:cs="Arial"/>
-          <w:color w:val="7030A0"/>
-        </w:rPr>
-        <w:t>±</w:t>
-      </w:r>
-      <w:r>
-        <w:rPr>
-          <w:rFonts w:ascii="Arial" w:hAnsi="Arial" w:cs="Arial"/>
-          <w:color w:val="7030A0"/>
-        </w:rPr>
-        <w:t xml:space="preserve"> 0.</w:t>
-      </w:r>
-      <w:r>
-        <w:rPr>
-          <w:rFonts w:ascii="Arial" w:hAnsi="Arial" w:cs="Arial"/>
-          <w:color w:val="7030A0"/>
-        </w:rPr>
-        <w:t>26</w:t>
-      </w:r>
-      <w:r>
-        <w:rPr>
-          <w:rFonts w:ascii="Arial" w:hAnsi="Arial" w:cs="Arial"/>
-          <w:color w:val="7030A0"/>
-        </w:rPr>
-        <w:t>)</w:t>
-      </w:r>
-      <w:r>
-        <w:rPr>
-          <w:rFonts w:ascii="Arial" w:hAnsi="Arial" w:cs="Arial"/>
-          <w:color w:val="7030A0"/>
-        </w:rPr>
-        <w:t xml:space="preserve"> before the</w:t>
-      </w:r>
-      <w:r>
-        <w:rPr>
-          <w:rFonts w:ascii="Arial" w:hAnsi="Arial" w:cs="Arial"/>
-          <w:color w:val="7030A0"/>
-        </w:rPr>
-        <w:t xml:space="preserve"> </w:t>
-      </w:r>
-      <w:r>
-        <w:rPr>
-          <w:rFonts w:ascii="Arial" w:hAnsi="Arial" w:cs="Arial"/>
-          <w:color w:val="7030A0"/>
-        </w:rPr>
-        <w:t>1</w:t>
-      </w:r>
-      <w:r>
-        <w:rPr>
-          <w:rFonts w:ascii="Arial" w:hAnsi="Arial" w:cs="Arial"/>
-          <w:color w:val="7030A0"/>
-        </w:rPr>
-        <w:t>5</w:t>
-      </w:r>
-      <w:r>
-        <w:rPr>
-          <w:rFonts w:ascii="Arial" w:hAnsi="Arial" w:cs="Arial"/>
-          <w:color w:val="7030A0"/>
-        </w:rPr>
-        <w:t>˚C</w:t>
-      </w:r>
-      <w:r>
-        <w:rPr>
-          <w:rFonts w:ascii="Arial" w:hAnsi="Arial" w:cs="Arial"/>
-          <w:color w:val="7030A0"/>
-        </w:rPr>
-        <w:t xml:space="preserve"> marine heatwave</w:t>
-      </w:r>
-      <w:r>
-        <w:rPr>
-          <w:rFonts w:ascii="Arial" w:hAnsi="Arial" w:cs="Arial"/>
-          <w:color w:val="7030A0"/>
-        </w:rPr>
-        <w:t xml:space="preserve"> </w:t>
-      </w:r>
-      <w:r>
-        <w:rPr>
-          <w:rFonts w:ascii="Arial" w:hAnsi="Arial" w:cs="Arial"/>
-          <w:color w:val="7030A0"/>
-        </w:rPr>
-        <w:t>(</w:t>
+        <w:t xml:space="preserve"> (</w:t>
       </w:r>
       <w:r>
         <w:rPr>
@@ -5995,21 +6679,14 @@
           <w:rFonts w:ascii="Arial" w:hAnsi="Arial" w:cs="Arial"/>
           <w:color w:val="7030A0"/>
         </w:rPr>
-        <w:t>=</w:t>
-      </w:r>
-      <w:r>
-        <w:rPr>
-          <w:rFonts w:ascii="Arial" w:hAnsi="Arial" w:cs="Arial"/>
-          <w:color w:val="7030A0"/>
-        </w:rPr>
-        <w:t xml:space="preserve"> 0.0</w:t>
-      </w:r>
-      <w:r>
-        <w:rPr>
-          <w:rFonts w:ascii="Arial" w:hAnsi="Arial" w:cs="Arial"/>
-          <w:color w:val="7030A0"/>
-        </w:rPr>
-        <w:t xml:space="preserve">12, </w:t>
+        <w:t>&gt; 0.05</w:t>
+      </w:r>
+      <w:r>
+        <w:rPr>
+          <w:rFonts w:ascii="Arial" w:hAnsi="Arial" w:cs="Arial"/>
+          <w:color w:val="7030A0"/>
+        </w:rPr>
+        <w:t xml:space="preserve">, </w:t>
       </w:r>
       <w:r>
         <w:rPr>
@@ -6030,60 +6707,30 @@
       <w:r>
         <w:rPr>
           <w:rFonts w:ascii="Arial" w:hAnsi="Arial" w:cs="Arial"/>
-          <w:b/>
-          <w:bCs/>
-          <w:color w:val="7030A0"/>
-        </w:rPr>
-        <w:t xml:space="preserve"> PAIRWISE</w:t>
-      </w:r>
-      <w:r>
-        <w:rPr>
-          <w:rFonts w:ascii="Arial" w:hAnsi="Arial" w:cs="Arial"/>
-          <w:color w:val="7030A0"/>
-        </w:rPr>
-        <w:t>)</w:t>
-      </w:r>
-      <w:r>
-        <w:rPr>
-          <w:rFonts w:ascii="Arial" w:hAnsi="Arial" w:cs="Arial"/>
-          <w:color w:val="7030A0"/>
-        </w:rPr>
-        <w:t xml:space="preserve">. Similarly, for oysters in the </w:t>
-      </w:r>
-      <w:r>
-        <w:rPr>
-          <w:rFonts w:ascii="Arial" w:hAnsi="Arial" w:cs="Arial"/>
-          <w:color w:val="7030A0"/>
-        </w:rPr>
-        <w:t>1</w:t>
-      </w:r>
-      <w:r>
-        <w:rPr>
-          <w:rFonts w:ascii="Arial" w:hAnsi="Arial" w:cs="Arial"/>
-          <w:color w:val="7030A0"/>
-        </w:rPr>
-        <w:t>8</w:t>
-      </w:r>
-      <w:r>
-        <w:rPr>
-          <w:rFonts w:ascii="Arial" w:hAnsi="Arial" w:cs="Arial"/>
-          <w:color w:val="7030A0"/>
-        </w:rPr>
-        <w:t>˚C</w:t>
-      </w:r>
-      <w:r>
-        <w:rPr>
-          <w:rFonts w:ascii="Arial" w:hAnsi="Arial" w:cs="Arial"/>
-          <w:color w:val="7030A0"/>
-        </w:rPr>
-        <w:t xml:space="preserve"> marine heatwave</w:t>
-      </w:r>
-      <w:r>
-        <w:rPr>
-          <w:rFonts w:ascii="Arial" w:hAnsi="Arial" w:cs="Arial"/>
-          <w:color w:val="7030A0"/>
-        </w:rPr>
-        <w:t xml:space="preserve"> (</w:t>
+          <w:color w:val="7030A0"/>
+        </w:rPr>
+        <w:t xml:space="preserve">) </w:t>
+      </w:r>
+      <w:r>
+        <w:rPr>
+          <w:rFonts w:ascii="Arial" w:hAnsi="Arial" w:cs="Arial"/>
+          <w:color w:val="7030A0"/>
+        </w:rPr>
+        <w:t xml:space="preserve">did; </w:t>
+      </w:r>
+      <w:r>
+        <w:rPr>
+          <w:rFonts w:ascii="Arial" w:hAnsi="Arial" w:cs="Arial"/>
+          <w:color w:val="7030A0"/>
+        </w:rPr>
+        <w:t>the two factors did not interact.</w:t>
+      </w:r>
+      <w:r>
+        <w:rPr>
+          <w:rFonts w:ascii="Arial" w:hAnsi="Arial" w:cs="Arial"/>
+          <w:color w:val="7030A0"/>
+        </w:rPr>
+        <w:t xml:space="preserve"> </w:t>
       </w:r>
       <w:r>
         <w:rPr>
@@ -6092,7 +6739,56 @@
           <w:iCs/>
           <w:color w:val="7030A0"/>
         </w:rPr>
-        <w:t>P</w:t>
+        <w:t>C. sikamea</w:t>
+      </w:r>
+      <w:r>
+        <w:rPr>
+          <w:rFonts w:ascii="Arial" w:hAnsi="Arial" w:cs="Arial"/>
+          <w:color w:val="7030A0"/>
+        </w:rPr>
+        <w:t xml:space="preserve"> stress hardened at </w:t>
+      </w:r>
+      <w:r>
+        <w:rPr>
+          <w:rFonts w:ascii="Arial" w:hAnsi="Arial" w:cs="Arial"/>
+          <w:color w:val="7030A0"/>
+        </w:rPr>
+        <w:t>1</w:t>
+      </w:r>
+      <w:r>
+        <w:rPr>
+          <w:rFonts w:ascii="Arial" w:hAnsi="Arial" w:cs="Arial"/>
+          <w:color w:val="7030A0"/>
+        </w:rPr>
+        <w:t>5</w:t>
+      </w:r>
+      <w:r>
+        <w:rPr>
+          <w:rFonts w:ascii="Arial" w:hAnsi="Arial" w:cs="Arial"/>
+          <w:color w:val="7030A0"/>
+        </w:rPr>
+        <w:t>˚C</w:t>
+      </w:r>
+      <w:r>
+        <w:rPr>
+          <w:rFonts w:ascii="Arial" w:hAnsi="Arial" w:cs="Arial"/>
+          <w:color w:val="7030A0"/>
+        </w:rPr>
+        <w:t xml:space="preserve"> (</w:t>
+      </w:r>
+      <w:r>
+        <w:rPr>
+          <w:rFonts w:ascii="Arial" w:hAnsi="Arial" w:cs="Arial"/>
+          <w:color w:val="7030A0"/>
+        </w:rPr>
+        <w:t>4.</w:t>
+      </w:r>
+      <w:r>
+        <w:rPr>
+          <w:rFonts w:ascii="Arial" w:hAnsi="Arial" w:cs="Arial"/>
+          <w:color w:val="7030A0"/>
+        </w:rPr>
+        <w:t>26</w:t>
       </w:r>
       <w:r>
         <w:rPr>
@@ -6106,7 +6802,7 @@
           <w:rFonts w:ascii="Arial" w:hAnsi="Arial" w:cs="Arial"/>
           <w:color w:val="7030A0"/>
         </w:rPr>
-        <w:t>=</w:t>
+        <w:t>±</w:t>
       </w:r>
       <w:r>
         <w:rPr>
@@ -6120,23 +6816,7 @@
           <w:rFonts w:ascii="Arial" w:hAnsi="Arial" w:cs="Arial"/>
           <w:color w:val="7030A0"/>
         </w:rPr>
-        <w:t xml:space="preserve">12, </w:t>
-      </w:r>
-      <w:r>
-        <w:rPr>
-          <w:rFonts w:ascii="Arial" w:hAnsi="Arial" w:cs="Arial"/>
-          <w:color w:val="7030A0"/>
-        </w:rPr>
-        <w:t xml:space="preserve">Table </w:t>
-      </w:r>
-      <w:r>
-        <w:rPr>
-          <w:rFonts w:ascii="Arial" w:hAnsi="Arial" w:cs="Arial"/>
-          <w:b/>
-          <w:bCs/>
-          <w:color w:val="7030A0"/>
-        </w:rPr>
-        <w:t>GROWTH</w:t>
+        <w:t>7</w:t>
       </w:r>
       <w:r>
         <w:rPr>
@@ -6150,21 +6830,105 @@
           <w:rFonts w:ascii="Arial" w:hAnsi="Arial" w:cs="Arial"/>
           <w:color w:val="7030A0"/>
         </w:rPr>
-        <w:t xml:space="preserve"> varied by </w:t>
-      </w:r>
-      <w:r>
-        <w:rPr>
-          <w:rFonts w:ascii="Arial" w:hAnsi="Arial" w:cs="Arial"/>
-          <w:color w:val="7030A0"/>
-        </w:rPr>
-        <w:t>12.5</w:t>
-      </w:r>
-      <w:r>
-        <w:rPr>
-          <w:rFonts w:ascii="Arial" w:hAnsi="Arial" w:cs="Arial"/>
-          <w:color w:val="7030A0"/>
-        </w:rPr>
-        <w:t xml:space="preserve">% between the </w:t>
+        <w:t xml:space="preserve"> </w:t>
+      </w:r>
+      <w:r>
+        <w:rPr>
+          <w:rFonts w:ascii="Arial" w:hAnsi="Arial" w:cs="Arial"/>
+          <w:color w:val="7030A0"/>
+        </w:rPr>
+        <w:t xml:space="preserve">had a </w:t>
+      </w:r>
+      <w:r>
+        <w:rPr>
+          <w:rFonts w:ascii="Arial" w:hAnsi="Arial" w:cs="Arial"/>
+          <w:color w:val="7030A0"/>
+        </w:rPr>
+        <w:t>6.1</w:t>
+      </w:r>
+      <w:r>
+        <w:rPr>
+          <w:rFonts w:ascii="Arial" w:hAnsi="Arial" w:cs="Arial"/>
+          <w:color w:val="7030A0"/>
+        </w:rPr>
+        <w:t xml:space="preserve">% higher CI than their counterparts at </w:t>
+      </w:r>
+      <w:r>
+        <w:rPr>
+          <w:rFonts w:ascii="Arial" w:hAnsi="Arial" w:cs="Arial"/>
+          <w:color w:val="7030A0"/>
+        </w:rPr>
+        <w:t>2</w:t>
+      </w:r>
+      <w:r>
+        <w:rPr>
+          <w:rFonts w:ascii="Arial" w:hAnsi="Arial" w:cs="Arial"/>
+          <w:color w:val="7030A0"/>
+        </w:rPr>
+        <w:t>1˚C</w:t>
+      </w:r>
+      <w:r>
+        <w:rPr>
+          <w:rFonts w:ascii="Arial" w:hAnsi="Arial" w:cs="Arial"/>
+          <w:color w:val="7030A0"/>
+        </w:rPr>
+        <w:t xml:space="preserve"> (</w:t>
+      </w:r>
+      <w:r>
+        <w:rPr>
+          <w:rFonts w:ascii="Arial" w:hAnsi="Arial" w:cs="Arial"/>
+          <w:color w:val="7030A0"/>
+        </w:rPr>
+        <w:t>4.</w:t>
+      </w:r>
+      <w:r>
+        <w:rPr>
+          <w:rFonts w:ascii="Arial" w:hAnsi="Arial" w:cs="Arial"/>
+          <w:color w:val="7030A0"/>
+        </w:rPr>
+        <w:t>00</w:t>
+      </w:r>
+      <w:r>
+        <w:rPr>
+          <w:rFonts w:ascii="Arial" w:hAnsi="Arial" w:cs="Arial"/>
+          <w:color w:val="7030A0"/>
+        </w:rPr>
+        <w:t xml:space="preserve"> </w:t>
+      </w:r>
+      <w:r>
+        <w:rPr>
+          <w:rFonts w:ascii="Arial" w:hAnsi="Arial" w:cs="Arial"/>
+          <w:color w:val="7030A0"/>
+        </w:rPr>
+        <w:t>±</w:t>
+      </w:r>
+      <w:r>
+        <w:rPr>
+          <w:rFonts w:ascii="Arial" w:hAnsi="Arial" w:cs="Arial"/>
+          <w:color w:val="7030A0"/>
+        </w:rPr>
+        <w:t xml:space="preserve"> 0.</w:t>
+      </w:r>
+      <w:r>
+        <w:rPr>
+          <w:rFonts w:ascii="Arial" w:hAnsi="Arial" w:cs="Arial"/>
+          <w:color w:val="7030A0"/>
+        </w:rPr>
+        <w:t>07</w:t>
+      </w:r>
+      <w:r>
+        <w:rPr>
+          <w:rFonts w:ascii="Arial" w:hAnsi="Arial" w:cs="Arial"/>
+          <w:color w:val="7030A0"/>
+        </w:rPr>
+        <w:t xml:space="preserve">). And, </w:t>
+      </w:r>
+      <w:r>
+        <w:rPr>
+          <w:rFonts w:ascii="Arial" w:hAnsi="Arial" w:cs="Arial"/>
+          <w:color w:val="7030A0"/>
+        </w:rPr>
+        <w:t xml:space="preserve">oysters in the </w:t>
       </w:r>
       <w:r>
         <w:rPr>
@@ -6192,6 +6956,83 @@
           <w:rFonts w:ascii="Arial" w:hAnsi="Arial" w:cs="Arial"/>
           <w:color w:val="7030A0"/>
         </w:rPr>
+        <w:t xml:space="preserve"> marine heatwave were had the greatest CI (4</w:t>
+      </w:r>
+      <w:r>
+        <w:rPr>
+          <w:rFonts w:ascii="Arial" w:hAnsi="Arial" w:cs="Arial"/>
+          <w:color w:val="7030A0"/>
+        </w:rPr>
+        <w:t>.</w:t>
+      </w:r>
+      <w:r>
+        <w:rPr>
+          <w:rFonts w:ascii="Arial" w:hAnsi="Arial" w:cs="Arial"/>
+          <w:color w:val="7030A0"/>
+        </w:rPr>
+        <w:t>4</w:t>
+      </w:r>
+      <w:r>
+        <w:rPr>
+          <w:rFonts w:ascii="Arial" w:hAnsi="Arial" w:cs="Arial"/>
+          <w:color w:val="7030A0"/>
+        </w:rPr>
+        <w:t xml:space="preserve">1 </w:t>
+      </w:r>
+      <w:r>
+        <w:rPr>
+          <w:rFonts w:ascii="Arial" w:hAnsi="Arial" w:cs="Arial"/>
+          <w:color w:val="7030A0"/>
+        </w:rPr>
+        <w:t>±</w:t>
+      </w:r>
+      <w:r>
+        <w:rPr>
+          <w:rFonts w:ascii="Arial" w:hAnsi="Arial" w:cs="Arial"/>
+          <w:color w:val="7030A0"/>
+        </w:rPr>
+        <w:t xml:space="preserve"> 0.1</w:t>
+      </w:r>
+      <w:r>
+        <w:rPr>
+          <w:rFonts w:ascii="Arial" w:hAnsi="Arial" w:cs="Arial"/>
+          <w:color w:val="7030A0"/>
+        </w:rPr>
+        <w:t>0)</w:t>
+      </w:r>
+      <w:r>
+        <w:rPr>
+          <w:rFonts w:ascii="Arial" w:hAnsi="Arial" w:cs="Arial"/>
+          <w:color w:val="7030A0"/>
+        </w:rPr>
+        <w:t xml:space="preserve">, while those in the </w:t>
+      </w:r>
+      <w:r>
+        <w:rPr>
+          <w:rFonts w:ascii="Arial" w:hAnsi="Arial" w:cs="Arial"/>
+          <w:color w:val="7030A0"/>
+        </w:rPr>
+        <w:t>1</w:t>
+      </w:r>
+      <w:r>
+        <w:rPr>
+          <w:rFonts w:ascii="Arial" w:hAnsi="Arial" w:cs="Arial"/>
+          <w:color w:val="7030A0"/>
+        </w:rPr>
+        <w:t>8</w:t>
+      </w:r>
+      <w:r>
+        <w:rPr>
+          <w:rFonts w:ascii="Arial" w:hAnsi="Arial" w:cs="Arial"/>
+          <w:color w:val="7030A0"/>
+        </w:rPr>
+        <w:t>˚C</w:t>
+      </w:r>
+      <w:r>
+        <w:rPr>
+          <w:rFonts w:ascii="Arial" w:hAnsi="Arial" w:cs="Arial"/>
+          <w:color w:val="7030A0"/>
+        </w:rPr>
         <w:t xml:space="preserve"> </w:t>
       </w:r>
       <w:r>
@@ -6199,6 +7040,132 @@
           <w:rFonts w:ascii="Arial" w:hAnsi="Arial" w:cs="Arial"/>
           <w:color w:val="7030A0"/>
         </w:rPr>
+        <w:t>(4.</w:t>
+      </w:r>
+      <w:r>
+        <w:rPr>
+          <w:rFonts w:ascii="Arial" w:hAnsi="Arial" w:cs="Arial"/>
+          <w:color w:val="7030A0"/>
+        </w:rPr>
+        <w:t>08</w:t>
+      </w:r>
+      <w:r>
+        <w:rPr>
+          <w:rFonts w:ascii="Arial" w:hAnsi="Arial" w:cs="Arial"/>
+          <w:color w:val="7030A0"/>
+        </w:rPr>
+        <w:t xml:space="preserve"> </w:t>
+      </w:r>
+      <w:r>
+        <w:rPr>
+          <w:rFonts w:ascii="Arial" w:hAnsi="Arial" w:cs="Arial"/>
+          <w:color w:val="7030A0"/>
+        </w:rPr>
+        <w:t>±</w:t>
+      </w:r>
+      <w:r>
+        <w:rPr>
+          <w:rFonts w:ascii="Arial" w:hAnsi="Arial" w:cs="Arial"/>
+          <w:color w:val="7030A0"/>
+        </w:rPr>
+        <w:t xml:space="preserve"> 0.10)</w:t>
+      </w:r>
+      <w:r>
+        <w:rPr>
+          <w:rFonts w:ascii="Arial" w:hAnsi="Arial" w:cs="Arial"/>
+          <w:color w:val="7030A0"/>
+        </w:rPr>
+        <w:t>, 2</w:t>
+      </w:r>
+      <w:r>
+        <w:rPr>
+          <w:rFonts w:ascii="Arial" w:hAnsi="Arial" w:cs="Arial"/>
+          <w:color w:val="7030A0"/>
+        </w:rPr>
+        <w:t>1˚C</w:t>
+      </w:r>
+      <w:r>
+        <w:rPr>
+          <w:rFonts w:ascii="Arial" w:hAnsi="Arial" w:cs="Arial"/>
+          <w:color w:val="7030A0"/>
+        </w:rPr>
+        <w:t xml:space="preserve"> </w:t>
+      </w:r>
+      <w:r>
+        <w:rPr>
+          <w:rFonts w:ascii="Arial" w:hAnsi="Arial" w:cs="Arial"/>
+          <w:color w:val="7030A0"/>
+        </w:rPr>
+        <w:t>(4.</w:t>
+      </w:r>
+      <w:r>
+        <w:rPr>
+          <w:rFonts w:ascii="Arial" w:hAnsi="Arial" w:cs="Arial"/>
+          <w:color w:val="7030A0"/>
+        </w:rPr>
+        <w:t>2</w:t>
+      </w:r>
+      <w:r>
+        <w:rPr>
+          <w:rFonts w:ascii="Arial" w:hAnsi="Arial" w:cs="Arial"/>
+          <w:color w:val="7030A0"/>
+        </w:rPr>
+        <w:t xml:space="preserve">1 </w:t>
+      </w:r>
+      <w:r>
+        <w:rPr>
+          <w:rFonts w:ascii="Arial" w:hAnsi="Arial" w:cs="Arial"/>
+          <w:color w:val="7030A0"/>
+        </w:rPr>
+        <w:t>±</w:t>
+      </w:r>
+      <w:r>
+        <w:rPr>
+          <w:rFonts w:ascii="Arial" w:hAnsi="Arial" w:cs="Arial"/>
+          <w:color w:val="7030A0"/>
+        </w:rPr>
+        <w:t xml:space="preserve"> 0.1</w:t>
+      </w:r>
+      <w:r>
+        <w:rPr>
+          <w:rFonts w:ascii="Arial" w:hAnsi="Arial" w:cs="Arial"/>
+          <w:color w:val="7030A0"/>
+        </w:rPr>
+        <w:t>2</w:t>
+      </w:r>
+      <w:r>
+        <w:rPr>
+          <w:rFonts w:ascii="Arial" w:hAnsi="Arial" w:cs="Arial"/>
+          <w:color w:val="7030A0"/>
+        </w:rPr>
+        <w:t>)</w:t>
+      </w:r>
+      <w:r>
+        <w:rPr>
+          <w:rFonts w:ascii="Arial" w:hAnsi="Arial" w:cs="Arial"/>
+          <w:color w:val="7030A0"/>
+        </w:rPr>
+        <w:t>, and 24</w:t>
+      </w:r>
+      <w:r>
+        <w:rPr>
+          <w:rFonts w:ascii="Arial" w:hAnsi="Arial" w:cs="Arial"/>
+          <w:color w:val="7030A0"/>
+        </w:rPr>
+        <w:t>˚C</w:t>
+      </w:r>
+      <w:r>
+        <w:rPr>
+          <w:rFonts w:ascii="Arial" w:hAnsi="Arial" w:cs="Arial"/>
+          <w:color w:val="7030A0"/>
+        </w:rPr>
+        <w:t xml:space="preserve"> </w:t>
+      </w:r>
+      <w:r>
+        <w:rPr>
+          <w:rFonts w:ascii="Arial" w:hAnsi="Arial" w:cs="Arial"/>
+          <w:color w:val="7030A0"/>
+        </w:rPr>
         <w:t>(</w:t>
       </w:r>
       <w:r>
@@ -6206,14 +7173,14 @@
           <w:rFonts w:ascii="Arial" w:hAnsi="Arial" w:cs="Arial"/>
           <w:color w:val="7030A0"/>
         </w:rPr>
-        <w:t>8.54</w:t>
-      </w:r>
-      <w:r>
-        <w:rPr>
-          <w:rFonts w:ascii="Arial" w:hAnsi="Arial" w:cs="Arial"/>
-          <w:color w:val="7030A0"/>
-        </w:rPr>
-        <w:t xml:space="preserve"> </w:t>
+        <w:t>3.8</w:t>
+      </w:r>
+      <w:r>
+        <w:rPr>
+          <w:rFonts w:ascii="Arial" w:hAnsi="Arial" w:cs="Arial"/>
+          <w:color w:val="7030A0"/>
+        </w:rPr>
+        <w:t xml:space="preserve">1 </w:t>
       </w:r>
       <w:r>
         <w:rPr>
@@ -6227,14 +7194,14 @@
           <w:rFonts w:ascii="Arial" w:hAnsi="Arial" w:cs="Arial"/>
           <w:color w:val="7030A0"/>
         </w:rPr>
-        <w:t xml:space="preserve"> 0.</w:t>
-      </w:r>
-      <w:r>
-        <w:rPr>
-          <w:rFonts w:ascii="Arial" w:hAnsi="Arial" w:cs="Arial"/>
-          <w:color w:val="7030A0"/>
-        </w:rPr>
-        <w:t>64</w:t>
+        <w:t xml:space="preserve"> 0.0</w:t>
+      </w:r>
+      <w:r>
+        <w:rPr>
+          <w:rFonts w:ascii="Arial" w:hAnsi="Arial" w:cs="Arial"/>
+          <w:color w:val="7030A0"/>
+        </w:rPr>
+        <w:t>8</w:t>
       </w:r>
       <w:r>
         <w:rPr>
@@ -6248,94 +7215,467 @@
           <w:rFonts w:ascii="Arial" w:hAnsi="Arial" w:cs="Arial"/>
           <w:color w:val="7030A0"/>
         </w:rPr>
-        <w:t xml:space="preserve"> and 2</w:t>
-      </w:r>
-      <w:r>
-        <w:rPr>
-          <w:rFonts w:ascii="Arial" w:hAnsi="Arial" w:cs="Arial"/>
-          <w:color w:val="7030A0"/>
-        </w:rPr>
-        <w:t>1˚C</w:t>
-      </w:r>
-      <w:r>
-        <w:rPr>
-          <w:rFonts w:ascii="Arial" w:hAnsi="Arial" w:cs="Arial"/>
-          <w:color w:val="7030A0"/>
-        </w:rPr>
-        <w:t xml:space="preserve"> </w:t>
-      </w:r>
-      <w:r>
-        <w:rPr>
-          <w:rFonts w:ascii="Arial" w:hAnsi="Arial" w:cs="Arial"/>
-          <w:color w:val="7030A0"/>
-        </w:rPr>
-        <w:t>(7.</w:t>
-      </w:r>
-      <w:r>
-        <w:rPr>
-          <w:rFonts w:ascii="Arial" w:hAnsi="Arial" w:cs="Arial"/>
-          <w:color w:val="7030A0"/>
-        </w:rPr>
-        <w:t>47</w:t>
-      </w:r>
-      <w:r>
-        <w:rPr>
-          <w:rFonts w:ascii="Arial" w:hAnsi="Arial" w:cs="Arial"/>
-          <w:color w:val="7030A0"/>
-        </w:rPr>
-        <w:t xml:space="preserve"> </w:t>
-      </w:r>
-      <w:r>
-        <w:rPr>
-          <w:rFonts w:ascii="Arial" w:hAnsi="Arial" w:cs="Arial"/>
-          <w:color w:val="7030A0"/>
-        </w:rPr>
-        <w:t>±</w:t>
-      </w:r>
-      <w:r>
-        <w:rPr>
-          <w:rFonts w:ascii="Arial" w:hAnsi="Arial" w:cs="Arial"/>
-          <w:color w:val="7030A0"/>
-        </w:rPr>
-        <w:t xml:space="preserve"> 0.</w:t>
-      </w:r>
-      <w:r>
-        <w:rPr>
-          <w:rFonts w:ascii="Arial" w:hAnsi="Arial" w:cs="Arial"/>
-          <w:color w:val="7030A0"/>
-        </w:rPr>
-        <w:t>50</w:t>
-      </w:r>
-      <w:r>
-        <w:rPr>
-          <w:rFonts w:ascii="Arial" w:hAnsi="Arial" w:cs="Arial"/>
-          <w:color w:val="7030A0"/>
-        </w:rPr>
-        <w:t>)</w:t>
-      </w:r>
-      <w:r>
-        <w:rPr>
-          <w:rFonts w:ascii="Arial" w:hAnsi="Arial" w:cs="Arial"/>
-          <w:color w:val="7030A0"/>
-        </w:rPr>
-        <w:t xml:space="preserve"> stress hardening treatments.</w:t>
+        <w:t xml:space="preserve"> treatments were </w:t>
+      </w:r>
+      <w:r>
+        <w:rPr>
+          <w:rFonts w:ascii="Arial" w:hAnsi="Arial" w:cs="Arial"/>
+          <w:color w:val="7030A0"/>
+        </w:rPr>
+        <w:t>8.1</w:t>
+      </w:r>
+      <w:r>
+        <w:rPr>
+          <w:rFonts w:ascii="Arial" w:hAnsi="Arial" w:cs="Arial"/>
+          <w:color w:val="7030A0"/>
+        </w:rPr>
+        <w:t xml:space="preserve">%, </w:t>
+      </w:r>
+      <w:r>
+        <w:rPr>
+          <w:rFonts w:ascii="Arial" w:hAnsi="Arial" w:cs="Arial"/>
+          <w:color w:val="7030A0"/>
+        </w:rPr>
+        <w:t>4.8</w:t>
+      </w:r>
+      <w:r>
+        <w:rPr>
+          <w:rFonts w:ascii="Arial" w:hAnsi="Arial" w:cs="Arial"/>
+          <w:color w:val="7030A0"/>
+        </w:rPr>
+        <w:t xml:space="preserve">%, and </w:t>
+      </w:r>
+      <w:r>
+        <w:rPr>
+          <w:rFonts w:ascii="Arial" w:hAnsi="Arial" w:cs="Arial"/>
+          <w:color w:val="7030A0"/>
+        </w:rPr>
+        <w:t>15.7</w:t>
+      </w:r>
+      <w:r>
+        <w:rPr>
+          <w:rFonts w:ascii="Arial" w:hAnsi="Arial" w:cs="Arial"/>
+          <w:color w:val="7030A0"/>
+        </w:rPr>
+        <w:t>% smaller, respectively.</w:t>
       </w:r>
     </w:p>
     <w:p>
       <w:pPr>
-        <w:ind w:left="720" w:firstLine="720"/>
-        <w:rPr>
-          <w:rFonts w:ascii="Arial" w:hAnsi="Arial" w:cs="Arial"/>
-          <w:color w:val="7030A0"/>
-        </w:rPr>
-      </w:pPr>
-      <w:r>
+        <w:ind w:firstLine="720"/>
         <w:rPr>
           <w:rFonts w:ascii="Arial" w:hAnsi="Arial" w:cs="Arial"/>
           <w:i/>
           <w:iCs/>
           <w:color w:val="7030A0"/>
         </w:rPr>
+      </w:pPr>
+      <w:r>
+        <w:rPr>
+          <w:rFonts w:ascii="Arial" w:hAnsi="Arial" w:cs="Arial"/>
+          <w:color w:val="7030A0"/>
+        </w:rPr>
+        <w:t>Tidal regime during stress hardening (</w:t>
+      </w:r>
+      <w:r>
+        <w:rPr>
+          <w:rFonts w:ascii="Arial" w:hAnsi="Arial" w:cs="Arial"/>
+          <w:i/>
+          <w:iCs/>
+          <w:color w:val="7030A0"/>
+        </w:rPr>
+        <w:t>P</w:t>
+      </w:r>
+      <w:r>
+        <w:rPr>
+          <w:rFonts w:ascii="Arial" w:hAnsi="Arial" w:cs="Arial"/>
+          <w:color w:val="7030A0"/>
+        </w:rPr>
+        <w:t xml:space="preserve"> </w:t>
+      </w:r>
+      <w:r>
+        <w:rPr>
+          <w:rFonts w:ascii="Arial" w:hAnsi="Arial" w:cs="Arial"/>
+          <w:color w:val="7030A0"/>
+        </w:rPr>
+        <w:t>&lt;</w:t>
+      </w:r>
+      <w:r>
+        <w:rPr>
+          <w:rFonts w:ascii="Arial" w:hAnsi="Arial" w:cs="Arial"/>
+          <w:color w:val="7030A0"/>
+        </w:rPr>
+        <w:t xml:space="preserve"> 0.0</w:t>
+      </w:r>
+      <w:r>
+        <w:rPr>
+          <w:rFonts w:ascii="Arial" w:hAnsi="Arial" w:cs="Arial"/>
+          <w:color w:val="7030A0"/>
+        </w:rPr>
+        <w:t>1</w:t>
+      </w:r>
+      <w:r>
+        <w:rPr>
+          <w:rFonts w:ascii="Arial" w:hAnsi="Arial" w:cs="Arial"/>
+          <w:color w:val="7030A0"/>
+        </w:rPr>
+        <w:t xml:space="preserve">, </w:t>
+      </w:r>
+      <w:r>
+        <w:rPr>
+          <w:rFonts w:ascii="Arial" w:hAnsi="Arial" w:cs="Arial"/>
+          <w:color w:val="7030A0"/>
+        </w:rPr>
+        <w:t xml:space="preserve">Table </w:t>
+      </w:r>
+      <w:r>
+        <w:rPr>
+          <w:rFonts w:ascii="Arial" w:hAnsi="Arial" w:cs="Arial"/>
+          <w:b/>
+          <w:bCs/>
+          <w:color w:val="7030A0"/>
+        </w:rPr>
+        <w:t>GROWTH</w:t>
+      </w:r>
+      <w:r>
+        <w:rPr>
+          <w:rFonts w:ascii="Arial" w:hAnsi="Arial" w:cs="Arial"/>
+          <w:color w:val="7030A0"/>
+        </w:rPr>
+        <w:t>) and marine heatwave treatment (</w:t>
+      </w:r>
+      <w:r>
+        <w:rPr>
+          <w:rFonts w:ascii="Arial" w:hAnsi="Arial" w:cs="Arial"/>
+          <w:i/>
+          <w:iCs/>
+          <w:color w:val="7030A0"/>
+        </w:rPr>
+        <w:t>P</w:t>
+      </w:r>
+      <w:r>
+        <w:rPr>
+          <w:rFonts w:ascii="Arial" w:hAnsi="Arial" w:cs="Arial"/>
+          <w:color w:val="7030A0"/>
+        </w:rPr>
+        <w:t xml:space="preserve"> </w:t>
+      </w:r>
+      <w:r>
+        <w:rPr>
+          <w:rFonts w:ascii="Arial" w:hAnsi="Arial" w:cs="Arial"/>
+          <w:color w:val="7030A0"/>
+        </w:rPr>
+        <w:t>=</w:t>
+      </w:r>
+      <w:r>
+        <w:rPr>
+          <w:rFonts w:ascii="Arial" w:hAnsi="Arial" w:cs="Arial"/>
+          <w:color w:val="7030A0"/>
+        </w:rPr>
+        <w:t xml:space="preserve"> 0.0</w:t>
+      </w:r>
+      <w:r>
+        <w:rPr>
+          <w:rFonts w:ascii="Arial" w:hAnsi="Arial" w:cs="Arial"/>
+          <w:color w:val="7030A0"/>
+        </w:rPr>
+        <w:t>1</w:t>
+      </w:r>
+      <w:r>
+        <w:rPr>
+          <w:rFonts w:ascii="Arial" w:hAnsi="Arial" w:cs="Arial"/>
+          <w:color w:val="7030A0"/>
+        </w:rPr>
+        <w:t xml:space="preserve">, </w:t>
+      </w:r>
+      <w:r>
+        <w:rPr>
+          <w:rFonts w:ascii="Arial" w:hAnsi="Arial" w:cs="Arial"/>
+          <w:color w:val="7030A0"/>
+        </w:rPr>
+        <w:t xml:space="preserve">Table </w:t>
+      </w:r>
+      <w:r>
+        <w:rPr>
+          <w:rFonts w:ascii="Arial" w:hAnsi="Arial" w:cs="Arial"/>
+          <w:b/>
+          <w:bCs/>
+          <w:color w:val="7030A0"/>
+        </w:rPr>
+        <w:t>GROWTH</w:t>
+      </w:r>
+      <w:r>
+        <w:rPr>
+          <w:rFonts w:ascii="Arial" w:hAnsi="Arial" w:cs="Arial"/>
+          <w:color w:val="7030A0"/>
+        </w:rPr>
+        <w:t xml:space="preserve">) determined CI in </w:t>
+      </w:r>
+      <w:r>
+        <w:rPr>
+          <w:rFonts w:ascii="Arial" w:hAnsi="Arial" w:cs="Arial"/>
+          <w:i/>
+          <w:iCs/>
+          <w:color w:val="7030A0"/>
+        </w:rPr>
+        <w:t>M. gigas</w:t>
+      </w:r>
+      <w:r>
+        <w:rPr>
+          <w:rFonts w:ascii="Arial" w:hAnsi="Arial" w:cs="Arial"/>
+          <w:color w:val="7030A0"/>
+        </w:rPr>
+        <w:t>,</w:t>
+      </w:r>
+      <w:r>
+        <w:rPr>
+          <w:rFonts w:ascii="Arial" w:hAnsi="Arial" w:cs="Arial"/>
+          <w:color w:val="7030A0"/>
+        </w:rPr>
+        <w:t xml:space="preserve"> though they did not interact.</w:t>
+      </w:r>
+      <w:r>
+        <w:rPr>
+          <w:rFonts w:ascii="Arial" w:hAnsi="Arial" w:cs="Arial"/>
+          <w:color w:val="7030A0"/>
+        </w:rPr>
+        <w:t xml:space="preserve"> </w:t>
+      </w:r>
+      <w:r>
+        <w:rPr>
+          <w:rFonts w:ascii="Arial" w:hAnsi="Arial" w:cs="Arial"/>
+          <w:color w:val="7030A0"/>
+        </w:rPr>
+        <w:t>In contrast, s</w:t>
+      </w:r>
+      <w:r>
+        <w:rPr>
+          <w:rFonts w:ascii="Arial" w:hAnsi="Arial" w:cs="Arial"/>
+          <w:color w:val="7030A0"/>
+        </w:rPr>
+        <w:t>tress hardening temperature did not</w:t>
+      </w:r>
+      <w:r>
+        <w:rPr>
+          <w:rFonts w:ascii="Arial" w:hAnsi="Arial" w:cs="Arial"/>
+          <w:color w:val="7030A0"/>
+        </w:rPr>
+        <w:t xml:space="preserve"> affect CI</w:t>
+      </w:r>
+      <w:r>
+        <w:rPr>
+          <w:rFonts w:ascii="Arial" w:hAnsi="Arial" w:cs="Arial"/>
+          <w:color w:val="7030A0"/>
+        </w:rPr>
+        <w:t xml:space="preserve"> (</w:t>
+      </w:r>
+      <w:r>
+        <w:rPr>
+          <w:rFonts w:ascii="Arial" w:hAnsi="Arial" w:cs="Arial"/>
+          <w:i/>
+          <w:iCs/>
+          <w:color w:val="7030A0"/>
+        </w:rPr>
+        <w:t>P</w:t>
+      </w:r>
+      <w:r>
+        <w:rPr>
+          <w:rFonts w:ascii="Arial" w:hAnsi="Arial" w:cs="Arial"/>
+          <w:color w:val="7030A0"/>
+        </w:rPr>
+        <w:t xml:space="preserve"> </w:t>
+      </w:r>
+      <w:r>
+        <w:rPr>
+          <w:rFonts w:ascii="Arial" w:hAnsi="Arial" w:cs="Arial"/>
+          <w:color w:val="7030A0"/>
+        </w:rPr>
+        <w:t xml:space="preserve">&gt; 0.05, </w:t>
+      </w:r>
+      <w:r>
+        <w:rPr>
+          <w:rFonts w:ascii="Arial" w:hAnsi="Arial" w:cs="Arial"/>
+          <w:color w:val="7030A0"/>
+        </w:rPr>
+        <w:t xml:space="preserve">Table </w:t>
+      </w:r>
+      <w:r>
+        <w:rPr>
+          <w:rFonts w:ascii="Arial" w:hAnsi="Arial" w:cs="Arial"/>
+          <w:b/>
+          <w:bCs/>
+          <w:color w:val="7030A0"/>
+        </w:rPr>
+        <w:t>GROWTH</w:t>
+      </w:r>
+      <w:r>
+        <w:rPr>
+          <w:rFonts w:ascii="Arial" w:hAnsi="Arial" w:cs="Arial"/>
+          <w:color w:val="7030A0"/>
+        </w:rPr>
+        <w:t>)</w:t>
+      </w:r>
+      <w:r>
+        <w:rPr>
+          <w:rFonts w:ascii="Arial" w:hAnsi="Arial" w:cs="Arial"/>
+          <w:color w:val="7030A0"/>
+        </w:rPr>
+        <w:t xml:space="preserve">. </w:t>
+      </w:r>
+      <w:r>
+        <w:rPr>
+          <w:rFonts w:ascii="Arial" w:hAnsi="Arial" w:cs="Arial"/>
+          <w:color w:val="7030A0"/>
+        </w:rPr>
+        <w:t xml:space="preserve">Interestingly, oysters exposed to a tidal cycle </w:t>
+      </w:r>
+      <w:r>
+        <w:rPr>
+          <w:rFonts w:ascii="Arial" w:hAnsi="Arial" w:cs="Arial"/>
+          <w:color w:val="7030A0"/>
+        </w:rPr>
+        <w:t>(</w:t>
+      </w:r>
+      <w:r>
+        <w:rPr>
+          <w:rFonts w:ascii="Arial" w:hAnsi="Arial" w:cs="Arial"/>
+          <w:color w:val="7030A0"/>
+        </w:rPr>
+        <w:t>3</w:t>
+      </w:r>
+      <w:r>
+        <w:rPr>
+          <w:rFonts w:ascii="Arial" w:hAnsi="Arial" w:cs="Arial"/>
+          <w:color w:val="7030A0"/>
+        </w:rPr>
+        <w:t>.</w:t>
+      </w:r>
+      <w:r>
+        <w:rPr>
+          <w:rFonts w:ascii="Arial" w:hAnsi="Arial" w:cs="Arial"/>
+          <w:color w:val="7030A0"/>
+        </w:rPr>
+        <w:t>57</w:t>
+      </w:r>
+      <w:r>
+        <w:rPr>
+          <w:rFonts w:ascii="Arial" w:hAnsi="Arial" w:cs="Arial"/>
+          <w:color w:val="7030A0"/>
+        </w:rPr>
+        <w:t xml:space="preserve"> </w:t>
+      </w:r>
+      <w:r>
+        <w:rPr>
+          <w:rFonts w:ascii="Arial" w:hAnsi="Arial" w:cs="Arial"/>
+          <w:color w:val="7030A0"/>
+        </w:rPr>
+        <w:t>±</w:t>
+      </w:r>
+      <w:r>
+        <w:rPr>
+          <w:rFonts w:ascii="Arial" w:hAnsi="Arial" w:cs="Arial"/>
+          <w:color w:val="7030A0"/>
+        </w:rPr>
+        <w:t xml:space="preserve"> 0.0</w:t>
+      </w:r>
+      <w:r>
+        <w:rPr>
+          <w:rFonts w:ascii="Arial" w:hAnsi="Arial" w:cs="Arial"/>
+          <w:color w:val="7030A0"/>
+        </w:rPr>
+        <w:t>4</w:t>
+      </w:r>
+      <w:r>
+        <w:rPr>
+          <w:rFonts w:ascii="Arial" w:hAnsi="Arial" w:cs="Arial"/>
+          <w:color w:val="7030A0"/>
+        </w:rPr>
+        <w:t xml:space="preserve">) had a </w:t>
+      </w:r>
+      <w:r>
+        <w:rPr>
+          <w:rFonts w:ascii="Arial" w:hAnsi="Arial" w:cs="Arial"/>
+          <w:color w:val="7030A0"/>
+        </w:rPr>
+        <w:t>10.1</w:t>
+      </w:r>
+      <w:r>
+        <w:rPr>
+          <w:rFonts w:ascii="Arial" w:hAnsi="Arial" w:cs="Arial"/>
+          <w:color w:val="7030A0"/>
+        </w:rPr>
+        <w:t>% larger CI than those that were fully submerged</w:t>
+      </w:r>
+      <w:r>
+        <w:rPr>
+          <w:rFonts w:ascii="Arial" w:hAnsi="Arial" w:cs="Arial"/>
+          <w:color w:val="7030A0"/>
+        </w:rPr>
+        <w:t xml:space="preserve"> (3</w:t>
+      </w:r>
+      <w:r>
+        <w:rPr>
+          <w:rFonts w:ascii="Arial" w:hAnsi="Arial" w:cs="Arial"/>
+          <w:color w:val="7030A0"/>
+        </w:rPr>
+        <w:t>.</w:t>
+      </w:r>
+      <w:r>
+        <w:rPr>
+          <w:rFonts w:ascii="Arial" w:hAnsi="Arial" w:cs="Arial"/>
+          <w:color w:val="7030A0"/>
+        </w:rPr>
+        <w:t>97</w:t>
+      </w:r>
+      <w:r>
+        <w:rPr>
+          <w:rFonts w:ascii="Arial" w:hAnsi="Arial" w:cs="Arial"/>
+          <w:color w:val="7030A0"/>
+        </w:rPr>
+        <w:t xml:space="preserve"> </w:t>
+      </w:r>
+      <w:r>
+        <w:rPr>
+          <w:rFonts w:ascii="Arial" w:hAnsi="Arial" w:cs="Arial"/>
+          <w:color w:val="7030A0"/>
+        </w:rPr>
+        <w:t>±</w:t>
+      </w:r>
+      <w:r>
+        <w:rPr>
+          <w:rFonts w:ascii="Arial" w:hAnsi="Arial" w:cs="Arial"/>
+          <w:color w:val="7030A0"/>
+        </w:rPr>
+        <w:t xml:space="preserve"> 0.0</w:t>
+      </w:r>
+      <w:r>
+        <w:rPr>
+          <w:rFonts w:ascii="Arial" w:hAnsi="Arial" w:cs="Arial"/>
+          <w:color w:val="7030A0"/>
+        </w:rPr>
+        <w:t>8)</w:t>
+      </w:r>
+      <w:r>
+        <w:rPr>
+          <w:rFonts w:ascii="Arial" w:hAnsi="Arial" w:cs="Arial"/>
+          <w:color w:val="7030A0"/>
+        </w:rPr>
+        <w:t xml:space="preserve"> for the duration of the stress hardening period. </w:t>
+      </w:r>
+      <w:r>
+        <w:rPr>
+          <w:rFonts w:ascii="Arial" w:hAnsi="Arial" w:cs="Arial"/>
+          <w:color w:val="7030A0"/>
+        </w:rPr>
+        <w:t xml:space="preserve">Similar to </w:t>
+      </w:r>
+      <w:r>
+        <w:rPr>
+          <w:rFonts w:ascii="Arial" w:hAnsi="Arial" w:cs="Arial"/>
+          <w:i/>
+          <w:iCs/>
+          <w:color w:val="7030A0"/>
+        </w:rPr>
         <w:t>C. sikamea</w:t>
       </w:r>
       <w:r>
@@ -6343,48 +7683,386 @@
           <w:rFonts w:ascii="Arial" w:hAnsi="Arial" w:cs="Arial"/>
           <w:color w:val="7030A0"/>
         </w:rPr>
-        <w:t xml:space="preserve"> – </w:t>
-      </w:r>
-      <w:r>
-        <w:rPr>
-          <w:rFonts w:ascii="Arial" w:hAnsi="Arial" w:cs="Arial"/>
-          <w:color w:val="7030A0"/>
-        </w:rPr>
-        <w:t>x</w:t>
+        <w:t xml:space="preserve">, </w:t>
+      </w:r>
+      <w:r>
+        <w:rPr>
+          <w:rFonts w:ascii="Arial" w:hAnsi="Arial" w:cs="Arial"/>
+          <w:color w:val="7030A0"/>
+        </w:rPr>
+        <w:t xml:space="preserve">individuals in the </w:t>
+      </w:r>
+      <w:r>
+        <w:rPr>
+          <w:rFonts w:ascii="Arial" w:hAnsi="Arial" w:cs="Arial"/>
+          <w:color w:val="7030A0"/>
+        </w:rPr>
+        <w:t>1</w:t>
+      </w:r>
+      <w:r>
+        <w:rPr>
+          <w:rFonts w:ascii="Arial" w:hAnsi="Arial" w:cs="Arial"/>
+          <w:color w:val="7030A0"/>
+        </w:rPr>
+        <w:t>5</w:t>
+      </w:r>
+      <w:r>
+        <w:rPr>
+          <w:rFonts w:ascii="Arial" w:hAnsi="Arial" w:cs="Arial"/>
+          <w:color w:val="7030A0"/>
+        </w:rPr>
+        <w:t>˚C</w:t>
+      </w:r>
+      <w:r>
+        <w:rPr>
+          <w:rFonts w:ascii="Arial" w:hAnsi="Arial" w:cs="Arial"/>
+          <w:color w:val="7030A0"/>
+        </w:rPr>
+        <w:t xml:space="preserve"> marine heatwave</w:t>
+      </w:r>
+      <w:r>
+        <w:rPr>
+          <w:rFonts w:ascii="Arial" w:hAnsi="Arial" w:cs="Arial"/>
+          <w:color w:val="7030A0"/>
+        </w:rPr>
+        <w:t xml:space="preserve"> (</w:t>
+      </w:r>
+      <w:r>
+        <w:rPr>
+          <w:rFonts w:ascii="Arial" w:hAnsi="Arial" w:cs="Arial"/>
+          <w:color w:val="7030A0"/>
+        </w:rPr>
+        <w:t>4.1</w:t>
+      </w:r>
+      <w:r>
+        <w:rPr>
+          <w:rFonts w:ascii="Arial" w:hAnsi="Arial" w:cs="Arial"/>
+          <w:color w:val="7030A0"/>
+        </w:rPr>
+        <w:t>6</w:t>
+      </w:r>
+      <w:r>
+        <w:rPr>
+          <w:rFonts w:ascii="Arial" w:hAnsi="Arial" w:cs="Arial"/>
+          <w:color w:val="7030A0"/>
+        </w:rPr>
+        <w:t xml:space="preserve"> </w:t>
+      </w:r>
+      <w:r>
+        <w:rPr>
+          <w:rFonts w:ascii="Arial" w:hAnsi="Arial" w:cs="Arial"/>
+          <w:color w:val="7030A0"/>
+        </w:rPr>
+        <w:t>±</w:t>
+      </w:r>
+      <w:r>
+        <w:rPr>
+          <w:rFonts w:ascii="Arial" w:hAnsi="Arial" w:cs="Arial"/>
+          <w:color w:val="7030A0"/>
+        </w:rPr>
+        <w:t xml:space="preserve"> 0.1</w:t>
+      </w:r>
+      <w:r>
+        <w:rPr>
+          <w:rFonts w:ascii="Arial" w:hAnsi="Arial" w:cs="Arial"/>
+          <w:color w:val="7030A0"/>
+        </w:rPr>
+        <w:t>4</w:t>
+      </w:r>
+      <w:r>
+        <w:rPr>
+          <w:rFonts w:ascii="Arial" w:hAnsi="Arial" w:cs="Arial"/>
+          <w:color w:val="7030A0"/>
+        </w:rPr>
+        <w:t xml:space="preserve">) had the highest CI, while oysters in </w:t>
+      </w:r>
+      <w:r>
+        <w:rPr>
+          <w:rFonts w:ascii="Arial" w:hAnsi="Arial" w:cs="Arial"/>
+          <w:color w:val="7030A0"/>
+        </w:rPr>
+        <w:t>1</w:t>
+      </w:r>
+      <w:r>
+        <w:rPr>
+          <w:rFonts w:ascii="Arial" w:hAnsi="Arial" w:cs="Arial"/>
+          <w:color w:val="7030A0"/>
+        </w:rPr>
+        <w:t>8</w:t>
+      </w:r>
+      <w:r>
+        <w:rPr>
+          <w:rFonts w:ascii="Arial" w:hAnsi="Arial" w:cs="Arial"/>
+          <w:color w:val="7030A0"/>
+        </w:rPr>
+        <w:t>˚C</w:t>
+      </w:r>
+      <w:r>
+        <w:rPr>
+          <w:rFonts w:ascii="Arial" w:hAnsi="Arial" w:cs="Arial"/>
+          <w:color w:val="7030A0"/>
+        </w:rPr>
+        <w:t xml:space="preserve"> (</w:t>
+      </w:r>
+      <w:r>
+        <w:rPr>
+          <w:rFonts w:ascii="Arial" w:hAnsi="Arial" w:cs="Arial"/>
+          <w:color w:val="7030A0"/>
+        </w:rPr>
+        <w:t>3.9</w:t>
+      </w:r>
+      <w:r>
+        <w:rPr>
+          <w:rFonts w:ascii="Arial" w:hAnsi="Arial" w:cs="Arial"/>
+          <w:color w:val="7030A0"/>
+        </w:rPr>
+        <w:t xml:space="preserve">8 </w:t>
+      </w:r>
+      <w:r>
+        <w:rPr>
+          <w:rFonts w:ascii="Arial" w:hAnsi="Arial" w:cs="Arial"/>
+          <w:color w:val="7030A0"/>
+        </w:rPr>
+        <w:t>±</w:t>
+      </w:r>
+      <w:r>
+        <w:rPr>
+          <w:rFonts w:ascii="Arial" w:hAnsi="Arial" w:cs="Arial"/>
+          <w:color w:val="7030A0"/>
+        </w:rPr>
+        <w:t xml:space="preserve"> 0.0</w:t>
+      </w:r>
+      <w:r>
+        <w:rPr>
+          <w:rFonts w:ascii="Arial" w:hAnsi="Arial" w:cs="Arial"/>
+          <w:color w:val="7030A0"/>
+        </w:rPr>
+        <w:t>8</w:t>
+      </w:r>
+      <w:r>
+        <w:rPr>
+          <w:rFonts w:ascii="Arial" w:hAnsi="Arial" w:cs="Arial"/>
+          <w:color w:val="7030A0"/>
+        </w:rPr>
+        <w:t>), 2</w:t>
+      </w:r>
+      <w:r>
+        <w:rPr>
+          <w:rFonts w:ascii="Arial" w:hAnsi="Arial" w:cs="Arial"/>
+          <w:color w:val="7030A0"/>
+        </w:rPr>
+        <w:t>1˚C</w:t>
+      </w:r>
+      <w:r>
+        <w:rPr>
+          <w:rFonts w:ascii="Arial" w:hAnsi="Arial" w:cs="Arial"/>
+          <w:color w:val="7030A0"/>
+        </w:rPr>
+        <w:t xml:space="preserve"> (</w:t>
+      </w:r>
+      <w:r>
+        <w:rPr>
+          <w:rFonts w:ascii="Arial" w:hAnsi="Arial" w:cs="Arial"/>
+          <w:color w:val="7030A0"/>
+        </w:rPr>
+        <w:t>3</w:t>
+      </w:r>
+      <w:r>
+        <w:rPr>
+          <w:rFonts w:ascii="Arial" w:hAnsi="Arial" w:cs="Arial"/>
+          <w:color w:val="7030A0"/>
+        </w:rPr>
+        <w:t>.</w:t>
+      </w:r>
+      <w:r>
+        <w:rPr>
+          <w:rFonts w:ascii="Arial" w:hAnsi="Arial" w:cs="Arial"/>
+          <w:color w:val="7030A0"/>
+        </w:rPr>
+        <w:t>7</w:t>
+      </w:r>
+      <w:r>
+        <w:rPr>
+          <w:rFonts w:ascii="Arial" w:hAnsi="Arial" w:cs="Arial"/>
+          <w:color w:val="7030A0"/>
+        </w:rPr>
+        <w:t xml:space="preserve">2 </w:t>
+      </w:r>
+      <w:r>
+        <w:rPr>
+          <w:rFonts w:ascii="Arial" w:hAnsi="Arial" w:cs="Arial"/>
+          <w:color w:val="7030A0"/>
+        </w:rPr>
+        <w:t>±</w:t>
+      </w:r>
+      <w:r>
+        <w:rPr>
+          <w:rFonts w:ascii="Arial" w:hAnsi="Arial" w:cs="Arial"/>
+          <w:color w:val="7030A0"/>
+        </w:rPr>
+        <w:t xml:space="preserve"> 0.</w:t>
+      </w:r>
+      <w:r>
+        <w:rPr>
+          <w:rFonts w:ascii="Arial" w:hAnsi="Arial" w:cs="Arial"/>
+          <w:color w:val="7030A0"/>
+        </w:rPr>
+        <w:t>05</w:t>
+      </w:r>
+      <w:r>
+        <w:rPr>
+          <w:rFonts w:ascii="Arial" w:hAnsi="Arial" w:cs="Arial"/>
+          <w:color w:val="7030A0"/>
+        </w:rPr>
+        <w:t>), and 24</w:t>
+      </w:r>
+      <w:r>
+        <w:rPr>
+          <w:rFonts w:ascii="Arial" w:hAnsi="Arial" w:cs="Arial"/>
+          <w:color w:val="7030A0"/>
+        </w:rPr>
+        <w:t>˚C</w:t>
+      </w:r>
+      <w:r>
+        <w:rPr>
+          <w:rFonts w:ascii="Arial" w:hAnsi="Arial" w:cs="Arial"/>
+          <w:color w:val="7030A0"/>
+        </w:rPr>
+        <w:t xml:space="preserve"> (3.</w:t>
+      </w:r>
+      <w:r>
+        <w:rPr>
+          <w:rFonts w:ascii="Arial" w:hAnsi="Arial" w:cs="Arial"/>
+          <w:color w:val="7030A0"/>
+        </w:rPr>
+        <w:t>5</w:t>
+      </w:r>
+      <w:r>
+        <w:rPr>
+          <w:rFonts w:ascii="Arial" w:hAnsi="Arial" w:cs="Arial"/>
+          <w:color w:val="7030A0"/>
+        </w:rPr>
+        <w:t xml:space="preserve">1 </w:t>
+      </w:r>
+      <w:r>
+        <w:rPr>
+          <w:rFonts w:ascii="Arial" w:hAnsi="Arial" w:cs="Arial"/>
+          <w:color w:val="7030A0"/>
+        </w:rPr>
+        <w:t>±</w:t>
+      </w:r>
+      <w:r>
+        <w:rPr>
+          <w:rFonts w:ascii="Arial" w:hAnsi="Arial" w:cs="Arial"/>
+          <w:color w:val="7030A0"/>
+        </w:rPr>
+        <w:t xml:space="preserve"> 0.08) treatments were </w:t>
+      </w:r>
+      <w:r>
+        <w:rPr>
+          <w:rFonts w:ascii="Arial" w:hAnsi="Arial" w:cs="Arial"/>
+          <w:color w:val="7030A0"/>
+        </w:rPr>
+        <w:t>4</w:t>
+      </w:r>
+      <w:r>
+        <w:rPr>
+          <w:rFonts w:ascii="Arial" w:hAnsi="Arial" w:cs="Arial"/>
+          <w:color w:val="7030A0"/>
+        </w:rPr>
+        <w:t>.</w:t>
+      </w:r>
+      <w:r>
+        <w:rPr>
+          <w:rFonts w:ascii="Arial" w:hAnsi="Arial" w:cs="Arial"/>
+          <w:color w:val="7030A0"/>
+        </w:rPr>
+        <w:t>5</w:t>
+      </w:r>
+      <w:r>
+        <w:rPr>
+          <w:rFonts w:ascii="Arial" w:hAnsi="Arial" w:cs="Arial"/>
+          <w:color w:val="7030A0"/>
+        </w:rPr>
+        <w:t xml:space="preserve">%, </w:t>
+      </w:r>
+      <w:r>
+        <w:rPr>
+          <w:rFonts w:ascii="Arial" w:hAnsi="Arial" w:cs="Arial"/>
+          <w:color w:val="7030A0"/>
+        </w:rPr>
+        <w:t>4</w:t>
+      </w:r>
+      <w:r>
+        <w:rPr>
+          <w:rFonts w:ascii="Arial" w:hAnsi="Arial" w:cs="Arial"/>
+          <w:color w:val="7030A0"/>
+        </w:rPr>
+        <w:t>.</w:t>
+      </w:r>
+      <w:r>
+        <w:rPr>
+          <w:rFonts w:ascii="Arial" w:hAnsi="Arial" w:cs="Arial"/>
+          <w:color w:val="7030A0"/>
+        </w:rPr>
+        <w:t>5</w:t>
+      </w:r>
+      <w:r>
+        <w:rPr>
+          <w:rFonts w:ascii="Arial" w:hAnsi="Arial" w:cs="Arial"/>
+          <w:color w:val="7030A0"/>
+        </w:rPr>
+        <w:t>%, and 1</w:t>
+      </w:r>
+      <w:r>
+        <w:rPr>
+          <w:rFonts w:ascii="Arial" w:hAnsi="Arial" w:cs="Arial"/>
+          <w:color w:val="7030A0"/>
+        </w:rPr>
+        <w:t>8</w:t>
+      </w:r>
+      <w:r>
+        <w:rPr>
+          <w:rFonts w:ascii="Arial" w:hAnsi="Arial" w:cs="Arial"/>
+          <w:color w:val="7030A0"/>
+        </w:rPr>
+        <w:t>.</w:t>
+      </w:r>
+      <w:r>
+        <w:rPr>
+          <w:rFonts w:ascii="Arial" w:hAnsi="Arial" w:cs="Arial"/>
+          <w:color w:val="7030A0"/>
+        </w:rPr>
+        <w:t>5</w:t>
+      </w:r>
+      <w:r>
+        <w:rPr>
+          <w:rFonts w:ascii="Arial" w:hAnsi="Arial" w:cs="Arial"/>
+          <w:color w:val="7030A0"/>
+        </w:rPr>
+        <w:t xml:space="preserve">% </w:t>
+      </w:r>
+      <w:r>
+        <w:rPr>
+          <w:rFonts w:ascii="Arial" w:hAnsi="Arial" w:cs="Arial"/>
+          <w:color w:val="7030A0"/>
+        </w:rPr>
+        <w:t>lower</w:t>
+      </w:r>
+      <w:r>
+        <w:rPr>
+          <w:rFonts w:ascii="Arial" w:hAnsi="Arial" w:cs="Arial"/>
+          <w:color w:val="7030A0"/>
+        </w:rPr>
+        <w:t>, respectively.</w:t>
       </w:r>
     </w:p>
     <w:p>
       <w:pPr>
-        <w:ind w:left="720" w:firstLine="720"/>
-        <w:rPr>
-          <w:rFonts w:ascii="Arial" w:hAnsi="Arial" w:cs="Arial"/>
-          <w:color w:val="7030A0"/>
-        </w:rPr>
-      </w:pPr>
-      <w:r>
-        <w:rPr>
-          <w:rFonts w:ascii="Arial" w:hAnsi="Arial" w:cs="Arial"/>
-          <w:i/>
-          <w:iCs/>
-          <w:color w:val="7030A0"/>
-        </w:rPr>
-        <w:t>M. gigas</w:t>
-      </w:r>
-      <w:r>
-        <w:rPr>
-          <w:rFonts w:ascii="Arial" w:hAnsi="Arial" w:cs="Arial"/>
-          <w:color w:val="7030A0"/>
-        </w:rPr>
-        <w:t xml:space="preserve"> – x</w:t>
-      </w:r>
-    </w:p>
-    <w:p>
-      <w:pPr>
-        <w:rPr>
-          <w:rFonts w:ascii="Arial" w:hAnsi="Arial" w:cs="Arial"/>
-          <w:i/>
-          <w:iCs/>
-          <w:color w:val="FF0000"/>
+        <w:ind w:firstLine="720"/>
+        <w:rPr>
+          <w:rFonts w:ascii="Arial" w:hAnsi="Arial" w:cs="Arial"/>
+          <w:color w:val="7030A0"/>
         </w:rPr>
       </w:pPr>
     </w:p>
@@ -6462,6 +8140,16 @@
       <w:pPr>
         <w:rPr>
           <w:rFonts w:ascii="Arial" w:hAnsi="Arial" w:cs="Arial"/>
+          <w:i/>
+          <w:iCs/>
+          <w:color w:val="FF0000"/>
+        </w:rPr>
+      </w:pPr>
+    </w:p>
+    <w:p>
+      <w:pPr>
+        <w:rPr>
+          <w:rFonts w:ascii="Arial" w:hAnsi="Arial" w:cs="Arial"/>
         </w:rPr>
       </w:pPr>
       <w:r>
@@ -6521,7 +8209,6 @@
           <w:sz w:val="28"/>
           <w:szCs w:val="28"/>
         </w:rPr>
-        <w:lastRenderedPageBreak/>
         <w:t>DISCUSSION</w:t>
       </w:r>
     </w:p>
@@ -12251,6 +13938,12 @@
                 <w:rFonts w:ascii="Arial" w:hAnsi="Arial" w:cs="Arial"/>
               </w:rPr>
             </w:pPr>
+            <w:r>
+              <w:rPr>
+                <w:rFonts w:ascii="Arial" w:hAnsi="Arial" w:cs="Arial"/>
+              </w:rPr>
+              <w:t>-0.254</w:t>
+            </w:r>
           </w:p>
         </w:tc>
         <w:tc>
@@ -12265,6 +13958,12 @@
                 <w:rFonts w:ascii="Arial" w:hAnsi="Arial" w:cs="Arial"/>
               </w:rPr>
             </w:pPr>
+            <w:r>
+              <w:rPr>
+                <w:rFonts w:ascii="Arial" w:hAnsi="Arial" w:cs="Arial"/>
+              </w:rPr>
+              <w:t>0.099</w:t>
+            </w:r>
           </w:p>
         </w:tc>
         <w:tc>
@@ -12278,6 +13977,12 @@
                 <w:rFonts w:ascii="Arial" w:hAnsi="Arial" w:cs="Arial"/>
               </w:rPr>
             </w:pPr>
+            <w:r>
+              <w:rPr>
+                <w:rFonts w:ascii="Arial" w:hAnsi="Arial" w:cs="Arial"/>
+              </w:rPr>
+              <w:t>702</w:t>
+            </w:r>
           </w:p>
         </w:tc>
         <w:tc>
@@ -12292,6 +13997,12 @@
                 <w:rFonts w:ascii="Arial" w:hAnsi="Arial" w:cs="Arial"/>
               </w:rPr>
             </w:pPr>
+            <w:r>
+              <w:rPr>
+                <w:rFonts w:ascii="Arial" w:hAnsi="Arial" w:cs="Arial"/>
+              </w:rPr>
+              <w:t>-2.541</w:t>
+            </w:r>
           </w:p>
         </w:tc>
         <w:tc>
@@ -12304,8 +14015,18 @@
               <w:jc w:val="center"/>
               <w:rPr>
                 <w:rFonts w:ascii="Arial" w:hAnsi="Arial" w:cs="Arial"/>
-              </w:rPr>
-            </w:pPr>
+                <w:b/>
+                <w:bCs/>
+              </w:rPr>
+            </w:pPr>
+            <w:r>
+              <w:rPr>
+                <w:rFonts w:ascii="Arial" w:hAnsi="Arial" w:cs="Arial"/>
+                <w:b/>
+                <w:bCs/>
+              </w:rPr>
+              <w:t>0.011</w:t>
+            </w:r>
           </w:p>
         </w:tc>
       </w:tr>
@@ -12401,6 +14122,12 @@
                 <w:rFonts w:ascii="Arial" w:hAnsi="Arial" w:cs="Arial"/>
               </w:rPr>
             </w:pPr>
+            <w:r>
+              <w:rPr>
+                <w:rFonts w:ascii="Arial" w:hAnsi="Arial" w:cs="Arial"/>
+              </w:rPr>
+              <w:t>0.036</w:t>
+            </w:r>
           </w:p>
         </w:tc>
         <w:tc>
@@ -12415,6 +14142,12 @@
                 <w:rFonts w:ascii="Arial" w:hAnsi="Arial" w:cs="Arial"/>
               </w:rPr>
             </w:pPr>
+            <w:r>
+              <w:rPr>
+                <w:rFonts w:ascii="Arial" w:hAnsi="Arial" w:cs="Arial"/>
+              </w:rPr>
+              <w:t>0.102</w:t>
+            </w:r>
           </w:p>
         </w:tc>
         <w:tc>
@@ -12428,6 +14161,12 @@
                 <w:rFonts w:ascii="Arial" w:hAnsi="Arial" w:cs="Arial"/>
               </w:rPr>
             </w:pPr>
+            <w:r>
+              <w:rPr>
+                <w:rFonts w:ascii="Arial" w:hAnsi="Arial" w:cs="Arial"/>
+              </w:rPr>
+              <w:t>0.353</w:t>
+            </w:r>
           </w:p>
         </w:tc>
         <w:tc>
@@ -12442,6 +14181,12 @@
                 <w:rFonts w:ascii="Arial" w:hAnsi="Arial" w:cs="Arial"/>
               </w:rPr>
             </w:pPr>
+            <w:r>
+              <w:rPr>
+                <w:rFonts w:ascii="Arial" w:hAnsi="Arial" w:cs="Arial"/>
+              </w:rPr>
+              <w:t>---</w:t>
+            </w:r>
           </w:p>
         </w:tc>
         <w:tc>
@@ -12456,6 +14201,12 @@
                 <w:rFonts w:ascii="Arial" w:hAnsi="Arial" w:cs="Arial"/>
               </w:rPr>
             </w:pPr>
+            <w:r>
+              <w:rPr>
+                <w:rFonts w:ascii="Arial" w:hAnsi="Arial" w:cs="Arial"/>
+              </w:rPr>
+              <w:t>0.724</w:t>
+            </w:r>
           </w:p>
         </w:tc>
       </w:tr>
@@ -12559,7 +14310,15 @@
                 <w:i/>
                 <w:iCs/>
               </w:rPr>
-              <w:t>ref</w:t>
+              <w:t>r</w:t>
+            </w:r>
+            <w:r>
+              <w:rPr>
+                <w:rFonts w:ascii="Arial" w:hAnsi="Arial" w:cs="Arial"/>
+                <w:i/>
+                <w:iCs/>
+              </w:rPr>
+              <w:t>ef</w:t>
             </w:r>
           </w:p>
         </w:tc>
@@ -12747,6 +14506,12 @@
                 <w:rFonts w:ascii="Arial" w:hAnsi="Arial" w:cs="Arial"/>
               </w:rPr>
             </w:pPr>
+            <w:r>
+              <w:rPr>
+                <w:rFonts w:ascii="Arial" w:hAnsi="Arial" w:cs="Arial"/>
+              </w:rPr>
+              <w:t>-0.326</w:t>
+            </w:r>
           </w:p>
         </w:tc>
         <w:tc>
@@ -12761,6 +14526,12 @@
                 <w:rFonts w:ascii="Arial" w:hAnsi="Arial" w:cs="Arial"/>
               </w:rPr>
             </w:pPr>
+            <w:r>
+              <w:rPr>
+                <w:rFonts w:ascii="Arial" w:hAnsi="Arial" w:cs="Arial"/>
+              </w:rPr>
+              <w:t>0.111</w:t>
+            </w:r>
           </w:p>
         </w:tc>
         <w:tc>
@@ -12774,6 +14545,12 @@
                 <w:rFonts w:ascii="Arial" w:hAnsi="Arial" w:cs="Arial"/>
               </w:rPr>
             </w:pPr>
+            <w:r>
+              <w:rPr>
+                <w:rFonts w:ascii="Arial" w:hAnsi="Arial" w:cs="Arial"/>
+              </w:rPr>
+              <w:t>702</w:t>
+            </w:r>
           </w:p>
         </w:tc>
         <w:tc>
@@ -12788,6 +14565,12 @@
                 <w:rFonts w:ascii="Arial" w:hAnsi="Arial" w:cs="Arial"/>
               </w:rPr>
             </w:pPr>
+            <w:r>
+              <w:rPr>
+                <w:rFonts w:ascii="Arial" w:hAnsi="Arial" w:cs="Arial"/>
+              </w:rPr>
+              <w:t>-2.321</w:t>
+            </w:r>
           </w:p>
         </w:tc>
         <w:tc>
@@ -12800,8 +14583,18 @@
               <w:jc w:val="center"/>
               <w:rPr>
                 <w:rFonts w:ascii="Arial" w:hAnsi="Arial" w:cs="Arial"/>
-              </w:rPr>
-            </w:pPr>
+                <w:b/>
+                <w:bCs/>
+              </w:rPr>
+            </w:pPr>
+            <w:r>
+              <w:rPr>
+                <w:rFonts w:ascii="Arial" w:hAnsi="Arial" w:cs="Arial"/>
+                <w:b/>
+                <w:bCs/>
+              </w:rPr>
+              <w:t>0.021</w:t>
+            </w:r>
           </w:p>
         </w:tc>
       </w:tr>
@@ -12899,6 +14692,12 @@
                 <w:rFonts w:ascii="Arial" w:hAnsi="Arial" w:cs="Arial"/>
               </w:rPr>
             </w:pPr>
+            <w:r>
+              <w:rPr>
+                <w:rFonts w:ascii="Arial" w:hAnsi="Arial" w:cs="Arial"/>
+              </w:rPr>
+              <w:t>-0.204</w:t>
+            </w:r>
           </w:p>
         </w:tc>
         <w:tc>
@@ -12913,6 +14712,12 @@
                 <w:rFonts w:ascii="Arial" w:hAnsi="Arial" w:cs="Arial"/>
               </w:rPr>
             </w:pPr>
+            <w:r>
+              <w:rPr>
+                <w:rFonts w:ascii="Arial" w:hAnsi="Arial" w:cs="Arial"/>
+              </w:rPr>
+              <w:t>0.099</w:t>
+            </w:r>
           </w:p>
         </w:tc>
         <w:tc>
@@ -12926,6 +14731,12 @@
                 <w:rFonts w:ascii="Arial" w:hAnsi="Arial" w:cs="Arial"/>
               </w:rPr>
             </w:pPr>
+            <w:r>
+              <w:rPr>
+                <w:rFonts w:ascii="Arial" w:hAnsi="Arial" w:cs="Arial"/>
+              </w:rPr>
+              <w:t>702</w:t>
+            </w:r>
           </w:p>
         </w:tc>
         <w:tc>
@@ -12940,6 +14751,12 @@
                 <w:rFonts w:ascii="Arial" w:hAnsi="Arial" w:cs="Arial"/>
               </w:rPr>
             </w:pPr>
+            <w:r>
+              <w:rPr>
+                <w:rFonts w:ascii="Arial" w:hAnsi="Arial" w:cs="Arial"/>
+              </w:rPr>
+              <w:t>-1.449</w:t>
+            </w:r>
           </w:p>
         </w:tc>
         <w:tc>
@@ -12954,6 +14771,12 @@
                 <w:rFonts w:ascii="Arial" w:hAnsi="Arial" w:cs="Arial"/>
               </w:rPr>
             </w:pPr>
+            <w:r>
+              <w:rPr>
+                <w:rFonts w:ascii="Arial" w:hAnsi="Arial" w:cs="Arial"/>
+              </w:rPr>
+              <w:t>0.148</w:t>
+            </w:r>
           </w:p>
         </w:tc>
       </w:tr>
@@ -13053,6 +14876,12 @@
                 <w:rFonts w:ascii="Arial" w:hAnsi="Arial" w:cs="Arial"/>
               </w:rPr>
             </w:pPr>
+            <w:r>
+              <w:rPr>
+                <w:rFonts w:ascii="Arial" w:hAnsi="Arial" w:cs="Arial"/>
+              </w:rPr>
+              <w:t>-0.591</w:t>
+            </w:r>
           </w:p>
         </w:tc>
         <w:tc>
@@ -13067,6 +14896,12 @@
                 <w:rFonts w:ascii="Arial" w:hAnsi="Arial" w:cs="Arial"/>
               </w:rPr>
             </w:pPr>
+            <w:r>
+              <w:rPr>
+                <w:rFonts w:ascii="Arial" w:hAnsi="Arial" w:cs="Arial"/>
+              </w:rPr>
+              <w:t>0.141</w:t>
+            </w:r>
           </w:p>
         </w:tc>
         <w:tc>
@@ -13080,6 +14915,12 @@
                 <w:rFonts w:ascii="Arial" w:hAnsi="Arial" w:cs="Arial"/>
               </w:rPr>
             </w:pPr>
+            <w:r>
+              <w:rPr>
+                <w:rFonts w:ascii="Arial" w:hAnsi="Arial" w:cs="Arial"/>
+              </w:rPr>
+              <w:t>702</w:t>
+            </w:r>
           </w:p>
         </w:tc>
         <w:tc>
@@ -13094,6 +14935,12 @@
                 <w:rFonts w:ascii="Arial" w:hAnsi="Arial" w:cs="Arial"/>
               </w:rPr>
             </w:pPr>
+            <w:r>
+              <w:rPr>
+                <w:rFonts w:ascii="Arial" w:hAnsi="Arial" w:cs="Arial"/>
+              </w:rPr>
+              <w:t>-4.169</w:t>
+            </w:r>
           </w:p>
         </w:tc>
         <w:tc>
@@ -13110,6 +14957,14 @@
                 <w:bCs/>
               </w:rPr>
             </w:pPr>
+            <w:r>
+              <w:rPr>
+                <w:rFonts w:ascii="Arial" w:hAnsi="Arial" w:cs="Arial"/>
+                <w:b/>
+                <w:bCs/>
+              </w:rPr>
+              <w:t>&lt; 0.01</w:t>
+            </w:r>
           </w:p>
         </w:tc>
       </w:tr>
@@ -14315,6 +16170,12 @@
                 <w:rFonts w:ascii="Arial" w:hAnsi="Arial" w:cs="Arial"/>
               </w:rPr>
             </w:pPr>
+            <w:r>
+              <w:rPr>
+                <w:rFonts w:ascii="Arial" w:hAnsi="Arial" w:cs="Arial"/>
+              </w:rPr>
+              <w:t>-0.156</w:t>
+            </w:r>
           </w:p>
         </w:tc>
         <w:tc>
@@ -14329,6 +16190,12 @@
                 <w:rFonts w:ascii="Arial" w:hAnsi="Arial" w:cs="Arial"/>
               </w:rPr>
             </w:pPr>
+            <w:r>
+              <w:rPr>
+                <w:rFonts w:ascii="Arial" w:hAnsi="Arial" w:cs="Arial"/>
+              </w:rPr>
+              <w:t>0.095</w:t>
+            </w:r>
           </w:p>
         </w:tc>
         <w:tc>
@@ -14342,6 +16209,12 @@
                 <w:rFonts w:ascii="Arial" w:hAnsi="Arial" w:cs="Arial"/>
               </w:rPr>
             </w:pPr>
+            <w:r>
+              <w:rPr>
+                <w:rFonts w:ascii="Arial" w:hAnsi="Arial" w:cs="Arial"/>
+              </w:rPr>
+              <w:t>---</w:t>
+            </w:r>
           </w:p>
         </w:tc>
         <w:tc>
@@ -14356,6 +16229,12 @@
                 <w:rFonts w:ascii="Arial" w:hAnsi="Arial" w:cs="Arial"/>
               </w:rPr>
             </w:pPr>
+            <w:r>
+              <w:rPr>
+                <w:rFonts w:ascii="Arial" w:hAnsi="Arial" w:cs="Arial"/>
+              </w:rPr>
+              <w:t>-1.644</w:t>
+            </w:r>
           </w:p>
         </w:tc>
         <w:tc>
@@ -14370,6 +16249,12 @@
                 <w:rFonts w:ascii="Arial" w:hAnsi="Arial" w:cs="Arial"/>
               </w:rPr>
             </w:pPr>
+            <w:r>
+              <w:rPr>
+                <w:rFonts w:ascii="Arial" w:hAnsi="Arial" w:cs="Arial"/>
+              </w:rPr>
+              <w:t>0.101</w:t>
+            </w:r>
           </w:p>
         </w:tc>
       </w:tr>
@@ -14461,6 +16346,12 @@
                 <w:rFonts w:ascii="Arial" w:hAnsi="Arial" w:cs="Arial"/>
               </w:rPr>
             </w:pPr>
+            <w:r>
+              <w:rPr>
+                <w:rFonts w:ascii="Arial" w:hAnsi="Arial" w:cs="Arial"/>
+              </w:rPr>
+              <w:t>0.391</w:t>
+            </w:r>
           </w:p>
         </w:tc>
         <w:tc>
@@ -14475,6 +16366,12 @@
                 <w:rFonts w:ascii="Arial" w:hAnsi="Arial" w:cs="Arial"/>
               </w:rPr>
             </w:pPr>
+            <w:r>
+              <w:rPr>
+                <w:rFonts w:ascii="Arial" w:hAnsi="Arial" w:cs="Arial"/>
+              </w:rPr>
+              <w:t>0.091</w:t>
+            </w:r>
           </w:p>
         </w:tc>
         <w:tc>
@@ -14488,6 +16385,12 @@
                 <w:rFonts w:ascii="Arial" w:hAnsi="Arial" w:cs="Arial"/>
               </w:rPr>
             </w:pPr>
+            <w:r>
+              <w:rPr>
+                <w:rFonts w:ascii="Arial" w:hAnsi="Arial" w:cs="Arial"/>
+              </w:rPr>
+              <w:t>754.394</w:t>
+            </w:r>
           </w:p>
         </w:tc>
         <w:tc>
@@ -14502,6 +16405,12 @@
                 <w:rFonts w:ascii="Arial" w:hAnsi="Arial" w:cs="Arial"/>
               </w:rPr>
             </w:pPr>
+            <w:r>
+              <w:rPr>
+                <w:rFonts w:ascii="Arial" w:hAnsi="Arial" w:cs="Arial"/>
+              </w:rPr>
+              <w:t>4.313</w:t>
+            </w:r>
           </w:p>
         </w:tc>
         <w:tc>
@@ -14516,6 +16425,14 @@
                 <w:rFonts w:ascii="Arial" w:hAnsi="Arial" w:cs="Arial"/>
               </w:rPr>
             </w:pPr>
+            <w:r>
+              <w:rPr>
+                <w:rFonts w:ascii="Arial" w:hAnsi="Arial" w:cs="Arial"/>
+                <w:b/>
+                <w:bCs/>
+              </w:rPr>
+              <w:t>&lt; 0.01</w:t>
+            </w:r>
           </w:p>
         </w:tc>
       </w:tr>
@@ -14637,44 +16554,30 @@
                 <w:i/>
                 <w:iCs/>
               </w:rPr>
-              <w:t>ref</w:t>
-            </w:r>
-          </w:p>
-        </w:tc>
-        <w:tc>
-          <w:tcPr>
-            <w:tcW w:w="1080" w:type="dxa"/>
-          </w:tcPr>
-          <w:p>
-            <w:pPr>
-              <w:jc w:val="center"/>
+              <w:t>R</w:t>
+            </w:r>
+            <w:r>
               <w:rPr>
                 <w:rFonts w:ascii="Arial" w:hAnsi="Arial" w:cs="Arial"/>
                 <w:i/>
                 <w:iCs/>
               </w:rPr>
-            </w:pPr>
-            <w:r>
+              <w:t>ef</w:t>
+            </w:r>
+          </w:p>
+        </w:tc>
+        <w:tc>
+          <w:tcPr>
+            <w:tcW w:w="1080" w:type="dxa"/>
+          </w:tcPr>
+          <w:p>
+            <w:pPr>
+              <w:jc w:val="center"/>
               <w:rPr>
                 <w:rFonts w:ascii="Arial" w:hAnsi="Arial" w:cs="Arial"/>
                 <w:i/>
                 <w:iCs/>
               </w:rPr>
-              <w:t>ref</w:t>
-            </w:r>
-          </w:p>
-        </w:tc>
-        <w:tc>
-          <w:tcPr>
-            <w:tcW w:w="990" w:type="dxa"/>
-            <w:vAlign w:val="center"/>
-          </w:tcPr>
-          <w:p>
-            <w:pPr>
-              <w:jc w:val="center"/>
-              <w:rPr>
-                <w:rFonts w:ascii="Arial" w:hAnsi="Arial" w:cs="Arial"/>
-              </w:rPr>
             </w:pPr>
             <w:r>
               <w:rPr>
@@ -14682,28 +16585,58 @@
                 <w:i/>
                 <w:iCs/>
               </w:rPr>
-              <w:t>ref</w:t>
-            </w:r>
-          </w:p>
-        </w:tc>
-        <w:tc>
-          <w:tcPr>
-            <w:tcW w:w="1080" w:type="dxa"/>
-            <w:vAlign w:val="center"/>
-          </w:tcPr>
-          <w:p>
-            <w:pPr>
-              <w:jc w:val="center"/>
-              <w:rPr>
-                <w:rFonts w:ascii="Arial" w:hAnsi="Arial" w:cs="Arial"/>
-              </w:rPr>
-            </w:pPr>
+              <w:t>R</w:t>
+            </w:r>
             <w:r>
               <w:rPr>
                 <w:rFonts w:ascii="Arial" w:hAnsi="Arial" w:cs="Arial"/>
                 <w:i/>
                 <w:iCs/>
               </w:rPr>
+              <w:t>ef</w:t>
+            </w:r>
+          </w:p>
+        </w:tc>
+        <w:tc>
+          <w:tcPr>
+            <w:tcW w:w="990" w:type="dxa"/>
+            <w:vAlign w:val="center"/>
+          </w:tcPr>
+          <w:p>
+            <w:pPr>
+              <w:jc w:val="center"/>
+              <w:rPr>
+                <w:rFonts w:ascii="Arial" w:hAnsi="Arial" w:cs="Arial"/>
+              </w:rPr>
+            </w:pPr>
+            <w:r>
+              <w:rPr>
+                <w:rFonts w:ascii="Arial" w:hAnsi="Arial" w:cs="Arial"/>
+                <w:i/>
+                <w:iCs/>
+              </w:rPr>
+              <w:t>ref</w:t>
+            </w:r>
+          </w:p>
+        </w:tc>
+        <w:tc>
+          <w:tcPr>
+            <w:tcW w:w="1080" w:type="dxa"/>
+            <w:vAlign w:val="center"/>
+          </w:tcPr>
+          <w:p>
+            <w:pPr>
+              <w:jc w:val="center"/>
+              <w:rPr>
+                <w:rFonts w:ascii="Arial" w:hAnsi="Arial" w:cs="Arial"/>
+              </w:rPr>
+            </w:pPr>
+            <w:r>
+              <w:rPr>
+                <w:rFonts w:ascii="Arial" w:hAnsi="Arial" w:cs="Arial"/>
+                <w:i/>
+                <w:iCs/>
+              </w:rPr>
               <w:t>ref</w:t>
             </w:r>
           </w:p>
@@ -14799,6 +16732,12 @@
                 <w:rFonts w:ascii="Arial" w:hAnsi="Arial" w:cs="Arial"/>
               </w:rPr>
             </w:pPr>
+            <w:r>
+              <w:rPr>
+                <w:rFonts w:ascii="Arial" w:hAnsi="Arial" w:cs="Arial"/>
+              </w:rPr>
+              <w:t>-0.471</w:t>
+            </w:r>
           </w:p>
         </w:tc>
         <w:tc>
@@ -14813,6 +16752,12 @@
                 <w:rFonts w:ascii="Arial" w:hAnsi="Arial" w:cs="Arial"/>
               </w:rPr>
             </w:pPr>
+            <w:r>
+              <w:rPr>
+                <w:rFonts w:ascii="Arial" w:hAnsi="Arial" w:cs="Arial"/>
+              </w:rPr>
+              <w:t>0.226</w:t>
+            </w:r>
           </w:p>
         </w:tc>
         <w:tc>
@@ -14826,6 +16771,12 @@
                 <w:rFonts w:ascii="Arial" w:hAnsi="Arial" w:cs="Arial"/>
               </w:rPr>
             </w:pPr>
+            <w:r>
+              <w:rPr>
+                <w:rFonts w:ascii="Arial" w:hAnsi="Arial" w:cs="Arial"/>
+              </w:rPr>
+              <w:t>16.177</w:t>
+            </w:r>
           </w:p>
         </w:tc>
         <w:tc>
@@ -14840,6 +16791,12 @@
                 <w:rFonts w:ascii="Arial" w:hAnsi="Arial" w:cs="Arial"/>
               </w:rPr>
             </w:pPr>
+            <w:r>
+              <w:rPr>
+                <w:rFonts w:ascii="Arial" w:hAnsi="Arial" w:cs="Arial"/>
+              </w:rPr>
+              <w:t>-2.089</w:t>
+            </w:r>
           </w:p>
         </w:tc>
         <w:tc>
@@ -14854,6 +16811,12 @@
                 <w:rFonts w:ascii="Arial" w:hAnsi="Arial" w:cs="Arial"/>
               </w:rPr>
             </w:pPr>
+            <w:r>
+              <w:rPr>
+                <w:rFonts w:ascii="Arial" w:hAnsi="Arial" w:cs="Arial"/>
+              </w:rPr>
+              <w:t>0.0528</w:t>
+            </w:r>
           </w:p>
         </w:tc>
       </w:tr>
@@ -14947,6 +16910,12 @@
                 <w:rFonts w:ascii="Arial" w:hAnsi="Arial" w:cs="Arial"/>
               </w:rPr>
             </w:pPr>
+            <w:r>
+              <w:rPr>
+                <w:rFonts w:ascii="Arial" w:hAnsi="Arial" w:cs="Arial"/>
+              </w:rPr>
+              <w:t>-0.427</w:t>
+            </w:r>
           </w:p>
         </w:tc>
         <w:tc>
@@ -14961,6 +16930,12 @@
                 <w:rFonts w:ascii="Arial" w:hAnsi="Arial" w:cs="Arial"/>
               </w:rPr>
             </w:pPr>
+            <w:r>
+              <w:rPr>
+                <w:rFonts w:ascii="Arial" w:hAnsi="Arial" w:cs="Arial"/>
+              </w:rPr>
+              <w:t>0.225</w:t>
+            </w:r>
           </w:p>
         </w:tc>
         <w:tc>
@@ -14974,6 +16949,12 @@
                 <w:rFonts w:ascii="Arial" w:hAnsi="Arial" w:cs="Arial"/>
               </w:rPr>
             </w:pPr>
+            <w:r>
+              <w:rPr>
+                <w:rFonts w:ascii="Arial" w:hAnsi="Arial" w:cs="Arial"/>
+              </w:rPr>
+              <w:t>15.957</w:t>
+            </w:r>
           </w:p>
         </w:tc>
         <w:tc>
@@ -14988,6 +16969,12 @@
                 <w:rFonts w:ascii="Arial" w:hAnsi="Arial" w:cs="Arial"/>
               </w:rPr>
             </w:pPr>
+            <w:r>
+              <w:rPr>
+                <w:rFonts w:ascii="Arial" w:hAnsi="Arial" w:cs="Arial"/>
+              </w:rPr>
+              <w:t>-2.903</w:t>
+            </w:r>
           </w:p>
         </w:tc>
         <w:tc>
@@ -15002,6 +16989,12 @@
                 <w:rFonts w:ascii="Arial" w:hAnsi="Arial" w:cs="Arial"/>
               </w:rPr>
             </w:pPr>
+            <w:r>
+              <w:rPr>
+                <w:rFonts w:ascii="Arial" w:hAnsi="Arial" w:cs="Arial"/>
+              </w:rPr>
+              <w:t>0.0752</w:t>
+            </w:r>
           </w:p>
         </w:tc>
       </w:tr>
@@ -15097,6 +17090,12 @@
                 <w:rFonts w:ascii="Arial" w:hAnsi="Arial" w:cs="Arial"/>
               </w:rPr>
             </w:pPr>
+            <w:r>
+              <w:rPr>
+                <w:rFonts w:ascii="Arial" w:hAnsi="Arial" w:cs="Arial"/>
+              </w:rPr>
+              <w:t>-0.649</w:t>
+            </w:r>
           </w:p>
         </w:tc>
         <w:tc>
@@ -15111,6 +17110,12 @@
                 <w:rFonts w:ascii="Arial" w:hAnsi="Arial" w:cs="Arial"/>
               </w:rPr>
             </w:pPr>
+            <w:r>
+              <w:rPr>
+                <w:rFonts w:ascii="Arial" w:hAnsi="Arial" w:cs="Arial"/>
+              </w:rPr>
+              <w:t>0.225</w:t>
+            </w:r>
           </w:p>
         </w:tc>
         <w:tc>
@@ -15124,6 +17129,12 @@
                 <w:rFonts w:ascii="Arial" w:hAnsi="Arial" w:cs="Arial"/>
               </w:rPr>
             </w:pPr>
+            <w:r>
+              <w:rPr>
+                <w:rFonts w:ascii="Arial" w:hAnsi="Arial" w:cs="Arial"/>
+              </w:rPr>
+              <w:t>16.092</w:t>
+            </w:r>
           </w:p>
         </w:tc>
         <w:tc>
@@ -15138,6 +17149,12 @@
                 <w:rFonts w:ascii="Arial" w:hAnsi="Arial" w:cs="Arial"/>
               </w:rPr>
             </w:pPr>
+            <w:r>
+              <w:rPr>
+                <w:rFonts w:ascii="Arial" w:hAnsi="Arial" w:cs="Arial"/>
+              </w:rPr>
+              <w:t>-2.879</w:t>
+            </w:r>
           </w:p>
         </w:tc>
         <w:tc>
@@ -15150,8 +17167,18 @@
               <w:jc w:val="center"/>
               <w:rPr>
                 <w:rFonts w:ascii="Arial" w:hAnsi="Arial" w:cs="Arial"/>
-              </w:rPr>
-            </w:pPr>
+                <w:b/>
+                <w:bCs/>
+              </w:rPr>
+            </w:pPr>
+            <w:r>
+              <w:rPr>
+                <w:rFonts w:ascii="Arial" w:hAnsi="Arial" w:cs="Arial"/>
+                <w:b/>
+                <w:bCs/>
+              </w:rPr>
+              <w:t>0.0109</w:t>
+            </w:r>
           </w:p>
         </w:tc>
       </w:tr>
@@ -18311,6 +20338,12 @@
                 <w:rFonts w:ascii="Arial" w:hAnsi="Arial" w:cs="Arial"/>
               </w:rPr>
             </w:pPr>
+            <w:r>
+              <w:rPr>
+                <w:rFonts w:ascii="Arial" w:hAnsi="Arial" w:cs="Arial"/>
+              </w:rPr>
+              <w:t>---</w:t>
+            </w:r>
           </w:p>
         </w:tc>
         <w:tc>
@@ -18326,6 +20359,12 @@
                 <w:color w:val="000000" w:themeColor="text1"/>
               </w:rPr>
             </w:pPr>
+            <w:r>
+              <w:rPr>
+                <w:rFonts w:ascii="Arial" w:hAnsi="Arial" w:cs="Arial"/>
+              </w:rPr>
+              <w:t>---</w:t>
+            </w:r>
           </w:p>
         </w:tc>
         <w:tc>
@@ -18341,6 +20380,12 @@
                 <w:color w:val="000000" w:themeColor="text1"/>
               </w:rPr>
             </w:pPr>
+            <w:r>
+              <w:rPr>
+                <w:rFonts w:ascii="Arial" w:hAnsi="Arial" w:cs="Arial"/>
+              </w:rPr>
+              <w:t>---</w:t>
+            </w:r>
           </w:p>
         </w:tc>
         <w:tc>
@@ -18356,6 +20401,12 @@
                 <w:color w:val="000000" w:themeColor="text1"/>
               </w:rPr>
             </w:pPr>
+            <w:r>
+              <w:rPr>
+                <w:rFonts w:ascii="Arial" w:hAnsi="Arial" w:cs="Arial"/>
+              </w:rPr>
+              <w:t>---</w:t>
+            </w:r>
           </w:p>
         </w:tc>
         <w:tc>
@@ -18371,6 +20422,12 @@
                 <w:color w:val="000000" w:themeColor="text1"/>
               </w:rPr>
             </w:pPr>
+            <w:r>
+              <w:rPr>
+                <w:rFonts w:ascii="Arial" w:hAnsi="Arial" w:cs="Arial"/>
+              </w:rPr>
+              <w:t>---</w:t>
+            </w:r>
           </w:p>
         </w:tc>
         <w:tc>
@@ -18386,6 +20443,12 @@
                 <w:color w:val="000000" w:themeColor="text1"/>
               </w:rPr>
             </w:pPr>
+            <w:r>
+              <w:rPr>
+                <w:rFonts w:ascii="Arial" w:hAnsi="Arial" w:cs="Arial"/>
+              </w:rPr>
+              <w:t>---</w:t>
+            </w:r>
           </w:p>
         </w:tc>
       </w:tr>
@@ -18472,6 +20535,12 @@
                 <w:rFonts w:ascii="Arial" w:hAnsi="Arial" w:cs="Arial"/>
               </w:rPr>
             </w:pPr>
+            <w:r>
+              <w:rPr>
+                <w:rFonts w:ascii="Arial" w:hAnsi="Arial" w:cs="Arial"/>
+              </w:rPr>
+              <w:t>---</w:t>
+            </w:r>
           </w:p>
         </w:tc>
         <w:tc>
@@ -18487,6 +20556,12 @@
                 <w:color w:val="000000" w:themeColor="text1"/>
               </w:rPr>
             </w:pPr>
+            <w:r>
+              <w:rPr>
+                <w:rFonts w:ascii="Arial" w:hAnsi="Arial" w:cs="Arial"/>
+              </w:rPr>
+              <w:t>---</w:t>
+            </w:r>
           </w:p>
         </w:tc>
         <w:tc>
@@ -18502,6 +20577,12 @@
                 <w:color w:val="000000" w:themeColor="text1"/>
               </w:rPr>
             </w:pPr>
+            <w:r>
+              <w:rPr>
+                <w:rFonts w:ascii="Arial" w:hAnsi="Arial" w:cs="Arial"/>
+              </w:rPr>
+              <w:t>---</w:t>
+            </w:r>
           </w:p>
         </w:tc>
         <w:tc>
@@ -18517,6 +20598,12 @@
                 <w:color w:val="000000" w:themeColor="text1"/>
               </w:rPr>
             </w:pPr>
+            <w:r>
+              <w:rPr>
+                <w:rFonts w:ascii="Arial" w:hAnsi="Arial" w:cs="Arial"/>
+              </w:rPr>
+              <w:t>---</w:t>
+            </w:r>
           </w:p>
         </w:tc>
         <w:tc>
@@ -18532,6 +20619,12 @@
                 <w:color w:val="000000" w:themeColor="text1"/>
               </w:rPr>
             </w:pPr>
+            <w:r>
+              <w:rPr>
+                <w:rFonts w:ascii="Arial" w:hAnsi="Arial" w:cs="Arial"/>
+              </w:rPr>
+              <w:t>---</w:t>
+            </w:r>
           </w:p>
         </w:tc>
         <w:tc>
@@ -18547,6 +20640,12 @@
                 <w:color w:val="000000" w:themeColor="text1"/>
               </w:rPr>
             </w:pPr>
+            <w:r>
+              <w:rPr>
+                <w:rFonts w:ascii="Arial" w:hAnsi="Arial" w:cs="Arial"/>
+              </w:rPr>
+              <w:t>---</w:t>
+            </w:r>
           </w:p>
         </w:tc>
       </w:tr>
@@ -18627,6 +20726,12 @@
                 <w:rFonts w:ascii="Arial" w:hAnsi="Arial" w:cs="Arial"/>
               </w:rPr>
             </w:pPr>
+            <w:r>
+              <w:rPr>
+                <w:rFonts w:ascii="Arial" w:hAnsi="Arial" w:cs="Arial"/>
+              </w:rPr>
+              <w:t>---</w:t>
+            </w:r>
           </w:p>
         </w:tc>
         <w:tc>
@@ -18642,6 +20747,12 @@
                 <w:color w:val="000000" w:themeColor="text1"/>
               </w:rPr>
             </w:pPr>
+            <w:r>
+              <w:rPr>
+                <w:rFonts w:ascii="Arial" w:hAnsi="Arial" w:cs="Arial"/>
+              </w:rPr>
+              <w:t>---</w:t>
+            </w:r>
           </w:p>
         </w:tc>
         <w:tc>
@@ -18657,6 +20768,12 @@
                 <w:color w:val="000000" w:themeColor="text1"/>
               </w:rPr>
             </w:pPr>
+            <w:r>
+              <w:rPr>
+                <w:rFonts w:ascii="Arial" w:hAnsi="Arial" w:cs="Arial"/>
+              </w:rPr>
+              <w:t>---</w:t>
+            </w:r>
           </w:p>
         </w:tc>
         <w:tc>
@@ -18672,6 +20789,12 @@
                 <w:color w:val="000000" w:themeColor="text1"/>
               </w:rPr>
             </w:pPr>
+            <w:r>
+              <w:rPr>
+                <w:rFonts w:ascii="Arial" w:hAnsi="Arial" w:cs="Arial"/>
+              </w:rPr>
+              <w:t>---</w:t>
+            </w:r>
           </w:p>
         </w:tc>
         <w:tc>
@@ -18687,6 +20810,12 @@
                 <w:color w:val="000000" w:themeColor="text1"/>
               </w:rPr>
             </w:pPr>
+            <w:r>
+              <w:rPr>
+                <w:rFonts w:ascii="Arial" w:hAnsi="Arial" w:cs="Arial"/>
+              </w:rPr>
+              <w:t>---</w:t>
+            </w:r>
           </w:p>
         </w:tc>
         <w:tc>
@@ -18702,6 +20831,12 @@
                 <w:color w:val="000000" w:themeColor="text1"/>
               </w:rPr>
             </w:pPr>
+            <w:r>
+              <w:rPr>
+                <w:rFonts w:ascii="Arial" w:hAnsi="Arial" w:cs="Arial"/>
+              </w:rPr>
+              <w:t>---</w:t>
+            </w:r>
           </w:p>
         </w:tc>
       </w:tr>
@@ -18782,6 +20917,12 @@
                 <w:rFonts w:ascii="Arial" w:hAnsi="Arial" w:cs="Arial"/>
               </w:rPr>
             </w:pPr>
+            <w:r>
+              <w:rPr>
+                <w:rFonts w:ascii="Arial" w:hAnsi="Arial" w:cs="Arial"/>
+              </w:rPr>
+              <w:t>---</w:t>
+            </w:r>
           </w:p>
         </w:tc>
         <w:tc>
@@ -18797,6 +20938,12 @@
                 <w:color w:val="000000" w:themeColor="text1"/>
               </w:rPr>
             </w:pPr>
+            <w:r>
+              <w:rPr>
+                <w:rFonts w:ascii="Arial" w:hAnsi="Arial" w:cs="Arial"/>
+              </w:rPr>
+              <w:t>---</w:t>
+            </w:r>
           </w:p>
         </w:tc>
         <w:tc>
@@ -18812,6 +20959,12 @@
                 <w:color w:val="000000" w:themeColor="text1"/>
               </w:rPr>
             </w:pPr>
+            <w:r>
+              <w:rPr>
+                <w:rFonts w:ascii="Arial" w:hAnsi="Arial" w:cs="Arial"/>
+              </w:rPr>
+              <w:t>---</w:t>
+            </w:r>
           </w:p>
         </w:tc>
         <w:tc>
@@ -18827,6 +20980,12 @@
                 <w:color w:val="000000" w:themeColor="text1"/>
               </w:rPr>
             </w:pPr>
+            <w:r>
+              <w:rPr>
+                <w:rFonts w:ascii="Arial" w:hAnsi="Arial" w:cs="Arial"/>
+              </w:rPr>
+              <w:t>---</w:t>
+            </w:r>
           </w:p>
         </w:tc>
         <w:tc>
@@ -18842,6 +21001,12 @@
                 <w:color w:val="000000" w:themeColor="text1"/>
               </w:rPr>
             </w:pPr>
+            <w:r>
+              <w:rPr>
+                <w:rFonts w:ascii="Arial" w:hAnsi="Arial" w:cs="Arial"/>
+              </w:rPr>
+              <w:t>---</w:t>
+            </w:r>
           </w:p>
         </w:tc>
         <w:tc>
@@ -18857,6 +21022,12 @@
                 <w:color w:val="000000" w:themeColor="text1"/>
               </w:rPr>
             </w:pPr>
+            <w:r>
+              <w:rPr>
+                <w:rFonts w:ascii="Arial" w:hAnsi="Arial" w:cs="Arial"/>
+              </w:rPr>
+              <w:t>---</w:t>
+            </w:r>
           </w:p>
         </w:tc>
       </w:tr>
@@ -19711,6 +21882,12 @@
                 <w:rFonts w:ascii="Arial" w:hAnsi="Arial" w:cs="Arial"/>
               </w:rPr>
             </w:pPr>
+            <w:r>
+              <w:rPr>
+                <w:rFonts w:ascii="Arial" w:hAnsi="Arial" w:cs="Arial"/>
+              </w:rPr>
+              <w:t>---</w:t>
+            </w:r>
           </w:p>
         </w:tc>
         <w:tc>
@@ -19726,6 +21903,12 @@
                 <w:color w:val="000000" w:themeColor="text1"/>
               </w:rPr>
             </w:pPr>
+            <w:r>
+              <w:rPr>
+                <w:rFonts w:ascii="Arial" w:hAnsi="Arial" w:cs="Arial"/>
+              </w:rPr>
+              <w:t>---</w:t>
+            </w:r>
           </w:p>
         </w:tc>
         <w:tc>
@@ -19741,6 +21924,12 @@
                 <w:color w:val="000000" w:themeColor="text1"/>
               </w:rPr>
             </w:pPr>
+            <w:r>
+              <w:rPr>
+                <w:rFonts w:ascii="Arial" w:hAnsi="Arial" w:cs="Arial"/>
+              </w:rPr>
+              <w:t>---</w:t>
+            </w:r>
           </w:p>
         </w:tc>
         <w:tc>
@@ -19756,6 +21945,12 @@
                 <w:color w:val="000000" w:themeColor="text1"/>
               </w:rPr>
             </w:pPr>
+            <w:r>
+              <w:rPr>
+                <w:rFonts w:ascii="Arial" w:hAnsi="Arial" w:cs="Arial"/>
+              </w:rPr>
+              <w:t>---</w:t>
+            </w:r>
           </w:p>
         </w:tc>
         <w:tc>
@@ -19771,6 +21966,12 @@
                 <w:color w:val="000000" w:themeColor="text1"/>
               </w:rPr>
             </w:pPr>
+            <w:r>
+              <w:rPr>
+                <w:rFonts w:ascii="Arial" w:hAnsi="Arial" w:cs="Arial"/>
+              </w:rPr>
+              <w:t>---</w:t>
+            </w:r>
           </w:p>
         </w:tc>
         <w:tc>
@@ -19786,6 +21987,12 @@
                 <w:color w:val="000000" w:themeColor="text1"/>
               </w:rPr>
             </w:pPr>
+            <w:r>
+              <w:rPr>
+                <w:rFonts w:ascii="Arial" w:hAnsi="Arial" w:cs="Arial"/>
+              </w:rPr>
+              <w:t>---</w:t>
+            </w:r>
           </w:p>
         </w:tc>
       </w:tr>
@@ -19870,6 +22077,12 @@
                 <w:rFonts w:ascii="Arial" w:hAnsi="Arial" w:cs="Arial"/>
               </w:rPr>
             </w:pPr>
+            <w:r>
+              <w:rPr>
+                <w:rFonts w:ascii="Arial" w:hAnsi="Arial" w:cs="Arial"/>
+              </w:rPr>
+              <w:t>---</w:t>
+            </w:r>
           </w:p>
         </w:tc>
         <w:tc>
@@ -19885,6 +22098,12 @@
                 <w:color w:val="000000" w:themeColor="text1"/>
               </w:rPr>
             </w:pPr>
+            <w:r>
+              <w:rPr>
+                <w:rFonts w:ascii="Arial" w:hAnsi="Arial" w:cs="Arial"/>
+              </w:rPr>
+              <w:t>---</w:t>
+            </w:r>
           </w:p>
         </w:tc>
         <w:tc>
@@ -19900,6 +22119,12 @@
                 <w:color w:val="000000" w:themeColor="text1"/>
               </w:rPr>
             </w:pPr>
+            <w:r>
+              <w:rPr>
+                <w:rFonts w:ascii="Arial" w:hAnsi="Arial" w:cs="Arial"/>
+              </w:rPr>
+              <w:t>---</w:t>
+            </w:r>
           </w:p>
         </w:tc>
         <w:tc>
@@ -19915,6 +22140,12 @@
                 <w:color w:val="000000" w:themeColor="text1"/>
               </w:rPr>
             </w:pPr>
+            <w:r>
+              <w:rPr>
+                <w:rFonts w:ascii="Arial" w:hAnsi="Arial" w:cs="Arial"/>
+              </w:rPr>
+              <w:t>---</w:t>
+            </w:r>
           </w:p>
         </w:tc>
         <w:tc>
@@ -19930,6 +22161,12 @@
                 <w:color w:val="000000" w:themeColor="text1"/>
               </w:rPr>
             </w:pPr>
+            <w:r>
+              <w:rPr>
+                <w:rFonts w:ascii="Arial" w:hAnsi="Arial" w:cs="Arial"/>
+              </w:rPr>
+              <w:t>---</w:t>
+            </w:r>
           </w:p>
         </w:tc>
         <w:tc>
@@ -19945,6 +22182,12 @@
                 <w:color w:val="000000" w:themeColor="text1"/>
               </w:rPr>
             </w:pPr>
+            <w:r>
+              <w:rPr>
+                <w:rFonts w:ascii="Arial" w:hAnsi="Arial" w:cs="Arial"/>
+              </w:rPr>
+              <w:t>---</w:t>
+            </w:r>
           </w:p>
         </w:tc>
       </w:tr>
@@ -20023,6 +22266,12 @@
                 <w:rFonts w:ascii="Arial" w:hAnsi="Arial" w:cs="Arial"/>
               </w:rPr>
             </w:pPr>
+            <w:r>
+              <w:rPr>
+                <w:rFonts w:ascii="Arial" w:hAnsi="Arial" w:cs="Arial"/>
+              </w:rPr>
+              <w:t>---</w:t>
+            </w:r>
           </w:p>
         </w:tc>
         <w:tc>
@@ -20038,6 +22287,12 @@
                 <w:color w:val="000000" w:themeColor="text1"/>
               </w:rPr>
             </w:pPr>
+            <w:r>
+              <w:rPr>
+                <w:rFonts w:ascii="Arial" w:hAnsi="Arial" w:cs="Arial"/>
+              </w:rPr>
+              <w:t>---</w:t>
+            </w:r>
           </w:p>
         </w:tc>
         <w:tc>
@@ -20053,6 +22308,12 @@
                 <w:color w:val="000000" w:themeColor="text1"/>
               </w:rPr>
             </w:pPr>
+            <w:r>
+              <w:rPr>
+                <w:rFonts w:ascii="Arial" w:hAnsi="Arial" w:cs="Arial"/>
+              </w:rPr>
+              <w:t>---</w:t>
+            </w:r>
           </w:p>
         </w:tc>
         <w:tc>
@@ -20068,6 +22329,12 @@
                 <w:color w:val="000000" w:themeColor="text1"/>
               </w:rPr>
             </w:pPr>
+            <w:r>
+              <w:rPr>
+                <w:rFonts w:ascii="Arial" w:hAnsi="Arial" w:cs="Arial"/>
+              </w:rPr>
+              <w:t>---</w:t>
+            </w:r>
           </w:p>
         </w:tc>
         <w:tc>
@@ -20083,6 +22350,12 @@
                 <w:color w:val="000000" w:themeColor="text1"/>
               </w:rPr>
             </w:pPr>
+            <w:r>
+              <w:rPr>
+                <w:rFonts w:ascii="Arial" w:hAnsi="Arial" w:cs="Arial"/>
+              </w:rPr>
+              <w:t>---</w:t>
+            </w:r>
           </w:p>
         </w:tc>
         <w:tc>
@@ -20098,6 +22371,12 @@
                 <w:color w:val="000000" w:themeColor="text1"/>
               </w:rPr>
             </w:pPr>
+            <w:r>
+              <w:rPr>
+                <w:rFonts w:ascii="Arial" w:hAnsi="Arial" w:cs="Arial"/>
+              </w:rPr>
+              <w:t>---</w:t>
+            </w:r>
           </w:p>
         </w:tc>
       </w:tr>
@@ -20176,6 +22455,12 @@
                 <w:rFonts w:ascii="Arial" w:hAnsi="Arial" w:cs="Arial"/>
               </w:rPr>
             </w:pPr>
+            <w:r>
+              <w:rPr>
+                <w:rFonts w:ascii="Arial" w:hAnsi="Arial" w:cs="Arial"/>
+              </w:rPr>
+              <w:t>---</w:t>
+            </w:r>
           </w:p>
         </w:tc>
         <w:tc>
@@ -20191,6 +22476,12 @@
                 <w:color w:val="000000" w:themeColor="text1"/>
               </w:rPr>
             </w:pPr>
+            <w:r>
+              <w:rPr>
+                <w:rFonts w:ascii="Arial" w:hAnsi="Arial" w:cs="Arial"/>
+              </w:rPr>
+              <w:t>---</w:t>
+            </w:r>
           </w:p>
         </w:tc>
         <w:tc>
@@ -20206,6 +22497,12 @@
                 <w:color w:val="000000" w:themeColor="text1"/>
               </w:rPr>
             </w:pPr>
+            <w:r>
+              <w:rPr>
+                <w:rFonts w:ascii="Arial" w:hAnsi="Arial" w:cs="Arial"/>
+              </w:rPr>
+              <w:t>---</w:t>
+            </w:r>
           </w:p>
         </w:tc>
         <w:tc>
@@ -20221,6 +22518,12 @@
                 <w:color w:val="000000" w:themeColor="text1"/>
               </w:rPr>
             </w:pPr>
+            <w:r>
+              <w:rPr>
+                <w:rFonts w:ascii="Arial" w:hAnsi="Arial" w:cs="Arial"/>
+              </w:rPr>
+              <w:t>---</w:t>
+            </w:r>
           </w:p>
         </w:tc>
         <w:tc>
@@ -20236,6 +22539,12 @@
                 <w:color w:val="000000" w:themeColor="text1"/>
               </w:rPr>
             </w:pPr>
+            <w:r>
+              <w:rPr>
+                <w:rFonts w:ascii="Arial" w:hAnsi="Arial" w:cs="Arial"/>
+              </w:rPr>
+              <w:t>---</w:t>
+            </w:r>
           </w:p>
         </w:tc>
         <w:tc>
@@ -20251,6 +22560,12 @@
                 <w:color w:val="000000" w:themeColor="text1"/>
               </w:rPr>
             </w:pPr>
+            <w:r>
+              <w:rPr>
+                <w:rFonts w:ascii="Arial" w:hAnsi="Arial" w:cs="Arial"/>
+              </w:rPr>
+              <w:t>---</w:t>
+            </w:r>
           </w:p>
         </w:tc>
       </w:tr>

</xml_diff>

<commit_message>
generated PPT figures for growth
</commit_message>
<xml_diff>
--- a/writing/Chapter 1.docx
+++ b/writing/Chapter 1.docx
@@ -291,28 +291,7 @@
           <w:rFonts w:ascii="Arial" w:hAnsi="Arial" w:cs="Arial"/>
           <w:color w:val="7030A0"/>
         </w:rPr>
-        <w:t xml:space="preserve">Impacts of </w:t>
-      </w:r>
-      <w:r>
-        <w:rPr>
-          <w:rFonts w:ascii="Arial" w:hAnsi="Arial" w:cs="Arial"/>
-          <w:color w:val="7030A0"/>
-        </w:rPr>
-        <w:t xml:space="preserve">warming </w:t>
-      </w:r>
-      <w:r>
-        <w:rPr>
-          <w:rFonts w:ascii="Arial" w:hAnsi="Arial" w:cs="Arial"/>
-          <w:color w:val="7030A0"/>
-        </w:rPr>
-        <w:t>on oysters</w:t>
-      </w:r>
-      <w:r>
-        <w:rPr>
-          <w:rFonts w:ascii="Arial" w:hAnsi="Arial" w:cs="Arial"/>
-          <w:color w:val="7030A0"/>
-        </w:rPr>
-        <w:t xml:space="preserve">; </w:t>
+        <w:t xml:space="preserve">Impacts of warming on oysters; </w:t>
       </w:r>
       <w:r>
         <w:rPr>
@@ -1883,6 +1862,7 @@
           <w:iCs/>
         </w:rPr>
       </w:pPr>
+      <w:commentRangeStart w:id="0"/>
     </w:p>
     <w:p>
       <w:pPr>
@@ -1899,6 +1879,13 @@
           <w:iCs/>
         </w:rPr>
         <w:t>GROWTH</w:t>
+      </w:r>
+      <w:commentRangeEnd w:id="0"/>
+      <w:r>
+        <w:rPr>
+          <w:rStyle w:val="CommentReference"/>
+        </w:rPr>
+        <w:commentReference w:id="0"/>
       </w:r>
     </w:p>
     <w:p>
@@ -2027,28 +2014,7 @@
           <w:rFonts w:ascii="Arial" w:hAnsi="Arial" w:cs="Arial"/>
           <w:color w:val="7030A0"/>
         </w:rPr>
-        <w:t xml:space="preserve">sters </w:t>
-      </w:r>
-      <w:r>
-        <w:rPr>
-          <w:rFonts w:ascii="Arial" w:hAnsi="Arial" w:cs="Arial"/>
-          <w:color w:val="7030A0"/>
-        </w:rPr>
-        <w:t xml:space="preserve">that experienced </w:t>
-      </w:r>
-      <w:r>
-        <w:rPr>
-          <w:rFonts w:ascii="Arial" w:hAnsi="Arial" w:cs="Arial"/>
-          <w:color w:val="7030A0"/>
-        </w:rPr>
-        <w:t>tidal emersion during stress hardening</w:t>
-      </w:r>
-      <w:r>
-        <w:rPr>
-          <w:rFonts w:ascii="Arial" w:hAnsi="Arial" w:cs="Arial"/>
-          <w:color w:val="7030A0"/>
-        </w:rPr>
-        <w:t xml:space="preserve"> </w:t>
+        <w:t xml:space="preserve">sters that experienced tidal emersion during stress hardening </w:t>
       </w:r>
       <w:r>
         <w:rPr>
@@ -2083,21 +2049,7 @@
           <w:rFonts w:ascii="Arial" w:hAnsi="Arial" w:cs="Arial"/>
           <w:color w:val="7030A0"/>
         </w:rPr>
-        <w:t>6</w:t>
-      </w:r>
-      <w:r>
-        <w:rPr>
-          <w:rFonts w:ascii="Arial" w:hAnsi="Arial" w:cs="Arial"/>
-          <w:color w:val="7030A0"/>
-        </w:rPr>
-        <w:t>.22</w:t>
-      </w:r>
-      <w:r>
-        <w:rPr>
-          <w:rFonts w:ascii="Arial" w:hAnsi="Arial" w:cs="Arial"/>
-          <w:color w:val="7030A0"/>
-        </w:rPr>
-        <w:t xml:space="preserve"> mm ± 0.06</w:t>
+        <w:t>6.22 mm ± 0.06</w:t>
       </w:r>
       <w:r>
         <w:rPr>
@@ -2132,35 +2084,14 @@
           <w:rFonts w:ascii="Arial" w:hAnsi="Arial" w:cs="Arial"/>
           <w:color w:val="7030A0"/>
         </w:rPr>
-        <w:t>6.</w:t>
-      </w:r>
-      <w:r>
-        <w:rPr>
-          <w:rFonts w:ascii="Arial" w:hAnsi="Arial" w:cs="Arial"/>
-          <w:color w:val="7030A0"/>
-        </w:rPr>
-        <w:t>45</w:t>
-      </w:r>
-      <w:r>
-        <w:rPr>
-          <w:rFonts w:ascii="Arial" w:hAnsi="Arial" w:cs="Arial"/>
-          <w:color w:val="7030A0"/>
-        </w:rPr>
-        <w:t xml:space="preserve"> mm ± 0.06</w:t>
-      </w:r>
-      <w:r>
-        <w:rPr>
-          <w:rFonts w:ascii="Arial" w:hAnsi="Arial" w:cs="Arial"/>
-          <w:color w:val="7030A0"/>
-        </w:rPr>
-        <w:t xml:space="preserve">) </w:t>
-      </w:r>
-      <w:r>
-        <w:rPr>
-          <w:rFonts w:ascii="Arial" w:hAnsi="Arial" w:cs="Arial"/>
-          <w:color w:val="7030A0"/>
-        </w:rPr>
-        <w:t>(</w:t>
+        <w:t>6.45 mm ± 0.06</w:t>
+      </w:r>
+      <w:r>
+        <w:rPr>
+          <w:rFonts w:ascii="Arial" w:hAnsi="Arial" w:cs="Arial"/>
+          <w:color w:val="7030A0"/>
+        </w:rPr>
+        <w:t>) (</w:t>
       </w:r>
       <w:r>
         <w:rPr>
@@ -2220,35 +2151,7 @@
           <w:rFonts w:ascii="Arial" w:hAnsi="Arial" w:cs="Arial"/>
           <w:color w:val="7030A0"/>
         </w:rPr>
-        <w:t>21˚C</w:t>
-      </w:r>
-      <w:r>
-        <w:rPr>
-          <w:rFonts w:ascii="Arial" w:hAnsi="Arial" w:cs="Arial"/>
-          <w:color w:val="7030A0"/>
-        </w:rPr>
-        <w:t xml:space="preserve"> (</w:t>
-      </w:r>
-      <w:r>
-        <w:rPr>
-          <w:rFonts w:ascii="Arial" w:hAnsi="Arial" w:cs="Arial"/>
-          <w:color w:val="7030A0"/>
-        </w:rPr>
-        <w:t>6.43 mm ± 0.06</w:t>
-      </w:r>
-      <w:r>
-        <w:rPr>
-          <w:rFonts w:ascii="Arial" w:hAnsi="Arial" w:cs="Arial"/>
-          <w:color w:val="7030A0"/>
-        </w:rPr>
-        <w:t>)</w:t>
-      </w:r>
-      <w:r>
-        <w:rPr>
-          <w:rFonts w:ascii="Arial" w:hAnsi="Arial" w:cs="Arial"/>
-          <w:color w:val="7030A0"/>
-        </w:rPr>
-        <w:t xml:space="preserve"> </w:t>
+        <w:t xml:space="preserve">21˚C (6.43 mm ± 0.06) </w:t>
       </w:r>
       <w:r>
         <w:rPr>
@@ -2269,14 +2172,7 @@
           <w:rFonts w:ascii="Arial" w:hAnsi="Arial" w:cs="Arial"/>
           <w:color w:val="7030A0"/>
         </w:rPr>
-        <w:t>%</w:t>
-      </w:r>
-      <w:r>
-        <w:rPr>
-          <w:rFonts w:ascii="Arial" w:hAnsi="Arial" w:cs="Arial"/>
-          <w:color w:val="7030A0"/>
-        </w:rPr>
-        <w:t xml:space="preserve"> larger</w:t>
+        <w:t>% larger</w:t>
       </w:r>
       <w:r>
         <w:rPr>
@@ -2290,49 +2186,14 @@
           <w:rFonts w:ascii="Arial" w:hAnsi="Arial" w:cs="Arial"/>
           <w:color w:val="7030A0"/>
         </w:rPr>
-        <w:t>1</w:t>
-      </w:r>
-      <w:r>
-        <w:rPr>
-          <w:rFonts w:ascii="Arial" w:hAnsi="Arial" w:cs="Arial"/>
-          <w:color w:val="7030A0"/>
-        </w:rPr>
-        <w:t>5</w:t>
-      </w:r>
-      <w:r>
-        <w:rPr>
-          <w:rFonts w:ascii="Arial" w:hAnsi="Arial" w:cs="Arial"/>
-          <w:color w:val="7030A0"/>
-        </w:rPr>
-        <w:t>˚C</w:t>
-      </w:r>
-      <w:r>
-        <w:rPr>
-          <w:rFonts w:ascii="Arial" w:hAnsi="Arial" w:cs="Arial"/>
-          <w:color w:val="7030A0"/>
-        </w:rPr>
-        <w:t xml:space="preserve"> (</w:t>
-      </w:r>
-      <w:r>
-        <w:rPr>
-          <w:rFonts w:ascii="Arial" w:hAnsi="Arial" w:cs="Arial"/>
-          <w:color w:val="7030A0"/>
-        </w:rPr>
-        <w:t>6.25 mm ± 0.06</w:t>
-      </w:r>
-      <w:r>
-        <w:rPr>
-          <w:rFonts w:ascii="Arial" w:hAnsi="Arial" w:cs="Arial"/>
-          <w:color w:val="7030A0"/>
-        </w:rPr>
-        <w:t xml:space="preserve">) </w:t>
-      </w:r>
-      <w:r>
-        <w:rPr>
-          <w:rFonts w:ascii="Arial" w:hAnsi="Arial" w:cs="Arial"/>
-          <w:color w:val="7030A0"/>
-        </w:rPr>
-        <w:t>(</w:t>
+        <w:t>15˚C</w:t>
+      </w:r>
+      <w:r>
+        <w:rPr>
+          <w:rFonts w:ascii="Arial" w:hAnsi="Arial" w:cs="Arial"/>
+          <w:color w:val="7030A0"/>
+        </w:rPr>
+        <w:t xml:space="preserve"> (6.25 mm ± 0.06) (</w:t>
       </w:r>
       <w:r>
         <w:rPr>
@@ -2371,14 +2232,7 @@
           <w:rFonts w:ascii="Arial" w:hAnsi="Arial" w:cs="Arial"/>
           <w:color w:val="7030A0"/>
         </w:rPr>
-        <w:t>)</w:t>
-      </w:r>
-      <w:r>
-        <w:rPr>
-          <w:rFonts w:ascii="Arial" w:hAnsi="Arial" w:cs="Arial"/>
-          <w:color w:val="7030A0"/>
-        </w:rPr>
-        <w:t>.</w:t>
+        <w:t>).</w:t>
       </w:r>
       <w:r>
         <w:rPr>
@@ -2452,7 +2306,15 @@
           <w:rFonts w:ascii="Arial" w:hAnsi="Arial" w:cs="Arial"/>
           <w:color w:val="7030A0"/>
         </w:rPr>
-        <w:t xml:space="preserve">, it did interact with stress hardening temperature. Specifically, individuals in the </w:t>
+        <w:t xml:space="preserve">, it did interact with stress hardening temperature. </w:t>
+      </w:r>
+      <w:commentRangeStart w:id="1"/>
+      <w:r>
+        <w:rPr>
+          <w:rFonts w:ascii="Arial" w:hAnsi="Arial" w:cs="Arial"/>
+          <w:color w:val="7030A0"/>
+        </w:rPr>
+        <w:t xml:space="preserve">Specifically, individuals in the </w:t>
       </w:r>
       <w:r>
         <w:rPr>
@@ -2564,84 +2426,21 @@
           <w:rFonts w:ascii="Arial" w:hAnsi="Arial" w:cs="Arial"/>
           <w:color w:val="7030A0"/>
         </w:rPr>
-        <w:t>%</w:t>
-      </w:r>
-      <w:r>
-        <w:rPr>
-          <w:rFonts w:ascii="Arial" w:hAnsi="Arial" w:cs="Arial"/>
-          <w:color w:val="7030A0"/>
-        </w:rPr>
-        <w:t xml:space="preserve"> larger than those </w:t>
-      </w:r>
-      <w:r>
-        <w:rPr>
-          <w:rFonts w:ascii="Arial" w:hAnsi="Arial" w:cs="Arial"/>
-          <w:color w:val="7030A0"/>
-        </w:rPr>
-        <w:t xml:space="preserve">stress hardened at </w:t>
-      </w:r>
-      <w:r>
-        <w:rPr>
-          <w:rFonts w:ascii="Arial" w:hAnsi="Arial" w:cs="Arial"/>
-          <w:color w:val="7030A0"/>
-        </w:rPr>
-        <w:t>21</w:t>
-      </w:r>
-      <w:r>
-        <w:rPr>
-          <w:rFonts w:ascii="Arial" w:hAnsi="Arial" w:cs="Arial"/>
-          <w:color w:val="7030A0"/>
-        </w:rPr>
-        <w:t xml:space="preserve">˚C </w:t>
-      </w:r>
-      <w:r>
-        <w:rPr>
-          <w:rFonts w:ascii="Arial" w:hAnsi="Arial" w:cs="Arial"/>
-          <w:color w:val="7030A0"/>
-        </w:rPr>
-        <w:t>(</w:t>
-      </w:r>
-      <w:r>
-        <w:rPr>
-          <w:rFonts w:ascii="Arial" w:hAnsi="Arial" w:cs="Arial"/>
-          <w:color w:val="7030A0"/>
-        </w:rPr>
-        <w:t>6.</w:t>
-      </w:r>
-      <w:r>
-        <w:rPr>
-          <w:rFonts w:ascii="Arial" w:hAnsi="Arial" w:cs="Arial"/>
-          <w:color w:val="7030A0"/>
-        </w:rPr>
-        <w:t>36</w:t>
-      </w:r>
-      <w:r>
-        <w:rPr>
-          <w:rFonts w:ascii="Arial" w:hAnsi="Arial" w:cs="Arial"/>
-          <w:color w:val="7030A0"/>
-        </w:rPr>
-        <w:t xml:space="preserve"> mm ± 0.1</w:t>
-      </w:r>
-      <w:r>
-        <w:rPr>
-          <w:rFonts w:ascii="Arial" w:hAnsi="Arial" w:cs="Arial"/>
-          <w:color w:val="7030A0"/>
-        </w:rPr>
-        <w:t>3)</w:t>
-      </w:r>
-      <w:r>
-        <w:rPr>
-          <w:rFonts w:ascii="Arial" w:hAnsi="Arial" w:cs="Arial"/>
-          <w:color w:val="7030A0"/>
-        </w:rPr>
-        <w:t xml:space="preserve"> </w:t>
-      </w:r>
-      <w:r>
-        <w:rPr>
-          <w:rFonts w:ascii="Arial" w:hAnsi="Arial" w:cs="Arial"/>
-          <w:color w:val="7030A0"/>
-        </w:rPr>
-        <w:t>(</w:t>
+        <w:t xml:space="preserve">% larger than those stress hardened at 21˚C </w:t>
+      </w:r>
+      <w:r>
+        <w:rPr>
+          <w:rFonts w:ascii="Arial" w:hAnsi="Arial" w:cs="Arial"/>
+          <w:color w:val="7030A0"/>
+        </w:rPr>
+        <w:t>(6.36 mm ± 0.13)</w:t>
+      </w:r>
+      <w:r>
+        <w:rPr>
+          <w:rFonts w:ascii="Arial" w:hAnsi="Arial" w:cs="Arial"/>
+          <w:color w:val="7030A0"/>
+        </w:rPr>
+        <w:t xml:space="preserve"> (</w:t>
       </w:r>
       <w:r>
         <w:rPr>
@@ -2689,7 +2488,29 @@
           <w:rFonts w:ascii="Arial" w:hAnsi="Arial" w:cs="Arial"/>
           <w:color w:val="7030A0"/>
         </w:rPr>
-        <w:t>; the interaction did not hold for oysters in the other three marine heatwave treatments (</w:t>
+        <w:t xml:space="preserve">; the interaction did not hold for oysters in </w:t>
+      </w:r>
+      <w:commentRangeStart w:id="2"/>
+      <w:r>
+        <w:rPr>
+          <w:rFonts w:ascii="Arial" w:hAnsi="Arial" w:cs="Arial"/>
+          <w:color w:val="7030A0"/>
+        </w:rPr>
+        <w:t xml:space="preserve">the other three marine heatwave treatments </w:t>
+      </w:r>
+      <w:commentRangeEnd w:id="1"/>
+      <w:r>
+        <w:rPr>
+          <w:rStyle w:val="CommentReference"/>
+        </w:rPr>
+        <w:commentReference w:id="1"/>
+      </w:r>
+      <w:r>
+        <w:rPr>
+          <w:rFonts w:ascii="Arial" w:hAnsi="Arial" w:cs="Arial"/>
+          <w:color w:val="7030A0"/>
+        </w:rPr>
+        <w:t>(</w:t>
       </w:r>
       <w:r>
         <w:rPr>
@@ -2748,6 +2569,13 @@
           <w:color w:val="7030A0"/>
         </w:rPr>
         <w:t>.</w:t>
+      </w:r>
+      <w:commentRangeEnd w:id="2"/>
+      <w:r>
+        <w:rPr>
+          <w:rStyle w:val="CommentReference"/>
+        </w:rPr>
+        <w:commentReference w:id="2"/>
       </w:r>
     </w:p>
     <w:p>
@@ -2794,7 +2622,7 @@
           <w:color w:val="FF0000"/>
           <w:highlight w:val="yellow"/>
         </w:rPr>
-        <w:t>2</w:t>
+        <w:t>2.</w:t>
       </w:r>
       <w:r>
         <w:rPr>
@@ -2802,7 +2630,7 @@
           <w:color w:val="FF0000"/>
           <w:highlight w:val="yellow"/>
         </w:rPr>
-        <w:t>.</w:t>
+        <w:t>77</w:t>
       </w:r>
       <w:r>
         <w:rPr>
@@ -2810,7 +2638,7 @@
           <w:color w:val="FF0000"/>
           <w:highlight w:val="yellow"/>
         </w:rPr>
-        <w:t>77</w:t>
+        <w:t xml:space="preserve"> cm ± 0.03</w:t>
       </w:r>
       <w:r>
         <w:rPr>
@@ -2818,7 +2646,7 @@
           <w:color w:val="FF0000"/>
           <w:highlight w:val="yellow"/>
         </w:rPr>
-        <w:t xml:space="preserve"> </w:t>
+        <w:t xml:space="preserve"> and </w:t>
       </w:r>
       <w:r>
         <w:rPr>
@@ -2826,7 +2654,7 @@
           <w:color w:val="FF0000"/>
           <w:highlight w:val="yellow"/>
         </w:rPr>
-        <w:t>c</w:t>
+        <w:t>shell length</w:t>
       </w:r>
       <w:r>
         <w:rPr>
@@ -2834,7 +2662,7 @@
           <w:color w:val="FF0000"/>
           <w:highlight w:val="yellow"/>
         </w:rPr>
-        <w:t>m ± 0.0</w:t>
+        <w:t xml:space="preserve"> </w:t>
       </w:r>
       <w:r>
         <w:rPr>
@@ -2842,7 +2670,7 @@
           <w:color w:val="FF0000"/>
           <w:highlight w:val="yellow"/>
         </w:rPr>
-        <w:t>3</w:t>
+        <w:t>de</w:t>
       </w:r>
       <w:r>
         <w:rPr>
@@ -2850,7 +2678,7 @@
           <w:color w:val="FF0000"/>
           <w:highlight w:val="yellow"/>
         </w:rPr>
-        <w:t xml:space="preserve"> and </w:t>
+        <w:t>creased</w:t>
       </w:r>
       <w:r>
         <w:rPr>
@@ -2858,7 +2686,7 @@
           <w:color w:val="FF0000"/>
           <w:highlight w:val="yellow"/>
         </w:rPr>
-        <w:t>shell length</w:t>
+        <w:t xml:space="preserve"> by </w:t>
       </w:r>
       <w:r>
         <w:rPr>
@@ -2866,7 +2694,7 @@
           <w:color w:val="FF0000"/>
           <w:highlight w:val="yellow"/>
         </w:rPr>
-        <w:t xml:space="preserve"> </w:t>
+        <w:t>2</w:t>
       </w:r>
       <w:r>
         <w:rPr>
@@ -2874,7 +2702,7 @@
           <w:color w:val="FF0000"/>
           <w:highlight w:val="yellow"/>
         </w:rPr>
-        <w:t>de</w:t>
+        <w:t>.</w:t>
       </w:r>
       <w:r>
         <w:rPr>
@@ -2882,7 +2710,7 @@
           <w:color w:val="FF0000"/>
           <w:highlight w:val="yellow"/>
         </w:rPr>
-        <w:t>creased</w:t>
+        <w:t>5</w:t>
       </w:r>
       <w:r>
         <w:rPr>
@@ -2890,7 +2718,7 @@
           <w:color w:val="FF0000"/>
           <w:highlight w:val="yellow"/>
         </w:rPr>
-        <w:t xml:space="preserve"> by </w:t>
+        <w:t>%</w:t>
       </w:r>
       <w:r>
         <w:rPr>
@@ -2898,7 +2726,42 @@
           <w:color w:val="FF0000"/>
           <w:highlight w:val="yellow"/>
         </w:rPr>
-        <w:t>2</w:t>
+        <w:t xml:space="preserve"> to 2.70 cm ± 0.01</w:t>
+      </w:r>
+      <w:r>
+        <w:rPr>
+          <w:rFonts w:ascii="Arial" w:hAnsi="Arial" w:cs="Arial"/>
+          <w:color w:val="FF0000"/>
+        </w:rPr>
+        <w:t xml:space="preserve"> </w:t>
+      </w:r>
+      <w:r>
+        <w:rPr>
+          <w:rFonts w:ascii="Arial" w:hAnsi="Arial" w:cs="Arial"/>
+          <w:color w:val="7030A0"/>
+        </w:rPr>
+        <w:t>a</w:t>
+      </w:r>
+      <w:r>
+        <w:rPr>
+          <w:rFonts w:ascii="Arial" w:hAnsi="Arial" w:cs="Arial"/>
+          <w:color w:val="7030A0"/>
+        </w:rPr>
+        <w:t>t the end of the experiment</w:t>
+      </w:r>
+      <w:r>
+        <w:rPr>
+          <w:rFonts w:ascii="Arial" w:hAnsi="Arial" w:cs="Arial"/>
+          <w:color w:val="7030A0"/>
+        </w:rPr>
+        <w:t xml:space="preserve"> across all treatments</w:t>
+      </w:r>
+      <w:r>
+        <w:rPr>
+          <w:rFonts w:ascii="Arial" w:hAnsi="Arial" w:cs="Arial"/>
+          <w:color w:val="7030A0"/>
+        </w:rPr>
+        <w:t xml:space="preserve">, </w:t>
       </w:r>
       <w:r>
         <w:rPr>
@@ -2906,89 +2769,6 @@
           <w:color w:val="FF0000"/>
           <w:highlight w:val="yellow"/>
         </w:rPr>
-        <w:t>.</w:t>
-      </w:r>
-      <w:r>
-        <w:rPr>
-          <w:rFonts w:ascii="Arial" w:hAnsi="Arial" w:cs="Arial"/>
-          <w:color w:val="FF0000"/>
-          <w:highlight w:val="yellow"/>
-        </w:rPr>
-        <w:t>5</w:t>
-      </w:r>
-      <w:r>
-        <w:rPr>
-          <w:rFonts w:ascii="Arial" w:hAnsi="Arial" w:cs="Arial"/>
-          <w:color w:val="FF0000"/>
-          <w:highlight w:val="yellow"/>
-        </w:rPr>
-        <w:t>%</w:t>
-      </w:r>
-      <w:r>
-        <w:rPr>
-          <w:rFonts w:ascii="Arial" w:hAnsi="Arial" w:cs="Arial"/>
-          <w:color w:val="FF0000"/>
-          <w:highlight w:val="yellow"/>
-        </w:rPr>
-        <w:t xml:space="preserve"> to 2.70 </w:t>
-      </w:r>
-      <w:r>
-        <w:rPr>
-          <w:rFonts w:ascii="Arial" w:hAnsi="Arial" w:cs="Arial"/>
-          <w:color w:val="FF0000"/>
-          <w:highlight w:val="yellow"/>
-        </w:rPr>
-        <w:t>cm ± 0.0</w:t>
-      </w:r>
-      <w:r>
-        <w:rPr>
-          <w:rFonts w:ascii="Arial" w:hAnsi="Arial" w:cs="Arial"/>
-          <w:color w:val="FF0000"/>
-          <w:highlight w:val="yellow"/>
-        </w:rPr>
-        <w:t>1</w:t>
-      </w:r>
-      <w:r>
-        <w:rPr>
-          <w:rFonts w:ascii="Arial" w:hAnsi="Arial" w:cs="Arial"/>
-          <w:color w:val="FF0000"/>
-        </w:rPr>
-        <w:t xml:space="preserve"> </w:t>
-      </w:r>
-      <w:r>
-        <w:rPr>
-          <w:rFonts w:ascii="Arial" w:hAnsi="Arial" w:cs="Arial"/>
-          <w:color w:val="7030A0"/>
-        </w:rPr>
-        <w:t>a</w:t>
-      </w:r>
-      <w:r>
-        <w:rPr>
-          <w:rFonts w:ascii="Arial" w:hAnsi="Arial" w:cs="Arial"/>
-          <w:color w:val="7030A0"/>
-        </w:rPr>
-        <w:t>t the end of the experiment</w:t>
-      </w:r>
-      <w:r>
-        <w:rPr>
-          <w:rFonts w:ascii="Arial" w:hAnsi="Arial" w:cs="Arial"/>
-          <w:color w:val="7030A0"/>
-        </w:rPr>
-        <w:t xml:space="preserve"> across all treatments</w:t>
-      </w:r>
-      <w:r>
-        <w:rPr>
-          <w:rFonts w:ascii="Arial" w:hAnsi="Arial" w:cs="Arial"/>
-          <w:color w:val="7030A0"/>
-        </w:rPr>
-        <w:t xml:space="preserve">, </w:t>
-      </w:r>
-      <w:r>
-        <w:rPr>
-          <w:rFonts w:ascii="Arial" w:hAnsi="Arial" w:cs="Arial"/>
-          <w:color w:val="FF0000"/>
-          <w:highlight w:val="yellow"/>
-        </w:rPr>
         <w:t>suggesting that either oyster shells shrunk or the random sampling of lengths were larger than the majority of oysters</w:t>
       </w:r>
       <w:r>
@@ -3128,14 +2908,7 @@
           <w:rFonts w:ascii="Arial" w:hAnsi="Arial" w:cs="Arial"/>
           <w:color w:val="7030A0"/>
         </w:rPr>
-        <w:t xml:space="preserve"> </w:t>
-      </w:r>
-      <w:r>
-        <w:rPr>
-          <w:rFonts w:ascii="Arial" w:hAnsi="Arial" w:cs="Arial"/>
-          <w:color w:val="7030A0"/>
-        </w:rPr>
-        <w:t>(</w:t>
+        <w:t xml:space="preserve"> (</w:t>
       </w:r>
       <w:r>
         <w:rPr>
@@ -3172,14 +2945,7 @@
           <w:rFonts w:ascii="Arial" w:hAnsi="Arial" w:cs="Arial"/>
           <w:color w:val="7030A0"/>
         </w:rPr>
-        <w:t>1</w:t>
-      </w:r>
-      <w:r>
-        <w:rPr>
-          <w:rFonts w:ascii="Arial" w:hAnsi="Arial" w:cs="Arial"/>
-          <w:color w:val="7030A0"/>
-        </w:rPr>
-        <w:t xml:space="preserve">, </w:t>
+        <w:t xml:space="preserve">1, </w:t>
       </w:r>
       <w:r>
         <w:rPr>
@@ -3202,14 +2968,7 @@
           <w:rFonts w:ascii="Arial" w:hAnsi="Arial" w:cs="Arial"/>
           <w:color w:val="7030A0"/>
         </w:rPr>
-        <w:t>)</w:t>
-      </w:r>
-      <w:r>
-        <w:rPr>
-          <w:rFonts w:ascii="Arial" w:hAnsi="Arial" w:cs="Arial"/>
-          <w:color w:val="7030A0"/>
-        </w:rPr>
-        <w:t xml:space="preserve"> and </w:t>
+        <w:t xml:space="preserve">) and </w:t>
       </w:r>
       <w:r>
         <w:rPr>
@@ -3237,14 +2996,7 @@
           <w:rFonts w:ascii="Arial" w:hAnsi="Arial" w:cs="Arial"/>
           <w:color w:val="7030A0"/>
         </w:rPr>
-        <w:t xml:space="preserve"> </w:t>
-      </w:r>
-      <w:r>
-        <w:rPr>
-          <w:rFonts w:ascii="Arial" w:hAnsi="Arial" w:cs="Arial"/>
-          <w:color w:val="7030A0"/>
-        </w:rPr>
-        <w:t>(</w:t>
+        <w:t xml:space="preserve"> (</w:t>
       </w:r>
       <w:r>
         <w:rPr>
@@ -3281,21 +3033,7 @@
           <w:rFonts w:ascii="Arial" w:hAnsi="Arial" w:cs="Arial"/>
           <w:color w:val="7030A0"/>
         </w:rPr>
-        <w:t>2</w:t>
-      </w:r>
-      <w:r>
-        <w:rPr>
-          <w:rFonts w:ascii="Arial" w:hAnsi="Arial" w:cs="Arial"/>
-          <w:color w:val="7030A0"/>
-        </w:rPr>
-        <w:t>4</w:t>
-      </w:r>
-      <w:r>
-        <w:rPr>
-          <w:rFonts w:ascii="Arial" w:hAnsi="Arial" w:cs="Arial"/>
-          <w:color w:val="7030A0"/>
-        </w:rPr>
-        <w:t xml:space="preserve">, </w:t>
+        <w:t xml:space="preserve">24, </w:t>
       </w:r>
       <w:r>
         <w:rPr>
@@ -3318,14 +3056,7 @@
           <w:rFonts w:ascii="Arial" w:hAnsi="Arial" w:cs="Arial"/>
           <w:color w:val="7030A0"/>
         </w:rPr>
-        <w:t>)</w:t>
-      </w:r>
-      <w:r>
-        <w:rPr>
-          <w:rFonts w:ascii="Arial" w:hAnsi="Arial" w:cs="Arial"/>
-          <w:color w:val="7030A0"/>
-        </w:rPr>
-        <w:t>.</w:t>
+        <w:t>).</w:t>
       </w:r>
       <w:r>
         <w:rPr>
@@ -3367,14 +3098,7 @@
           <w:rFonts w:ascii="Arial" w:hAnsi="Arial" w:cs="Arial"/>
           <w:color w:val="7030A0"/>
         </w:rPr>
-        <w:t xml:space="preserve"> </w:t>
-      </w:r>
-      <w:r>
-        <w:rPr>
-          <w:rFonts w:ascii="Arial" w:hAnsi="Arial" w:cs="Arial"/>
-          <w:color w:val="7030A0"/>
-        </w:rPr>
-        <w:t>(</w:t>
+        <w:t xml:space="preserve"> (</w:t>
       </w:r>
       <w:r>
         <w:rPr>
@@ -3641,6 +3365,27 @@
           <w:rFonts w:ascii="Arial" w:hAnsi="Arial" w:cs="Arial"/>
           <w:color w:val="7030A0"/>
         </w:rPr>
+        <w:t xml:space="preserve"> (2</w:t>
+      </w:r>
+      <w:r>
+        <w:rPr>
+          <w:rFonts w:ascii="Arial" w:hAnsi="Arial" w:cs="Arial"/>
+          <w:color w:val="7030A0"/>
+        </w:rPr>
+        <w:t>.</w:t>
+      </w:r>
+      <w:r>
+        <w:rPr>
+          <w:rFonts w:ascii="Arial" w:hAnsi="Arial" w:cs="Arial"/>
+          <w:color w:val="7030A0"/>
+        </w:rPr>
+        <w:t>70</w:t>
+      </w:r>
+      <w:r>
+        <w:rPr>
+          <w:rFonts w:ascii="Arial" w:hAnsi="Arial" w:cs="Arial"/>
+          <w:color w:val="7030A0"/>
+        </w:rPr>
         <w:t xml:space="preserve"> </w:t>
       </w:r>
       <w:r>
@@ -3648,7 +3393,56 @@
           <w:rFonts w:ascii="Arial" w:hAnsi="Arial" w:cs="Arial"/>
           <w:color w:val="7030A0"/>
         </w:rPr>
-        <w:t>(2</w:t>
+        <w:t>c</w:t>
+      </w:r>
+      <w:r>
+        <w:rPr>
+          <w:rFonts w:ascii="Arial" w:hAnsi="Arial" w:cs="Arial"/>
+          <w:color w:val="7030A0"/>
+        </w:rPr>
+        <w:t>m ± 0.0</w:t>
+      </w:r>
+      <w:r>
+        <w:rPr>
+          <w:rFonts w:ascii="Arial" w:hAnsi="Arial" w:cs="Arial"/>
+          <w:color w:val="7030A0"/>
+        </w:rPr>
+        <w:t>2)</w:t>
+      </w:r>
+      <w:r>
+        <w:rPr>
+          <w:rFonts w:ascii="Arial" w:hAnsi="Arial" w:cs="Arial"/>
+          <w:color w:val="7030A0"/>
+        </w:rPr>
+        <w:t xml:space="preserve">, </w:t>
+      </w:r>
+      <w:r>
+        <w:rPr>
+          <w:rFonts w:ascii="Arial" w:hAnsi="Arial" w:cs="Arial"/>
+          <w:color w:val="7030A0"/>
+        </w:rPr>
+        <w:t>1</w:t>
+      </w:r>
+      <w:r>
+        <w:rPr>
+          <w:rFonts w:ascii="Arial" w:hAnsi="Arial" w:cs="Arial"/>
+          <w:color w:val="7030A0"/>
+        </w:rPr>
+        <w:t>5</w:t>
+      </w:r>
+      <w:r>
+        <w:rPr>
+          <w:rFonts w:ascii="Arial" w:hAnsi="Arial" w:cs="Arial"/>
+          <w:color w:val="7030A0"/>
+        </w:rPr>
+        <w:t>˚C</w:t>
+      </w:r>
+      <w:r>
+        <w:rPr>
+          <w:rFonts w:ascii="Arial" w:hAnsi="Arial" w:cs="Arial"/>
+          <w:color w:val="7030A0"/>
+        </w:rPr>
+        <w:t xml:space="preserve"> (2</w:t>
       </w:r>
       <w:r>
         <w:rPr>
@@ -3662,14 +3456,7 @@
           <w:rFonts w:ascii="Arial" w:hAnsi="Arial" w:cs="Arial"/>
           <w:color w:val="7030A0"/>
         </w:rPr>
-        <w:t>7</w:t>
-      </w:r>
-      <w:r>
-        <w:rPr>
-          <w:rFonts w:ascii="Arial" w:hAnsi="Arial" w:cs="Arial"/>
-          <w:color w:val="7030A0"/>
-        </w:rPr>
-        <w:t>0</w:t>
+        <w:t>67</w:t>
       </w:r>
       <w:r>
         <w:rPr>
@@ -3704,7 +3491,7 @@
           <w:rFonts w:ascii="Arial" w:hAnsi="Arial" w:cs="Arial"/>
           <w:color w:val="7030A0"/>
         </w:rPr>
-        <w:t xml:space="preserve">, </w:t>
+        <w:t xml:space="preserve">, and </w:t>
       </w:r>
       <w:r>
         <w:rPr>
@@ -3718,7 +3505,7 @@
           <w:rFonts w:ascii="Arial" w:hAnsi="Arial" w:cs="Arial"/>
           <w:color w:val="7030A0"/>
         </w:rPr>
-        <w:t>5</w:t>
+        <w:t>8</w:t>
       </w:r>
       <w:r>
         <w:rPr>
@@ -3732,6 +3519,27 @@
           <w:rFonts w:ascii="Arial" w:hAnsi="Arial" w:cs="Arial"/>
           <w:color w:val="7030A0"/>
         </w:rPr>
+        <w:t xml:space="preserve"> (2</w:t>
+      </w:r>
+      <w:r>
+        <w:rPr>
+          <w:rFonts w:ascii="Arial" w:hAnsi="Arial" w:cs="Arial"/>
+          <w:color w:val="7030A0"/>
+        </w:rPr>
+        <w:t>.</w:t>
+      </w:r>
+      <w:r>
+        <w:rPr>
+          <w:rFonts w:ascii="Arial" w:hAnsi="Arial" w:cs="Arial"/>
+          <w:color w:val="7030A0"/>
+        </w:rPr>
+        <w:t>4</w:t>
+      </w:r>
+      <w:r>
+        <w:rPr>
+          <w:rFonts w:ascii="Arial" w:hAnsi="Arial" w:cs="Arial"/>
+          <w:color w:val="7030A0"/>
+        </w:rPr>
         <w:t xml:space="preserve"> </w:t>
       </w:r>
       <w:r>
@@ -3739,7 +3547,21 @@
           <w:rFonts w:ascii="Arial" w:hAnsi="Arial" w:cs="Arial"/>
           <w:color w:val="7030A0"/>
         </w:rPr>
-        <w:t>(2</w:t>
+        <w:t>c</w:t>
+      </w:r>
+      <w:r>
+        <w:rPr>
+          <w:rFonts w:ascii="Arial" w:hAnsi="Arial" w:cs="Arial"/>
+          <w:color w:val="7030A0"/>
+        </w:rPr>
+        <w:t>m ± 0.0</w:t>
+      </w:r>
+      <w:r>
+        <w:rPr>
+          <w:rFonts w:ascii="Arial" w:hAnsi="Arial" w:cs="Arial"/>
+          <w:color w:val="7030A0"/>
+        </w:rPr>
+        <w:t>2)</w:t>
       </w:r>
       <w:r>
         <w:rPr>
@@ -3753,147 +3575,7 @@
           <w:rFonts w:ascii="Arial" w:hAnsi="Arial" w:cs="Arial"/>
           <w:color w:val="7030A0"/>
         </w:rPr>
-        <w:t>6</w:t>
-      </w:r>
-      <w:r>
-        <w:rPr>
-          <w:rFonts w:ascii="Arial" w:hAnsi="Arial" w:cs="Arial"/>
-          <w:color w:val="7030A0"/>
-        </w:rPr>
-        <w:t>7</w:t>
-      </w:r>
-      <w:r>
-        <w:rPr>
-          <w:rFonts w:ascii="Arial" w:hAnsi="Arial" w:cs="Arial"/>
-          <w:color w:val="7030A0"/>
-        </w:rPr>
-        <w:t xml:space="preserve"> </w:t>
-      </w:r>
-      <w:r>
-        <w:rPr>
-          <w:rFonts w:ascii="Arial" w:hAnsi="Arial" w:cs="Arial"/>
-          <w:color w:val="7030A0"/>
-        </w:rPr>
-        <w:t>c</w:t>
-      </w:r>
-      <w:r>
-        <w:rPr>
-          <w:rFonts w:ascii="Arial" w:hAnsi="Arial" w:cs="Arial"/>
-          <w:color w:val="7030A0"/>
-        </w:rPr>
-        <w:t>m ± 0.0</w:t>
-      </w:r>
-      <w:r>
-        <w:rPr>
-          <w:rFonts w:ascii="Arial" w:hAnsi="Arial" w:cs="Arial"/>
-          <w:color w:val="7030A0"/>
-        </w:rPr>
-        <w:t>2)</w:t>
-      </w:r>
-      <w:r>
-        <w:rPr>
-          <w:rFonts w:ascii="Arial" w:hAnsi="Arial" w:cs="Arial"/>
-          <w:color w:val="7030A0"/>
-        </w:rPr>
-        <w:t xml:space="preserve">, and </w:t>
-      </w:r>
-      <w:r>
-        <w:rPr>
-          <w:rFonts w:ascii="Arial" w:hAnsi="Arial" w:cs="Arial"/>
-          <w:color w:val="7030A0"/>
-        </w:rPr>
-        <w:t>1</w:t>
-      </w:r>
-      <w:r>
-        <w:rPr>
-          <w:rFonts w:ascii="Arial" w:hAnsi="Arial" w:cs="Arial"/>
-          <w:color w:val="7030A0"/>
-        </w:rPr>
-        <w:t>8</w:t>
-      </w:r>
-      <w:r>
-        <w:rPr>
-          <w:rFonts w:ascii="Arial" w:hAnsi="Arial" w:cs="Arial"/>
-          <w:color w:val="7030A0"/>
-        </w:rPr>
-        <w:t>˚C</w:t>
-      </w:r>
-      <w:r>
-        <w:rPr>
-          <w:rFonts w:ascii="Arial" w:hAnsi="Arial" w:cs="Arial"/>
-          <w:color w:val="7030A0"/>
-        </w:rPr>
-        <w:t xml:space="preserve"> </w:t>
-      </w:r>
-      <w:r>
-        <w:rPr>
-          <w:rFonts w:ascii="Arial" w:hAnsi="Arial" w:cs="Arial"/>
-          <w:color w:val="7030A0"/>
-        </w:rPr>
-        <w:t>(2</w:t>
-      </w:r>
-      <w:r>
-        <w:rPr>
-          <w:rFonts w:ascii="Arial" w:hAnsi="Arial" w:cs="Arial"/>
-          <w:color w:val="7030A0"/>
-        </w:rPr>
-        <w:t>.</w:t>
-      </w:r>
-      <w:r>
-        <w:rPr>
-          <w:rFonts w:ascii="Arial" w:hAnsi="Arial" w:cs="Arial"/>
-          <w:color w:val="7030A0"/>
-        </w:rPr>
-        <w:t>4</w:t>
-      </w:r>
-      <w:r>
-        <w:rPr>
-          <w:rFonts w:ascii="Arial" w:hAnsi="Arial" w:cs="Arial"/>
-          <w:color w:val="7030A0"/>
-        </w:rPr>
-        <w:t xml:space="preserve"> </w:t>
-      </w:r>
-      <w:r>
-        <w:rPr>
-          <w:rFonts w:ascii="Arial" w:hAnsi="Arial" w:cs="Arial"/>
-          <w:color w:val="7030A0"/>
-        </w:rPr>
-        <w:t>c</w:t>
-      </w:r>
-      <w:r>
-        <w:rPr>
-          <w:rFonts w:ascii="Arial" w:hAnsi="Arial" w:cs="Arial"/>
-          <w:color w:val="7030A0"/>
-        </w:rPr>
-        <w:t>m ± 0.0</w:t>
-      </w:r>
-      <w:r>
-        <w:rPr>
-          <w:rFonts w:ascii="Arial" w:hAnsi="Arial" w:cs="Arial"/>
-          <w:color w:val="7030A0"/>
-        </w:rPr>
-        <w:t>2)</w:t>
-      </w:r>
-      <w:r>
-        <w:rPr>
-          <w:rFonts w:ascii="Arial" w:hAnsi="Arial" w:cs="Arial"/>
-          <w:color w:val="7030A0"/>
-        </w:rPr>
-        <w:t>.</w:t>
-      </w:r>
-      <w:r>
-        <w:rPr>
-          <w:rFonts w:ascii="Arial" w:hAnsi="Arial" w:cs="Arial"/>
-          <w:color w:val="7030A0"/>
-        </w:rPr>
-        <w:t xml:space="preserve"> </w:t>
-      </w:r>
-      <w:r>
-        <w:rPr>
-          <w:rFonts w:ascii="Arial" w:hAnsi="Arial" w:cs="Arial"/>
-          <w:color w:val="7030A0"/>
-        </w:rPr>
-        <w:t>Although the tidal regime during stress hardening did not affect shell length (</w:t>
+        <w:t xml:space="preserve"> Although the tidal regime during stress hardening did not affect shell length (</w:t>
       </w:r>
       <w:r>
         <w:rPr>
@@ -3974,21 +3656,7 @@
           <w:rFonts w:ascii="Arial" w:hAnsi="Arial" w:cs="Arial"/>
           <w:color w:val="7030A0"/>
         </w:rPr>
-        <w:t xml:space="preserve"> marine heatwaves</w:t>
-      </w:r>
-      <w:r>
-        <w:rPr>
-          <w:rFonts w:ascii="Arial" w:hAnsi="Arial" w:cs="Arial"/>
-          <w:color w:val="7030A0"/>
-        </w:rPr>
-        <w:t xml:space="preserve"> </w:t>
-      </w:r>
-      <w:r>
-        <w:rPr>
-          <w:rFonts w:ascii="Arial" w:hAnsi="Arial" w:cs="Arial"/>
-          <w:color w:val="7030A0"/>
-        </w:rPr>
-        <w:t>(</w:t>
+        <w:t xml:space="preserve"> marine heatwaves (</w:t>
       </w:r>
       <w:r>
         <w:rPr>
@@ -4062,14 +3730,21 @@
           <w:rFonts w:ascii="Arial" w:hAnsi="Arial" w:cs="Arial"/>
           <w:color w:val="7030A0"/>
         </w:rPr>
-        <w:t xml:space="preserve">Specifically, oysters that experienced cyclical tides at </w:t>
-      </w:r>
-      <w:r>
-        <w:rPr>
-          <w:rFonts w:ascii="Arial" w:hAnsi="Arial" w:cs="Arial"/>
-          <w:color w:val="7030A0"/>
-        </w:rPr>
-        <w:t>with 18</w:t>
+        <w:t xml:space="preserve">Specifically, oysters that experienced cyclical tides </w:t>
+      </w:r>
+      <w:r>
+        <w:rPr>
+          <w:rFonts w:ascii="Arial" w:hAnsi="Arial" w:cs="Arial"/>
+          <w:color w:val="7030A0"/>
+        </w:rPr>
+        <w:t xml:space="preserve">and MHWs </w:t>
+      </w:r>
+      <w:r>
+        <w:rPr>
+          <w:rFonts w:ascii="Arial" w:hAnsi="Arial" w:cs="Arial"/>
+          <w:color w:val="7030A0"/>
+        </w:rPr>
+        <w:t>at 18</w:t>
       </w:r>
       <w:r>
         <w:rPr>
@@ -4083,6 +3758,27 @@
           <w:rFonts w:ascii="Arial" w:hAnsi="Arial" w:cs="Arial"/>
           <w:color w:val="7030A0"/>
         </w:rPr>
+        <w:t xml:space="preserve"> (2</w:t>
+      </w:r>
+      <w:r>
+        <w:rPr>
+          <w:rFonts w:ascii="Arial" w:hAnsi="Arial" w:cs="Arial"/>
+          <w:color w:val="7030A0"/>
+        </w:rPr>
+        <w:t>.</w:t>
+      </w:r>
+      <w:r>
+        <w:rPr>
+          <w:rFonts w:ascii="Arial" w:hAnsi="Arial" w:cs="Arial"/>
+          <w:color w:val="7030A0"/>
+        </w:rPr>
+        <w:t>54</w:t>
+      </w:r>
+      <w:r>
+        <w:rPr>
+          <w:rFonts w:ascii="Arial" w:hAnsi="Arial" w:cs="Arial"/>
+          <w:color w:val="7030A0"/>
+        </w:rPr>
         <w:t xml:space="preserve"> </w:t>
       </w:r>
       <w:r>
@@ -4090,7 +3786,56 @@
           <w:rFonts w:ascii="Arial" w:hAnsi="Arial" w:cs="Arial"/>
           <w:color w:val="7030A0"/>
         </w:rPr>
-        <w:t>(2</w:t>
+        <w:t>c</w:t>
+      </w:r>
+      <w:r>
+        <w:rPr>
+          <w:rFonts w:ascii="Arial" w:hAnsi="Arial" w:cs="Arial"/>
+          <w:color w:val="7030A0"/>
+        </w:rPr>
+        <w:t>m ± 0.0</w:t>
+      </w:r>
+      <w:r>
+        <w:rPr>
+          <w:rFonts w:ascii="Arial" w:hAnsi="Arial" w:cs="Arial"/>
+          <w:color w:val="7030A0"/>
+        </w:rPr>
+        <w:t>3</w:t>
+      </w:r>
+      <w:r>
+        <w:rPr>
+          <w:rFonts w:ascii="Arial" w:hAnsi="Arial" w:cs="Arial"/>
+          <w:color w:val="7030A0"/>
+        </w:rPr>
+        <w:t xml:space="preserve">) and </w:t>
+      </w:r>
+      <w:r>
+        <w:rPr>
+          <w:rFonts w:ascii="Arial" w:hAnsi="Arial" w:cs="Arial"/>
+          <w:color w:val="7030A0"/>
+        </w:rPr>
+        <w:t>2</w:t>
+      </w:r>
+      <w:r>
+        <w:rPr>
+          <w:rFonts w:ascii="Arial" w:hAnsi="Arial" w:cs="Arial"/>
+          <w:color w:val="7030A0"/>
+        </w:rPr>
+        <w:t>4</w:t>
+      </w:r>
+      <w:r>
+        <w:rPr>
+          <w:rFonts w:ascii="Arial" w:hAnsi="Arial" w:cs="Arial"/>
+          <w:color w:val="7030A0"/>
+        </w:rPr>
+        <w:t>˚C</w:t>
+      </w:r>
+      <w:r>
+        <w:rPr>
+          <w:rFonts w:ascii="Arial" w:hAnsi="Arial" w:cs="Arial"/>
+          <w:color w:val="7030A0"/>
+        </w:rPr>
+        <w:t xml:space="preserve"> (2</w:t>
       </w:r>
       <w:r>
         <w:rPr>
@@ -4104,7 +3849,7 @@
           <w:rFonts w:ascii="Arial" w:hAnsi="Arial" w:cs="Arial"/>
           <w:color w:val="7030A0"/>
         </w:rPr>
-        <w:t>54</w:t>
+        <w:t>62</w:t>
       </w:r>
       <w:r>
         <w:rPr>
@@ -4139,7 +3884,119 @@
           <w:rFonts w:ascii="Arial" w:hAnsi="Arial" w:cs="Arial"/>
           <w:color w:val="7030A0"/>
         </w:rPr>
-        <w:t xml:space="preserve">) and </w:t>
+        <w:t xml:space="preserve">) </w:t>
+      </w:r>
+      <w:r>
+        <w:rPr>
+          <w:rFonts w:ascii="Arial" w:hAnsi="Arial" w:cs="Arial"/>
+          <w:color w:val="7030A0"/>
+        </w:rPr>
+        <w:t>were</w:t>
+      </w:r>
+      <w:r>
+        <w:rPr>
+          <w:rFonts w:ascii="Arial" w:hAnsi="Arial" w:cs="Arial"/>
+          <w:color w:val="7030A0"/>
+        </w:rPr>
+        <w:t xml:space="preserve"> </w:t>
+      </w:r>
+      <w:r>
+        <w:rPr>
+          <w:rFonts w:ascii="Arial" w:hAnsi="Arial" w:cs="Arial"/>
+          <w:color w:val="7030A0"/>
+        </w:rPr>
+        <w:t>7.9</w:t>
+      </w:r>
+      <w:r>
+        <w:rPr>
+          <w:rFonts w:ascii="Arial" w:hAnsi="Arial" w:cs="Arial"/>
+          <w:color w:val="7030A0"/>
+        </w:rPr>
+        <w:t xml:space="preserve">% and </w:t>
+      </w:r>
+      <w:r>
+        <w:rPr>
+          <w:rFonts w:ascii="Arial" w:hAnsi="Arial" w:cs="Arial"/>
+          <w:color w:val="7030A0"/>
+        </w:rPr>
+        <w:t>6.5</w:t>
+      </w:r>
+      <w:r>
+        <w:rPr>
+          <w:rFonts w:ascii="Arial" w:hAnsi="Arial" w:cs="Arial"/>
+          <w:color w:val="7030A0"/>
+        </w:rPr>
+        <w:t>% smaller, respectively, than their counterparts that were submerged during stress</w:t>
+      </w:r>
+      <w:r>
+        <w:rPr>
+          <w:rFonts w:ascii="Arial" w:hAnsi="Arial" w:cs="Arial"/>
+          <w:color w:val="7030A0"/>
+        </w:rPr>
+        <w:t xml:space="preserve"> hardening</w:t>
+      </w:r>
+      <w:r>
+        <w:rPr>
+          <w:rFonts w:ascii="Arial" w:hAnsi="Arial" w:cs="Arial"/>
+          <w:color w:val="7030A0"/>
+        </w:rPr>
+        <w:t xml:space="preserve"> (18</w:t>
+      </w:r>
+      <w:r>
+        <w:rPr>
+          <w:rFonts w:ascii="Arial" w:hAnsi="Arial" w:cs="Arial"/>
+          <w:color w:val="7030A0"/>
+        </w:rPr>
+        <w:t>˚C</w:t>
+      </w:r>
+      <w:r>
+        <w:rPr>
+          <w:rFonts w:ascii="Arial" w:hAnsi="Arial" w:cs="Arial"/>
+          <w:color w:val="7030A0"/>
+        </w:rPr>
+        <w:t>: 2</w:t>
+      </w:r>
+      <w:r>
+        <w:rPr>
+          <w:rFonts w:ascii="Arial" w:hAnsi="Arial" w:cs="Arial"/>
+          <w:color w:val="7030A0"/>
+        </w:rPr>
+        <w:t>.</w:t>
+      </w:r>
+      <w:r>
+        <w:rPr>
+          <w:rFonts w:ascii="Arial" w:hAnsi="Arial" w:cs="Arial"/>
+          <w:color w:val="7030A0"/>
+        </w:rPr>
+        <w:t>74</w:t>
+      </w:r>
+      <w:r>
+        <w:rPr>
+          <w:rFonts w:ascii="Arial" w:hAnsi="Arial" w:cs="Arial"/>
+          <w:color w:val="7030A0"/>
+        </w:rPr>
+        <w:t xml:space="preserve"> </w:t>
+      </w:r>
+      <w:r>
+        <w:rPr>
+          <w:rFonts w:ascii="Arial" w:hAnsi="Arial" w:cs="Arial"/>
+          <w:color w:val="7030A0"/>
+        </w:rPr>
+        <w:t>c</w:t>
+      </w:r>
+      <w:r>
+        <w:rPr>
+          <w:rFonts w:ascii="Arial" w:hAnsi="Arial" w:cs="Arial"/>
+          <w:color w:val="7030A0"/>
+        </w:rPr>
+        <w:t>m ± 0.0</w:t>
+      </w:r>
+      <w:r>
+        <w:rPr>
+          <w:rFonts w:ascii="Arial" w:hAnsi="Arial" w:cs="Arial"/>
+          <w:color w:val="7030A0"/>
+        </w:rPr>
+        <w:t xml:space="preserve">3; </w:t>
       </w:r>
       <w:r>
         <w:rPr>
@@ -4167,266 +4024,7 @@
           <w:rFonts w:ascii="Arial" w:hAnsi="Arial" w:cs="Arial"/>
           <w:color w:val="7030A0"/>
         </w:rPr>
-        <w:t xml:space="preserve"> </w:t>
-      </w:r>
-      <w:r>
-        <w:rPr>
-          <w:rFonts w:ascii="Arial" w:hAnsi="Arial" w:cs="Arial"/>
-          <w:color w:val="7030A0"/>
-        </w:rPr>
-        <w:t>(2</w:t>
-      </w:r>
-      <w:r>
-        <w:rPr>
-          <w:rFonts w:ascii="Arial" w:hAnsi="Arial" w:cs="Arial"/>
-          <w:color w:val="7030A0"/>
-        </w:rPr>
-        <w:t>.</w:t>
-      </w:r>
-      <w:r>
-        <w:rPr>
-          <w:rFonts w:ascii="Arial" w:hAnsi="Arial" w:cs="Arial"/>
-          <w:color w:val="7030A0"/>
-        </w:rPr>
-        <w:t>62</w:t>
-      </w:r>
-      <w:r>
-        <w:rPr>
-          <w:rFonts w:ascii="Arial" w:hAnsi="Arial" w:cs="Arial"/>
-          <w:color w:val="7030A0"/>
-        </w:rPr>
-        <w:t xml:space="preserve"> </w:t>
-      </w:r>
-      <w:r>
-        <w:rPr>
-          <w:rFonts w:ascii="Arial" w:hAnsi="Arial" w:cs="Arial"/>
-          <w:color w:val="7030A0"/>
-        </w:rPr>
-        <w:t>c</w:t>
-      </w:r>
-      <w:r>
-        <w:rPr>
-          <w:rFonts w:ascii="Arial" w:hAnsi="Arial" w:cs="Arial"/>
-          <w:color w:val="7030A0"/>
-        </w:rPr>
-        <w:t>m ± 0.0</w:t>
-      </w:r>
-      <w:r>
-        <w:rPr>
-          <w:rFonts w:ascii="Arial" w:hAnsi="Arial" w:cs="Arial"/>
-          <w:color w:val="7030A0"/>
-        </w:rPr>
-        <w:t>3</w:t>
-      </w:r>
-      <w:r>
-        <w:rPr>
-          <w:rFonts w:ascii="Arial" w:hAnsi="Arial" w:cs="Arial"/>
-          <w:color w:val="7030A0"/>
-        </w:rPr>
-        <w:t>)</w:t>
-      </w:r>
-      <w:r>
-        <w:rPr>
-          <w:rFonts w:ascii="Arial" w:hAnsi="Arial" w:cs="Arial"/>
-          <w:color w:val="7030A0"/>
-        </w:rPr>
-        <w:t xml:space="preserve"> </w:t>
-      </w:r>
-      <w:r>
-        <w:rPr>
-          <w:rFonts w:ascii="Arial" w:hAnsi="Arial" w:cs="Arial"/>
-          <w:color w:val="7030A0"/>
-        </w:rPr>
-        <w:t>were</w:t>
-      </w:r>
-      <w:r>
-        <w:rPr>
-          <w:rFonts w:ascii="Arial" w:hAnsi="Arial" w:cs="Arial"/>
-          <w:color w:val="7030A0"/>
-        </w:rPr>
-        <w:t xml:space="preserve"> </w:t>
-      </w:r>
-      <w:r>
-        <w:rPr>
-          <w:rFonts w:ascii="Arial" w:hAnsi="Arial" w:cs="Arial"/>
-          <w:color w:val="7030A0"/>
-        </w:rPr>
-        <w:t>7.9</w:t>
-      </w:r>
-      <w:r>
-        <w:rPr>
-          <w:rFonts w:ascii="Arial" w:hAnsi="Arial" w:cs="Arial"/>
-          <w:color w:val="7030A0"/>
-        </w:rPr>
-        <w:t>%</w:t>
-      </w:r>
-      <w:r>
-        <w:rPr>
-          <w:rFonts w:ascii="Arial" w:hAnsi="Arial" w:cs="Arial"/>
-          <w:color w:val="7030A0"/>
-        </w:rPr>
-        <w:t xml:space="preserve"> and </w:t>
-      </w:r>
-      <w:r>
-        <w:rPr>
-          <w:rFonts w:ascii="Arial" w:hAnsi="Arial" w:cs="Arial"/>
-          <w:color w:val="7030A0"/>
-        </w:rPr>
-        <w:t>6.5</w:t>
-      </w:r>
-      <w:r>
-        <w:rPr>
-          <w:rFonts w:ascii="Arial" w:hAnsi="Arial" w:cs="Arial"/>
-          <w:color w:val="7030A0"/>
-        </w:rPr>
-        <w:t>%</w:t>
-      </w:r>
-      <w:r>
-        <w:rPr>
-          <w:rFonts w:ascii="Arial" w:hAnsi="Arial" w:cs="Arial"/>
-          <w:color w:val="7030A0"/>
-        </w:rPr>
-        <w:t xml:space="preserve"> smaller, respectively, than their counterparts that were submerged during stress</w:t>
-      </w:r>
-      <w:r>
-        <w:rPr>
-          <w:rFonts w:ascii="Arial" w:hAnsi="Arial" w:cs="Arial"/>
-          <w:color w:val="7030A0"/>
-        </w:rPr>
-        <w:t xml:space="preserve"> hardening</w:t>
-      </w:r>
-      <w:r>
-        <w:rPr>
-          <w:rFonts w:ascii="Arial" w:hAnsi="Arial" w:cs="Arial"/>
-          <w:color w:val="7030A0"/>
-        </w:rPr>
-        <w:t xml:space="preserve"> (</w:t>
-      </w:r>
-      <w:r>
-        <w:rPr>
-          <w:rFonts w:ascii="Arial" w:hAnsi="Arial" w:cs="Arial"/>
-          <w:color w:val="7030A0"/>
-        </w:rPr>
-        <w:t>18</w:t>
-      </w:r>
-      <w:r>
-        <w:rPr>
-          <w:rFonts w:ascii="Arial" w:hAnsi="Arial" w:cs="Arial"/>
-          <w:color w:val="7030A0"/>
-        </w:rPr>
-        <w:t>˚C</w:t>
-      </w:r>
-      <w:r>
-        <w:rPr>
-          <w:rFonts w:ascii="Arial" w:hAnsi="Arial" w:cs="Arial"/>
-          <w:color w:val="7030A0"/>
-        </w:rPr>
-        <w:t xml:space="preserve">: </w:t>
-      </w:r>
-      <w:r>
-        <w:rPr>
-          <w:rFonts w:ascii="Arial" w:hAnsi="Arial" w:cs="Arial"/>
-          <w:color w:val="7030A0"/>
-        </w:rPr>
-        <w:t>2</w:t>
-      </w:r>
-      <w:r>
-        <w:rPr>
-          <w:rFonts w:ascii="Arial" w:hAnsi="Arial" w:cs="Arial"/>
-          <w:color w:val="7030A0"/>
-        </w:rPr>
-        <w:t>.</w:t>
-      </w:r>
-      <w:r>
-        <w:rPr>
-          <w:rFonts w:ascii="Arial" w:hAnsi="Arial" w:cs="Arial"/>
-          <w:color w:val="7030A0"/>
-        </w:rPr>
-        <w:t>7</w:t>
-      </w:r>
-      <w:r>
-        <w:rPr>
-          <w:rFonts w:ascii="Arial" w:hAnsi="Arial" w:cs="Arial"/>
-          <w:color w:val="7030A0"/>
-        </w:rPr>
-        <w:t>4</w:t>
-      </w:r>
-      <w:r>
-        <w:rPr>
-          <w:rFonts w:ascii="Arial" w:hAnsi="Arial" w:cs="Arial"/>
-          <w:color w:val="7030A0"/>
-        </w:rPr>
-        <w:t xml:space="preserve"> </w:t>
-      </w:r>
-      <w:r>
-        <w:rPr>
-          <w:rFonts w:ascii="Arial" w:hAnsi="Arial" w:cs="Arial"/>
-          <w:color w:val="7030A0"/>
-        </w:rPr>
-        <w:t>c</w:t>
-      </w:r>
-      <w:r>
-        <w:rPr>
-          <w:rFonts w:ascii="Arial" w:hAnsi="Arial" w:cs="Arial"/>
-          <w:color w:val="7030A0"/>
-        </w:rPr>
-        <w:t>m ± 0.0</w:t>
-      </w:r>
-      <w:r>
-        <w:rPr>
-          <w:rFonts w:ascii="Arial" w:hAnsi="Arial" w:cs="Arial"/>
-          <w:color w:val="7030A0"/>
-        </w:rPr>
-        <w:t>3</w:t>
-      </w:r>
-      <w:r>
-        <w:rPr>
-          <w:rFonts w:ascii="Arial" w:hAnsi="Arial" w:cs="Arial"/>
-          <w:color w:val="7030A0"/>
-        </w:rPr>
-        <w:t>;</w:t>
-      </w:r>
-      <w:r>
-        <w:rPr>
-          <w:rFonts w:ascii="Arial" w:hAnsi="Arial" w:cs="Arial"/>
-          <w:color w:val="7030A0"/>
-        </w:rPr>
-        <w:t xml:space="preserve"> </w:t>
-      </w:r>
-      <w:r>
-        <w:rPr>
-          <w:rFonts w:ascii="Arial" w:hAnsi="Arial" w:cs="Arial"/>
-          <w:color w:val="7030A0"/>
-        </w:rPr>
-        <w:t>2</w:t>
-      </w:r>
-      <w:r>
-        <w:rPr>
-          <w:rFonts w:ascii="Arial" w:hAnsi="Arial" w:cs="Arial"/>
-          <w:color w:val="7030A0"/>
-        </w:rPr>
-        <w:t>4</w:t>
-      </w:r>
-      <w:r>
-        <w:rPr>
-          <w:rFonts w:ascii="Arial" w:hAnsi="Arial" w:cs="Arial"/>
-          <w:color w:val="7030A0"/>
-        </w:rPr>
-        <w:t>˚C</w:t>
-      </w:r>
-      <w:r>
-        <w:rPr>
-          <w:rFonts w:ascii="Arial" w:hAnsi="Arial" w:cs="Arial"/>
-          <w:color w:val="7030A0"/>
-        </w:rPr>
-        <w:t xml:space="preserve">: </w:t>
-      </w:r>
-      <w:r>
-        <w:rPr>
-          <w:rFonts w:ascii="Arial" w:hAnsi="Arial" w:cs="Arial"/>
-          <w:color w:val="7030A0"/>
-        </w:rPr>
-        <w:t>2</w:t>
+        <w:t>: 2</w:t>
       </w:r>
       <w:r>
         <w:rPr>
@@ -4597,14 +4195,7 @@
           <w:rFonts w:ascii="Arial" w:hAnsi="Arial" w:cs="Arial"/>
           <w:color w:val="7030A0"/>
         </w:rPr>
-        <w:t xml:space="preserve">ere 2.62 </w:t>
-      </w:r>
-      <w:r>
-        <w:rPr>
-          <w:rFonts w:ascii="Arial" w:hAnsi="Arial" w:cs="Arial"/>
-          <w:color w:val="7030A0"/>
-        </w:rPr>
-        <w:t>c</w:t>
+        <w:t>ere 2.62 c</w:t>
       </w:r>
       <w:r>
         <w:rPr>
@@ -4618,14 +4209,7 @@
           <w:rFonts w:ascii="Arial" w:hAnsi="Arial" w:cs="Arial"/>
           <w:color w:val="7030A0"/>
         </w:rPr>
-        <w:t>3</w:t>
-      </w:r>
-      <w:r>
-        <w:rPr>
-          <w:rFonts w:ascii="Arial" w:hAnsi="Arial" w:cs="Arial"/>
-          <w:color w:val="7030A0"/>
-        </w:rPr>
-        <w:t xml:space="preserve"> and had increased </w:t>
+        <w:t xml:space="preserve">3 and had increased </w:t>
       </w:r>
       <w:r>
         <w:rPr>
@@ -4639,14 +4223,7 @@
           <w:rFonts w:ascii="Arial" w:hAnsi="Arial" w:cs="Arial"/>
           <w:color w:val="7030A0"/>
         </w:rPr>
-        <w:t>2.7</w:t>
-      </w:r>
-      <w:r>
-        <w:rPr>
-          <w:rFonts w:ascii="Arial" w:hAnsi="Arial" w:cs="Arial"/>
-          <w:color w:val="7030A0"/>
-        </w:rPr>
-        <w:t>6 c</w:t>
+        <w:t>2.76 c</w:t>
       </w:r>
       <w:r>
         <w:rPr>
@@ -4817,14 +4394,7 @@
           <w:rFonts w:ascii="Arial" w:hAnsi="Arial" w:cs="Arial"/>
           <w:color w:val="7030A0"/>
         </w:rPr>
-        <w:t xml:space="preserve">, but not by marine heatwave temperature </w:t>
-      </w:r>
-      <w:r>
-        <w:rPr>
-          <w:rFonts w:ascii="Arial" w:hAnsi="Arial" w:cs="Arial"/>
-          <w:color w:val="7030A0"/>
-        </w:rPr>
-        <w:t>(</w:t>
+        <w:t>, but not by marine heatwave temperature (</w:t>
       </w:r>
       <w:r>
         <w:rPr>
@@ -4861,14 +4431,7 @@
           <w:rFonts w:ascii="Arial" w:hAnsi="Arial" w:cs="Arial"/>
           <w:color w:val="7030A0"/>
         </w:rPr>
-        <w:t>5</w:t>
-      </w:r>
-      <w:r>
-        <w:rPr>
-          <w:rFonts w:ascii="Arial" w:hAnsi="Arial" w:cs="Arial"/>
-          <w:color w:val="7030A0"/>
-        </w:rPr>
-        <w:t xml:space="preserve">, </w:t>
+        <w:t xml:space="preserve">5, </w:t>
       </w:r>
       <w:r>
         <w:rPr>
@@ -4891,28 +4454,14 @@
           <w:rFonts w:ascii="Arial" w:hAnsi="Arial" w:cs="Arial"/>
           <w:color w:val="7030A0"/>
         </w:rPr>
-        <w:t>)</w:t>
-      </w:r>
-      <w:r>
-        <w:rPr>
-          <w:rFonts w:ascii="Arial" w:hAnsi="Arial" w:cs="Arial"/>
-          <w:color w:val="7030A0"/>
-        </w:rPr>
-        <w:t xml:space="preserve">. Oysters hardened at </w:t>
-      </w:r>
-      <w:r>
-        <w:rPr>
-          <w:rFonts w:ascii="Arial" w:hAnsi="Arial" w:cs="Arial"/>
-          <w:color w:val="7030A0"/>
-        </w:rPr>
-        <w:t>1</w:t>
-      </w:r>
-      <w:r>
-        <w:rPr>
-          <w:rFonts w:ascii="Arial" w:hAnsi="Arial" w:cs="Arial"/>
-          <w:color w:val="7030A0"/>
-        </w:rPr>
-        <w:t>5</w:t>
+        <w:t xml:space="preserve">). Oysters hardened at </w:t>
+      </w:r>
+      <w:r>
+        <w:rPr>
+          <w:rFonts w:ascii="Arial" w:hAnsi="Arial" w:cs="Arial"/>
+          <w:color w:val="7030A0"/>
+        </w:rPr>
+        <w:t>15</w:t>
       </w:r>
       <w:r>
         <w:rPr>
@@ -4968,21 +4517,7 @@
           <w:rFonts w:ascii="Arial" w:hAnsi="Arial" w:cs="Arial"/>
           <w:color w:val="7030A0"/>
         </w:rPr>
-        <w:t>2</w:t>
-      </w:r>
-      <w:r>
-        <w:rPr>
-          <w:rFonts w:ascii="Arial" w:hAnsi="Arial" w:cs="Arial"/>
-          <w:color w:val="7030A0"/>
-        </w:rPr>
-        <w:t xml:space="preserve">) </w:t>
-      </w:r>
-      <w:r>
-        <w:rPr>
-          <w:rFonts w:ascii="Arial" w:hAnsi="Arial" w:cs="Arial"/>
-          <w:color w:val="7030A0"/>
-        </w:rPr>
-        <w:t xml:space="preserve">were </w:t>
+        <w:t xml:space="preserve">2) were </w:t>
       </w:r>
       <w:r>
         <w:rPr>
@@ -4996,70 +4531,14 @@
           <w:rFonts w:ascii="Arial" w:hAnsi="Arial" w:cs="Arial"/>
           <w:color w:val="7030A0"/>
         </w:rPr>
-        <w:t>% smaller than those at</w:t>
-      </w:r>
-      <w:r>
-        <w:rPr>
-          <w:rFonts w:ascii="Arial" w:hAnsi="Arial" w:cs="Arial"/>
-          <w:color w:val="7030A0"/>
-        </w:rPr>
-        <w:t xml:space="preserve"> </w:t>
-      </w:r>
-      <w:r>
-        <w:rPr>
-          <w:rFonts w:ascii="Arial" w:hAnsi="Arial" w:cs="Arial"/>
-          <w:color w:val="7030A0"/>
-        </w:rPr>
-        <w:t>2</w:t>
-      </w:r>
-      <w:r>
-        <w:rPr>
-          <w:rFonts w:ascii="Arial" w:hAnsi="Arial" w:cs="Arial"/>
-          <w:color w:val="7030A0"/>
-        </w:rPr>
-        <w:t>1</w:t>
-      </w:r>
-      <w:r>
-        <w:rPr>
-          <w:rFonts w:ascii="Arial" w:hAnsi="Arial" w:cs="Arial"/>
-          <w:color w:val="7030A0"/>
-        </w:rPr>
-        <w:t>˚C (2.</w:t>
-      </w:r>
-      <w:r>
-        <w:rPr>
-          <w:rFonts w:ascii="Arial" w:hAnsi="Arial" w:cs="Arial"/>
-          <w:color w:val="7030A0"/>
-        </w:rPr>
-        <w:t>81</w:t>
-      </w:r>
-      <w:r>
-        <w:rPr>
-          <w:rFonts w:ascii="Arial" w:hAnsi="Arial" w:cs="Arial"/>
-          <w:color w:val="7030A0"/>
-        </w:rPr>
-        <w:t xml:space="preserve"> cm ± 0.0</w:t>
-      </w:r>
-      <w:r>
-        <w:rPr>
-          <w:rFonts w:ascii="Arial" w:hAnsi="Arial" w:cs="Arial"/>
-          <w:color w:val="7030A0"/>
-        </w:rPr>
-        <w:t>2</w:t>
-      </w:r>
-      <w:r>
-        <w:rPr>
-          <w:rFonts w:ascii="Arial" w:hAnsi="Arial" w:cs="Arial"/>
-          <w:color w:val="7030A0"/>
-        </w:rPr>
-        <w:t>)</w:t>
-      </w:r>
-      <w:r>
-        <w:rPr>
-          <w:rFonts w:ascii="Arial" w:hAnsi="Arial" w:cs="Arial"/>
-          <w:color w:val="7030A0"/>
-        </w:rPr>
-        <w:t>.</w:t>
+        <w:t xml:space="preserve">% smaller than those at </w:t>
+      </w:r>
+      <w:r>
+        <w:rPr>
+          <w:rFonts w:ascii="Arial" w:hAnsi="Arial" w:cs="Arial"/>
+          <w:color w:val="7030A0"/>
+        </w:rPr>
+        <w:t>21˚C (2.81 cm ± 0.02).</w:t>
       </w:r>
       <w:r>
         <w:rPr>
@@ -5087,35 +4566,7 @@
           <w:rFonts w:ascii="Arial" w:hAnsi="Arial" w:cs="Arial"/>
           <w:color w:val="7030A0"/>
         </w:rPr>
-        <w:t>tidal cycles (</w:t>
-      </w:r>
-      <w:r>
-        <w:rPr>
-          <w:rFonts w:ascii="Arial" w:hAnsi="Arial" w:cs="Arial"/>
-          <w:color w:val="7030A0"/>
-        </w:rPr>
-        <w:t>2.</w:t>
-      </w:r>
-      <w:r>
-        <w:rPr>
-          <w:rFonts w:ascii="Arial" w:hAnsi="Arial" w:cs="Arial"/>
-          <w:color w:val="7030A0"/>
-        </w:rPr>
-        <w:t>66</w:t>
-      </w:r>
-      <w:r>
-        <w:rPr>
-          <w:rFonts w:ascii="Arial" w:hAnsi="Arial" w:cs="Arial"/>
-          <w:color w:val="7030A0"/>
-        </w:rPr>
-        <w:t xml:space="preserve"> cm ± 0.02</w:t>
-      </w:r>
-      <w:r>
-        <w:rPr>
-          <w:rFonts w:ascii="Arial" w:hAnsi="Arial" w:cs="Arial"/>
-          <w:color w:val="7030A0"/>
-        </w:rPr>
-        <w:t xml:space="preserve">) were </w:t>
+        <w:t xml:space="preserve">tidal cycles (2.66 cm ± 0.02) were </w:t>
       </w:r>
       <w:r>
         <w:rPr>
@@ -5143,35 +4594,7 @@
           <w:rFonts w:ascii="Arial" w:hAnsi="Arial" w:cs="Arial"/>
           <w:color w:val="7030A0"/>
         </w:rPr>
-        <w:t xml:space="preserve"> oysters that were fully submerged (</w:t>
-      </w:r>
-      <w:r>
-        <w:rPr>
-          <w:rFonts w:ascii="Arial" w:hAnsi="Arial" w:cs="Arial"/>
-          <w:color w:val="7030A0"/>
-        </w:rPr>
-        <w:t>2.8</w:t>
-      </w:r>
-      <w:r>
-        <w:rPr>
-          <w:rFonts w:ascii="Arial" w:hAnsi="Arial" w:cs="Arial"/>
-          <w:color w:val="7030A0"/>
-        </w:rPr>
-        <w:t>7</w:t>
-      </w:r>
-      <w:r>
-        <w:rPr>
-          <w:rFonts w:ascii="Arial" w:hAnsi="Arial" w:cs="Arial"/>
-          <w:color w:val="7030A0"/>
-        </w:rPr>
-        <w:t xml:space="preserve"> cm ± 0.02</w:t>
-      </w:r>
-      <w:r>
-        <w:rPr>
-          <w:rFonts w:ascii="Arial" w:hAnsi="Arial" w:cs="Arial"/>
-          <w:color w:val="7030A0"/>
-        </w:rPr>
-        <w:t>) during stress hardening</w:t>
+        <w:t xml:space="preserve"> oysters that were fully submerged (2.87 cm ± 0.02) during stress hardening</w:t>
       </w:r>
       <w:r>
         <w:rPr>
@@ -5247,14 +4670,7 @@
           <w:rFonts w:ascii="Arial" w:hAnsi="Arial" w:cs="Arial"/>
           <w:color w:val="7030A0"/>
         </w:rPr>
-        <w:t xml:space="preserve"> temperature </w:t>
-      </w:r>
-      <w:r>
-        <w:rPr>
-          <w:rFonts w:ascii="Arial" w:hAnsi="Arial" w:cs="Arial"/>
-          <w:color w:val="7030A0"/>
-        </w:rPr>
-        <w:t>(</w:t>
+        <w:t xml:space="preserve"> temperature (</w:t>
       </w:r>
       <w:r>
         <w:rPr>
@@ -5314,14 +4730,7 @@
           <w:rFonts w:ascii="Arial" w:hAnsi="Arial" w:cs="Arial"/>
           <w:color w:val="7030A0"/>
         </w:rPr>
-        <w:t>)</w:t>
-      </w:r>
-      <w:r>
-        <w:rPr>
-          <w:rFonts w:ascii="Arial" w:hAnsi="Arial" w:cs="Arial"/>
-          <w:color w:val="7030A0"/>
-        </w:rPr>
-        <w:t xml:space="preserve"> influenced</w:t>
+        <w:t>) influenced</w:t>
       </w:r>
       <w:r>
         <w:rPr>
@@ -5358,14 +4767,7 @@
           <w:rFonts w:ascii="Arial" w:hAnsi="Arial" w:cs="Arial"/>
           <w:color w:val="7030A0"/>
         </w:rPr>
-        <w:t xml:space="preserve">, whereas tide and marine heatwave temperature did not </w:t>
-      </w:r>
-      <w:r>
-        <w:rPr>
-          <w:rFonts w:ascii="Arial" w:hAnsi="Arial" w:cs="Arial"/>
-          <w:color w:val="7030A0"/>
-        </w:rPr>
-        <w:t>(</w:t>
+        <w:t>, whereas tide and marine heatwave temperature did not (</w:t>
       </w:r>
       <w:r>
         <w:rPr>
@@ -5658,14 +5060,7 @@
           <w:rFonts w:ascii="Arial" w:hAnsi="Arial" w:cs="Arial"/>
           <w:color w:val="7030A0"/>
         </w:rPr>
-        <w:t>2</w:t>
-      </w:r>
-      <w:r>
-        <w:rPr>
-          <w:rFonts w:ascii="Arial" w:hAnsi="Arial" w:cs="Arial"/>
-          <w:color w:val="7030A0"/>
-        </w:rPr>
-        <w:t xml:space="preserve">, </w:t>
+        <w:t xml:space="preserve">2, </w:t>
       </w:r>
       <w:r>
         <w:rPr>
@@ -5744,42 +5139,7 @@
           <w:rFonts w:ascii="Arial" w:hAnsi="Arial" w:cs="Arial"/>
           <w:color w:val="7030A0"/>
         </w:rPr>
-        <w:t xml:space="preserve"> </w:t>
-      </w:r>
-      <w:r>
-        <w:rPr>
-          <w:rFonts w:ascii="Arial" w:hAnsi="Arial" w:cs="Arial"/>
-          <w:color w:val="7030A0"/>
-        </w:rPr>
-        <w:t>(</w:t>
-      </w:r>
-      <w:r>
-        <w:rPr>
-          <w:rFonts w:ascii="Arial" w:hAnsi="Arial" w:cs="Arial"/>
-          <w:color w:val="7030A0"/>
-        </w:rPr>
-        <w:t>6</w:t>
-      </w:r>
-      <w:r>
-        <w:rPr>
-          <w:rFonts w:ascii="Arial" w:hAnsi="Arial" w:cs="Arial"/>
-          <w:color w:val="7030A0"/>
-        </w:rPr>
-        <w:t>.</w:t>
-      </w:r>
-      <w:r>
-        <w:rPr>
-          <w:rFonts w:ascii="Arial" w:hAnsi="Arial" w:cs="Arial"/>
-          <w:color w:val="7030A0"/>
-        </w:rPr>
-        <w:t>7</w:t>
-      </w:r>
-      <w:r>
-        <w:rPr>
-          <w:rFonts w:ascii="Arial" w:hAnsi="Arial" w:cs="Arial"/>
-          <w:color w:val="7030A0"/>
-        </w:rPr>
-        <w:t xml:space="preserve">1 </w:t>
+        <w:t xml:space="preserve"> (6.71 </w:t>
       </w:r>
       <w:r>
         <w:rPr>
@@ -5793,21 +5153,7 @@
           <w:rFonts w:ascii="Arial" w:hAnsi="Arial" w:cs="Arial"/>
           <w:color w:val="7030A0"/>
         </w:rPr>
-        <w:t xml:space="preserve"> 0.</w:t>
-      </w:r>
-      <w:r>
-        <w:rPr>
-          <w:rFonts w:ascii="Arial" w:hAnsi="Arial" w:cs="Arial"/>
-          <w:color w:val="7030A0"/>
-        </w:rPr>
-        <w:t>34</w:t>
-      </w:r>
-      <w:r>
-        <w:rPr>
-          <w:rFonts w:ascii="Arial" w:hAnsi="Arial" w:cs="Arial"/>
-          <w:color w:val="7030A0"/>
-        </w:rPr>
-        <w:t>)</w:t>
+        <w:t xml:space="preserve"> 0.34)</w:t>
       </w:r>
       <w:r>
         <w:rPr>
@@ -5870,42 +5216,7 @@
           <w:rFonts w:ascii="Arial" w:hAnsi="Arial" w:cs="Arial"/>
           <w:color w:val="7030A0"/>
         </w:rPr>
-        <w:t xml:space="preserve"> </w:t>
-      </w:r>
-      <w:r>
-        <w:rPr>
-          <w:rFonts w:ascii="Arial" w:hAnsi="Arial" w:cs="Arial"/>
-          <w:color w:val="7030A0"/>
-        </w:rPr>
-        <w:t>(</w:t>
-      </w:r>
-      <w:r>
-        <w:rPr>
-          <w:rFonts w:ascii="Arial" w:hAnsi="Arial" w:cs="Arial"/>
-          <w:color w:val="7030A0"/>
-        </w:rPr>
-        <w:t>5</w:t>
-      </w:r>
-      <w:r>
-        <w:rPr>
-          <w:rFonts w:ascii="Arial" w:hAnsi="Arial" w:cs="Arial"/>
-          <w:color w:val="7030A0"/>
-        </w:rPr>
-        <w:t>.</w:t>
-      </w:r>
-      <w:r>
-        <w:rPr>
-          <w:rFonts w:ascii="Arial" w:hAnsi="Arial" w:cs="Arial"/>
-          <w:color w:val="7030A0"/>
-        </w:rPr>
-        <w:t>67</w:t>
-      </w:r>
-      <w:r>
-        <w:rPr>
-          <w:rFonts w:ascii="Arial" w:hAnsi="Arial" w:cs="Arial"/>
-          <w:color w:val="7030A0"/>
-        </w:rPr>
-        <w:t xml:space="preserve"> </w:t>
+        <w:t xml:space="preserve"> (5.67 </w:t>
       </w:r>
       <w:r>
         <w:rPr>
@@ -5919,21 +5230,7 @@
           <w:rFonts w:ascii="Arial" w:hAnsi="Arial" w:cs="Arial"/>
           <w:color w:val="7030A0"/>
         </w:rPr>
-        <w:t xml:space="preserve"> 0.</w:t>
-      </w:r>
-      <w:r>
-        <w:rPr>
-          <w:rFonts w:ascii="Arial" w:hAnsi="Arial" w:cs="Arial"/>
-          <w:color w:val="7030A0"/>
-        </w:rPr>
-        <w:t>26</w:t>
-      </w:r>
-      <w:r>
-        <w:rPr>
-          <w:rFonts w:ascii="Arial" w:hAnsi="Arial" w:cs="Arial"/>
-          <w:color w:val="7030A0"/>
-        </w:rPr>
-        <w:t>)</w:t>
+        <w:t xml:space="preserve"> 0.26)</w:t>
       </w:r>
       <w:r>
         <w:rPr>
@@ -6058,14 +5355,7 @@
           <w:rFonts w:ascii="Arial" w:hAnsi="Arial" w:cs="Arial"/>
           <w:color w:val="7030A0"/>
         </w:rPr>
-        <w:t>)</w:t>
-      </w:r>
-      <w:r>
-        <w:rPr>
-          <w:rFonts w:ascii="Arial" w:hAnsi="Arial" w:cs="Arial"/>
-          <w:color w:val="7030A0"/>
-        </w:rPr>
-        <w:t xml:space="preserve">. Similarly, for oysters in the </w:t>
+        <w:t xml:space="preserve">). Similarly, for oysters in the </w:t>
       </w:r>
       <w:r>
         <w:rPr>
@@ -6093,14 +5383,7 @@
           <w:rFonts w:ascii="Arial" w:hAnsi="Arial" w:cs="Arial"/>
           <w:color w:val="7030A0"/>
         </w:rPr>
-        <w:t xml:space="preserve"> marine heatwave</w:t>
-      </w:r>
-      <w:r>
-        <w:rPr>
-          <w:rFonts w:ascii="Arial" w:hAnsi="Arial" w:cs="Arial"/>
-          <w:color w:val="7030A0"/>
-        </w:rPr>
-        <w:t xml:space="preserve"> (</w:t>
+        <w:t xml:space="preserve"> marine heatwave (</w:t>
       </w:r>
       <w:r>
         <w:rPr>
@@ -6169,14 +5452,7 @@
           <w:rFonts w:ascii="Arial" w:hAnsi="Arial" w:cs="Arial"/>
           <w:color w:val="7030A0"/>
         </w:rPr>
-        <w:t>)</w:t>
-      </w:r>
-      <w:r>
-        <w:rPr>
-          <w:rFonts w:ascii="Arial" w:hAnsi="Arial" w:cs="Arial"/>
-          <w:color w:val="7030A0"/>
-        </w:rPr>
-        <w:t xml:space="preserve"> varied by </w:t>
+        <w:t xml:space="preserve">) varied by </w:t>
       </w:r>
       <w:r>
         <w:rPr>
@@ -6218,28 +5494,7 @@
           <w:rFonts w:ascii="Arial" w:hAnsi="Arial" w:cs="Arial"/>
           <w:color w:val="7030A0"/>
         </w:rPr>
-        <w:t xml:space="preserve"> </w:t>
-      </w:r>
-      <w:r>
-        <w:rPr>
-          <w:rFonts w:ascii="Arial" w:hAnsi="Arial" w:cs="Arial"/>
-          <w:color w:val="7030A0"/>
-        </w:rPr>
-        <w:t>(</w:t>
-      </w:r>
-      <w:r>
-        <w:rPr>
-          <w:rFonts w:ascii="Arial" w:hAnsi="Arial" w:cs="Arial"/>
-          <w:color w:val="7030A0"/>
-        </w:rPr>
-        <w:t>8.54</w:t>
-      </w:r>
-      <w:r>
-        <w:rPr>
-          <w:rFonts w:ascii="Arial" w:hAnsi="Arial" w:cs="Arial"/>
-          <w:color w:val="7030A0"/>
-        </w:rPr>
-        <w:t xml:space="preserve"> </w:t>
+        <w:t xml:space="preserve"> (8.54 </w:t>
       </w:r>
       <w:r>
         <w:rPr>
@@ -6253,21 +5508,7 @@
           <w:rFonts w:ascii="Arial" w:hAnsi="Arial" w:cs="Arial"/>
           <w:color w:val="7030A0"/>
         </w:rPr>
-        <w:t xml:space="preserve"> 0.</w:t>
-      </w:r>
-      <w:r>
-        <w:rPr>
-          <w:rFonts w:ascii="Arial" w:hAnsi="Arial" w:cs="Arial"/>
-          <w:color w:val="7030A0"/>
-        </w:rPr>
-        <w:t>64</w:t>
-      </w:r>
-      <w:r>
-        <w:rPr>
-          <w:rFonts w:ascii="Arial" w:hAnsi="Arial" w:cs="Arial"/>
-          <w:color w:val="7030A0"/>
-        </w:rPr>
-        <w:t>)</w:t>
+        <w:t xml:space="preserve"> 0.64)</w:t>
       </w:r>
       <w:r>
         <w:rPr>
@@ -6288,28 +5529,7 @@
           <w:rFonts w:ascii="Arial" w:hAnsi="Arial" w:cs="Arial"/>
           <w:color w:val="7030A0"/>
         </w:rPr>
-        <w:t xml:space="preserve"> </w:t>
-      </w:r>
-      <w:r>
-        <w:rPr>
-          <w:rFonts w:ascii="Arial" w:hAnsi="Arial" w:cs="Arial"/>
-          <w:color w:val="7030A0"/>
-        </w:rPr>
-        <w:t>(7.</w:t>
-      </w:r>
-      <w:r>
-        <w:rPr>
-          <w:rFonts w:ascii="Arial" w:hAnsi="Arial" w:cs="Arial"/>
-          <w:color w:val="7030A0"/>
-        </w:rPr>
-        <w:t>47</w:t>
-      </w:r>
-      <w:r>
-        <w:rPr>
-          <w:rFonts w:ascii="Arial" w:hAnsi="Arial" w:cs="Arial"/>
-          <w:color w:val="7030A0"/>
-        </w:rPr>
-        <w:t xml:space="preserve"> </w:t>
+        <w:t xml:space="preserve"> (7.47 </w:t>
       </w:r>
       <w:r>
         <w:rPr>
@@ -6323,21 +5543,7 @@
           <w:rFonts w:ascii="Arial" w:hAnsi="Arial" w:cs="Arial"/>
           <w:color w:val="7030A0"/>
         </w:rPr>
-        <w:t xml:space="preserve"> 0.</w:t>
-      </w:r>
-      <w:r>
-        <w:rPr>
-          <w:rFonts w:ascii="Arial" w:hAnsi="Arial" w:cs="Arial"/>
-          <w:color w:val="7030A0"/>
-        </w:rPr>
-        <w:t>50</w:t>
-      </w:r>
-      <w:r>
-        <w:rPr>
-          <w:rFonts w:ascii="Arial" w:hAnsi="Arial" w:cs="Arial"/>
-          <w:color w:val="7030A0"/>
-        </w:rPr>
-        <w:t>)</w:t>
+        <w:t xml:space="preserve"> 0.50)</w:t>
       </w:r>
       <w:r>
         <w:rPr>
@@ -6362,28 +5568,7 @@
           <w:rFonts w:ascii="Arial" w:hAnsi="Arial" w:cs="Arial"/>
           <w:color w:val="7030A0"/>
         </w:rPr>
-        <w:t xml:space="preserve">While tidal regime during stress hardening </w:t>
-      </w:r>
-      <w:r>
-        <w:rPr>
-          <w:rFonts w:ascii="Arial" w:hAnsi="Arial" w:cs="Arial"/>
-          <w:color w:val="7030A0"/>
-        </w:rPr>
-        <w:t xml:space="preserve">did not </w:t>
-      </w:r>
-      <w:r>
-        <w:rPr>
-          <w:rFonts w:ascii="Arial" w:hAnsi="Arial" w:cs="Arial"/>
-          <w:color w:val="7030A0"/>
-        </w:rPr>
-        <w:t xml:space="preserve">influence CI </w:t>
-      </w:r>
-      <w:r>
-        <w:rPr>
-          <w:rFonts w:ascii="Arial" w:hAnsi="Arial" w:cs="Arial"/>
-          <w:color w:val="7030A0"/>
-        </w:rPr>
-        <w:t>(</w:t>
+        <w:t>While tidal regime during stress hardening did not influence CI (</w:t>
       </w:r>
       <w:r>
         <w:rPr>
@@ -6429,14 +5614,7 @@
           <w:rFonts w:ascii="Arial" w:hAnsi="Arial" w:cs="Arial"/>
           <w:color w:val="7030A0"/>
         </w:rPr>
-        <w:t>)</w:t>
-      </w:r>
-      <w:r>
-        <w:rPr>
-          <w:rFonts w:ascii="Arial" w:hAnsi="Arial" w:cs="Arial"/>
-          <w:color w:val="7030A0"/>
-        </w:rPr>
-        <w:t xml:space="preserve"> in </w:t>
+        <w:t xml:space="preserve">) in </w:t>
       </w:r>
       <w:r>
         <w:rPr>
@@ -6598,14 +5776,7 @@
           <w:rFonts w:ascii="Arial" w:hAnsi="Arial" w:cs="Arial"/>
           <w:color w:val="7030A0"/>
         </w:rPr>
-        <w:t>2</w:t>
-      </w:r>
-      <w:r>
-        <w:rPr>
-          <w:rFonts w:ascii="Arial" w:hAnsi="Arial" w:cs="Arial"/>
-          <w:color w:val="7030A0"/>
-        </w:rPr>
-        <w:t xml:space="preserve">, </w:t>
+        <w:t xml:space="preserve">2, </w:t>
       </w:r>
       <w:r>
         <w:rPr>
@@ -6628,21 +5799,15 @@
           <w:rFonts w:ascii="Arial" w:hAnsi="Arial" w:cs="Arial"/>
           <w:color w:val="7030A0"/>
         </w:rPr>
-        <w:t xml:space="preserve">) </w:t>
-      </w:r>
-      <w:r>
-        <w:rPr>
-          <w:rFonts w:ascii="Arial" w:hAnsi="Arial" w:cs="Arial"/>
-          <w:color w:val="7030A0"/>
-        </w:rPr>
-        <w:t xml:space="preserve">except for </w:t>
-      </w:r>
-      <w:r>
-        <w:rPr>
-          <w:rFonts w:ascii="Arial" w:hAnsi="Arial" w:cs="Arial"/>
-          <w:color w:val="7030A0"/>
-        </w:rPr>
-        <w:t>2</w:t>
+        <w:t>) except for</w:t>
+      </w:r>
+      <w:commentRangeStart w:id="3"/>
+      <w:r>
+        <w:rPr>
+          <w:rFonts w:ascii="Arial" w:hAnsi="Arial" w:cs="Arial"/>
+          <w:color w:val="7030A0"/>
+        </w:rPr>
+        <w:t xml:space="preserve"> 2</w:t>
       </w:r>
       <w:r>
         <w:rPr>
@@ -6656,7 +5821,21 @@
           <w:rFonts w:ascii="Arial" w:hAnsi="Arial" w:cs="Arial"/>
           <w:color w:val="7030A0"/>
         </w:rPr>
-        <w:t xml:space="preserve"> (</w:t>
+        <w:t xml:space="preserve"> </w:t>
+      </w:r>
+      <w:commentRangeEnd w:id="3"/>
+      <w:r>
+        <w:rPr>
+          <w:rStyle w:val="CommentReference"/>
+        </w:rPr>
+        <w:commentReference w:id="3"/>
+      </w:r>
+      <w:r>
+        <w:rPr>
+          <w:rFonts w:ascii="Arial" w:hAnsi="Arial" w:cs="Arial"/>
+          <w:color w:val="7030A0"/>
+        </w:rPr>
+        <w:t>(</w:t>
       </w:r>
       <w:r>
         <w:rPr>
@@ -6679,14 +5858,7 @@
           <w:rFonts w:ascii="Arial" w:hAnsi="Arial" w:cs="Arial"/>
           <w:color w:val="7030A0"/>
         </w:rPr>
-        <w:t>&gt; 0.05</w:t>
-      </w:r>
-      <w:r>
-        <w:rPr>
-          <w:rFonts w:ascii="Arial" w:hAnsi="Arial" w:cs="Arial"/>
-          <w:color w:val="7030A0"/>
-        </w:rPr>
-        <w:t xml:space="preserve">, </w:t>
+        <w:t xml:space="preserve">&gt; 0.05, </w:t>
       </w:r>
       <w:r>
         <w:rPr>
@@ -6781,14 +5953,175 @@
           <w:rFonts w:ascii="Arial" w:hAnsi="Arial" w:cs="Arial"/>
           <w:color w:val="7030A0"/>
         </w:rPr>
-        <w:t>4.</w:t>
-      </w:r>
-      <w:r>
-        <w:rPr>
-          <w:rFonts w:ascii="Arial" w:hAnsi="Arial" w:cs="Arial"/>
-          <w:color w:val="7030A0"/>
-        </w:rPr>
-        <w:t>26</w:t>
+        <w:t xml:space="preserve">4.26 </w:t>
+      </w:r>
+      <w:r>
+        <w:rPr>
+          <w:rFonts w:ascii="Arial" w:hAnsi="Arial" w:cs="Arial"/>
+          <w:color w:val="7030A0"/>
+        </w:rPr>
+        <w:t>±</w:t>
+      </w:r>
+      <w:r>
+        <w:rPr>
+          <w:rFonts w:ascii="Arial" w:hAnsi="Arial" w:cs="Arial"/>
+          <w:color w:val="7030A0"/>
+        </w:rPr>
+        <w:t xml:space="preserve"> 0.07</w:t>
+      </w:r>
+      <w:r>
+        <w:rPr>
+          <w:rFonts w:ascii="Arial" w:hAnsi="Arial" w:cs="Arial"/>
+          <w:color w:val="7030A0"/>
+        </w:rPr>
+        <w:t xml:space="preserve">) had a </w:t>
+      </w:r>
+      <w:r>
+        <w:rPr>
+          <w:rFonts w:ascii="Arial" w:hAnsi="Arial" w:cs="Arial"/>
+          <w:color w:val="7030A0"/>
+        </w:rPr>
+        <w:t>6.1</w:t>
+      </w:r>
+      <w:r>
+        <w:rPr>
+          <w:rFonts w:ascii="Arial" w:hAnsi="Arial" w:cs="Arial"/>
+          <w:color w:val="7030A0"/>
+        </w:rPr>
+        <w:t>% higher CI than their counterparts at 2</w:t>
+      </w:r>
+      <w:r>
+        <w:rPr>
+          <w:rFonts w:ascii="Arial" w:hAnsi="Arial" w:cs="Arial"/>
+          <w:color w:val="7030A0"/>
+        </w:rPr>
+        <w:t>1˚C</w:t>
+      </w:r>
+      <w:r>
+        <w:rPr>
+          <w:rFonts w:ascii="Arial" w:hAnsi="Arial" w:cs="Arial"/>
+          <w:color w:val="7030A0"/>
+        </w:rPr>
+        <w:t xml:space="preserve"> (</w:t>
+      </w:r>
+      <w:r>
+        <w:rPr>
+          <w:rFonts w:ascii="Arial" w:hAnsi="Arial" w:cs="Arial"/>
+          <w:color w:val="7030A0"/>
+        </w:rPr>
+        <w:t xml:space="preserve">4.00 </w:t>
+      </w:r>
+      <w:r>
+        <w:rPr>
+          <w:rFonts w:ascii="Arial" w:hAnsi="Arial" w:cs="Arial"/>
+          <w:color w:val="7030A0"/>
+        </w:rPr>
+        <w:t>±</w:t>
+      </w:r>
+      <w:r>
+        <w:rPr>
+          <w:rFonts w:ascii="Arial" w:hAnsi="Arial" w:cs="Arial"/>
+          <w:color w:val="7030A0"/>
+        </w:rPr>
+        <w:t xml:space="preserve"> 0.07</w:t>
+      </w:r>
+      <w:r>
+        <w:rPr>
+          <w:rFonts w:ascii="Arial" w:hAnsi="Arial" w:cs="Arial"/>
+          <w:color w:val="7030A0"/>
+        </w:rPr>
+        <w:t xml:space="preserve">). And, </w:t>
+      </w:r>
+      <w:r>
+        <w:rPr>
+          <w:rFonts w:ascii="Arial" w:hAnsi="Arial" w:cs="Arial"/>
+          <w:color w:val="7030A0"/>
+        </w:rPr>
+        <w:t xml:space="preserve">oysters in the </w:t>
+      </w:r>
+      <w:r>
+        <w:rPr>
+          <w:rFonts w:ascii="Arial" w:hAnsi="Arial" w:cs="Arial"/>
+          <w:color w:val="7030A0"/>
+        </w:rPr>
+        <w:t>1</w:t>
+      </w:r>
+      <w:r>
+        <w:rPr>
+          <w:rFonts w:ascii="Arial" w:hAnsi="Arial" w:cs="Arial"/>
+          <w:color w:val="7030A0"/>
+        </w:rPr>
+        <w:t>5</w:t>
+      </w:r>
+      <w:r>
+        <w:rPr>
+          <w:rFonts w:ascii="Arial" w:hAnsi="Arial" w:cs="Arial"/>
+          <w:color w:val="7030A0"/>
+        </w:rPr>
+        <w:t>˚C</w:t>
+      </w:r>
+      <w:r>
+        <w:rPr>
+          <w:rFonts w:ascii="Arial" w:hAnsi="Arial" w:cs="Arial"/>
+          <w:color w:val="7030A0"/>
+        </w:rPr>
+        <w:t xml:space="preserve"> marine heatwave were had the greatest CI (4.41 </w:t>
+      </w:r>
+      <w:r>
+        <w:rPr>
+          <w:rFonts w:ascii="Arial" w:hAnsi="Arial" w:cs="Arial"/>
+          <w:color w:val="7030A0"/>
+        </w:rPr>
+        <w:t>±</w:t>
+      </w:r>
+      <w:r>
+        <w:rPr>
+          <w:rFonts w:ascii="Arial" w:hAnsi="Arial" w:cs="Arial"/>
+          <w:color w:val="7030A0"/>
+        </w:rPr>
+        <w:t xml:space="preserve"> 0.10)</w:t>
+      </w:r>
+      <w:r>
+        <w:rPr>
+          <w:rFonts w:ascii="Arial" w:hAnsi="Arial" w:cs="Arial"/>
+          <w:color w:val="7030A0"/>
+        </w:rPr>
+        <w:t xml:space="preserve">, while those in the </w:t>
+      </w:r>
+      <w:r>
+        <w:rPr>
+          <w:rFonts w:ascii="Arial" w:hAnsi="Arial" w:cs="Arial"/>
+          <w:color w:val="7030A0"/>
+        </w:rPr>
+        <w:t>1</w:t>
+      </w:r>
+      <w:r>
+        <w:rPr>
+          <w:rFonts w:ascii="Arial" w:hAnsi="Arial" w:cs="Arial"/>
+          <w:color w:val="7030A0"/>
+        </w:rPr>
+        <w:t>8</w:t>
+      </w:r>
+      <w:r>
+        <w:rPr>
+          <w:rFonts w:ascii="Arial" w:hAnsi="Arial" w:cs="Arial"/>
+          <w:color w:val="7030A0"/>
+        </w:rPr>
+        <w:t>˚C</w:t>
+      </w:r>
+      <w:r>
+        <w:rPr>
+          <w:rFonts w:ascii="Arial" w:hAnsi="Arial" w:cs="Arial"/>
+          <w:color w:val="7030A0"/>
+        </w:rPr>
+        <w:t xml:space="preserve"> (4.</w:t>
+      </w:r>
+      <w:r>
+        <w:rPr>
+          <w:rFonts w:ascii="Arial" w:hAnsi="Arial" w:cs="Arial"/>
+          <w:color w:val="7030A0"/>
+        </w:rPr>
+        <w:t>08</w:t>
       </w:r>
       <w:r>
         <w:rPr>
@@ -6809,14 +6142,63 @@
           <w:rFonts w:ascii="Arial" w:hAnsi="Arial" w:cs="Arial"/>
           <w:color w:val="7030A0"/>
         </w:rPr>
-        <w:t xml:space="preserve"> 0.0</w:t>
-      </w:r>
-      <w:r>
-        <w:rPr>
-          <w:rFonts w:ascii="Arial" w:hAnsi="Arial" w:cs="Arial"/>
-          <w:color w:val="7030A0"/>
-        </w:rPr>
-        <w:t>7</w:t>
+        <w:t xml:space="preserve"> 0.10)</w:t>
+      </w:r>
+      <w:r>
+        <w:rPr>
+          <w:rFonts w:ascii="Arial" w:hAnsi="Arial" w:cs="Arial"/>
+          <w:color w:val="7030A0"/>
+        </w:rPr>
+        <w:t>, 2</w:t>
+      </w:r>
+      <w:r>
+        <w:rPr>
+          <w:rFonts w:ascii="Arial" w:hAnsi="Arial" w:cs="Arial"/>
+          <w:color w:val="7030A0"/>
+        </w:rPr>
+        <w:t>1˚C</w:t>
+      </w:r>
+      <w:r>
+        <w:rPr>
+          <w:rFonts w:ascii="Arial" w:hAnsi="Arial" w:cs="Arial"/>
+          <w:color w:val="7030A0"/>
+        </w:rPr>
+        <w:t xml:space="preserve"> (4.</w:t>
+      </w:r>
+      <w:r>
+        <w:rPr>
+          <w:rFonts w:ascii="Arial" w:hAnsi="Arial" w:cs="Arial"/>
+          <w:color w:val="7030A0"/>
+        </w:rPr>
+        <w:t>2</w:t>
+      </w:r>
+      <w:r>
+        <w:rPr>
+          <w:rFonts w:ascii="Arial" w:hAnsi="Arial" w:cs="Arial"/>
+          <w:color w:val="7030A0"/>
+        </w:rPr>
+        <w:t xml:space="preserve">1 </w:t>
+      </w:r>
+      <w:r>
+        <w:rPr>
+          <w:rFonts w:ascii="Arial" w:hAnsi="Arial" w:cs="Arial"/>
+          <w:color w:val="7030A0"/>
+        </w:rPr>
+        <w:t>±</w:t>
+      </w:r>
+      <w:r>
+        <w:rPr>
+          <w:rFonts w:ascii="Arial" w:hAnsi="Arial" w:cs="Arial"/>
+          <w:color w:val="7030A0"/>
+        </w:rPr>
+        <w:t xml:space="preserve"> 0.1</w:t>
+      </w:r>
+      <w:r>
+        <w:rPr>
+          <w:rFonts w:ascii="Arial" w:hAnsi="Arial" w:cs="Arial"/>
+          <w:color w:val="7030A0"/>
+        </w:rPr>
+        <w:t>2</w:t>
       </w:r>
       <w:r>
         <w:rPr>
@@ -6830,42 +6212,14 @@
           <w:rFonts w:ascii="Arial" w:hAnsi="Arial" w:cs="Arial"/>
           <w:color w:val="7030A0"/>
         </w:rPr>
-        <w:t xml:space="preserve"> </w:t>
-      </w:r>
-      <w:r>
-        <w:rPr>
-          <w:rFonts w:ascii="Arial" w:hAnsi="Arial" w:cs="Arial"/>
-          <w:color w:val="7030A0"/>
-        </w:rPr>
-        <w:t xml:space="preserve">had a </w:t>
-      </w:r>
-      <w:r>
-        <w:rPr>
-          <w:rFonts w:ascii="Arial" w:hAnsi="Arial" w:cs="Arial"/>
-          <w:color w:val="7030A0"/>
-        </w:rPr>
-        <w:t>6.1</w:t>
-      </w:r>
-      <w:r>
-        <w:rPr>
-          <w:rFonts w:ascii="Arial" w:hAnsi="Arial" w:cs="Arial"/>
-          <w:color w:val="7030A0"/>
-        </w:rPr>
-        <w:t xml:space="preserve">% higher CI than their counterparts at </w:t>
-      </w:r>
-      <w:r>
-        <w:rPr>
-          <w:rFonts w:ascii="Arial" w:hAnsi="Arial" w:cs="Arial"/>
-          <w:color w:val="7030A0"/>
-        </w:rPr>
-        <w:t>2</w:t>
-      </w:r>
-      <w:r>
-        <w:rPr>
-          <w:rFonts w:ascii="Arial" w:hAnsi="Arial" w:cs="Arial"/>
-          <w:color w:val="7030A0"/>
-        </w:rPr>
-        <w:t>1˚C</w:t>
+        <w:t>, and 24</w:t>
+      </w:r>
+      <w:r>
+        <w:rPr>
+          <w:rFonts w:ascii="Arial" w:hAnsi="Arial" w:cs="Arial"/>
+          <w:color w:val="7030A0"/>
+        </w:rPr>
+        <w:t>˚C</w:t>
       </w:r>
       <w:r>
         <w:rPr>
@@ -6873,300 +6227,6 @@
           <w:color w:val="7030A0"/>
         </w:rPr>
         <w:t xml:space="preserve"> (</w:t>
-      </w:r>
-      <w:r>
-        <w:rPr>
-          <w:rFonts w:ascii="Arial" w:hAnsi="Arial" w:cs="Arial"/>
-          <w:color w:val="7030A0"/>
-        </w:rPr>
-        <w:t>4.</w:t>
-      </w:r>
-      <w:r>
-        <w:rPr>
-          <w:rFonts w:ascii="Arial" w:hAnsi="Arial" w:cs="Arial"/>
-          <w:color w:val="7030A0"/>
-        </w:rPr>
-        <w:t>00</w:t>
-      </w:r>
-      <w:r>
-        <w:rPr>
-          <w:rFonts w:ascii="Arial" w:hAnsi="Arial" w:cs="Arial"/>
-          <w:color w:val="7030A0"/>
-        </w:rPr>
-        <w:t xml:space="preserve"> </w:t>
-      </w:r>
-      <w:r>
-        <w:rPr>
-          <w:rFonts w:ascii="Arial" w:hAnsi="Arial" w:cs="Arial"/>
-          <w:color w:val="7030A0"/>
-        </w:rPr>
-        <w:t>±</w:t>
-      </w:r>
-      <w:r>
-        <w:rPr>
-          <w:rFonts w:ascii="Arial" w:hAnsi="Arial" w:cs="Arial"/>
-          <w:color w:val="7030A0"/>
-        </w:rPr>
-        <w:t xml:space="preserve"> 0.</w:t>
-      </w:r>
-      <w:r>
-        <w:rPr>
-          <w:rFonts w:ascii="Arial" w:hAnsi="Arial" w:cs="Arial"/>
-          <w:color w:val="7030A0"/>
-        </w:rPr>
-        <w:t>07</w:t>
-      </w:r>
-      <w:r>
-        <w:rPr>
-          <w:rFonts w:ascii="Arial" w:hAnsi="Arial" w:cs="Arial"/>
-          <w:color w:val="7030A0"/>
-        </w:rPr>
-        <w:t xml:space="preserve">). And, </w:t>
-      </w:r>
-      <w:r>
-        <w:rPr>
-          <w:rFonts w:ascii="Arial" w:hAnsi="Arial" w:cs="Arial"/>
-          <w:color w:val="7030A0"/>
-        </w:rPr>
-        <w:t xml:space="preserve">oysters in the </w:t>
-      </w:r>
-      <w:r>
-        <w:rPr>
-          <w:rFonts w:ascii="Arial" w:hAnsi="Arial" w:cs="Arial"/>
-          <w:color w:val="7030A0"/>
-        </w:rPr>
-        <w:t>1</w:t>
-      </w:r>
-      <w:r>
-        <w:rPr>
-          <w:rFonts w:ascii="Arial" w:hAnsi="Arial" w:cs="Arial"/>
-          <w:color w:val="7030A0"/>
-        </w:rPr>
-        <w:t>5</w:t>
-      </w:r>
-      <w:r>
-        <w:rPr>
-          <w:rFonts w:ascii="Arial" w:hAnsi="Arial" w:cs="Arial"/>
-          <w:color w:val="7030A0"/>
-        </w:rPr>
-        <w:t>˚C</w:t>
-      </w:r>
-      <w:r>
-        <w:rPr>
-          <w:rFonts w:ascii="Arial" w:hAnsi="Arial" w:cs="Arial"/>
-          <w:color w:val="7030A0"/>
-        </w:rPr>
-        <w:t xml:space="preserve"> marine heatwave were had the greatest CI (4</w:t>
-      </w:r>
-      <w:r>
-        <w:rPr>
-          <w:rFonts w:ascii="Arial" w:hAnsi="Arial" w:cs="Arial"/>
-          <w:color w:val="7030A0"/>
-        </w:rPr>
-        <w:t>.</w:t>
-      </w:r>
-      <w:r>
-        <w:rPr>
-          <w:rFonts w:ascii="Arial" w:hAnsi="Arial" w:cs="Arial"/>
-          <w:color w:val="7030A0"/>
-        </w:rPr>
-        <w:t>4</w:t>
-      </w:r>
-      <w:r>
-        <w:rPr>
-          <w:rFonts w:ascii="Arial" w:hAnsi="Arial" w:cs="Arial"/>
-          <w:color w:val="7030A0"/>
-        </w:rPr>
-        <w:t xml:space="preserve">1 </w:t>
-      </w:r>
-      <w:r>
-        <w:rPr>
-          <w:rFonts w:ascii="Arial" w:hAnsi="Arial" w:cs="Arial"/>
-          <w:color w:val="7030A0"/>
-        </w:rPr>
-        <w:t>±</w:t>
-      </w:r>
-      <w:r>
-        <w:rPr>
-          <w:rFonts w:ascii="Arial" w:hAnsi="Arial" w:cs="Arial"/>
-          <w:color w:val="7030A0"/>
-        </w:rPr>
-        <w:t xml:space="preserve"> 0.1</w:t>
-      </w:r>
-      <w:r>
-        <w:rPr>
-          <w:rFonts w:ascii="Arial" w:hAnsi="Arial" w:cs="Arial"/>
-          <w:color w:val="7030A0"/>
-        </w:rPr>
-        <w:t>0)</w:t>
-      </w:r>
-      <w:r>
-        <w:rPr>
-          <w:rFonts w:ascii="Arial" w:hAnsi="Arial" w:cs="Arial"/>
-          <w:color w:val="7030A0"/>
-        </w:rPr>
-        <w:t xml:space="preserve">, while those in the </w:t>
-      </w:r>
-      <w:r>
-        <w:rPr>
-          <w:rFonts w:ascii="Arial" w:hAnsi="Arial" w:cs="Arial"/>
-          <w:color w:val="7030A0"/>
-        </w:rPr>
-        <w:t>1</w:t>
-      </w:r>
-      <w:r>
-        <w:rPr>
-          <w:rFonts w:ascii="Arial" w:hAnsi="Arial" w:cs="Arial"/>
-          <w:color w:val="7030A0"/>
-        </w:rPr>
-        <w:t>8</w:t>
-      </w:r>
-      <w:r>
-        <w:rPr>
-          <w:rFonts w:ascii="Arial" w:hAnsi="Arial" w:cs="Arial"/>
-          <w:color w:val="7030A0"/>
-        </w:rPr>
-        <w:t>˚C</w:t>
-      </w:r>
-      <w:r>
-        <w:rPr>
-          <w:rFonts w:ascii="Arial" w:hAnsi="Arial" w:cs="Arial"/>
-          <w:color w:val="7030A0"/>
-        </w:rPr>
-        <w:t xml:space="preserve"> </w:t>
-      </w:r>
-      <w:r>
-        <w:rPr>
-          <w:rFonts w:ascii="Arial" w:hAnsi="Arial" w:cs="Arial"/>
-          <w:color w:val="7030A0"/>
-        </w:rPr>
-        <w:t>(4.</w:t>
-      </w:r>
-      <w:r>
-        <w:rPr>
-          <w:rFonts w:ascii="Arial" w:hAnsi="Arial" w:cs="Arial"/>
-          <w:color w:val="7030A0"/>
-        </w:rPr>
-        <w:t>08</w:t>
-      </w:r>
-      <w:r>
-        <w:rPr>
-          <w:rFonts w:ascii="Arial" w:hAnsi="Arial" w:cs="Arial"/>
-          <w:color w:val="7030A0"/>
-        </w:rPr>
-        <w:t xml:space="preserve"> </w:t>
-      </w:r>
-      <w:r>
-        <w:rPr>
-          <w:rFonts w:ascii="Arial" w:hAnsi="Arial" w:cs="Arial"/>
-          <w:color w:val="7030A0"/>
-        </w:rPr>
-        <w:t>±</w:t>
-      </w:r>
-      <w:r>
-        <w:rPr>
-          <w:rFonts w:ascii="Arial" w:hAnsi="Arial" w:cs="Arial"/>
-          <w:color w:val="7030A0"/>
-        </w:rPr>
-        <w:t xml:space="preserve"> 0.10)</w:t>
-      </w:r>
-      <w:r>
-        <w:rPr>
-          <w:rFonts w:ascii="Arial" w:hAnsi="Arial" w:cs="Arial"/>
-          <w:color w:val="7030A0"/>
-        </w:rPr>
-        <w:t>, 2</w:t>
-      </w:r>
-      <w:r>
-        <w:rPr>
-          <w:rFonts w:ascii="Arial" w:hAnsi="Arial" w:cs="Arial"/>
-          <w:color w:val="7030A0"/>
-        </w:rPr>
-        <w:t>1˚C</w:t>
-      </w:r>
-      <w:r>
-        <w:rPr>
-          <w:rFonts w:ascii="Arial" w:hAnsi="Arial" w:cs="Arial"/>
-          <w:color w:val="7030A0"/>
-        </w:rPr>
-        <w:t xml:space="preserve"> </w:t>
-      </w:r>
-      <w:r>
-        <w:rPr>
-          <w:rFonts w:ascii="Arial" w:hAnsi="Arial" w:cs="Arial"/>
-          <w:color w:val="7030A0"/>
-        </w:rPr>
-        <w:t>(4.</w:t>
-      </w:r>
-      <w:r>
-        <w:rPr>
-          <w:rFonts w:ascii="Arial" w:hAnsi="Arial" w:cs="Arial"/>
-          <w:color w:val="7030A0"/>
-        </w:rPr>
-        <w:t>2</w:t>
-      </w:r>
-      <w:r>
-        <w:rPr>
-          <w:rFonts w:ascii="Arial" w:hAnsi="Arial" w:cs="Arial"/>
-          <w:color w:val="7030A0"/>
-        </w:rPr>
-        <w:t xml:space="preserve">1 </w:t>
-      </w:r>
-      <w:r>
-        <w:rPr>
-          <w:rFonts w:ascii="Arial" w:hAnsi="Arial" w:cs="Arial"/>
-          <w:color w:val="7030A0"/>
-        </w:rPr>
-        <w:t>±</w:t>
-      </w:r>
-      <w:r>
-        <w:rPr>
-          <w:rFonts w:ascii="Arial" w:hAnsi="Arial" w:cs="Arial"/>
-          <w:color w:val="7030A0"/>
-        </w:rPr>
-        <w:t xml:space="preserve"> 0.1</w:t>
-      </w:r>
-      <w:r>
-        <w:rPr>
-          <w:rFonts w:ascii="Arial" w:hAnsi="Arial" w:cs="Arial"/>
-          <w:color w:val="7030A0"/>
-        </w:rPr>
-        <w:t>2</w:t>
-      </w:r>
-      <w:r>
-        <w:rPr>
-          <w:rFonts w:ascii="Arial" w:hAnsi="Arial" w:cs="Arial"/>
-          <w:color w:val="7030A0"/>
-        </w:rPr>
-        <w:t>)</w:t>
-      </w:r>
-      <w:r>
-        <w:rPr>
-          <w:rFonts w:ascii="Arial" w:hAnsi="Arial" w:cs="Arial"/>
-          <w:color w:val="7030A0"/>
-        </w:rPr>
-        <w:t>, and 24</w:t>
-      </w:r>
-      <w:r>
-        <w:rPr>
-          <w:rFonts w:ascii="Arial" w:hAnsi="Arial" w:cs="Arial"/>
-          <w:color w:val="7030A0"/>
-        </w:rPr>
-        <w:t>˚C</w:t>
-      </w:r>
-      <w:r>
-        <w:rPr>
-          <w:rFonts w:ascii="Arial" w:hAnsi="Arial" w:cs="Arial"/>
-          <w:color w:val="7030A0"/>
-        </w:rPr>
-        <w:t xml:space="preserve"> </w:t>
-      </w:r>
-      <w:r>
-        <w:rPr>
-          <w:rFonts w:ascii="Arial" w:hAnsi="Arial" w:cs="Arial"/>
-          <w:color w:val="7030A0"/>
-        </w:rPr>
-        <w:t>(</w:t>
       </w:r>
       <w:r>
         <w:rPr>
@@ -7312,14 +6372,7 @@
           <w:rFonts w:ascii="Arial" w:hAnsi="Arial" w:cs="Arial"/>
           <w:color w:val="7030A0"/>
         </w:rPr>
-        <w:t>1</w:t>
-      </w:r>
-      <w:r>
-        <w:rPr>
-          <w:rFonts w:ascii="Arial" w:hAnsi="Arial" w:cs="Arial"/>
-          <w:color w:val="7030A0"/>
-        </w:rPr>
-        <w:t xml:space="preserve">, </w:t>
+        <w:t xml:space="preserve">1, </w:t>
       </w:r>
       <w:r>
         <w:rPr>
@@ -7379,14 +6432,7 @@
           <w:rFonts w:ascii="Arial" w:hAnsi="Arial" w:cs="Arial"/>
           <w:color w:val="7030A0"/>
         </w:rPr>
-        <w:t>1</w:t>
-      </w:r>
-      <w:r>
-        <w:rPr>
-          <w:rFonts w:ascii="Arial" w:hAnsi="Arial" w:cs="Arial"/>
-          <w:color w:val="7030A0"/>
-        </w:rPr>
-        <w:t xml:space="preserve">, </w:t>
+        <w:t xml:space="preserve">1, </w:t>
       </w:r>
       <w:r>
         <w:rPr>
@@ -7541,28 +6587,7 @@
           <w:rFonts w:ascii="Arial" w:hAnsi="Arial" w:cs="Arial"/>
           <w:color w:val="7030A0"/>
         </w:rPr>
-        <w:t>3</w:t>
-      </w:r>
-      <w:r>
-        <w:rPr>
-          <w:rFonts w:ascii="Arial" w:hAnsi="Arial" w:cs="Arial"/>
-          <w:color w:val="7030A0"/>
-        </w:rPr>
-        <w:t>.</w:t>
-      </w:r>
-      <w:r>
-        <w:rPr>
-          <w:rFonts w:ascii="Arial" w:hAnsi="Arial" w:cs="Arial"/>
-          <w:color w:val="7030A0"/>
-        </w:rPr>
-        <w:t>57</w:t>
-      </w:r>
-      <w:r>
-        <w:rPr>
-          <w:rFonts w:ascii="Arial" w:hAnsi="Arial" w:cs="Arial"/>
-          <w:color w:val="7030A0"/>
-        </w:rPr>
-        <w:t xml:space="preserve"> </w:t>
+        <w:t xml:space="preserve">3.57 </w:t>
       </w:r>
       <w:r>
         <w:rPr>
@@ -7576,14 +6601,7 @@
           <w:rFonts w:ascii="Arial" w:hAnsi="Arial" w:cs="Arial"/>
           <w:color w:val="7030A0"/>
         </w:rPr>
-        <w:t xml:space="preserve"> 0.0</w:t>
-      </w:r>
-      <w:r>
-        <w:rPr>
-          <w:rFonts w:ascii="Arial" w:hAnsi="Arial" w:cs="Arial"/>
-          <w:color w:val="7030A0"/>
-        </w:rPr>
-        <w:t>4</w:t>
+        <w:t xml:space="preserve"> 0.04</w:t>
       </w:r>
       <w:r>
         <w:rPr>
@@ -7611,28 +6629,7 @@
           <w:rFonts w:ascii="Arial" w:hAnsi="Arial" w:cs="Arial"/>
           <w:color w:val="7030A0"/>
         </w:rPr>
-        <w:t xml:space="preserve"> (3</w:t>
-      </w:r>
-      <w:r>
-        <w:rPr>
-          <w:rFonts w:ascii="Arial" w:hAnsi="Arial" w:cs="Arial"/>
-          <w:color w:val="7030A0"/>
-        </w:rPr>
-        <w:t>.</w:t>
-      </w:r>
-      <w:r>
-        <w:rPr>
-          <w:rFonts w:ascii="Arial" w:hAnsi="Arial" w:cs="Arial"/>
-          <w:color w:val="7030A0"/>
-        </w:rPr>
-        <w:t>97</w:t>
-      </w:r>
-      <w:r>
-        <w:rPr>
-          <w:rFonts w:ascii="Arial" w:hAnsi="Arial" w:cs="Arial"/>
-          <w:color w:val="7030A0"/>
-        </w:rPr>
-        <w:t xml:space="preserve"> </w:t>
+        <w:t xml:space="preserve"> (3.97 </w:t>
       </w:r>
       <w:r>
         <w:rPr>
@@ -7646,14 +6643,7 @@
           <w:rFonts w:ascii="Arial" w:hAnsi="Arial" w:cs="Arial"/>
           <w:color w:val="7030A0"/>
         </w:rPr>
-        <w:t xml:space="preserve"> 0.0</w:t>
-      </w:r>
-      <w:r>
-        <w:rPr>
-          <w:rFonts w:ascii="Arial" w:hAnsi="Arial" w:cs="Arial"/>
-          <w:color w:val="7030A0"/>
-        </w:rPr>
-        <w:t>8)</w:t>
+        <w:t xml:space="preserve"> 0.08)</w:t>
       </w:r>
       <w:r>
         <w:rPr>
@@ -7718,21 +6708,7 @@
           <w:rFonts w:ascii="Arial" w:hAnsi="Arial" w:cs="Arial"/>
           <w:color w:val="7030A0"/>
         </w:rPr>
-        <w:t xml:space="preserve"> marine heatwave</w:t>
-      </w:r>
-      <w:r>
-        <w:rPr>
-          <w:rFonts w:ascii="Arial" w:hAnsi="Arial" w:cs="Arial"/>
-          <w:color w:val="7030A0"/>
-        </w:rPr>
-        <w:t xml:space="preserve"> (</w:t>
-      </w:r>
-      <w:r>
-        <w:rPr>
-          <w:rFonts w:ascii="Arial" w:hAnsi="Arial" w:cs="Arial"/>
-          <w:color w:val="7030A0"/>
-        </w:rPr>
-        <w:t>4.1</w:t>
+        <w:t xml:space="preserve"> marine heatwave (4.1</w:t>
       </w:r>
       <w:r>
         <w:rPr>
@@ -13174,15 +12150,7 @@
                 <w:b/>
                 <w:bCs/>
               </w:rPr>
-              <w:t>0.0</w:t>
-            </w:r>
-            <w:r>
-              <w:rPr>
-                <w:rFonts w:ascii="Arial" w:hAnsi="Arial" w:cs="Arial"/>
-                <w:b/>
-                <w:bCs/>
-              </w:rPr>
-              <w:t>24</w:t>
+              <w:t>0.024</w:t>
             </w:r>
           </w:p>
         </w:tc>
@@ -17414,15 +16382,7 @@
                 <w:b/>
                 <w:bCs/>
               </w:rPr>
-              <w:t>SH</w:t>
-            </w:r>
-            <w:r>
-              <w:rPr>
-                <w:rFonts w:ascii="Arial" w:hAnsi="Arial" w:cs="Arial"/>
-                <w:b/>
-                <w:bCs/>
-              </w:rPr>
-              <w:t xml:space="preserve"> Comparison</w:t>
+              <w:t>SH Comparison</w:t>
             </w:r>
           </w:p>
         </w:tc>
@@ -17755,14 +16715,7 @@
                 <w:rFonts w:ascii="Arial" w:hAnsi="Arial" w:cs="Arial"/>
                 <w:color w:val="000000" w:themeColor="text1"/>
               </w:rPr>
-              <w:t>3.34</w:t>
-            </w:r>
-            <w:r>
-              <w:rPr>
-                <w:rFonts w:ascii="Arial" w:hAnsi="Arial" w:cs="Arial"/>
-                <w:color w:val="000000" w:themeColor="text1"/>
-              </w:rPr>
-              <w:t>4</w:t>
+              <w:t>3.344</w:t>
             </w:r>
           </w:p>
         </w:tc>
@@ -17985,50 +16938,29 @@
                 <w:rFonts w:ascii="Arial" w:hAnsi="Arial" w:cs="Arial"/>
                 <w:color w:val="000000" w:themeColor="text1"/>
               </w:rPr>
-              <w:t>-</w:t>
-            </w:r>
-            <w:r>
+              <w:t>-0.004</w:t>
+            </w:r>
+          </w:p>
+        </w:tc>
+        <w:tc>
+          <w:tcPr>
+            <w:tcW w:w="805" w:type="dxa"/>
+            <w:vAlign w:val="center"/>
+          </w:tcPr>
+          <w:p>
+            <w:pPr>
+              <w:jc w:val="center"/>
               <w:rPr>
                 <w:rFonts w:ascii="Arial" w:hAnsi="Arial" w:cs="Arial"/>
                 <w:color w:val="000000" w:themeColor="text1"/>
               </w:rPr>
-              <w:t>0.</w:t>
-            </w:r>
+            </w:pPr>
             <w:r>
               <w:rPr>
                 <w:rFonts w:ascii="Arial" w:hAnsi="Arial" w:cs="Arial"/>
                 <w:color w:val="000000" w:themeColor="text1"/>
               </w:rPr>
-              <w:t>004</w:t>
-            </w:r>
-          </w:p>
-        </w:tc>
-        <w:tc>
-          <w:tcPr>
-            <w:tcW w:w="805" w:type="dxa"/>
-            <w:vAlign w:val="center"/>
-          </w:tcPr>
-          <w:p>
-            <w:pPr>
-              <w:jc w:val="center"/>
-              <w:rPr>
-                <w:rFonts w:ascii="Arial" w:hAnsi="Arial" w:cs="Arial"/>
-                <w:color w:val="000000" w:themeColor="text1"/>
-              </w:rPr>
-            </w:pPr>
-            <w:r>
-              <w:rPr>
-                <w:rFonts w:ascii="Arial" w:hAnsi="Arial" w:cs="Arial"/>
-                <w:color w:val="000000" w:themeColor="text1"/>
-              </w:rPr>
-              <w:t>0.</w:t>
-            </w:r>
-            <w:r>
-              <w:rPr>
-                <w:rFonts w:ascii="Arial" w:hAnsi="Arial" w:cs="Arial"/>
-                <w:color w:val="000000" w:themeColor="text1"/>
-              </w:rPr>
-              <w:t>99</w:t>
+              <w:t>0.99</w:t>
             </w:r>
             <w:r>
               <w:rPr>
@@ -18125,13 +17057,7 @@
               <w:rPr>
                 <w:rFonts w:ascii="Arial" w:hAnsi="Arial" w:cs="Arial"/>
               </w:rPr>
-              <w:t>2</w:t>
-            </w:r>
-            <w:r>
-              <w:rPr>
-                <w:rFonts w:ascii="Arial" w:hAnsi="Arial" w:cs="Arial"/>
-              </w:rPr>
-              <w:t>1</w:t>
+              <w:t>21</w:t>
             </w:r>
             <w:r>
               <w:rPr>
@@ -18239,57 +17165,29 @@
                 <w:rFonts w:ascii="Arial" w:hAnsi="Arial" w:cs="Arial"/>
                 <w:color w:val="000000" w:themeColor="text1"/>
               </w:rPr>
-              <w:t>-</w:t>
-            </w:r>
-            <w:r>
+              <w:t>-0.414</w:t>
+            </w:r>
+          </w:p>
+        </w:tc>
+        <w:tc>
+          <w:tcPr>
+            <w:tcW w:w="805" w:type="dxa"/>
+            <w:vAlign w:val="center"/>
+          </w:tcPr>
+          <w:p>
+            <w:pPr>
+              <w:jc w:val="center"/>
               <w:rPr>
                 <w:rFonts w:ascii="Arial" w:hAnsi="Arial" w:cs="Arial"/>
                 <w:color w:val="000000" w:themeColor="text1"/>
               </w:rPr>
-              <w:t>0</w:t>
-            </w:r>
+            </w:pPr>
             <w:r>
               <w:rPr>
                 <w:rFonts w:ascii="Arial" w:hAnsi="Arial" w:cs="Arial"/>
                 <w:color w:val="000000" w:themeColor="text1"/>
               </w:rPr>
-              <w:t>.</w:t>
-            </w:r>
-            <w:r>
-              <w:rPr>
-                <w:rFonts w:ascii="Arial" w:hAnsi="Arial" w:cs="Arial"/>
-                <w:color w:val="000000" w:themeColor="text1"/>
-              </w:rPr>
-              <w:t>414</w:t>
-            </w:r>
-          </w:p>
-        </w:tc>
-        <w:tc>
-          <w:tcPr>
-            <w:tcW w:w="805" w:type="dxa"/>
-            <w:vAlign w:val="center"/>
-          </w:tcPr>
-          <w:p>
-            <w:pPr>
-              <w:jc w:val="center"/>
-              <w:rPr>
-                <w:rFonts w:ascii="Arial" w:hAnsi="Arial" w:cs="Arial"/>
-                <w:color w:val="000000" w:themeColor="text1"/>
-              </w:rPr>
-            </w:pPr>
-            <w:r>
-              <w:rPr>
-                <w:rFonts w:ascii="Arial" w:hAnsi="Arial" w:cs="Arial"/>
-                <w:color w:val="000000" w:themeColor="text1"/>
-              </w:rPr>
-              <w:t>0.</w:t>
-            </w:r>
-            <w:r>
-              <w:rPr>
-                <w:rFonts w:ascii="Arial" w:hAnsi="Arial" w:cs="Arial"/>
-                <w:color w:val="000000" w:themeColor="text1"/>
-              </w:rPr>
-              <w:t>67</w:t>
+              <w:t>0.67</w:t>
             </w:r>
             <w:r>
               <w:rPr>
@@ -18506,43 +17404,29 @@
                 <w:rFonts w:ascii="Arial" w:hAnsi="Arial" w:cs="Arial"/>
                 <w:color w:val="000000" w:themeColor="text1"/>
               </w:rPr>
-              <w:t>1.</w:t>
-            </w:r>
-            <w:r>
+              <w:t>1.663</w:t>
+            </w:r>
+          </w:p>
+        </w:tc>
+        <w:tc>
+          <w:tcPr>
+            <w:tcW w:w="805" w:type="dxa"/>
+            <w:vAlign w:val="center"/>
+          </w:tcPr>
+          <w:p>
+            <w:pPr>
+              <w:jc w:val="center"/>
               <w:rPr>
                 <w:rFonts w:ascii="Arial" w:hAnsi="Arial" w:cs="Arial"/>
                 <w:color w:val="000000" w:themeColor="text1"/>
               </w:rPr>
-              <w:t>663</w:t>
-            </w:r>
-          </w:p>
-        </w:tc>
-        <w:tc>
-          <w:tcPr>
-            <w:tcW w:w="805" w:type="dxa"/>
-            <w:vAlign w:val="center"/>
-          </w:tcPr>
-          <w:p>
-            <w:pPr>
-              <w:jc w:val="center"/>
+            </w:pPr>
+            <w:r>
               <w:rPr>
                 <w:rFonts w:ascii="Arial" w:hAnsi="Arial" w:cs="Arial"/>
                 <w:color w:val="000000" w:themeColor="text1"/>
               </w:rPr>
-            </w:pPr>
-            <w:r>
-              <w:rPr>
-                <w:rFonts w:ascii="Arial" w:hAnsi="Arial" w:cs="Arial"/>
-                <w:color w:val="000000" w:themeColor="text1"/>
-              </w:rPr>
-              <w:t>0</w:t>
-            </w:r>
-            <w:r>
-              <w:rPr>
-                <w:rFonts w:ascii="Arial" w:hAnsi="Arial" w:cs="Arial"/>
-                <w:color w:val="000000" w:themeColor="text1"/>
-              </w:rPr>
-              <w:t>.09</w:t>
+              <w:t>0.09</w:t>
             </w:r>
             <w:r>
               <w:rPr>
@@ -22688,7 +21572,7 @@
         </w:rPr>
         <w:t>(</w:t>
       </w:r>
-      <w:commentRangeStart w:id="0"/>
+      <w:commentRangeStart w:id="4"/>
       <w:r>
         <w:rPr>
           <w:rFonts w:ascii="Arial" w:hAnsi="Arial" w:cs="Arial"/>
@@ -22706,12 +21590,12 @@
         </w:rPr>
         <w:t xml:space="preserve"> regression</w:t>
       </w:r>
-      <w:commentRangeEnd w:id="0"/>
+      <w:commentRangeEnd w:id="4"/>
       <w:r>
         <w:rPr>
           <w:rStyle w:val="CommentReference"/>
         </w:rPr>
-        <w:commentReference w:id="0"/>
+        <w:commentReference w:id="4"/>
       </w:r>
       <w:r>
         <w:rPr>
@@ -26443,25 +25327,7 @@
               <w:rPr>
                 <w:rFonts w:ascii="Arial" w:hAnsi="Arial" w:cs="Arial"/>
               </w:rPr>
-              <w:t>1</w:t>
-            </w:r>
-            <w:r>
-              <w:rPr>
-                <w:rFonts w:ascii="Arial" w:hAnsi="Arial" w:cs="Arial"/>
-              </w:rPr>
-              <w:t>.</w:t>
-            </w:r>
-            <w:r>
-              <w:rPr>
-                <w:rFonts w:ascii="Arial" w:hAnsi="Arial" w:cs="Arial"/>
-              </w:rPr>
-              <w:t>144</w:t>
-            </w:r>
-            <w:r>
-              <w:rPr>
-                <w:rFonts w:ascii="Arial" w:hAnsi="Arial" w:cs="Arial"/>
-              </w:rPr>
-              <w:t xml:space="preserve"> * 10</w:t>
+              <w:t>1.144 * 10</w:t>
             </w:r>
             <w:r>
               <w:rPr>
@@ -26495,13 +25361,7 @@
               <w:rPr>
                 <w:rFonts w:ascii="Arial" w:hAnsi="Arial" w:cs="Arial"/>
               </w:rPr>
-              <w:t>0.6</w:t>
-            </w:r>
-            <w:r>
-              <w:rPr>
-                <w:rFonts w:ascii="Arial" w:hAnsi="Arial" w:cs="Arial"/>
-              </w:rPr>
-              <w:t>344</w:t>
+              <w:t>0.6344</w:t>
             </w:r>
           </w:p>
         </w:tc>
@@ -28050,7 +26910,71 @@
 
 <file path=word/comments.xml><?xml version="1.0" encoding="utf-8"?>
 <w:comments xmlns:wpc="http://schemas.microsoft.com/office/word/2010/wordprocessingCanvas" xmlns:cx="http://schemas.microsoft.com/office/drawing/2014/chartex" xmlns:cx1="http://schemas.microsoft.com/office/drawing/2015/9/8/chartex" xmlns:cx2="http://schemas.microsoft.com/office/drawing/2015/10/21/chartex" xmlns:cx3="http://schemas.microsoft.com/office/drawing/2016/5/9/chartex" xmlns:cx4="http://schemas.microsoft.com/office/drawing/2016/5/10/chartex" xmlns:cx5="http://schemas.microsoft.com/office/drawing/2016/5/11/chartex" xmlns:cx6="http://schemas.microsoft.com/office/drawing/2016/5/12/chartex" xmlns:cx7="http://schemas.microsoft.com/office/drawing/2016/5/13/chartex" xmlns:cx8="http://schemas.microsoft.com/office/drawing/2016/5/14/chartex" xmlns:mc="http://schemas.openxmlformats.org/markup-compatibility/2006" xmlns:aink="http://schemas.microsoft.com/office/drawing/2016/ink" xmlns:am3d="http://schemas.microsoft.com/office/drawing/2017/model3d" xmlns:o="urn:schemas-microsoft-com:office:office" xmlns:oel="http://schemas.microsoft.com/office/2019/extlst" xmlns:r="http://schemas.openxmlformats.org/officeDocument/2006/relationships" xmlns:m="http://schemas.openxmlformats.org/officeDocument/2006/math" xmlns:v="urn:schemas-microsoft-com:vml" xmlns:wp14="http://schemas.microsoft.com/office/word/2010/wordprocessingDrawing" xmlns:wp="http://schemas.openxmlformats.org/drawingml/2006/wordprocessingDrawing" xmlns:w10="urn:schemas-microsoft-com:office:word" xmlns:w="http://schemas.openxmlformats.org/wordprocessingml/2006/main" xmlns:w14="http://schemas.microsoft.com/office/word/2010/wordml" xmlns:w15="http://schemas.microsoft.com/office/word/2012/wordml" xmlns:w16cex="http://schemas.microsoft.com/office/word/2018/wordml/cex" xmlns:w16cid="http://schemas.microsoft.com/office/word/2016/wordml/cid" xmlns:w16="http://schemas.microsoft.com/office/word/2018/wordml" xmlns:w16sdtdh="http://schemas.microsoft.com/office/word/2020/wordml/sdtdatahash" xmlns:w16se="http://schemas.microsoft.com/office/word/2015/wordml/symex" xmlns:wpg="http://schemas.microsoft.com/office/word/2010/wordprocessingGroup" xmlns:wpi="http://schemas.microsoft.com/office/word/2010/wordprocessingInk" xmlns:wne="http://schemas.microsoft.com/office/word/2006/wordml" xmlns:wps="http://schemas.microsoft.com/office/word/2010/wordprocessingShape" mc:Ignorable="w14 w15 w16se w16cid w16 w16cex w16sdtdh wp14">
-  <w:comment w:id="0" w:author="Priya Shukla" w:date="2023-03-28T16:40:00Z" w:initials="PS">
+  <w:comment w:id="0" w:author="Priya Shukla" w:date="2023-04-06T19:10:00Z" w:initials="PS">
+    <w:p>
+      <w:pPr>
+        <w:pStyle w:val="CommentText"/>
+      </w:pPr>
+      <w:r>
+        <w:rPr>
+          <w:rStyle w:val="CommentReference"/>
+        </w:rPr>
+        <w:annotationRef/>
+      </w:r>
+      <w:r>
+        <w:t>Re-write results looking at stats first then graphs side-by-side.</w:t>
+      </w:r>
+    </w:p>
+  </w:comment>
+  <w:comment w:id="1" w:author="Priya Shukla" w:date="2023-04-06T19:21:00Z" w:initials="PS">
+    <w:p>
+      <w:pPr>
+        <w:pStyle w:val="CommentText"/>
+      </w:pPr>
+      <w:r>
+        <w:rPr>
+          <w:rStyle w:val="CommentReference"/>
+        </w:rPr>
+        <w:annotationRef/>
+      </w:r>
+      <w:r>
+        <w:t>Re-write (check stats table).</w:t>
+      </w:r>
+    </w:p>
+  </w:comment>
+  <w:comment w:id="2" w:author="Priya Shukla" w:date="2023-04-06T19:07:00Z" w:initials="PS">
+    <w:p>
+      <w:pPr>
+        <w:pStyle w:val="CommentText"/>
+      </w:pPr>
+      <w:r>
+        <w:rPr>
+          <w:rStyle w:val="CommentReference"/>
+        </w:rPr>
+        <w:annotationRef/>
+      </w:r>
+      <w:r>
+        <w:t>Exist weakly at MHW 24C</w:t>
+      </w:r>
+    </w:p>
+  </w:comment>
+  <w:comment w:id="3" w:author="Priya Shukla" w:date="2023-04-06T19:24:00Z" w:initials="PS">
+    <w:p>
+      <w:pPr>
+        <w:pStyle w:val="CommentText"/>
+      </w:pPr>
+      <w:r>
+        <w:rPr>
+          <w:rStyle w:val="CommentReference"/>
+        </w:rPr>
+        <w:annotationRef/>
+      </w:r>
+      <w:r>
+        <w:t>Is this SH_Temp or MHW?</w:t>
+      </w:r>
+    </w:p>
+  </w:comment>
+  <w:comment w:id="4" w:author="Priya Shukla" w:date="2023-03-28T16:40:00Z" w:initials="PS">
     <w:p>
       <w:pPr>
         <w:pStyle w:val="CommentText"/>
@@ -28085,18 +27009,30 @@
 
 <file path=word/commentsExtended.xml><?xml version="1.0" encoding="utf-8"?>
 <w15:commentsEx xmlns:wpc="http://schemas.microsoft.com/office/word/2010/wordprocessingCanvas" xmlns:cx="http://schemas.microsoft.com/office/drawing/2014/chartex" xmlns:cx1="http://schemas.microsoft.com/office/drawing/2015/9/8/chartex" xmlns:cx2="http://schemas.microsoft.com/office/drawing/2015/10/21/chartex" xmlns:cx3="http://schemas.microsoft.com/office/drawing/2016/5/9/chartex" xmlns:cx4="http://schemas.microsoft.com/office/drawing/2016/5/10/chartex" xmlns:cx5="http://schemas.microsoft.com/office/drawing/2016/5/11/chartex" xmlns:cx6="http://schemas.microsoft.com/office/drawing/2016/5/12/chartex" xmlns:cx7="http://schemas.microsoft.com/office/drawing/2016/5/13/chartex" xmlns:cx8="http://schemas.microsoft.com/office/drawing/2016/5/14/chartex" xmlns:mc="http://schemas.openxmlformats.org/markup-compatibility/2006" xmlns:aink="http://schemas.microsoft.com/office/drawing/2016/ink" xmlns:am3d="http://schemas.microsoft.com/office/drawing/2017/model3d" xmlns:o="urn:schemas-microsoft-com:office:office" xmlns:oel="http://schemas.microsoft.com/office/2019/extlst" xmlns:r="http://schemas.openxmlformats.org/officeDocument/2006/relationships" xmlns:m="http://schemas.openxmlformats.org/officeDocument/2006/math" xmlns:v="urn:schemas-microsoft-com:vml" xmlns:wp14="http://schemas.microsoft.com/office/word/2010/wordprocessingDrawing" xmlns:wp="http://schemas.openxmlformats.org/drawingml/2006/wordprocessingDrawing" xmlns:w10="urn:schemas-microsoft-com:office:word" xmlns:w="http://schemas.openxmlformats.org/wordprocessingml/2006/main" xmlns:w14="http://schemas.microsoft.com/office/word/2010/wordml" xmlns:w15="http://schemas.microsoft.com/office/word/2012/wordml" xmlns:w16cex="http://schemas.microsoft.com/office/word/2018/wordml/cex" xmlns:w16cid="http://schemas.microsoft.com/office/word/2016/wordml/cid" xmlns:w16="http://schemas.microsoft.com/office/word/2018/wordml" xmlns:w16sdtdh="http://schemas.microsoft.com/office/word/2020/wordml/sdtdatahash" xmlns:w16se="http://schemas.microsoft.com/office/word/2015/wordml/symex" xmlns:wpg="http://schemas.microsoft.com/office/word/2010/wordprocessingGroup" xmlns:wpi="http://schemas.microsoft.com/office/word/2010/wordprocessingInk" xmlns:wne="http://schemas.microsoft.com/office/word/2006/wordml" xmlns:wps="http://schemas.microsoft.com/office/word/2010/wordprocessingShape" mc:Ignorable="w14 w15 w16se w16cid w16 w16cex w16sdtdh wp14">
+  <w15:commentEx w15:paraId="6A4E7AE2" w15:done="0"/>
+  <w15:commentEx w15:paraId="639F5626" w15:done="0"/>
+  <w15:commentEx w15:paraId="73FD6ADB" w15:done="0"/>
+  <w15:commentEx w15:paraId="51F6C9F2" w15:done="0"/>
   <w15:commentEx w15:paraId="0DDB47F1" w15:done="0"/>
 </w15:commentsEx>
 </file>
 
 <file path=word/commentsExtensible.xml><?xml version="1.0" encoding="utf-8"?>
 <w16cex:commentsExtensible xmlns:wpc="http://schemas.microsoft.com/office/word/2010/wordprocessingCanvas" xmlns:cx="http://schemas.microsoft.com/office/drawing/2014/chartex" xmlns:cx1="http://schemas.microsoft.com/office/drawing/2015/9/8/chartex" xmlns:cx2="http://schemas.microsoft.com/office/drawing/2015/10/21/chartex" xmlns:cx3="http://schemas.microsoft.com/office/drawing/2016/5/9/chartex" xmlns:cx4="http://schemas.microsoft.com/office/drawing/2016/5/10/chartex" xmlns:cx5="http://schemas.microsoft.com/office/drawing/2016/5/11/chartex" xmlns:cx6="http://schemas.microsoft.com/office/drawing/2016/5/12/chartex" xmlns:cx7="http://schemas.microsoft.com/office/drawing/2016/5/13/chartex" xmlns:cx8="http://schemas.microsoft.com/office/drawing/2016/5/14/chartex" xmlns:mc="http://schemas.openxmlformats.org/markup-compatibility/2006" xmlns:aink="http://schemas.microsoft.com/office/drawing/2016/ink" xmlns:am3d="http://schemas.microsoft.com/office/drawing/2017/model3d" xmlns:o="urn:schemas-microsoft-com:office:office" xmlns:oel="http://schemas.microsoft.com/office/2019/extlst" xmlns:r="http://schemas.openxmlformats.org/officeDocument/2006/relationships" xmlns:m="http://schemas.openxmlformats.org/officeDocument/2006/math" xmlns:v="urn:schemas-microsoft-com:vml" xmlns:wp14="http://schemas.microsoft.com/office/word/2010/wordprocessingDrawing" xmlns:wp="http://schemas.openxmlformats.org/drawingml/2006/wordprocessingDrawing" xmlns:w10="urn:schemas-microsoft-com:office:word" xmlns:w="http://schemas.openxmlformats.org/wordprocessingml/2006/main" xmlns:w14="http://schemas.microsoft.com/office/word/2010/wordml" xmlns:w15="http://schemas.microsoft.com/office/word/2012/wordml" xmlns:w16cex="http://schemas.microsoft.com/office/word/2018/wordml/cex" xmlns:w16cid="http://schemas.microsoft.com/office/word/2016/wordml/cid" xmlns:w16="http://schemas.microsoft.com/office/word/2018/wordml" xmlns:w16sdtdh="http://schemas.microsoft.com/office/word/2020/wordml/sdtdatahash" xmlns:w16se="http://schemas.microsoft.com/office/word/2015/wordml/symex" xmlns:wpg="http://schemas.microsoft.com/office/word/2010/wordprocessingGroup" xmlns:wpi="http://schemas.microsoft.com/office/word/2010/wordprocessingInk" xmlns:wne="http://schemas.microsoft.com/office/word/2006/wordml" xmlns:wps="http://schemas.microsoft.com/office/word/2010/wordprocessingShape" mc:Ignorable="w14 w15 w16se w16cid w16 w16cex w16sdtdh wp14">
+  <w16cex:commentExtensible w16cex:durableId="27D997BC" w16cex:dateUtc="2023-04-07T02:10:00Z"/>
+  <w16cex:commentExtensible w16cex:durableId="27D99A2C" w16cex:dateUtc="2023-04-07T02:21:00Z"/>
+  <w16cex:commentExtensible w16cex:durableId="27D996F3" w16cex:dateUtc="2023-04-07T02:07:00Z"/>
+  <w16cex:commentExtensible w16cex:durableId="27D99AEC" w16cex:dateUtc="2023-04-07T02:24:00Z"/>
   <w16cex:commentExtensible w16cex:durableId="27CD96FC" w16cex:dateUtc="2023-03-28T23:40:00Z"/>
 </w16cex:commentsExtensible>
 </file>
 
 <file path=word/commentsIds.xml><?xml version="1.0" encoding="utf-8"?>
 <w16cid:commentsIds xmlns:wpc="http://schemas.microsoft.com/office/word/2010/wordprocessingCanvas" xmlns:cx="http://schemas.microsoft.com/office/drawing/2014/chartex" xmlns:cx1="http://schemas.microsoft.com/office/drawing/2015/9/8/chartex" xmlns:cx2="http://schemas.microsoft.com/office/drawing/2015/10/21/chartex" xmlns:cx3="http://schemas.microsoft.com/office/drawing/2016/5/9/chartex" xmlns:cx4="http://schemas.microsoft.com/office/drawing/2016/5/10/chartex" xmlns:cx5="http://schemas.microsoft.com/office/drawing/2016/5/11/chartex" xmlns:cx6="http://schemas.microsoft.com/office/drawing/2016/5/12/chartex" xmlns:cx7="http://schemas.microsoft.com/office/drawing/2016/5/13/chartex" xmlns:cx8="http://schemas.microsoft.com/office/drawing/2016/5/14/chartex" xmlns:mc="http://schemas.openxmlformats.org/markup-compatibility/2006" xmlns:aink="http://schemas.microsoft.com/office/drawing/2016/ink" xmlns:am3d="http://schemas.microsoft.com/office/drawing/2017/model3d" xmlns:o="urn:schemas-microsoft-com:office:office" xmlns:oel="http://schemas.microsoft.com/office/2019/extlst" xmlns:r="http://schemas.openxmlformats.org/officeDocument/2006/relationships" xmlns:m="http://schemas.openxmlformats.org/officeDocument/2006/math" xmlns:v="urn:schemas-microsoft-com:vml" xmlns:wp14="http://schemas.microsoft.com/office/word/2010/wordprocessingDrawing" xmlns:wp="http://schemas.openxmlformats.org/drawingml/2006/wordprocessingDrawing" xmlns:w10="urn:schemas-microsoft-com:office:word" xmlns:w="http://schemas.openxmlformats.org/wordprocessingml/2006/main" xmlns:w14="http://schemas.microsoft.com/office/word/2010/wordml" xmlns:w15="http://schemas.microsoft.com/office/word/2012/wordml" xmlns:w16cex="http://schemas.microsoft.com/office/word/2018/wordml/cex" xmlns:w16cid="http://schemas.microsoft.com/office/word/2016/wordml/cid" xmlns:w16="http://schemas.microsoft.com/office/word/2018/wordml" xmlns:w16sdtdh="http://schemas.microsoft.com/office/word/2020/wordml/sdtdatahash" xmlns:w16se="http://schemas.microsoft.com/office/word/2015/wordml/symex" xmlns:wpg="http://schemas.microsoft.com/office/word/2010/wordprocessingGroup" xmlns:wpi="http://schemas.microsoft.com/office/word/2010/wordprocessingInk" xmlns:wne="http://schemas.microsoft.com/office/word/2006/wordml" xmlns:wps="http://schemas.microsoft.com/office/word/2010/wordprocessingShape" mc:Ignorable="w14 w15 w16se w16cid w16 w16cex w16sdtdh wp14">
+  <w16cid:commentId w16cid:paraId="6A4E7AE2" w16cid:durableId="27D997BC"/>
+  <w16cid:commentId w16cid:paraId="639F5626" w16cid:durableId="27D99A2C"/>
+  <w16cid:commentId w16cid:paraId="73FD6ADB" w16cid:durableId="27D996F3"/>
+  <w16cid:commentId w16cid:paraId="51F6C9F2" w16cid:durableId="27D99AEC"/>
   <w16cid:commentId w16cid:paraId="0DDB47F1" w16cid:durableId="27CD96FC"/>
 </w16cid:commentsIds>
 </file>
@@ -28631,6 +27567,7 @@
   <w:style w:type="character" w:default="1" w:styleId="DefaultParagraphFont">
     <w:name w:val="Default Paragraph Font"/>
     <w:uiPriority w:val="1"/>
+    <w:semiHidden/>
     <w:unhideWhenUsed/>
   </w:style>
   <w:style w:type="table" w:default="1" w:styleId="TableNormal">

</xml_diff>